<commit_message>
revert(script): restore presentation script to pre-merge state (commit 53ab127)
</commit_message>
<xml_diff>
--- a/draft/fraud-detection/slide/scripts/SCRIPT_THUYET_TRINH_TOAN_TEAM_CS106.docx
+++ b/draft/fraud-detection/slide/scripts/SCRIPT_THUYET_TRINH_TOAN_TEAM_CS106.docx
@@ -5179,7 +5179,7 @@
           <w:rFonts w:ascii="Times New Roman" w:hAnsi="Times New Roman"/>
           <w:i/>
         </w:rPr>
-        <w:t>(Thời lượng chuẩn hóa: **~20s – 25s** [Meeting thực tế: ~15s] | Người nói: **Đặng Chí Thanh** - EDA &amp; Preprocessing Lead)</w:t>
+        <w:t>(Thời lượng chuẩn hóa: **~15s** [Meeting thực tế: ~15s] | Người nói: **Đặng Chí Thanh** - EDA &amp; Preprocessing Lead)</w:t>
       </w:r>
       <w:r>
         <w:rPr>
@@ -5192,36 +5192,20 @@
         <w:rPr>
           <w:rFonts w:ascii="Times New Roman" w:hAnsi="Times New Roman"/>
         </w:rPr>
-        <w:t>Dạ em cảm ơn anh Hôn cho phần mở đầu vừa rồi. Em chào thầy và các bạn!</w:t>
-      </w:r>
-    </w:p>
-    <w:p>
-      <w:r>
-        <w:rPr>
-          <w:rFonts w:ascii="Times New Roman" w:hAnsi="Times New Roman"/>
-        </w:rPr>
-        <w:t xml:space="preserve">Để tiếp nối lộ trình báo cáo của nhóm, em xin phép đi thẳng vào </w:t>
+        <w:t xml:space="preserve">Dạ em cảm ơn anh Hôn. Em chào thầy và các bạn, em là </w:t>
       </w:r>
       <w:r>
         <w:rPr>
           <w:rFonts w:ascii="Times New Roman" w:hAnsi="Times New Roman"/>
           <w:b/>
         </w:rPr>
-        <w:t>Phần 01: Giới thiệu và phát biểu bài toán</w:t>
-      </w:r>
-      <w:r>
-        <w:rPr>
-          <w:rFonts w:ascii="Times New Roman" w:hAnsi="Times New Roman"/>
-        </w:rPr>
-        <w:t>.</w:t>
-      </w:r>
-    </w:p>
-    <w:p>
-      <w:r>
-        <w:rPr>
-          <w:rFonts w:ascii="Times New Roman" w:hAnsi="Times New Roman"/>
-        </w:rPr>
-        <w:t>Ở Phần 1 này, nhóm sẽ đi qua 3 nội dung chính như trên slide, gồm: bối cảnh công nghiệp của Mobile Money (thanh toán di động), các thách thức kỹ thuật cốt lõi, và mục tiêu nghiên cứu của nhóm.</w:t>
+        <w:t>Đặng Chí Thanh</w:t>
+      </w:r>
+      <w:r>
+        <w:rPr>
+          <w:rFonts w:ascii="Times New Roman" w:hAnsi="Times New Roman"/>
+        </w:rPr>
+        <w:t>. Sau đây em xin phép đại diện nhóm bắt đầu với Phần 1: Giới thiệu bài toán và những thách thức kỹ thuật cốt lõi trong phát hiện gian lận tài chính.</w:t>
       </w:r>
     </w:p>
     <w:p>
@@ -5267,7 +5251,7 @@
         <w:rPr>
           <w:rFonts w:ascii="Times New Roman" w:hAnsi="Times New Roman"/>
         </w:rPr>
-        <w:t>Về mặt thực tế, hiện nay các giao dịch ví điện tử Mobile Money diễn ra hàng triệu lượt mỗi ngày. Kẻ gian tẩu tán tiền chỉ trong vài giây, nên hệ thống phòng thủ bắt buộc phải đưa ra quyết định real-time với độ trễ dưới 100 mili-giây trước khi tiền bị rút mất.</w:t>
+        <w:t>Kính thưa Thầy và các bạn, hiện nay các giao dịch trên ví điện tử và Mobile Money đang tăng trưởng bùng nổ, kéo theo các thủ đoạn lừa đảo và tẩu tán tiền diễn ra chỉ trong vài giây. Do đó, hệ thống phòng thủ bắt buộc phải đưa ra quyết định cực nhanh theo thời gian thực, với độ trễ dưới 100 mili-giây trước khi tiền bị rút mất.</w:t>
       </w:r>
     </w:p>
     <w:p>
@@ -5275,15 +5259,7 @@
         <w:rPr>
           <w:rFonts w:ascii="Times New Roman" w:hAnsi="Times New Roman"/>
         </w:rPr>
-        <w:t>Thầy và các bạn có thể quan sát ở các khung bên phải màn hình là bảng ký hiệu toán học và các mục tiêu cụ thể mà nhóm hướng tới.</w:t>
-      </w:r>
-    </w:p>
-    <w:p>
-      <w:r>
-        <w:rPr>
-          <w:rFonts w:ascii="Times New Roman" w:hAnsi="Times New Roman"/>
-        </w:rPr>
-        <w:t xml:space="preserve">Còn trọng tâm khi tiếp cận bài toán, ở cột bên trái, em đối mặt với </w:t>
+        <w:t xml:space="preserve">Khi bắt tay vào bài toán, nhóm em phải đối mặt với </w:t>
       </w:r>
       <w:r>
         <w:rPr>
@@ -5319,7 +5295,20 @@
         <w:rPr>
           <w:rFonts w:ascii="Times New Roman" w:hAnsi="Times New Roman"/>
         </w:rPr>
-        <w:t xml:space="preserve">: Gian lận chỉ chiếm khoảng `0.13%` — tức là cứ 800 giao dịch bình thường mới có đúng 1 ca gian lận. Với tỷ lệ lệch này, thước đo Accuracy bị vô hiệu hóa hoàn toàn, vì nếu một mô hình ngây thơ lúc nào cũng đoán "Hợp lệ" thì Accuracy đã đạt `99.87%` nhưng thực tế không bắt được tên trộm nào. Do đó, nhóm bắt buộc phải tối ưu </w:t>
+        <w:t xml:space="preserve">: Gian lận chỉ chiếm tỷ lệ khoảng </w:t>
+      </w:r>
+      <w:r>
+        <w:rPr>
+          <w:rFonts w:ascii="Times New Roman" w:hAnsi="Times New Roman"/>
+          <w:b/>
+        </w:rPr>
+        <w:t>0.13%</w:t>
+      </w:r>
+      <w:r>
+        <w:rPr>
+          <w:rFonts w:ascii="Times New Roman" w:hAnsi="Times New Roman"/>
+        </w:rPr>
+        <w:t xml:space="preserve"> — tức là cứ 800 giao dịch bình thường thì mới có đúng 1 giao dịch lừa đảo. Nếu dùng thước đo Accuracy truyền thống, một bộ phân lớp ngây thơ lúc nào cũng đoán 'hợp lệ' thì đã đạt 99.87% độ chính xác, nhưng hoàn toàn vô dụng vì không bắt được tên trộm nào! Do đó, nhóm bắt buộc phải tối ưu hóa </w:t>
       </w:r>
       <w:r>
         <w:rPr>
@@ -5355,7 +5344,7 @@
         <w:rPr>
           <w:rFonts w:ascii="Times New Roman" w:hAnsi="Times New Roman"/>
         </w:rPr>
-        <w:t>: Bỏ sót 1 ca gian lận thì khách hàng mất tiền thật và ngân hàng mất uy tín. Trong khi cảnh báo nhầm thì mình chỉ cần gửi OTP yêu cầu người dùng xác thực lại. Vì vậy, chi phí phạt cho việc bỏ sót phải lớn hơn rất nhiều so với báo nhầm.</w:t>
+        <w:t>: Chi phí của việc bỏ sót một vụ gian lận (False Negative) là khách hàng mất tiền thật và ngân hàng mất uy tín. Trong khi cảnh báo nhầm (False Positive) thì chỉ cần yêu cầu người dùng xác thực lại một bước OTP.</w:t>
       </w:r>
     </w:p>
     <w:p>
@@ -5372,13 +5361,21 @@
           <w:rFonts w:ascii="Times New Roman" w:hAnsi="Times New Roman"/>
           <w:b/>
         </w:rPr>
-        <w:t>Thứ ba là tính phi tĩnh</w:t>
-      </w:r>
-      <w:r>
-        <w:rPr>
-          <w:rFonts w:ascii="Times New Roman" w:hAnsi="Times New Roman"/>
-        </w:rPr>
-        <w:t>: Kẻ gian liên tục biến đổi thủ đoạn luân chuyển tiền để lách qua các bộ lọc luật tĩnh.</w:t>
+        <w:t>Thứ ba là Hành vi phi tĩnh</w:t>
+      </w:r>
+      <w:r>
+        <w:rPr>
+          <w:rFonts w:ascii="Times New Roman" w:hAnsi="Times New Roman"/>
+        </w:rPr>
+        <w:t>: Kẻ gian liên tục biến đổi thủ đoạn luân chuyển tiền tinh vi để lách qua các tập luật tĩnh.</w:t>
+      </w:r>
+    </w:p>
+    <w:p>
+      <w:r>
+        <w:rPr>
+          <w:rFonts w:ascii="Times New Roman" w:hAnsi="Times New Roman"/>
+        </w:rPr>
+        <w:t>Vì vậy, mục tiêu của nhóm là xây dựng một pipeline chuẩn chỉ, kết hợp cả mô hình có giám sát lẫn mô hình không giám sát để tạo thành hệ thống phòng thủ đa tầng.</w:t>
       </w:r>
     </w:p>
     <w:p>
@@ -5445,7 +5442,7 @@
         <w:rPr>
           <w:rFonts w:ascii="Times New Roman" w:hAnsi="Times New Roman"/>
         </w:rPr>
-        <w:t xml:space="preserve">Tập gốc khi em download trên Kaggle về ghi nhận hơn </w:t>
+        <w:t xml:space="preserve">Tập gốc ghi nhận hơn </w:t>
       </w:r>
       <w:r>
         <w:rPr>
@@ -5458,27 +5455,14 @@
         <w:rPr>
           <w:rFonts w:ascii="Times New Roman" w:hAnsi="Times New Roman"/>
         </w:rPr>
-        <w:t xml:space="preserve"> trong 30 ngày. Để tối ưu tài nguyên tính toán mà không làm lệch ranh giới bài toán, em thực hiện lấy mẫu phân tầng </w:t>
+        <w:t xml:space="preserve"> trong 30 ngày. Để tối ưu hóa tài nguyên tính toán nhưng không làm mất bản chất bài toán, nhóm thực hiện lấy mẫu phân tầng 200,000 sự kiện, và </w:t>
       </w:r>
       <w:r>
         <w:rPr>
           <w:rFonts w:ascii="Times New Roman" w:hAnsi="Times New Roman"/>
           <w:b/>
         </w:rPr>
-        <w:t>200,000 sự kiện</w:t>
-      </w:r>
-      <w:r>
-        <w:rPr>
-          <w:rFonts w:ascii="Times New Roman" w:hAnsi="Times New Roman"/>
-        </w:rPr>
-        <w:t xml:space="preserve">, nhưng </w:t>
-      </w:r>
-      <w:r>
-        <w:rPr>
-          <w:rFonts w:ascii="Times New Roman" w:hAnsi="Times New Roman"/>
-          <w:b/>
-        </w:rPr>
-        <w:t>bảo toàn nguyên vẹn 100% toàn bộ 8,213 ca gian lận gốc</w:t>
+        <w:t>giữ nguyên vẹn 100% toàn bộ 8,213 ca gian lận gốc</w:t>
       </w:r>
       <w:r>
         <w:rPr>
@@ -5492,7 +5476,7 @@
         <w:rPr>
           <w:rFonts w:ascii="Times New Roman" w:hAnsi="Times New Roman"/>
         </w:rPr>
-        <w:t>Thầy và các bạn có thể nhìn vào bảng ở giữa màn hình: dữ liệu ghi nhận bước thời gian theo giờ, loại giao dịch, số tiền, cùng số dư trước và sau của cả tài khoản chuyển lẫn tài khoản nhận.</w:t>
+        <w:t>Bảng dữ liệu ở giữa slide thể hiện các trường thuộc tính như bước thời gian, loại giao dịch, số tiền, và số dư trước sau.</w:t>
       </w:r>
     </w:p>
     <w:p>
@@ -5500,68 +5484,33 @@
         <w:rPr>
           <w:rFonts w:ascii="Times New Roman" w:hAnsi="Times New Roman"/>
         </w:rPr>
-        <w:t>Đặc biệt, qua phân tích phân bố ban đầu, em phát hiện ra một quy luật rất đắt giá ở khung màu xanh bên dưới:</w:t>
-      </w:r>
-    </w:p>
-    <w:p>
-      <w:r>
-        <w:rPr>
-          <w:rFonts w:ascii="Times New Roman" w:hAnsi="Times New Roman"/>
-        </w:rPr>
+        <w:t xml:space="preserve">Tuy nhiên, </w:t>
       </w:r>
       <w:r>
         <w:rPr>
           <w:rFonts w:ascii="Times New Roman" w:hAnsi="Times New Roman"/>
           <w:b/>
         </w:rPr>
-        <w:t>100% tất cả các ca gian lận CHỈ xảy ra ở đúng 2 loại giao dịch: TRANSFER (chuyển khoản) và CASH_OUT (rút tiền mặt)</w:t>
-      </w:r>
-      <w:r>
-        <w:rPr>
-          <w:rFonts w:ascii="Times New Roman" w:hAnsi="Times New Roman"/>
-        </w:rPr>
-        <w:t>. Các loại khác an toàn tuyệt đối. Nhờ phát hiện này, bước tiền xử lý lọc chỉ giữ lại 2 loại trên đã giúp nhóm triệt tiêu ngay được `70%` dữ liệu nhiễu vô ích cho toàn bộ pipeline phía sau.</w:t>
-      </w:r>
-    </w:p>
-    <w:p>
-      <w:pPr>
-        <w:ind w:left="432" w:right="432"/>
-      </w:pPr>
-      <w:r>
-        <w:rPr>
-          <w:rFonts w:ascii="Times New Roman" w:hAnsi="Times New Roman"/>
-          <w:i/>
-          <w:color w:val="444444"/>
-        </w:rPr>
+        <w:t>insight mang tính quyết định nhất</w:t>
+      </w:r>
+      <w:r>
+        <w:rPr>
+          <w:rFonts w:ascii="Times New Roman" w:hAnsi="Times New Roman"/>
+        </w:rPr>
+        <w:t xml:space="preserve"> mà em muốn nhấn mạnh nằm ở khung màu xanh dưới cùng: </w:t>
       </w:r>
       <w:r>
         <w:rPr>
           <w:rFonts w:ascii="Times New Roman" w:hAnsi="Times New Roman"/>
           <w:b/>
-          <w:i/>
-          <w:color w:val="444444"/>
-        </w:rPr>
-        <w:t>Đúc kết Phần 01:</w:t>
-      </w:r>
-      <w:r>
-        <w:rPr>
-          <w:rFonts w:ascii="Times New Roman" w:hAnsi="Times New Roman"/>
-          <w:i/>
-          <w:color w:val="444444"/>
-        </w:rPr>
-      </w:r>
-    </w:p>
-    <w:p>
-      <w:pPr>
-        <w:ind w:left="432" w:right="432"/>
-      </w:pPr>
-      <w:r>
-        <w:rPr>
-          <w:rFonts w:ascii="Times New Roman" w:hAnsi="Times New Roman"/>
-          <w:i/>
-          <w:color w:val="444444"/>
-        </w:rPr>
-        <w:t>Tóm lại, Phần 1 đã làm rõ bản chất mất cân bằng cực đoan 0.13% và insight khoanh vùng 2 loại giao dịch giúp loại bỏ 70% dữ liệu nhiễu, tạo tiền đề dữ liệu sạch cho Phần 2.</w:t>
+        </w:rPr>
+        <w:t>100% tất cả các ca gian lận chỉ xuất hiện ở đúng 2 loại giao dịch là TRANSFER (Chuyển khoản) và CASH_OUT (Rút tiền mặt)</w:t>
+      </w:r>
+      <w:r>
+        <w:rPr>
+          <w:rFonts w:ascii="Times New Roman" w:hAnsi="Times New Roman"/>
+        </w:rPr>
+        <w:t>. Các loại còn lại như PAYMENT, CASH_IN hay DEBIT an toàn tuyệt đối (0% gian lận). Nhờ phát hiện này, ngay tại bước tiền xử lý, việc lọc dữ liệu chỉ giữ lại 2 loại giao dịch đã giúp nhóm triệt tiêu ngay được hơn 70% dữ liệu nhiễu!</w:t>
       </w:r>
     </w:p>
     <w:p>
@@ -5607,20 +5556,7 @@
         <w:rPr>
           <w:rFonts w:ascii="Times New Roman" w:hAnsi="Times New Roman"/>
         </w:rPr>
-        <w:t xml:space="preserve">Sau khi đã khoanh vùng được tập dữ liệu sạch, chúng ta đến với </w:t>
-      </w:r>
-      <w:r>
-        <w:rPr>
-          <w:rFonts w:ascii="Times New Roman" w:hAnsi="Times New Roman"/>
-          <w:b/>
-        </w:rPr>
-        <w:t>Phần 02: Phân tích khám phá dữ liệu và kỹ thuật đặc trưng</w:t>
-      </w:r>
-      <w:r>
-        <w:rPr>
-          <w:rFonts w:ascii="Times New Roman" w:hAnsi="Times New Roman"/>
-        </w:rPr>
-        <w:t>.</w:t>
+        <w:t>Tiếp theo, em xin đi sâu vào Phần 2: Phân tích khám phá dữ liệu, 3 dấu vết hành vi của kẻ gian và kỹ thuật trích xuất 14 đặc trưng miền kế toán.</w:t>
       </w:r>
     </w:p>
     <w:p>
@@ -5653,7 +5589,7 @@
           <w:rFonts w:ascii="Times New Roman" w:hAnsi="Times New Roman"/>
           <w:i/>
         </w:rPr>
-        <w:t>(Thời lượng chuẩn hóa: **~55s – 60s** [Meeting thực tế: ~110s] | Người nói: **Đặng Chí Thanh**)</w:t>
+        <w:t>(Thời lượng chuẩn hóa: **~75s – 80s** [Meeting thực tế: ~110s] | Người nói: **Đặng Chí Thanh**)</w:t>
       </w:r>
       <w:r>
         <w:rPr>
@@ -5666,7 +5602,7 @@
         <w:rPr>
           <w:rFonts w:ascii="Times New Roman" w:hAnsi="Times New Roman"/>
         </w:rPr>
-        <w:t xml:space="preserve">Khi thực hiện EDA trên notebook `01_eda.ipynb`, em đúc kết được </w:t>
+        <w:t xml:space="preserve">Khi thực hiện EDA trên notebook `01_eda.ipynb`, nhóm đã đúc kết được </w:t>
       </w:r>
       <w:r>
         <w:rPr>
@@ -5679,12 +5615,12 @@
         <w:rPr>
           <w:rFonts w:ascii="Times New Roman" w:hAnsi="Times New Roman"/>
         </w:rPr>
-        <w:t>, tương ứng với 3 cột trên màn hình:</w:t>
+        <w:t>:</w:t>
       </w:r>
     </w:p>
     <w:p>
       <w:pPr>
-        <w:pStyle w:val="ListBullet"/>
+        <w:pStyle w:val="ListNumber"/>
       </w:pPr>
       <w:r>
         <w:rPr>
@@ -5696,18 +5632,18 @@
           <w:rFonts w:ascii="Times New Roman" w:hAnsi="Times New Roman"/>
           <w:b/>
         </w:rPr>
-        <w:t>Cột đầu tiên — Khoanh vùng loại giao dịch</w:t>
-      </w:r>
-      <w:r>
-        <w:rPr>
-          <w:rFonts w:ascii="Times New Roman" w:hAnsi="Times New Roman"/>
-        </w:rPr>
-        <w:t>: Kẻ gian chiếm được tài khoản sẽ dùng lệnh `TRANSFER` chuyển tiền sang tài khoản trung gian, rồi lập tức rút tiền mặt `CASH_OUT` ngay để cắt đứt dấu vết dòng tiền.</w:t>
+        <w:t>Dấu vết 1 — Khoanh vùng loại giao dịch (100%)</w:t>
+      </w:r>
+      <w:r>
+        <w:rPr>
+          <w:rFonts w:ascii="Times New Roman" w:hAnsi="Times New Roman"/>
+        </w:rPr>
+        <w:t>: Toàn bộ gian lận tập trung khu biệt. Kẻ gian khi chiếm đoạt tài khoản sẽ thực hiện lệnh `TRANSFER` sang tài khoản trung gian, rồi ngay lập tức rút tiền mặt bằng lệnh `CASH_OUT` để tẩu tán và cắt đứt hoàn toàn dấu vết dòng tiền.</w:t>
       </w:r>
     </w:p>
     <w:p>
       <w:pPr>
-        <w:pStyle w:val="ListBullet"/>
+        <w:pStyle w:val="ListNumber"/>
       </w:pPr>
       <w:r>
         <w:rPr>
@@ -5719,7 +5655,7 @@
           <w:rFonts w:ascii="Times New Roman" w:hAnsi="Times New Roman"/>
           <w:b/>
         </w:rPr>
-        <w:t>Cột thứ hai — Hành vi vét sạch tài khoản</w:t>
+        <w:t>Dấu vết 2 — Hành vi vét sạch tài khoản (97.56%)</w:t>
       </w:r>
       <w:r>
         <w:rPr>
@@ -5738,12 +5674,12 @@
         <w:rPr>
           <w:rFonts w:ascii="Times New Roman" w:hAnsi="Times New Roman"/>
         </w:rPr>
-        <w:t xml:space="preserve"> số vụ gian lận, số dư của nạn nhân sau giao dịch bị rút cạn sạch về đúng bằng 0 (`newbalanceOrig == 0`) trong 1 lần duy nhất trước khi nạn nhân kịp phát hiện và khóa thẻ.</w:t>
+        <w:t xml:space="preserve"> số vụ gian lận, số dư của nạn nhân sau giao dịch bị đưa về đúng bằng 0 (`newbalanceOrig == 0`). Kẻ gian luôn có tâm lý tối đa hóa số tiền chiếm đoạt trong một lần duy nhất trước khi nạn nhân kịp phát hiện và khóa thẻ.</w:t>
       </w:r>
     </w:p>
     <w:p>
       <w:pPr>
-        <w:pStyle w:val="ListBullet"/>
+        <w:pStyle w:val="ListNumber"/>
       </w:pPr>
       <w:r>
         <w:rPr>
@@ -5755,13 +5691,13 @@
           <w:rFonts w:ascii="Times New Roman" w:hAnsi="Times New Roman"/>
           <w:b/>
         </w:rPr>
-        <w:t>Cột thứ ba — Sai lệch sổ cái đích</w:t>
-      </w:r>
-      <w:r>
-        <w:rPr>
-          <w:rFonts w:ascii="Times New Roman" w:hAnsi="Times New Roman"/>
-        </w:rPr>
-        <w:t>: Tiền chuyển đi nhưng số dư tài khoản nhận thực tế không tăng tương ứng (`newbalanceDest ≈ 0`), vạch trần việc dùng các tài khoản rác (mule account) để tẩu tán tiền.</w:t>
+        <w:t>Dấu vết 3 — Bất thường biến động số dư ở tài khoản nhận</w:t>
+      </w:r>
+      <w:r>
+        <w:rPr>
+          <w:rFonts w:ascii="Times New Roman" w:hAnsi="Times New Roman"/>
+        </w:rPr>
+        <w:t>: Tại tài khoản đích, phần lớn các vụ gian lận thì số dư thực tế hầu như không tăng tương ứng theo sổ sách (`newbalanceDest ≈ 0`). Điều này phản ánh rõ nét việc kẻ gian sử dụng các tài khoản rác (mule account) hoặc luân chuyển rửa tiền đa tầng liên tục.</w:t>
       </w:r>
     </w:p>
     <w:p>
@@ -5769,7 +5705,7 @@
         <w:rPr>
           <w:rFonts w:ascii="Times New Roman" w:hAnsi="Times New Roman"/>
         </w:rPr>
-        <w:t>Nếu chỉ đưa số tiền hay số dư thô vào mô hình thì rất lãng phí. Vì vậy, em đã tiến hành chuyển đổi các quy luật này thành các đặc trưng kế toán.</w:t>
+        <w:t>Nếu chỉ đưa số tiền hay số dư thô vào mô hình thì rất lãng phí các tín hiệu cốt lõi này. Vì vậy, nhóm đã tiến hành toán học hóa thành các đặc trưng miền kế toán ở slide tiếp theo.</w:t>
       </w:r>
     </w:p>
     <w:p>
@@ -5802,7 +5738,7 @@
           <w:rFonts w:ascii="Times New Roman" w:hAnsi="Times New Roman"/>
           <w:i/>
         </w:rPr>
-        <w:t>(Thời lượng chuẩn hóa: **~65s – 70s** [Meeting thực tế: ~127s] | Người nói: **Đặng Chí Thanh**)</w:t>
+        <w:t>(Thời lượng chuẩn hóa: **~70s – 75s** [Meeting thực tế: ~127s] | Người nói: **Đặng Chí Thanh**)</w:t>
       </w:r>
       <w:r>
         <w:rPr>
@@ -5815,123 +5751,98 @@
         <w:rPr>
           <w:rFonts w:ascii="Times New Roman" w:hAnsi="Times New Roman"/>
         </w:rPr>
-        <w:t xml:space="preserve">Từ 3 dấu vết trên, em hiện thực trong code tổng cộng </w:t>
+        <w:t xml:space="preserve">Ở slide này, nhóm thể hiện tổng cộng </w:t>
       </w:r>
       <w:r>
         <w:rPr>
           <w:rFonts w:ascii="Times New Roman" w:hAnsi="Times New Roman"/>
           <w:b/>
         </w:rPr>
-        <w:t>14 đặc trưng miền chuyên sâu</w:t>
-      </w:r>
-      <w:r>
-        <w:rPr>
-          <w:rFonts w:ascii="Times New Roman" w:hAnsi="Times New Roman"/>
-        </w:rPr>
-        <w:t xml:space="preserve"> ở 3 khung công thức bên trái: gồm sai lệch số dư nguồn (`errorBalanceOrig`), sai lệch số dư đích (`errorBalanceDest`), cùng cờ rút cạn (`drain</w:t>
-      </w:r>
-      <w:r>
-        <w:rPr>
-          <w:rFonts w:ascii="Times New Roman" w:hAnsi="Times New Roman"/>
-          <w:i/>
-        </w:rPr>
-        <w:t>flag`) kết hợp giờ đêm (`is</w:t>
-      </w:r>
-      <w:r>
-        <w:rPr>
-          <w:rFonts w:ascii="Times New Roman" w:hAnsi="Times New Roman"/>
-        </w:rPr>
-        <w:t>overnight`).</w:t>
-      </w:r>
-    </w:p>
-    <w:p>
-      <w:r>
-        <w:rPr>
-          <w:rFonts w:ascii="Times New Roman" w:hAnsi="Times New Roman"/>
-        </w:rPr>
-        <w:t xml:space="preserve">Điều chứng minh rõ nhất hiệu quả của việc thiết kế đặc trưng nằm ở </w:t>
-      </w:r>
-      <w:r>
-        <w:rPr>
-          <w:rFonts w:ascii="Times New Roman" w:hAnsi="Times New Roman"/>
-          <w:b/>
-        </w:rPr>
-        <w:t>khung Feature Importance góc dưới bên phải</w:t>
-      </w:r>
-      <w:r>
-        <w:rPr>
-          <w:rFonts w:ascii="Times New Roman" w:hAnsi="Times New Roman"/>
-        </w:rPr>
-        <w:t>:</w:t>
-      </w:r>
-    </w:p>
-    <w:p>
-      <w:r>
-        <w:rPr>
-          <w:rFonts w:ascii="Times New Roman" w:hAnsi="Times New Roman"/>
-        </w:rPr>
-        <w:t xml:space="preserve">Khi đánh giá mô hình, </w:t>
-      </w:r>
-      <w:r>
-        <w:rPr>
-          <w:rFonts w:ascii="Times New Roman" w:hAnsi="Times New Roman"/>
-          <w:b/>
-        </w:rPr>
-        <w:t>chỉ riêng 2 biến `errorBalanceOrig` (49.9%) và `newbalanceOrig` (47.2%) đã chiếm tới hơn `97.1%` tổng sức mạnh phân loại!</w:t>
-      </w:r>
-      <w:r>
-        <w:rPr>
-          <w:rFonts w:ascii="Times New Roman" w:hAnsi="Times New Roman"/>
-        </w:rPr>
-      </w:r>
-    </w:p>
-    <w:p>
-      <w:r>
-        <w:rPr>
-          <w:rFonts w:ascii="Times New Roman" w:hAnsi="Times New Roman"/>
-        </w:rPr>
-        <w:t>Điều này chứng minh kỹ thuật đặc trưng miền đã giải quyết bài toán tận gốc, biến ranh giới phân lớp phức tạp thành tuyến tính rõ rệt. Và một nguyên tắc em luôn tuân thủ nghiêm ngặt là chống rò rỉ dữ liệu: toàn bộ các bước scale chuẩn hóa chỉ được fit trên tập Train.</w:t>
+        <w:t>14 đặc trưng miền</w:t>
+      </w:r>
+      <w:r>
+        <w:rPr>
+          <w:rFonts w:ascii="Times New Roman" w:hAnsi="Times New Roman"/>
+        </w:rPr>
+        <w:t xml:space="preserve"> đã hiện thực trong code. Em xin tóm lược nguyên lý của 3 nhóm đặc trưng quan trọng nhất:</w:t>
       </w:r>
     </w:p>
     <w:p>
       <w:pPr>
-        <w:ind w:left="432" w:right="432"/>
+        <w:pStyle w:val="ListBullet"/>
       </w:pPr>
       <w:r>
         <w:rPr>
           <w:rFonts w:ascii="Times New Roman" w:hAnsi="Times New Roman"/>
-          <w:i/>
-          <w:color w:val="444444"/>
         </w:rPr>
       </w:r>
       <w:r>
         <w:rPr>
           <w:rFonts w:ascii="Times New Roman" w:hAnsi="Times New Roman"/>
           <w:b/>
-          <w:i/>
-          <w:color w:val="444444"/>
-        </w:rPr>
-        <w:t>Đúc kết Phần 02 (Nhánh EDA &amp; Features):</w:t>
-      </w:r>
-      <w:r>
-        <w:rPr>
-          <w:rFonts w:ascii="Times New Roman" w:hAnsi="Times New Roman"/>
-          <w:i/>
-          <w:color w:val="444444"/>
-        </w:rPr>
+        </w:rPr>
+        <w:t>Nhóm 1: Sai lệch số dư nguồn (`errorBalanceOrig`)</w:t>
+      </w:r>
+      <w:r>
+        <w:rPr>
+          <w:rFonts w:ascii="Times New Roman" w:hAnsi="Times New Roman"/>
+        </w:rPr>
+        <w:t>:</w:t>
+      </w:r>
+    </w:p>
+    <w:p>
+      <w:r>
+        <w:rPr>
+          <w:rFonts w:ascii="Times New Roman" w:hAnsi="Times New Roman"/>
+        </w:rPr>
+        <w:t>$$</w:t>
+      </w:r>
+    </w:p>
+    <w:p>
+      <w:r>
+        <w:rPr>
+          <w:rFonts w:ascii="Times New Roman" w:hAnsi="Times New Roman"/>
+        </w:rPr>
+        <w:t>\text{errorBalanceOrig} = \text{oldbalanceOrg} - \text{amount} - \text{newbalanceOrig}</w:t>
+      </w:r>
+    </w:p>
+    <w:p>
+      <w:r>
+        <w:rPr>
+          <w:rFonts w:ascii="Times New Roman" w:hAnsi="Times New Roman"/>
+        </w:rPr>
+        <w:t>$$</w:t>
+      </w:r>
+    </w:p>
+    <w:p>
+      <w:r>
+        <w:rPr>
+          <w:rFonts w:ascii="Times New Roman" w:hAnsi="Times New Roman"/>
+        </w:rPr>
+        <w:t>Với giao dịch bình thường, phép tính này phải bằng 0. Nhưng với giao dịch gian lận, con số này bị lệch rất lớn vì tài khoản bị trừ tiền bất thường.</w:t>
       </w:r>
     </w:p>
     <w:p>
       <w:pPr>
-        <w:ind w:left="432" w:right="432"/>
+        <w:pStyle w:val="ListBullet"/>
       </w:pPr>
       <w:r>
         <w:rPr>
           <w:rFonts w:ascii="Times New Roman" w:hAnsi="Times New Roman"/>
-          <w:i/>
-          <w:color w:val="444444"/>
-        </w:rPr>
-        <w:t>Tóm lại, nhóm đã chuyển hóa thành công 3 dấu vết hành vi thành các đặc trưng kế toán quyết định 97.1% sức mạnh phân loại và đảm bảo tuyệt đối nguyên tắc Leak-Free.</w:t>
+        </w:rPr>
+      </w:r>
+      <w:r>
+        <w:rPr>
+          <w:rFonts w:ascii="Times New Roman" w:hAnsi="Times New Roman"/>
+          <w:b/>
+        </w:rPr>
+        <w:t>Nhóm 2: Sai lệch số dư đích (`errorBalanceDest`)</w:t>
+      </w:r>
+      <w:r>
+        <w:rPr>
+          <w:rFonts w:ascii="Times New Roman" w:hAnsi="Times New Roman"/>
+        </w:rPr>
+        <w:t>:</w:t>
       </w:r>
     </w:p>
     <w:p>
@@ -5939,7 +5850,7 @@
         <w:rPr>
           <w:rFonts w:ascii="Times New Roman" w:hAnsi="Times New Roman"/>
         </w:rPr>
-        <w:t>Khi đã có không gian đặc trưng chất lượng cao, bài toán tiếp theo là xử lý mất cân bằng 0.13% bằng kỹ thuật sinh mẫu thích ứng.</w:t>
+        <w:t>$$</w:t>
       </w:r>
     </w:p>
     <w:p>
@@ -5947,20 +5858,96 @@
         <w:rPr>
           <w:rFonts w:ascii="Times New Roman" w:hAnsi="Times New Roman"/>
         </w:rPr>
-        <w:t xml:space="preserve">Sau đây, em xin chuyển lại phần trình bày cho bạn </w:t>
+        <w:t>\text{errorBalanceDest} = \text{oldbalanceDest} + \text{amount} - \text{newbalanceDest}</w:t>
+      </w:r>
+    </w:p>
+    <w:p>
+      <w:r>
+        <w:rPr>
+          <w:rFonts w:ascii="Times New Roman" w:hAnsi="Times New Roman"/>
+        </w:rPr>
+        <w:t>$$</w:t>
+      </w:r>
+    </w:p>
+    <w:p>
+      <w:r>
+        <w:rPr>
+          <w:rFonts w:ascii="Times New Roman" w:hAnsi="Times New Roman"/>
+        </w:rPr>
+        <w:t>Ghi nhận bất thường khi tiền chuyển đi nhưng tài khoản nhận lại không ghi nhận tăng số dư.</w:t>
+      </w:r>
+    </w:p>
+    <w:p>
+      <w:pPr>
+        <w:pStyle w:val="ListBullet"/>
+      </w:pPr>
+      <w:r>
+        <w:rPr>
+          <w:rFonts w:ascii="Times New Roman" w:hAnsi="Times New Roman"/>
+        </w:rPr>
       </w:r>
       <w:r>
         <w:rPr>
           <w:rFonts w:ascii="Times New Roman" w:hAnsi="Times New Roman"/>
           <w:b/>
         </w:rPr>
+        <w:t>Nhóm 3: Cờ rút cạn (`drain_flag`) và Chu kỳ giờ đêm (`is_overnight`)</w:t>
+      </w:r>
+      <w:r>
+        <w:rPr>
+          <w:rFonts w:ascii="Times New Roman" w:hAnsi="Times New Roman"/>
+        </w:rPr>
+        <w:t>:</w:t>
+      </w:r>
+    </w:p>
+    <w:p>
+      <w:r>
+        <w:rPr>
+          <w:rFonts w:ascii="Times New Roman" w:hAnsi="Times New Roman"/>
+        </w:rPr>
+        <w:t>Bắt trọn hành vi vét sạch ví về 0 và các đợt tấn công từ 0 giờ đến 5 giờ sáng.</w:t>
+      </w:r>
+    </w:p>
+    <w:p>
+      <w:r>
+        <w:rPr>
+          <w:rFonts w:ascii="Times New Roman" w:hAnsi="Times New Roman"/>
+        </w:rPr>
+        <w:t xml:space="preserve">Điểm mấu chốt là: sau khi đánh giá độ quan trọng, </w:t>
+      </w:r>
+      <w:r>
+        <w:rPr>
+          <w:rFonts w:ascii="Times New Roman" w:hAnsi="Times New Roman"/>
+          <w:b/>
+        </w:rPr>
+        <w:t>chỉ riêng 2 đặc trưng `errorBalanceOrig` và `newbalanceOrig` đã chiếm tới hơn 97.1% tổng sức mạnh phân loại</w:t>
+      </w:r>
+      <w:r>
+        <w:rPr>
+          <w:rFonts w:ascii="Times New Roman" w:hAnsi="Times New Roman"/>
+        </w:rPr>
+        <w:t xml:space="preserve"> của mô hình! Điều này chứng minh rằng kỹ thuật đặc trưng miền đã giải quyết bài toán tận gốc rễ, biến bài toán phân lớp phi tuyến phức tạp thành ranh giới phân tách tuyến tính cực kỳ rõ rệt.</w:t>
+      </w:r>
+    </w:p>
+    <w:p>
+      <w:r>
+        <w:rPr>
+          <w:rFonts w:ascii="Times New Roman" w:hAnsi="Times New Roman"/>
+        </w:rPr>
+        <w:t xml:space="preserve">Sau đây, em xin mời bạn </w:t>
+      </w:r>
+      <w:r>
+        <w:rPr>
+          <w:rFonts w:ascii="Times New Roman" w:hAnsi="Times New Roman"/>
+          <w:b/>
+        </w:rPr>
         <w:t>Hoàng Cao Sơn</w:t>
       </w:r>
       <w:r>
         <w:rPr>
           <w:rFonts w:ascii="Times New Roman" w:hAnsi="Times New Roman"/>
         </w:rPr>
-        <w:t xml:space="preserve"> tiếp tục với nội dung SMOTE và ADASYN ở Slide 9 ạ.</w:t>
+        <w:t xml:space="preserve"> trình bày tiếp về phương pháp xử lý mất cân bằng và mô hình Random Forest ạ.</w:t>
       </w:r>
     </w:p>
     <w:p>

</xml_diff>

<commit_message>
feat(script): merge refined presentation script from PR #37 (Dang Chi Thanh Slides 3-8)
</commit_message>
<xml_diff>
--- a/draft/fraud-detection/slide/scripts/SCRIPT_THUYET_TRINH_TOAN_TEAM_CS106.docx
+++ b/draft/fraud-detection/slide/scripts/SCRIPT_THUYET_TRINH_TOAN_TEAM_CS106.docx
@@ -5179,7 +5179,7 @@
           <w:rFonts w:ascii="Times New Roman" w:hAnsi="Times New Roman"/>
           <w:i/>
         </w:rPr>
-        <w:t>(Thời lượng chuẩn hóa: **~15s** [Meeting thực tế: ~15s] | Người nói: **Đặng Chí Thanh** - EDA &amp; Preprocessing Lead)</w:t>
+        <w:t>(Thời lượng chuẩn hóa: **~20s – 25s** [Meeting thực tế: ~15s] | Người nói: **Đặng Chí Thanh** - EDA &amp; Preprocessing Lead)</w:t>
       </w:r>
       <w:r>
         <w:rPr>
@@ -5192,20 +5192,36 @@
         <w:rPr>
           <w:rFonts w:ascii="Times New Roman" w:hAnsi="Times New Roman"/>
         </w:rPr>
-        <w:t xml:space="preserve">Dạ em cảm ơn anh Hôn. Em chào thầy và các bạn, em là </w:t>
+        <w:t>Dạ em cảm ơn anh Hôn cho phần mở đầu vừa rồi. Em chào thầy và các bạn!</w:t>
+      </w:r>
+    </w:p>
+    <w:p>
+      <w:r>
+        <w:rPr>
+          <w:rFonts w:ascii="Times New Roman" w:hAnsi="Times New Roman"/>
+        </w:rPr>
+        <w:t xml:space="preserve">Để tiếp nối lộ trình báo cáo của nhóm, em xin phép đi thẳng vào </w:t>
       </w:r>
       <w:r>
         <w:rPr>
           <w:rFonts w:ascii="Times New Roman" w:hAnsi="Times New Roman"/>
           <w:b/>
         </w:rPr>
-        <w:t>Đặng Chí Thanh</w:t>
-      </w:r>
-      <w:r>
-        <w:rPr>
-          <w:rFonts w:ascii="Times New Roman" w:hAnsi="Times New Roman"/>
-        </w:rPr>
-        <w:t>. Sau đây em xin phép đại diện nhóm bắt đầu với Phần 1: Giới thiệu bài toán và những thách thức kỹ thuật cốt lõi trong phát hiện gian lận tài chính.</w:t>
+        <w:t>Phần 01: Giới thiệu và phát biểu bài toán</w:t>
+      </w:r>
+      <w:r>
+        <w:rPr>
+          <w:rFonts w:ascii="Times New Roman" w:hAnsi="Times New Roman"/>
+        </w:rPr>
+        <w:t>.</w:t>
+      </w:r>
+    </w:p>
+    <w:p>
+      <w:r>
+        <w:rPr>
+          <w:rFonts w:ascii="Times New Roman" w:hAnsi="Times New Roman"/>
+        </w:rPr>
+        <w:t>Ở Phần 1 này, nhóm sẽ đi qua 3 nội dung chính như trên slide, gồm: bối cảnh công nghiệp của Mobile Money (thanh toán di động), các thách thức kỹ thuật cốt lõi, và mục tiêu nghiên cứu của nhóm.</w:t>
       </w:r>
     </w:p>
     <w:p>
@@ -5251,7 +5267,7 @@
         <w:rPr>
           <w:rFonts w:ascii="Times New Roman" w:hAnsi="Times New Roman"/>
         </w:rPr>
-        <w:t>Kính thưa Thầy và các bạn, hiện nay các giao dịch trên ví điện tử và Mobile Money đang tăng trưởng bùng nổ, kéo theo các thủ đoạn lừa đảo và tẩu tán tiền diễn ra chỉ trong vài giây. Do đó, hệ thống phòng thủ bắt buộc phải đưa ra quyết định cực nhanh theo thời gian thực, với độ trễ dưới 100 mili-giây trước khi tiền bị rút mất.</w:t>
+        <w:t>Về mặt thực tế, hiện nay các giao dịch ví điện tử Mobile Money diễn ra hàng triệu lượt mỗi ngày. Kẻ gian tẩu tán tiền chỉ trong vài giây, nên hệ thống phòng thủ bắt buộc phải đưa ra quyết định real-time với độ trễ dưới 100 mili-giây trước khi tiền bị rút mất.</w:t>
       </w:r>
     </w:p>
     <w:p>
@@ -5259,7 +5275,15 @@
         <w:rPr>
           <w:rFonts w:ascii="Times New Roman" w:hAnsi="Times New Roman"/>
         </w:rPr>
-        <w:t xml:space="preserve">Khi bắt tay vào bài toán, nhóm em phải đối mặt với </w:t>
+        <w:t>Thầy và các bạn có thể quan sát ở các khung bên phải màn hình là bảng ký hiệu toán học và các mục tiêu cụ thể mà nhóm hướng tới.</w:t>
+      </w:r>
+    </w:p>
+    <w:p>
+      <w:r>
+        <w:rPr>
+          <w:rFonts w:ascii="Times New Roman" w:hAnsi="Times New Roman"/>
+        </w:rPr>
+        <w:t xml:space="preserve">Còn trọng tâm khi tiếp cận bài toán, ở cột bên trái, em đối mặt với </w:t>
       </w:r>
       <w:r>
         <w:rPr>
@@ -5295,20 +5319,7 @@
         <w:rPr>
           <w:rFonts w:ascii="Times New Roman" w:hAnsi="Times New Roman"/>
         </w:rPr>
-        <w:t xml:space="preserve">: Gian lận chỉ chiếm tỷ lệ khoảng </w:t>
-      </w:r>
-      <w:r>
-        <w:rPr>
-          <w:rFonts w:ascii="Times New Roman" w:hAnsi="Times New Roman"/>
-          <w:b/>
-        </w:rPr>
-        <w:t>0.13%</w:t>
-      </w:r>
-      <w:r>
-        <w:rPr>
-          <w:rFonts w:ascii="Times New Roman" w:hAnsi="Times New Roman"/>
-        </w:rPr>
-        <w:t xml:space="preserve"> — tức là cứ 800 giao dịch bình thường thì mới có đúng 1 giao dịch lừa đảo. Nếu dùng thước đo Accuracy truyền thống, một bộ phân lớp ngây thơ lúc nào cũng đoán 'hợp lệ' thì đã đạt 99.87% độ chính xác, nhưng hoàn toàn vô dụng vì không bắt được tên trộm nào! Do đó, nhóm bắt buộc phải tối ưu hóa </w:t>
+        <w:t xml:space="preserve">: Gian lận chỉ chiếm khoảng `0.13%` — tức là cứ 800 giao dịch bình thường mới có đúng 1 ca gian lận. Với tỷ lệ lệch này, thước đo Accuracy bị vô hiệu hóa hoàn toàn, vì nếu một mô hình ngây thơ lúc nào cũng đoán "Hợp lệ" thì Accuracy đã đạt `99.87%` nhưng thực tế không bắt được tên trộm nào. Do đó, nhóm bắt buộc phải tối ưu </w:t>
       </w:r>
       <w:r>
         <w:rPr>
@@ -5344,7 +5355,7 @@
         <w:rPr>
           <w:rFonts w:ascii="Times New Roman" w:hAnsi="Times New Roman"/>
         </w:rPr>
-        <w:t>: Chi phí của việc bỏ sót một vụ gian lận (False Negative) là khách hàng mất tiền thật và ngân hàng mất uy tín. Trong khi cảnh báo nhầm (False Positive) thì chỉ cần yêu cầu người dùng xác thực lại một bước OTP.</w:t>
+        <w:t>: Bỏ sót 1 ca gian lận thì khách hàng mất tiền thật và ngân hàng mất uy tín. Trong khi cảnh báo nhầm thì mình chỉ cần gửi OTP yêu cầu người dùng xác thực lại. Vì vậy, chi phí phạt cho việc bỏ sót phải lớn hơn rất nhiều so với báo nhầm.</w:t>
       </w:r>
     </w:p>
     <w:p>
@@ -5361,21 +5372,13 @@
           <w:rFonts w:ascii="Times New Roman" w:hAnsi="Times New Roman"/>
           <w:b/>
         </w:rPr>
-        <w:t>Thứ ba là Hành vi phi tĩnh</w:t>
-      </w:r>
-      <w:r>
-        <w:rPr>
-          <w:rFonts w:ascii="Times New Roman" w:hAnsi="Times New Roman"/>
-        </w:rPr>
-        <w:t>: Kẻ gian liên tục biến đổi thủ đoạn luân chuyển tiền tinh vi để lách qua các tập luật tĩnh.</w:t>
-      </w:r>
-    </w:p>
-    <w:p>
-      <w:r>
-        <w:rPr>
-          <w:rFonts w:ascii="Times New Roman" w:hAnsi="Times New Roman"/>
-        </w:rPr>
-        <w:t>Vì vậy, mục tiêu của nhóm là xây dựng một pipeline chuẩn chỉ, kết hợp cả mô hình có giám sát lẫn mô hình không giám sát để tạo thành hệ thống phòng thủ đa tầng.</w:t>
+        <w:t>Thứ ba là tính phi tĩnh</w:t>
+      </w:r>
+      <w:r>
+        <w:rPr>
+          <w:rFonts w:ascii="Times New Roman" w:hAnsi="Times New Roman"/>
+        </w:rPr>
+        <w:t>: Kẻ gian liên tục biến đổi thủ đoạn luân chuyển tiền để lách qua các bộ lọc luật tĩnh.</w:t>
       </w:r>
     </w:p>
     <w:p>
@@ -5442,7 +5445,7 @@
         <w:rPr>
           <w:rFonts w:ascii="Times New Roman" w:hAnsi="Times New Roman"/>
         </w:rPr>
-        <w:t xml:space="preserve">Tập gốc ghi nhận hơn </w:t>
+        <w:t xml:space="preserve">Tập gốc khi em download trên Kaggle về ghi nhận hơn </w:t>
       </w:r>
       <w:r>
         <w:rPr>
@@ -5455,14 +5458,27 @@
         <w:rPr>
           <w:rFonts w:ascii="Times New Roman" w:hAnsi="Times New Roman"/>
         </w:rPr>
-        <w:t xml:space="preserve"> trong 30 ngày. Để tối ưu hóa tài nguyên tính toán nhưng không làm mất bản chất bài toán, nhóm thực hiện lấy mẫu phân tầng 200,000 sự kiện, và </w:t>
+        <w:t xml:space="preserve"> trong 30 ngày. Để tối ưu tài nguyên tính toán mà không làm lệch ranh giới bài toán, em thực hiện lấy mẫu phân tầng </w:t>
       </w:r>
       <w:r>
         <w:rPr>
           <w:rFonts w:ascii="Times New Roman" w:hAnsi="Times New Roman"/>
           <w:b/>
         </w:rPr>
-        <w:t>giữ nguyên vẹn 100% toàn bộ 8,213 ca gian lận gốc</w:t>
+        <w:t>200,000 sự kiện</w:t>
+      </w:r>
+      <w:r>
+        <w:rPr>
+          <w:rFonts w:ascii="Times New Roman" w:hAnsi="Times New Roman"/>
+        </w:rPr>
+        <w:t xml:space="preserve">, nhưng </w:t>
+      </w:r>
+      <w:r>
+        <w:rPr>
+          <w:rFonts w:ascii="Times New Roman" w:hAnsi="Times New Roman"/>
+          <w:b/>
+        </w:rPr>
+        <w:t>bảo toàn nguyên vẹn 100% toàn bộ 8,213 ca gian lận gốc</w:t>
       </w:r>
       <w:r>
         <w:rPr>
@@ -5476,7 +5492,7 @@
         <w:rPr>
           <w:rFonts w:ascii="Times New Roman" w:hAnsi="Times New Roman"/>
         </w:rPr>
-        <w:t>Bảng dữ liệu ở giữa slide thể hiện các trường thuộc tính như bước thời gian, loại giao dịch, số tiền, và số dư trước sau.</w:t>
+        <w:t>Thầy và các bạn có thể nhìn vào bảng ở giữa màn hình: dữ liệu ghi nhận bước thời gian theo giờ, loại giao dịch, số tiền, cùng số dư trước và sau của cả tài khoản chuyển lẫn tài khoản nhận.</w:t>
       </w:r>
     </w:p>
     <w:p>
@@ -5484,33 +5500,68 @@
         <w:rPr>
           <w:rFonts w:ascii="Times New Roman" w:hAnsi="Times New Roman"/>
         </w:rPr>
-        <w:t xml:space="preserve">Tuy nhiên, </w:t>
+        <w:t>Đặc biệt, qua phân tích phân bố ban đầu, em phát hiện ra một quy luật rất đắt giá ở khung màu xanh bên dưới:</w:t>
+      </w:r>
+    </w:p>
+    <w:p>
+      <w:r>
+        <w:rPr>
+          <w:rFonts w:ascii="Times New Roman" w:hAnsi="Times New Roman"/>
+        </w:rPr>
       </w:r>
       <w:r>
         <w:rPr>
           <w:rFonts w:ascii="Times New Roman" w:hAnsi="Times New Roman"/>
           <w:b/>
         </w:rPr>
-        <w:t>insight mang tính quyết định nhất</w:t>
-      </w:r>
-      <w:r>
-        <w:rPr>
-          <w:rFonts w:ascii="Times New Roman" w:hAnsi="Times New Roman"/>
-        </w:rPr>
-        <w:t xml:space="preserve"> mà em muốn nhấn mạnh nằm ở khung màu xanh dưới cùng: </w:t>
+        <w:t>100% tất cả các ca gian lận CHỈ xảy ra ở đúng 2 loại giao dịch: TRANSFER (chuyển khoản) và CASH_OUT (rút tiền mặt)</w:t>
+      </w:r>
+      <w:r>
+        <w:rPr>
+          <w:rFonts w:ascii="Times New Roman" w:hAnsi="Times New Roman"/>
+        </w:rPr>
+        <w:t>. Các loại khác an toàn tuyệt đối. Nhờ phát hiện này, bước tiền xử lý lọc chỉ giữ lại 2 loại trên đã giúp nhóm triệt tiêu ngay được `70%` dữ liệu nhiễu vô ích cho toàn bộ pipeline phía sau.</w:t>
+      </w:r>
+    </w:p>
+    <w:p>
+      <w:pPr>
+        <w:ind w:left="432" w:right="432"/>
+      </w:pPr>
+      <w:r>
+        <w:rPr>
+          <w:rFonts w:ascii="Times New Roman" w:hAnsi="Times New Roman"/>
+          <w:i/>
+          <w:color w:val="444444"/>
+        </w:rPr>
       </w:r>
       <w:r>
         <w:rPr>
           <w:rFonts w:ascii="Times New Roman" w:hAnsi="Times New Roman"/>
           <w:b/>
-        </w:rPr>
-        <w:t>100% tất cả các ca gian lận chỉ xuất hiện ở đúng 2 loại giao dịch là TRANSFER (Chuyển khoản) và CASH_OUT (Rút tiền mặt)</w:t>
-      </w:r>
-      <w:r>
-        <w:rPr>
-          <w:rFonts w:ascii="Times New Roman" w:hAnsi="Times New Roman"/>
-        </w:rPr>
-        <w:t>. Các loại còn lại như PAYMENT, CASH_IN hay DEBIT an toàn tuyệt đối (0% gian lận). Nhờ phát hiện này, ngay tại bước tiền xử lý, việc lọc dữ liệu chỉ giữ lại 2 loại giao dịch đã giúp nhóm triệt tiêu ngay được hơn 70% dữ liệu nhiễu!</w:t>
+          <w:i/>
+          <w:color w:val="444444"/>
+        </w:rPr>
+        <w:t>Đúc kết Phần 01:</w:t>
+      </w:r>
+      <w:r>
+        <w:rPr>
+          <w:rFonts w:ascii="Times New Roman" w:hAnsi="Times New Roman"/>
+          <w:i/>
+          <w:color w:val="444444"/>
+        </w:rPr>
+      </w:r>
+    </w:p>
+    <w:p>
+      <w:pPr>
+        <w:ind w:left="432" w:right="432"/>
+      </w:pPr>
+      <w:r>
+        <w:rPr>
+          <w:rFonts w:ascii="Times New Roman" w:hAnsi="Times New Roman"/>
+          <w:i/>
+          <w:color w:val="444444"/>
+        </w:rPr>
+        <w:t>Tóm lại, Phần 1 đã làm rõ bản chất mất cân bằng cực đoan 0.13% và insight khoanh vùng 2 loại giao dịch giúp loại bỏ 70% dữ liệu nhiễu, tạo tiền đề dữ liệu sạch cho Phần 2.</w:t>
       </w:r>
     </w:p>
     <w:p>
@@ -5556,7 +5607,20 @@
         <w:rPr>
           <w:rFonts w:ascii="Times New Roman" w:hAnsi="Times New Roman"/>
         </w:rPr>
-        <w:t>Tiếp theo, em xin đi sâu vào Phần 2: Phân tích khám phá dữ liệu, 3 dấu vết hành vi của kẻ gian và kỹ thuật trích xuất 14 đặc trưng miền kế toán.</w:t>
+        <w:t xml:space="preserve">Sau khi đã khoanh vùng được tập dữ liệu sạch, chúng ta đến với </w:t>
+      </w:r>
+      <w:r>
+        <w:rPr>
+          <w:rFonts w:ascii="Times New Roman" w:hAnsi="Times New Roman"/>
+          <w:b/>
+        </w:rPr>
+        <w:t>Phần 02: Phân tích khám phá dữ liệu và kỹ thuật đặc trưng</w:t>
+      </w:r>
+      <w:r>
+        <w:rPr>
+          <w:rFonts w:ascii="Times New Roman" w:hAnsi="Times New Roman"/>
+        </w:rPr>
+        <w:t>.</w:t>
       </w:r>
     </w:p>
     <w:p>
@@ -5589,7 +5653,7 @@
           <w:rFonts w:ascii="Times New Roman" w:hAnsi="Times New Roman"/>
           <w:i/>
         </w:rPr>
-        <w:t>(Thời lượng chuẩn hóa: **~75s – 80s** [Meeting thực tế: ~110s] | Người nói: **Đặng Chí Thanh**)</w:t>
+        <w:t>(Thời lượng chuẩn hóa: **~55s – 60s** [Meeting thực tế: ~110s] | Người nói: **Đặng Chí Thanh**)</w:t>
       </w:r>
       <w:r>
         <w:rPr>
@@ -5602,7 +5666,7 @@
         <w:rPr>
           <w:rFonts w:ascii="Times New Roman" w:hAnsi="Times New Roman"/>
         </w:rPr>
-        <w:t xml:space="preserve">Khi thực hiện EDA trên notebook `01_eda.ipynb`, nhóm đã đúc kết được </w:t>
+        <w:t xml:space="preserve">Khi thực hiện EDA trên notebook `01_eda.ipynb`, em đúc kết được </w:t>
       </w:r>
       <w:r>
         <w:rPr>
@@ -5615,12 +5679,12 @@
         <w:rPr>
           <w:rFonts w:ascii="Times New Roman" w:hAnsi="Times New Roman"/>
         </w:rPr>
-        <w:t>:</w:t>
+        <w:t>, tương ứng với 3 cột trên màn hình:</w:t>
       </w:r>
     </w:p>
     <w:p>
       <w:pPr>
-        <w:pStyle w:val="ListNumber"/>
+        <w:pStyle w:val="ListBullet"/>
       </w:pPr>
       <w:r>
         <w:rPr>
@@ -5632,18 +5696,18 @@
           <w:rFonts w:ascii="Times New Roman" w:hAnsi="Times New Roman"/>
           <w:b/>
         </w:rPr>
-        <w:t>Dấu vết 1 — Khoanh vùng loại giao dịch (100%)</w:t>
-      </w:r>
-      <w:r>
-        <w:rPr>
-          <w:rFonts w:ascii="Times New Roman" w:hAnsi="Times New Roman"/>
-        </w:rPr>
-        <w:t>: Toàn bộ gian lận tập trung khu biệt. Kẻ gian khi chiếm đoạt tài khoản sẽ thực hiện lệnh `TRANSFER` sang tài khoản trung gian, rồi ngay lập tức rút tiền mặt bằng lệnh `CASH_OUT` để tẩu tán và cắt đứt hoàn toàn dấu vết dòng tiền.</w:t>
+        <w:t>Cột đầu tiên — Khoanh vùng loại giao dịch</w:t>
+      </w:r>
+      <w:r>
+        <w:rPr>
+          <w:rFonts w:ascii="Times New Roman" w:hAnsi="Times New Roman"/>
+        </w:rPr>
+        <w:t>: Kẻ gian chiếm được tài khoản sẽ dùng lệnh `TRANSFER` chuyển tiền sang tài khoản trung gian, rồi lập tức rút tiền mặt `CASH_OUT` ngay để cắt đứt dấu vết dòng tiền.</w:t>
       </w:r>
     </w:p>
     <w:p>
       <w:pPr>
-        <w:pStyle w:val="ListNumber"/>
+        <w:pStyle w:val="ListBullet"/>
       </w:pPr>
       <w:r>
         <w:rPr>
@@ -5655,7 +5719,7 @@
           <w:rFonts w:ascii="Times New Roman" w:hAnsi="Times New Roman"/>
           <w:b/>
         </w:rPr>
-        <w:t>Dấu vết 2 — Hành vi vét sạch tài khoản (97.56%)</w:t>
+        <w:t>Cột thứ hai — Hành vi vét sạch tài khoản</w:t>
       </w:r>
       <w:r>
         <w:rPr>
@@ -5674,12 +5738,12 @@
         <w:rPr>
           <w:rFonts w:ascii="Times New Roman" w:hAnsi="Times New Roman"/>
         </w:rPr>
-        <w:t xml:space="preserve"> số vụ gian lận, số dư của nạn nhân sau giao dịch bị đưa về đúng bằng 0 (`newbalanceOrig == 0`). Kẻ gian luôn có tâm lý tối đa hóa số tiền chiếm đoạt trong một lần duy nhất trước khi nạn nhân kịp phát hiện và khóa thẻ.</w:t>
+        <w:t xml:space="preserve"> số vụ gian lận, số dư của nạn nhân sau giao dịch bị rút cạn sạch về đúng bằng 0 (`newbalanceOrig == 0`) trong 1 lần duy nhất trước khi nạn nhân kịp phát hiện và khóa thẻ.</w:t>
       </w:r>
     </w:p>
     <w:p>
       <w:pPr>
-        <w:pStyle w:val="ListNumber"/>
+        <w:pStyle w:val="ListBullet"/>
       </w:pPr>
       <w:r>
         <w:rPr>
@@ -5691,13 +5755,13 @@
           <w:rFonts w:ascii="Times New Roman" w:hAnsi="Times New Roman"/>
           <w:b/>
         </w:rPr>
-        <w:t>Dấu vết 3 — Bất thường biến động số dư ở tài khoản nhận</w:t>
-      </w:r>
-      <w:r>
-        <w:rPr>
-          <w:rFonts w:ascii="Times New Roman" w:hAnsi="Times New Roman"/>
-        </w:rPr>
-        <w:t>: Tại tài khoản đích, phần lớn các vụ gian lận thì số dư thực tế hầu như không tăng tương ứng theo sổ sách (`newbalanceDest ≈ 0`). Điều này phản ánh rõ nét việc kẻ gian sử dụng các tài khoản rác (mule account) hoặc luân chuyển rửa tiền đa tầng liên tục.</w:t>
+        <w:t>Cột thứ ba — Sai lệch sổ cái đích</w:t>
+      </w:r>
+      <w:r>
+        <w:rPr>
+          <w:rFonts w:ascii="Times New Roman" w:hAnsi="Times New Roman"/>
+        </w:rPr>
+        <w:t>: Tiền chuyển đi nhưng số dư tài khoản nhận thực tế không tăng tương ứng (`newbalanceDest ≈ 0`), vạch trần việc dùng các tài khoản rác (mule account) để tẩu tán tiền.</w:t>
       </w:r>
     </w:p>
     <w:p>
@@ -5705,7 +5769,7 @@
         <w:rPr>
           <w:rFonts w:ascii="Times New Roman" w:hAnsi="Times New Roman"/>
         </w:rPr>
-        <w:t>Nếu chỉ đưa số tiền hay số dư thô vào mô hình thì rất lãng phí các tín hiệu cốt lõi này. Vì vậy, nhóm đã tiến hành toán học hóa thành các đặc trưng miền kế toán ở slide tiếp theo.</w:t>
+        <w:t>Nếu chỉ đưa số tiền hay số dư thô vào mô hình thì rất lãng phí. Vì vậy, em đã tiến hành chuyển đổi các quy luật này thành các đặc trưng kế toán.</w:t>
       </w:r>
     </w:p>
     <w:p>
@@ -5738,7 +5802,7 @@
           <w:rFonts w:ascii="Times New Roman" w:hAnsi="Times New Roman"/>
           <w:i/>
         </w:rPr>
-        <w:t>(Thời lượng chuẩn hóa: **~70s – 75s** [Meeting thực tế: ~127s] | Người nói: **Đặng Chí Thanh**)</w:t>
+        <w:t>(Thời lượng chuẩn hóa: **~65s – 70s** [Meeting thực tế: ~127s] | Người nói: **Đặng Chí Thanh**)</w:t>
       </w:r>
       <w:r>
         <w:rPr>
@@ -5751,98 +5815,123 @@
         <w:rPr>
           <w:rFonts w:ascii="Times New Roman" w:hAnsi="Times New Roman"/>
         </w:rPr>
-        <w:t xml:space="preserve">Ở slide này, nhóm thể hiện tổng cộng </w:t>
+        <w:t xml:space="preserve">Từ 3 dấu vết trên, em hiện thực trong code tổng cộng </w:t>
       </w:r>
       <w:r>
         <w:rPr>
           <w:rFonts w:ascii="Times New Roman" w:hAnsi="Times New Roman"/>
           <w:b/>
         </w:rPr>
-        <w:t>14 đặc trưng miền</w:t>
-      </w:r>
-      <w:r>
-        <w:rPr>
-          <w:rFonts w:ascii="Times New Roman" w:hAnsi="Times New Roman"/>
-        </w:rPr>
-        <w:t xml:space="preserve"> đã hiện thực trong code. Em xin tóm lược nguyên lý của 3 nhóm đặc trưng quan trọng nhất:</w:t>
+        <w:t>14 đặc trưng miền chuyên sâu</w:t>
+      </w:r>
+      <w:r>
+        <w:rPr>
+          <w:rFonts w:ascii="Times New Roman" w:hAnsi="Times New Roman"/>
+        </w:rPr>
+        <w:t xml:space="preserve"> ở 3 khung công thức bên trái: gồm sai lệch số dư nguồn (`errorBalanceOrig`), sai lệch số dư đích (`errorBalanceDest`), cùng cờ rút cạn (`drain</w:t>
+      </w:r>
+      <w:r>
+        <w:rPr>
+          <w:rFonts w:ascii="Times New Roman" w:hAnsi="Times New Roman"/>
+          <w:i/>
+        </w:rPr>
+        <w:t>flag`) kết hợp giờ đêm (`is</w:t>
+      </w:r>
+      <w:r>
+        <w:rPr>
+          <w:rFonts w:ascii="Times New Roman" w:hAnsi="Times New Roman"/>
+        </w:rPr>
+        <w:t>overnight`).</w:t>
+      </w:r>
+    </w:p>
+    <w:p>
+      <w:r>
+        <w:rPr>
+          <w:rFonts w:ascii="Times New Roman" w:hAnsi="Times New Roman"/>
+        </w:rPr>
+        <w:t xml:space="preserve">Điều chứng minh rõ nhất hiệu quả của việc thiết kế đặc trưng nằm ở </w:t>
+      </w:r>
+      <w:r>
+        <w:rPr>
+          <w:rFonts w:ascii="Times New Roman" w:hAnsi="Times New Roman"/>
+          <w:b/>
+        </w:rPr>
+        <w:t>khung Feature Importance góc dưới bên phải</w:t>
+      </w:r>
+      <w:r>
+        <w:rPr>
+          <w:rFonts w:ascii="Times New Roman" w:hAnsi="Times New Roman"/>
+        </w:rPr>
+        <w:t>:</w:t>
+      </w:r>
+    </w:p>
+    <w:p>
+      <w:r>
+        <w:rPr>
+          <w:rFonts w:ascii="Times New Roman" w:hAnsi="Times New Roman"/>
+        </w:rPr>
+        <w:t xml:space="preserve">Khi đánh giá mô hình, </w:t>
+      </w:r>
+      <w:r>
+        <w:rPr>
+          <w:rFonts w:ascii="Times New Roman" w:hAnsi="Times New Roman"/>
+          <w:b/>
+        </w:rPr>
+        <w:t>chỉ riêng 2 biến `errorBalanceOrig` (49.9%) và `newbalanceOrig` (47.2%) đã chiếm tới hơn `97.1%` tổng sức mạnh phân loại!</w:t>
+      </w:r>
+      <w:r>
+        <w:rPr>
+          <w:rFonts w:ascii="Times New Roman" w:hAnsi="Times New Roman"/>
+        </w:rPr>
+      </w:r>
+    </w:p>
+    <w:p>
+      <w:r>
+        <w:rPr>
+          <w:rFonts w:ascii="Times New Roman" w:hAnsi="Times New Roman"/>
+        </w:rPr>
+        <w:t>Điều này chứng minh kỹ thuật đặc trưng miền đã giải quyết bài toán tận gốc, biến ranh giới phân lớp phức tạp thành tuyến tính rõ rệt. Và một nguyên tắc em luôn tuân thủ nghiêm ngặt là chống rò rỉ dữ liệu: toàn bộ các bước scale chuẩn hóa chỉ được fit trên tập Train.</w:t>
       </w:r>
     </w:p>
     <w:p>
       <w:pPr>
-        <w:pStyle w:val="ListBullet"/>
+        <w:ind w:left="432" w:right="432"/>
       </w:pPr>
       <w:r>
         <w:rPr>
           <w:rFonts w:ascii="Times New Roman" w:hAnsi="Times New Roman"/>
+          <w:i/>
+          <w:color w:val="444444"/>
         </w:rPr>
       </w:r>
       <w:r>
         <w:rPr>
           <w:rFonts w:ascii="Times New Roman" w:hAnsi="Times New Roman"/>
           <w:b/>
-        </w:rPr>
-        <w:t>Nhóm 1: Sai lệch số dư nguồn (`errorBalanceOrig`)</w:t>
-      </w:r>
-      <w:r>
-        <w:rPr>
-          <w:rFonts w:ascii="Times New Roman" w:hAnsi="Times New Roman"/>
-        </w:rPr>
-        <w:t>:</w:t>
-      </w:r>
-    </w:p>
-    <w:p>
-      <w:r>
-        <w:rPr>
-          <w:rFonts w:ascii="Times New Roman" w:hAnsi="Times New Roman"/>
-        </w:rPr>
-        <w:t>$$</w:t>
-      </w:r>
-    </w:p>
-    <w:p>
-      <w:r>
-        <w:rPr>
-          <w:rFonts w:ascii="Times New Roman" w:hAnsi="Times New Roman"/>
-        </w:rPr>
-        <w:t>\text{errorBalanceOrig} = \text{oldbalanceOrg} - \text{amount} - \text{newbalanceOrig}</w:t>
-      </w:r>
-    </w:p>
-    <w:p>
-      <w:r>
-        <w:rPr>
-          <w:rFonts w:ascii="Times New Roman" w:hAnsi="Times New Roman"/>
-        </w:rPr>
-        <w:t>$$</w:t>
-      </w:r>
-    </w:p>
-    <w:p>
-      <w:r>
-        <w:rPr>
-          <w:rFonts w:ascii="Times New Roman" w:hAnsi="Times New Roman"/>
-        </w:rPr>
-        <w:t>Với giao dịch bình thường, phép tính này phải bằng 0. Nhưng với giao dịch gian lận, con số này bị lệch rất lớn vì tài khoản bị trừ tiền bất thường.</w:t>
+          <w:i/>
+          <w:color w:val="444444"/>
+        </w:rPr>
+        <w:t>Đúc kết Phần 02 (Nhánh EDA &amp; Features):</w:t>
+      </w:r>
+      <w:r>
+        <w:rPr>
+          <w:rFonts w:ascii="Times New Roman" w:hAnsi="Times New Roman"/>
+          <w:i/>
+          <w:color w:val="444444"/>
+        </w:rPr>
       </w:r>
     </w:p>
     <w:p>
       <w:pPr>
-        <w:pStyle w:val="ListBullet"/>
+        <w:ind w:left="432" w:right="432"/>
       </w:pPr>
       <w:r>
         <w:rPr>
           <w:rFonts w:ascii="Times New Roman" w:hAnsi="Times New Roman"/>
-        </w:rPr>
-      </w:r>
-      <w:r>
-        <w:rPr>
-          <w:rFonts w:ascii="Times New Roman" w:hAnsi="Times New Roman"/>
-          <w:b/>
-        </w:rPr>
-        <w:t>Nhóm 2: Sai lệch số dư đích (`errorBalanceDest`)</w:t>
-      </w:r>
-      <w:r>
-        <w:rPr>
-          <w:rFonts w:ascii="Times New Roman" w:hAnsi="Times New Roman"/>
-        </w:rPr>
-        <w:t>:</w:t>
+          <w:i/>
+          <w:color w:val="444444"/>
+        </w:rPr>
+        <w:t>Tóm lại, nhóm đã chuyển hóa thành công 3 dấu vết hành vi thành các đặc trưng kế toán quyết định 97.1% sức mạnh phân loại và đảm bảo tuyệt đối nguyên tắc Leak-Free.</w:t>
       </w:r>
     </w:p>
     <w:p>
@@ -5850,7 +5939,7 @@
         <w:rPr>
           <w:rFonts w:ascii="Times New Roman" w:hAnsi="Times New Roman"/>
         </w:rPr>
-        <w:t>$$</w:t>
+        <w:t>Khi đã có không gian đặc trưng chất lượng cao, bài toán tiếp theo là xử lý mất cân bằng 0.13% bằng kỹ thuật sinh mẫu thích ứng.</w:t>
       </w:r>
     </w:p>
     <w:p>
@@ -5858,96 +5947,20 @@
         <w:rPr>
           <w:rFonts w:ascii="Times New Roman" w:hAnsi="Times New Roman"/>
         </w:rPr>
-        <w:t>\text{errorBalanceDest} = \text{oldbalanceDest} + \text{amount} - \text{newbalanceDest}</w:t>
-      </w:r>
-    </w:p>
-    <w:p>
-      <w:r>
-        <w:rPr>
-          <w:rFonts w:ascii="Times New Roman" w:hAnsi="Times New Roman"/>
-        </w:rPr>
-        <w:t>$$</w:t>
-      </w:r>
-    </w:p>
-    <w:p>
-      <w:r>
-        <w:rPr>
-          <w:rFonts w:ascii="Times New Roman" w:hAnsi="Times New Roman"/>
-        </w:rPr>
-        <w:t>Ghi nhận bất thường khi tiền chuyển đi nhưng tài khoản nhận lại không ghi nhận tăng số dư.</w:t>
-      </w:r>
-    </w:p>
-    <w:p>
-      <w:pPr>
-        <w:pStyle w:val="ListBullet"/>
-      </w:pPr>
-      <w:r>
-        <w:rPr>
-          <w:rFonts w:ascii="Times New Roman" w:hAnsi="Times New Roman"/>
-        </w:rPr>
+        <w:t xml:space="preserve">Sau đây, em xin chuyển lại phần trình bày cho bạn </w:t>
       </w:r>
       <w:r>
         <w:rPr>
           <w:rFonts w:ascii="Times New Roman" w:hAnsi="Times New Roman"/>
           <w:b/>
         </w:rPr>
-        <w:t>Nhóm 3: Cờ rút cạn (`drain_flag`) và Chu kỳ giờ đêm (`is_overnight`)</w:t>
-      </w:r>
-      <w:r>
-        <w:rPr>
-          <w:rFonts w:ascii="Times New Roman" w:hAnsi="Times New Roman"/>
-        </w:rPr>
-        <w:t>:</w:t>
-      </w:r>
-    </w:p>
-    <w:p>
-      <w:r>
-        <w:rPr>
-          <w:rFonts w:ascii="Times New Roman" w:hAnsi="Times New Roman"/>
-        </w:rPr>
-        <w:t>Bắt trọn hành vi vét sạch ví về 0 và các đợt tấn công từ 0 giờ đến 5 giờ sáng.</w:t>
-      </w:r>
-    </w:p>
-    <w:p>
-      <w:r>
-        <w:rPr>
-          <w:rFonts w:ascii="Times New Roman" w:hAnsi="Times New Roman"/>
-        </w:rPr>
-        <w:t xml:space="preserve">Điểm mấu chốt là: sau khi đánh giá độ quan trọng, </w:t>
-      </w:r>
-      <w:r>
-        <w:rPr>
-          <w:rFonts w:ascii="Times New Roman" w:hAnsi="Times New Roman"/>
-          <w:b/>
-        </w:rPr>
-        <w:t>chỉ riêng 2 đặc trưng `errorBalanceOrig` và `newbalanceOrig` đã chiếm tới hơn 97.1% tổng sức mạnh phân loại</w:t>
-      </w:r>
-      <w:r>
-        <w:rPr>
-          <w:rFonts w:ascii="Times New Roman" w:hAnsi="Times New Roman"/>
-        </w:rPr>
-        <w:t xml:space="preserve"> của mô hình! Điều này chứng minh rằng kỹ thuật đặc trưng miền đã giải quyết bài toán tận gốc rễ, biến bài toán phân lớp phi tuyến phức tạp thành ranh giới phân tách tuyến tính cực kỳ rõ rệt.</w:t>
-      </w:r>
-    </w:p>
-    <w:p>
-      <w:r>
-        <w:rPr>
-          <w:rFonts w:ascii="Times New Roman" w:hAnsi="Times New Roman"/>
-        </w:rPr>
-        <w:t xml:space="preserve">Sau đây, em xin mời bạn </w:t>
-      </w:r>
-      <w:r>
-        <w:rPr>
-          <w:rFonts w:ascii="Times New Roman" w:hAnsi="Times New Roman"/>
-          <w:b/>
-        </w:rPr>
         <w:t>Hoàng Cao Sơn</w:t>
       </w:r>
       <w:r>
         <w:rPr>
           <w:rFonts w:ascii="Times New Roman" w:hAnsi="Times New Roman"/>
         </w:rPr>
-        <w:t xml:space="preserve"> trình bày tiếp về phương pháp xử lý mất cân bằng và mô hình Random Forest ạ.</w:t>
+        <w:t xml:space="preserve"> tiếp tục với nội dung SMOTE và ADASYN ở Slide 9 ạ.</w:t>
       </w:r>
     </w:p>
     <w:p>

</xml_diff>

<commit_message>
docs(scripts): add 15-minute target comparison table to presentation script
</commit_message>
<xml_diff>
--- a/draft/fraud-detection/slide/scripts/SCRIPT_THUYET_TRINH_TOAN_TEAM_CS106.docx
+++ b/draft/fraud-detection/slide/scripts/SCRIPT_THUYET_TRINH_TOAN_TEAM_CS106.docx
@@ -4573,6 +4573,1586 @@
                 <w:sz w:val="20"/>
               </w:rPr>
               <w:t>**Đạt tiêu chuẩn vàng cho buổi bảo vệ đồ án chuyên sâu môn Trí tuệ Nhân tạo tại UIT!**</w:t>
+            </w:r>
+          </w:p>
+        </w:tc>
+      </w:tr>
+    </w:tbl>
+    <w:p/>
+    <w:p>
+      <w:pPr>
+        <w:spacing w:before="80" w:after="80"/>
+      </w:pPr>
+    </w:p>
+    <w:p>
+      <w:pPr>
+        <w:pStyle w:val="Heading1"/>
+      </w:pPr>
+      <w:r>
+        <w:rPr>
+          <w:rFonts w:ascii="Times New Roman" w:hAnsi="Times New Roman"/>
+          <w:b/>
+          <w:color w:val="1F497D"/>
+          <w:sz w:val="28"/>
+        </w:rPr>
+        <w:t>⏱️ BẢNG ĐỐI CHIẾU THỜI GIAN THEO MỤC TIÊU 15 PHÚT (900 GIÂY)</w:t>
+      </w:r>
+    </w:p>
+    <w:p>
+      <w:pPr>
+        <w:ind w:left="432" w:right="432"/>
+      </w:pPr>
+      <w:r>
+        <w:rPr>
+          <w:rFonts w:ascii="Times New Roman" w:hAnsi="Times New Roman"/>
+          <w:i/>
+          <w:color w:val="444444"/>
+        </w:rPr>
+        <w:t xml:space="preserve">⚠️ </w:t>
+      </w:r>
+      <w:r>
+        <w:rPr>
+          <w:rFonts w:ascii="Times New Roman" w:hAnsi="Times New Roman"/>
+          <w:b/>
+          <w:i/>
+          <w:color w:val="444444"/>
+        </w:rPr>
+        <w:t>Định hướng chiến lược tối ưu cho buổi bảo vệ 15 phút (theo khung giờ chuẩn môn học CS106):</w:t>
+      </w:r>
+      <w:r>
+        <w:rPr>
+          <w:rFonts w:ascii="Times New Roman" w:hAnsi="Times New Roman"/>
+          <w:i/>
+          <w:color w:val="444444"/>
+        </w:rPr>
+      </w:r>
+    </w:p>
+    <w:p>
+      <w:pPr>
+        <w:ind w:left="432" w:right="432"/>
+      </w:pPr>
+      <w:r>
+        <w:rPr>
+          <w:rFonts w:ascii="Times New Roman" w:hAnsi="Times New Roman"/>
+          <w:i/>
+          <w:color w:val="444444"/>
+        </w:rPr>
+        <w:t xml:space="preserve">- </w:t>
+      </w:r>
+      <w:r>
+        <w:rPr>
+          <w:rFonts w:ascii="Times New Roman" w:hAnsi="Times New Roman"/>
+          <w:b/>
+          <w:i/>
+          <w:color w:val="444444"/>
+        </w:rPr>
+        <w:t>Bỏ qua Slide 21:</w:t>
+      </w:r>
+      <w:r>
+        <w:rPr>
+          <w:rFonts w:ascii="Times New Roman" w:hAnsi="Times New Roman"/>
+          <w:i/>
+          <w:color w:val="444444"/>
+        </w:rPr>
+        <w:t xml:space="preserve"> Bạn Phạm Thành Trung sau khi thao tác Live Demo tại Slide 20 sẽ trực tiếp tổng kết 4 đóng góp, cảm ơn Thầy/Cô và mở phiên hỏi đáp Q&amp;A.</w:t>
+      </w:r>
+    </w:p>
+    <w:p>
+      <w:pPr>
+        <w:ind w:left="432" w:right="432"/>
+      </w:pPr>
+      <w:r>
+        <w:rPr>
+          <w:rFonts w:ascii="Times New Roman" w:hAnsi="Times New Roman"/>
+          <w:i/>
+          <w:color w:val="444444"/>
+        </w:rPr>
+        <w:t xml:space="preserve">- </w:t>
+      </w:r>
+      <w:r>
+        <w:rPr>
+          <w:rFonts w:ascii="Times New Roman" w:hAnsi="Times New Roman"/>
+          <w:b/>
+          <w:i/>
+          <w:color w:val="444444"/>
+        </w:rPr>
+        <w:t>Slide 20 do một mình Trung phụ trách:</w:t>
+      </w:r>
+      <w:r>
+        <w:rPr>
+          <w:rFonts w:ascii="Times New Roman" w:hAnsi="Times New Roman"/>
+          <w:i/>
+          <w:color w:val="444444"/>
+        </w:rPr>
+        <w:t xml:space="preserve"> Anh Vũ Văn Duy không nói trên slide, dành toàn bộ thời lượng làm "chủ lực" trả lời các câu hỏi phản biện chuyên sâu về Báo cáo khoa học Word 32 trang và phương pháp luận học thuật.</w:t>
+      </w:r>
+    </w:p>
+    <w:tbl>
+      <w:tblPr>
+        <w:tblStyle w:val="TableGrid"/>
+        <w:tblW w:type="auto" w:w="0"/>
+        <w:tblLook w:firstColumn="1" w:firstRow="1" w:lastColumn="0" w:lastRow="0" w:noHBand="0" w:noVBand="1" w:val="04A0"/>
+      </w:tblPr>
+      <w:tblGrid>
+        <w:gridCol w:w="1104"/>
+        <w:gridCol w:w="1104"/>
+        <w:gridCol w:w="1104"/>
+        <w:gridCol w:w="1104"/>
+        <w:gridCol w:w="1104"/>
+        <w:gridCol w:w="1104"/>
+        <w:gridCol w:w="1104"/>
+        <w:gridCol w:w="1104"/>
+        <w:gridCol w:w="1104"/>
+      </w:tblGrid>
+      <w:tr>
+        <w:tc>
+          <w:tcPr>
+            <w:tcW w:type="dxa" w:w="1104"/>
+            <w:shd w:fill="1F497D"/>
+          </w:tcPr>
+          <w:p>
+            <w:pPr>
+              <w:jc w:val="center"/>
+            </w:pPr>
+            <w:r>
+              <w:rPr>
+                <w:rFonts w:ascii="Times New Roman" w:hAnsi="Times New Roman"/>
+                <w:b/>
+                <w:color w:val="FFFFFF"/>
+              </w:rPr>
+              <w:t>STT</w:t>
+            </w:r>
+          </w:p>
+        </w:tc>
+        <w:tc>
+          <w:tcPr>
+            <w:tcW w:type="dxa" w:w="1104"/>
+            <w:shd w:fill="1F497D"/>
+          </w:tcPr>
+          <w:p>
+            <w:pPr>
+              <w:jc w:val="center"/>
+            </w:pPr>
+            <w:r>
+              <w:rPr>
+                <w:rFonts w:ascii="Times New Roman" w:hAnsi="Times New Roman"/>
+                <w:b/>
+                <w:color w:val="FFFFFF"/>
+              </w:rPr>
+              <w:t>Thành viên</w:t>
+            </w:r>
+          </w:p>
+        </w:tc>
+        <w:tc>
+          <w:tcPr>
+            <w:tcW w:type="dxa" w:w="1104"/>
+            <w:shd w:fill="1F497D"/>
+          </w:tcPr>
+          <w:p>
+            <w:pPr>
+              <w:jc w:val="center"/>
+            </w:pPr>
+            <w:r>
+              <w:rPr>
+                <w:rFonts w:ascii="Times New Roman" w:hAnsi="Times New Roman"/>
+                <w:b/>
+                <w:color w:val="FFFFFF"/>
+              </w:rPr>
+              <w:t>Slide phụ trách</w:t>
+            </w:r>
+          </w:p>
+        </w:tc>
+        <w:tc>
+          <w:tcPr>
+            <w:tcW w:type="dxa" w:w="1104"/>
+            <w:shd w:fill="1F497D"/>
+          </w:tcPr>
+          <w:p>
+            <w:pPr>
+              <w:jc w:val="center"/>
+            </w:pPr>
+            <w:r>
+              <w:rPr>
+                <w:rFonts w:ascii="Times New Roman" w:hAnsi="Times New Roman"/>
+                <w:b/>
+                <w:color w:val="FFFFFF"/>
+              </w:rPr>
+              <w:t>Nội dung chính phụ trách</w:t>
+            </w:r>
+          </w:p>
+        </w:tc>
+        <w:tc>
+          <w:tcPr>
+            <w:tcW w:type="dxa" w:w="1104"/>
+            <w:shd w:fill="1F497D"/>
+          </w:tcPr>
+          <w:p>
+            <w:pPr>
+              <w:jc w:val="center"/>
+            </w:pPr>
+            <w:r>
+              <w:rPr>
+                <w:rFonts w:ascii="Times New Roman" w:hAnsi="Times New Roman"/>
+                <w:b/>
+                <w:color w:val="FFFFFF"/>
+              </w:rPr>
+              <w:t>Thời gian Mục tiêu 15p (Target Budget)</w:t>
+            </w:r>
+          </w:p>
+        </w:tc>
+        <w:tc>
+          <w:tcPr>
+            <w:tcW w:type="dxa" w:w="1104"/>
+            <w:shd w:fill="1F497D"/>
+          </w:tcPr>
+          <w:p>
+            <w:pPr>
+              <w:jc w:val="center"/>
+            </w:pPr>
+            <w:r>
+              <w:rPr>
+                <w:rFonts w:ascii="Times New Roman" w:hAnsi="Times New Roman"/>
+                <w:b/>
+                <w:color w:val="FFFFFF"/>
+              </w:rPr>
+              <w:t>Thời gian Kịch bản hiện tại (Script Time)</w:t>
+            </w:r>
+          </w:p>
+        </w:tc>
+        <w:tc>
+          <w:tcPr>
+            <w:tcW w:type="dxa" w:w="1104"/>
+            <w:shd w:fill="1F497D"/>
+          </w:tcPr>
+          <w:p>
+            <w:pPr>
+              <w:jc w:val="center"/>
+            </w:pPr>
+            <w:r>
+              <w:rPr>
+                <w:rFonts w:ascii="Times New Roman" w:hAnsi="Times New Roman"/>
+                <w:b/>
+                <w:color w:val="FFFFFF"/>
+              </w:rPr>
+              <w:t>Thực tế chạy thử Dry-run (18/09)</w:t>
+            </w:r>
+          </w:p>
+        </w:tc>
+        <w:tc>
+          <w:tcPr>
+            <w:tcW w:type="dxa" w:w="1104"/>
+            <w:shd w:fill="1F497D"/>
+          </w:tcPr>
+          <w:p>
+            <w:pPr>
+              <w:jc w:val="center"/>
+            </w:pPr>
+            <w:r>
+              <w:rPr>
+                <w:rFonts w:ascii="Times New Roman" w:hAnsi="Times New Roman"/>
+                <w:b/>
+                <w:color w:val="FFFFFF"/>
+              </w:rPr>
+              <w:t>Chênh lệch (Kịch bản vs Mục tiêu 15p)</w:t>
+            </w:r>
+          </w:p>
+        </w:tc>
+        <w:tc>
+          <w:tcPr>
+            <w:tcW w:type="dxa" w:w="1104"/>
+            <w:shd w:fill="1F497D"/>
+          </w:tcPr>
+          <w:p>
+            <w:pPr>
+              <w:jc w:val="center"/>
+            </w:pPr>
+            <w:r>
+              <w:rPr>
+                <w:rFonts w:ascii="Times New Roman" w:hAnsi="Times New Roman"/>
+                <w:b/>
+                <w:color w:val="FFFFFF"/>
+              </w:rPr>
+              <w:t>Mức độ đáp ứng &amp; Khuyến nghị nhịp độ</w:t>
+            </w:r>
+          </w:p>
+        </w:tc>
+      </w:tr>
+      <w:tr>
+        <w:tc>
+          <w:tcPr>
+            <w:tcW w:type="dxa" w:w="1104"/>
+          </w:tcPr>
+          <w:p>
+            <w:r>
+              <w:rPr>
+                <w:rFonts w:ascii="Times New Roman" w:hAnsi="Times New Roman"/>
+                <w:sz w:val="20"/>
+              </w:rPr>
+              <w:t>**1**</w:t>
+            </w:r>
+          </w:p>
+        </w:tc>
+        <w:tc>
+          <w:tcPr>
+            <w:tcW w:type="dxa" w:w="1104"/>
+          </w:tcPr>
+          <w:p>
+            <w:r>
+              <w:rPr>
+                <w:rFonts w:ascii="Times New Roman" w:hAnsi="Times New Roman"/>
+                <w:sz w:val="20"/>
+              </w:rPr>
+              <w:t>**Trần Hoàng Hôn**</w:t>
+            </w:r>
+          </w:p>
+        </w:tc>
+        <w:tc>
+          <w:tcPr>
+            <w:tcW w:type="dxa" w:w="1104"/>
+          </w:tcPr>
+          <w:p>
+            <w:r>
+              <w:rPr>
+                <w:rFonts w:ascii="Times New Roman" w:hAnsi="Times New Roman"/>
+                <w:sz w:val="20"/>
+              </w:rPr>
+              <w:t>**Slide 1, 2**</w:t>
+            </w:r>
+          </w:p>
+        </w:tc>
+        <w:tc>
+          <w:tcPr>
+            <w:tcW w:type="dxa" w:w="1104"/>
+          </w:tcPr>
+          <w:p>
+            <w:r>
+              <w:rPr>
+                <w:rFonts w:ascii="Times New Roman" w:hAnsi="Times New Roman"/>
+                <w:sz w:val="20"/>
+              </w:rPr>
+              <w:t>Mở đầu, giới thiệu 7 thành viên Nhóm 9 và lộ trình 5 phần.</w:t>
+            </w:r>
+          </w:p>
+        </w:tc>
+        <w:tc>
+          <w:tcPr>
+            <w:tcW w:type="dxa" w:w="1104"/>
+          </w:tcPr>
+          <w:p>
+            <w:r>
+              <w:rPr>
+                <w:rFonts w:ascii="Times New Roman" w:hAnsi="Times New Roman"/>
+                <w:sz w:val="20"/>
+              </w:rPr>
+              <w:t>**1 phút 15s** *(75s)*</w:t>
+            </w:r>
+          </w:p>
+        </w:tc>
+        <w:tc>
+          <w:tcPr>
+            <w:tcW w:type="dxa" w:w="1104"/>
+          </w:tcPr>
+          <w:p>
+            <w:r>
+              <w:rPr>
+                <w:rFonts w:ascii="Times New Roman" w:hAnsi="Times New Roman"/>
+                <w:sz w:val="20"/>
+              </w:rPr>
+              <w:t>**2 phút 35s** *(155s)*</w:t>
+            </w:r>
+          </w:p>
+        </w:tc>
+        <w:tc>
+          <w:tcPr>
+            <w:tcW w:type="dxa" w:w="1104"/>
+          </w:tcPr>
+          <w:p>
+            <w:r>
+              <w:rPr>
+                <w:rFonts w:ascii="Times New Roman" w:hAnsi="Times New Roman"/>
+                <w:sz w:val="20"/>
+              </w:rPr>
+              <w:t>*3 phút 16s* *(196s)*</w:t>
+            </w:r>
+          </w:p>
+        </w:tc>
+        <w:tc>
+          <w:tcPr>
+            <w:tcW w:type="dxa" w:w="1104"/>
+          </w:tcPr>
+          <w:p>
+            <w:r>
+              <w:rPr>
+                <w:rFonts w:ascii="Times New Roman" w:hAnsi="Times New Roman"/>
+                <w:sz w:val="20"/>
+              </w:rPr>
+              <w:t>🔴 **Vượt +1m20s** *(+106%)*</w:t>
+            </w:r>
+          </w:p>
+        </w:tc>
+        <w:tc>
+          <w:tcPr>
+            <w:tcW w:type="dxa" w:w="1104"/>
+          </w:tcPr>
+          <w:p>
+            <w:r>
+              <w:rPr>
+                <w:rFonts w:ascii="Times New Roman" w:hAnsi="Times New Roman"/>
+                <w:sz w:val="20"/>
+              </w:rPr>
+              <w:t>⚠️ **Cần rút gọn:** Đọc nhanh tên 7 bạn (45s) + lướt nhanh Agenda (30s).</w:t>
+            </w:r>
+          </w:p>
+        </w:tc>
+      </w:tr>
+      <w:tr>
+        <w:tc>
+          <w:tcPr>
+            <w:tcW w:type="dxa" w:w="1104"/>
+          </w:tcPr>
+          <w:p>
+            <w:r>
+              <w:rPr>
+                <w:rFonts w:ascii="Times New Roman" w:hAnsi="Times New Roman"/>
+                <w:sz w:val="20"/>
+              </w:rPr>
+              <w:t>**2**</w:t>
+            </w:r>
+          </w:p>
+        </w:tc>
+        <w:tc>
+          <w:tcPr>
+            <w:tcW w:type="dxa" w:w="1104"/>
+          </w:tcPr>
+          <w:p>
+            <w:r>
+              <w:rPr>
+                <w:rFonts w:ascii="Times New Roman" w:hAnsi="Times New Roman"/>
+                <w:sz w:val="20"/>
+              </w:rPr>
+              <w:t>**Đặng Chí Thanh**</w:t>
+            </w:r>
+          </w:p>
+        </w:tc>
+        <w:tc>
+          <w:tcPr>
+            <w:tcW w:type="dxa" w:w="1104"/>
+          </w:tcPr>
+          <w:p>
+            <w:r>
+              <w:rPr>
+                <w:rFonts w:ascii="Times New Roman" w:hAnsi="Times New Roman"/>
+                <w:sz w:val="20"/>
+              </w:rPr>
+              <w:t>**Slide 3, 4, 5, 6, 7, 8**</w:t>
+            </w:r>
+          </w:p>
+        </w:tc>
+        <w:tc>
+          <w:tcPr>
+            <w:tcW w:type="dxa" w:w="1104"/>
+          </w:tcPr>
+          <w:p>
+            <w:r>
+              <w:rPr>
+                <w:rFonts w:ascii="Times New Roman" w:hAnsi="Times New Roman"/>
+                <w:sz w:val="20"/>
+              </w:rPr>
+              <w:t>Bối cảnh, PaySim 200k, 100% gian lận ở 2 loại, 14 đặc trưng miền.</w:t>
+            </w:r>
+          </w:p>
+        </w:tc>
+        <w:tc>
+          <w:tcPr>
+            <w:tcW w:type="dxa" w:w="1104"/>
+          </w:tcPr>
+          <w:p>
+            <w:r>
+              <w:rPr>
+                <w:rFonts w:ascii="Times New Roman" w:hAnsi="Times New Roman"/>
+                <w:sz w:val="20"/>
+              </w:rPr>
+              <w:t>**3 phút 30s** *(210s)*</w:t>
+            </w:r>
+          </w:p>
+        </w:tc>
+        <w:tc>
+          <w:tcPr>
+            <w:tcW w:type="dxa" w:w="1104"/>
+          </w:tcPr>
+          <w:p>
+            <w:r>
+              <w:rPr>
+                <w:rFonts w:ascii="Times New Roman" w:hAnsi="Times New Roman"/>
+                <w:sz w:val="20"/>
+              </w:rPr>
+              <w:t>**5 phút 22s** *(322s)*</w:t>
+            </w:r>
+          </w:p>
+        </w:tc>
+        <w:tc>
+          <w:tcPr>
+            <w:tcW w:type="dxa" w:w="1104"/>
+          </w:tcPr>
+          <w:p>
+            <w:r>
+              <w:rPr>
+                <w:rFonts w:ascii="Times New Roman" w:hAnsi="Times New Roman"/>
+                <w:sz w:val="20"/>
+              </w:rPr>
+              <w:t>*7 phút 54s* *(474s)*</w:t>
+            </w:r>
+          </w:p>
+        </w:tc>
+        <w:tc>
+          <w:tcPr>
+            <w:tcW w:type="dxa" w:w="1104"/>
+          </w:tcPr>
+          <w:p>
+            <w:r>
+              <w:rPr>
+                <w:rFonts w:ascii="Times New Roman" w:hAnsi="Times New Roman"/>
+                <w:sz w:val="20"/>
+              </w:rPr>
+              <w:t>🔴 **Vượt +1m52s** *(+53%)*</w:t>
+            </w:r>
+          </w:p>
+        </w:tc>
+        <w:tc>
+          <w:tcPr>
+            <w:tcW w:type="dxa" w:w="1104"/>
+          </w:tcPr>
+          <w:p>
+            <w:r>
+              <w:rPr>
+                <w:rFonts w:ascii="Times New Roman" w:hAnsi="Times New Roman"/>
+                <w:sz w:val="20"/>
+              </w:rPr>
+              <w:t>⚠️ **Cần nói lướt:** Đi thẳng vào 2 biến quyết định 97.1% (PR #37).</w:t>
+            </w:r>
+          </w:p>
+        </w:tc>
+      </w:tr>
+      <w:tr>
+        <w:tc>
+          <w:tcPr>
+            <w:tcW w:type="dxa" w:w="1104"/>
+          </w:tcPr>
+          <w:p>
+            <w:r>
+              <w:rPr>
+                <w:rFonts w:ascii="Times New Roman" w:hAnsi="Times New Roman"/>
+                <w:sz w:val="20"/>
+              </w:rPr>
+              <w:t>**3**</w:t>
+            </w:r>
+          </w:p>
+        </w:tc>
+        <w:tc>
+          <w:tcPr>
+            <w:tcW w:type="dxa" w:w="1104"/>
+          </w:tcPr>
+          <w:p>
+            <w:r>
+              <w:rPr>
+                <w:rFonts w:ascii="Times New Roman" w:hAnsi="Times New Roman"/>
+                <w:sz w:val="20"/>
+              </w:rPr>
+              <w:t>**Hoàng Cao Sơn**</w:t>
+            </w:r>
+          </w:p>
+        </w:tc>
+        <w:tc>
+          <w:tcPr>
+            <w:tcW w:type="dxa" w:w="1104"/>
+          </w:tcPr>
+          <w:p>
+            <w:r>
+              <w:rPr>
+                <w:rFonts w:ascii="Times New Roman" w:hAnsi="Times New Roman"/>
+                <w:sz w:val="20"/>
+              </w:rPr>
+              <w:t>**Slide 9, 10, 11, 12 (RF)**</w:t>
+            </w:r>
+          </w:p>
+        </w:tc>
+        <w:tc>
+          <w:tcPr>
+            <w:tcW w:type="dxa" w:w="1104"/>
+          </w:tcPr>
+          <w:p>
+            <w:r>
+              <w:rPr>
+                <w:rFonts w:ascii="Times New Roman" w:hAnsi="Times New Roman"/>
+                <w:sz w:val="20"/>
+              </w:rPr>
+              <w:t>SMOTENC giữ nguyên cờ 0/1, 4 chốt chặn Leak-Free và Random Forest.</w:t>
+            </w:r>
+          </w:p>
+        </w:tc>
+        <w:tc>
+          <w:tcPr>
+            <w:tcW w:type="dxa" w:w="1104"/>
+          </w:tcPr>
+          <w:p>
+            <w:r>
+              <w:rPr>
+                <w:rFonts w:ascii="Times New Roman" w:hAnsi="Times New Roman"/>
+                <w:sz w:val="20"/>
+              </w:rPr>
+              <w:t>**2 phút 00s** *(120s)*</w:t>
+            </w:r>
+          </w:p>
+        </w:tc>
+        <w:tc>
+          <w:tcPr>
+            <w:tcW w:type="dxa" w:w="1104"/>
+          </w:tcPr>
+          <w:p>
+            <w:r>
+              <w:rPr>
+                <w:rFonts w:ascii="Times New Roman" w:hAnsi="Times New Roman"/>
+                <w:sz w:val="20"/>
+              </w:rPr>
+              <w:t>**3 phút 30s** *(210s)*</w:t>
+            </w:r>
+          </w:p>
+        </w:tc>
+        <w:tc>
+          <w:tcPr>
+            <w:tcW w:type="dxa" w:w="1104"/>
+          </w:tcPr>
+          <w:p>
+            <w:r>
+              <w:rPr>
+                <w:rFonts w:ascii="Times New Roman" w:hAnsi="Times New Roman"/>
+                <w:sz w:val="20"/>
+              </w:rPr>
+              <w:t>*7 phút 17s* *(437s)*</w:t>
+            </w:r>
+          </w:p>
+        </w:tc>
+        <w:tc>
+          <w:tcPr>
+            <w:tcW w:type="dxa" w:w="1104"/>
+          </w:tcPr>
+          <w:p>
+            <w:r>
+              <w:rPr>
+                <w:rFonts w:ascii="Times New Roman" w:hAnsi="Times New Roman"/>
+                <w:sz w:val="20"/>
+              </w:rPr>
+              <w:t>🔴 **Vượt +1m30s** *(+75%)*</w:t>
+            </w:r>
+          </w:p>
+        </w:tc>
+        <w:tc>
+          <w:tcPr>
+            <w:tcW w:type="dxa" w:w="1104"/>
+          </w:tcPr>
+          <w:p>
+            <w:r>
+              <w:rPr>
+                <w:rFonts w:ascii="Times New Roman" w:hAnsi="Times New Roman"/>
+                <w:sz w:val="20"/>
+              </w:rPr>
+              <w:t>⚠️ **Cắt lý thuyết:** Bỏ giải thích ADASYN, chỉ nêu kết quả RF F1=0.9973.</w:t>
+            </w:r>
+          </w:p>
+        </w:tc>
+      </w:tr>
+      <w:tr>
+        <w:tc>
+          <w:tcPr>
+            <w:tcW w:type="dxa" w:w="1104"/>
+          </w:tcPr>
+          <w:p>
+            <w:r>
+              <w:rPr>
+                <w:rFonts w:ascii="Times New Roman" w:hAnsi="Times New Roman"/>
+                <w:sz w:val="20"/>
+              </w:rPr>
+              <w:t>**4**</w:t>
+            </w:r>
+          </w:p>
+        </w:tc>
+        <w:tc>
+          <w:tcPr>
+            <w:tcW w:type="dxa" w:w="1104"/>
+          </w:tcPr>
+          <w:p>
+            <w:r>
+              <w:rPr>
+                <w:rFonts w:ascii="Times New Roman" w:hAnsi="Times New Roman"/>
+                <w:sz w:val="20"/>
+              </w:rPr>
+              <w:t>**Bùi Thị Mỷ Cẩm**</w:t>
+            </w:r>
+          </w:p>
+        </w:tc>
+        <w:tc>
+          <w:tcPr>
+            <w:tcW w:type="dxa" w:w="1104"/>
+          </w:tcPr>
+          <w:p>
+            <w:r>
+              <w:rPr>
+                <w:rFonts w:ascii="Times New Roman" w:hAnsi="Times New Roman"/>
+                <w:sz w:val="20"/>
+              </w:rPr>
+              <w:t>**Slide 12 (XGB), 13, 18**</w:t>
+            </w:r>
+          </w:p>
+        </w:tc>
+        <w:tc>
+          <w:tcPr>
+            <w:tcW w:type="dxa" w:w="1104"/>
+          </w:tcPr>
+          <w:p>
+            <w:r>
+              <w:rPr>
+                <w:rFonts w:ascii="Times New Roman" w:hAnsi="Times New Roman"/>
+                <w:sz w:val="20"/>
+              </w:rPr>
+              <w:t>XGBoost siêu tốc (41s, JSON 410KB) và Deep Autoencoder bắt Zero-Day.</w:t>
+            </w:r>
+          </w:p>
+        </w:tc>
+        <w:tc>
+          <w:tcPr>
+            <w:tcW w:type="dxa" w:w="1104"/>
+          </w:tcPr>
+          <w:p>
+            <w:r>
+              <w:rPr>
+                <w:rFonts w:ascii="Times New Roman" w:hAnsi="Times New Roman"/>
+                <w:sz w:val="20"/>
+              </w:rPr>
+              <w:t>**2 phút 00s** *(120s)*</w:t>
+            </w:r>
+          </w:p>
+        </w:tc>
+        <w:tc>
+          <w:tcPr>
+            <w:tcW w:type="dxa" w:w="1104"/>
+          </w:tcPr>
+          <w:p>
+            <w:r>
+              <w:rPr>
+                <w:rFonts w:ascii="Times New Roman" w:hAnsi="Times New Roman"/>
+                <w:sz w:val="20"/>
+              </w:rPr>
+              <w:t>**3 phút 43s** *(223s)*</w:t>
+            </w:r>
+          </w:p>
+        </w:tc>
+        <w:tc>
+          <w:tcPr>
+            <w:tcW w:type="dxa" w:w="1104"/>
+          </w:tcPr>
+          <w:p>
+            <w:r>
+              <w:rPr>
+                <w:rFonts w:ascii="Times New Roman" w:hAnsi="Times New Roman"/>
+                <w:sz w:val="20"/>
+              </w:rPr>
+              <w:t>*4 phút 15s* *(255s)*</w:t>
+            </w:r>
+          </w:p>
+        </w:tc>
+        <w:tc>
+          <w:tcPr>
+            <w:tcW w:type="dxa" w:w="1104"/>
+          </w:tcPr>
+          <w:p>
+            <w:r>
+              <w:rPr>
+                <w:rFonts w:ascii="Times New Roman" w:hAnsi="Times New Roman"/>
+                <w:sz w:val="20"/>
+              </w:rPr>
+              <w:t>🔴 **Vượt +1m43s** *(+86%)*</w:t>
+            </w:r>
+          </w:p>
+        </w:tc>
+        <w:tc>
+          <w:tcPr>
+            <w:tcW w:type="dxa" w:w="1104"/>
+          </w:tcPr>
+          <w:p>
+            <w:r>
+              <w:rPr>
+                <w:rFonts w:ascii="Times New Roman" w:hAnsi="Times New Roman"/>
+                <w:sz w:val="20"/>
+              </w:rPr>
+              <w:t>⚠️ **Cần cô đọng:** XGB 40s + Autoencoder &amp; ngưỡng 95th 80s.</w:t>
+            </w:r>
+          </w:p>
+        </w:tc>
+      </w:tr>
+      <w:tr>
+        <w:tc>
+          <w:tcPr>
+            <w:tcW w:type="dxa" w:w="1104"/>
+          </w:tcPr>
+          <w:p>
+            <w:r>
+              <w:rPr>
+                <w:rFonts w:ascii="Times New Roman" w:hAnsi="Times New Roman"/>
+                <w:sz w:val="20"/>
+              </w:rPr>
+              <w:t>**5**</w:t>
+            </w:r>
+          </w:p>
+        </w:tc>
+        <w:tc>
+          <w:tcPr>
+            <w:tcW w:type="dxa" w:w="1104"/>
+          </w:tcPr>
+          <w:p>
+            <w:r>
+              <w:rPr>
+                <w:rFonts w:ascii="Times New Roman" w:hAnsi="Times New Roman"/>
+                <w:sz w:val="20"/>
+              </w:rPr>
+              <w:t>**Nguyễn Duy Khang**</w:t>
+            </w:r>
+          </w:p>
+        </w:tc>
+        <w:tc>
+          <w:tcPr>
+            <w:tcW w:type="dxa" w:w="1104"/>
+          </w:tcPr>
+          <w:p>
+            <w:r>
+              <w:rPr>
+                <w:rFonts w:ascii="Times New Roman" w:hAnsi="Times New Roman"/>
+                <w:sz w:val="20"/>
+              </w:rPr>
+              <w:t>**Slide 14, 15, 16, 17**</w:t>
+            </w:r>
+          </w:p>
+        </w:tc>
+        <w:tc>
+          <w:tcPr>
+            <w:tcW w:type="dxa" w:w="1104"/>
+          </w:tcPr>
+          <w:p>
+            <w:r>
+              <w:rPr>
+                <w:rFonts w:ascii="Times New Roman" w:hAnsi="Times New Roman"/>
+                <w:sz w:val="20"/>
+              </w:rPr>
+              <w:t>Đối chuẩn 5 mô hình, Ma trận nhầm lẫn (sót 8 ca) và Feature Importance.</w:t>
+            </w:r>
+          </w:p>
+        </w:tc>
+        <w:tc>
+          <w:tcPr>
+            <w:tcW w:type="dxa" w:w="1104"/>
+          </w:tcPr>
+          <w:p>
+            <w:r>
+              <w:rPr>
+                <w:rFonts w:ascii="Times New Roman" w:hAnsi="Times New Roman"/>
+                <w:sz w:val="20"/>
+              </w:rPr>
+              <w:t>**2 phút 15s** *(135s)*</w:t>
+            </w:r>
+          </w:p>
+        </w:tc>
+        <w:tc>
+          <w:tcPr>
+            <w:tcW w:type="dxa" w:w="1104"/>
+          </w:tcPr>
+          <w:p>
+            <w:r>
+              <w:rPr>
+                <w:rFonts w:ascii="Times New Roman" w:hAnsi="Times New Roman"/>
+                <w:sz w:val="20"/>
+              </w:rPr>
+              <w:t>**4 phút 39s** *(279s)*</w:t>
+            </w:r>
+          </w:p>
+        </w:tc>
+        <w:tc>
+          <w:tcPr>
+            <w:tcW w:type="dxa" w:w="1104"/>
+          </w:tcPr>
+          <w:p>
+            <w:r>
+              <w:rPr>
+                <w:rFonts w:ascii="Times New Roman" w:hAnsi="Times New Roman"/>
+                <w:sz w:val="20"/>
+              </w:rPr>
+              <w:t>*4 phút 27s* *(267s)*</w:t>
+            </w:r>
+          </w:p>
+        </w:tc>
+        <w:tc>
+          <w:tcPr>
+            <w:tcW w:type="dxa" w:w="1104"/>
+          </w:tcPr>
+          <w:p>
+            <w:r>
+              <w:rPr>
+                <w:rFonts w:ascii="Times New Roman" w:hAnsi="Times New Roman"/>
+                <w:sz w:val="20"/>
+              </w:rPr>
+              <w:t>🔴 **Vượt +2m24s** *(+106%)*</w:t>
+            </w:r>
+          </w:p>
+        </w:tc>
+        <w:tc>
+          <w:tcPr>
+            <w:tcW w:type="dxa" w:w="1104"/>
+          </w:tcPr>
+          <w:p>
+            <w:r>
+              <w:rPr>
+                <w:rFonts w:ascii="Times New Roman" w:hAnsi="Times New Roman"/>
+                <w:sz w:val="20"/>
+              </w:rPr>
+              <w:t>⚠️ **Không đọc bảng:** Chỉ nêu bật RF &amp; XGBoost dẫn đầu, lướt các chỉ số phụ.</w:t>
+            </w:r>
+          </w:p>
+        </w:tc>
+      </w:tr>
+      <w:tr>
+        <w:tc>
+          <w:tcPr>
+            <w:tcW w:type="dxa" w:w="1104"/>
+          </w:tcPr>
+          <w:p>
+            <w:r>
+              <w:rPr>
+                <w:rFonts w:ascii="Times New Roman" w:hAnsi="Times New Roman"/>
+                <w:sz w:val="20"/>
+              </w:rPr>
+              <w:t>**6**</w:t>
+            </w:r>
+          </w:p>
+        </w:tc>
+        <w:tc>
+          <w:tcPr>
+            <w:tcW w:type="dxa" w:w="1104"/>
+          </w:tcPr>
+          <w:p>
+            <w:r>
+              <w:rPr>
+                <w:rFonts w:ascii="Times New Roman" w:hAnsi="Times New Roman"/>
+                <w:sz w:val="20"/>
+              </w:rPr>
+              <w:t>**Vũ Văn Duy**</w:t>
+            </w:r>
+          </w:p>
+        </w:tc>
+        <w:tc>
+          <w:tcPr>
+            <w:tcW w:type="dxa" w:w="1104"/>
+          </w:tcPr>
+          <w:p>
+            <w:r>
+              <w:rPr>
+                <w:rFonts w:ascii="Times New Roman" w:hAnsi="Times New Roman"/>
+                <w:sz w:val="20"/>
+              </w:rPr>
+              <w:t>*Không nói Slide*</w:t>
+            </w:r>
+          </w:p>
+        </w:tc>
+        <w:tc>
+          <w:tcPr>
+            <w:tcW w:type="dxa" w:w="1104"/>
+          </w:tcPr>
+          <w:p>
+            <w:r>
+              <w:rPr>
+                <w:rFonts w:ascii="Times New Roman" w:hAnsi="Times New Roman"/>
+                <w:sz w:val="20"/>
+              </w:rPr>
+              <w:t>**Chuyên trách phản biện:** Trụ cột trả lời Q&amp;A về Báo cáo Word 32 trang &amp; Threats to Validity.</w:t>
+            </w:r>
+          </w:p>
+        </w:tc>
+        <w:tc>
+          <w:tcPr>
+            <w:tcW w:type="dxa" w:w="1104"/>
+          </w:tcPr>
+          <w:p>
+            <w:r>
+              <w:rPr>
+                <w:rFonts w:ascii="Times New Roman" w:hAnsi="Times New Roman"/>
+                <w:sz w:val="20"/>
+              </w:rPr>
+              <w:t>**0 phút 00s** *(0s)*</w:t>
+            </w:r>
+          </w:p>
+        </w:tc>
+        <w:tc>
+          <w:tcPr>
+            <w:tcW w:type="dxa" w:w="1104"/>
+          </w:tcPr>
+          <w:p>
+            <w:r>
+              <w:rPr>
+                <w:rFonts w:ascii="Times New Roman" w:hAnsi="Times New Roman"/>
+                <w:sz w:val="20"/>
+              </w:rPr>
+              <w:t>**0 phút 00s** *(0s)*</w:t>
+            </w:r>
+          </w:p>
+        </w:tc>
+        <w:tc>
+          <w:tcPr>
+            <w:tcW w:type="dxa" w:w="1104"/>
+          </w:tcPr>
+          <w:p>
+            <w:r>
+              <w:rPr>
+                <w:rFonts w:ascii="Times New Roman" w:hAnsi="Times New Roman"/>
+                <w:sz w:val="20"/>
+              </w:rPr>
+              <w:t>*2 phút 29s* *(149s)*</w:t>
+            </w:r>
+          </w:p>
+        </w:tc>
+        <w:tc>
+          <w:tcPr>
+            <w:tcW w:type="dxa" w:w="1104"/>
+          </w:tcPr>
+          <w:p>
+            <w:r>
+              <w:rPr>
+                <w:rFonts w:ascii="Times New Roman" w:hAnsi="Times New Roman"/>
+                <w:sz w:val="20"/>
+              </w:rPr>
+              <w:t>🟢 **`0s` (Khớp tuyệt đối)**</w:t>
+            </w:r>
+          </w:p>
+        </w:tc>
+        <w:tc>
+          <w:tcPr>
+            <w:tcW w:type="dxa" w:w="1104"/>
+          </w:tcPr>
+          <w:p>
+            <w:r>
+              <w:rPr>
+                <w:rFonts w:ascii="Times New Roman" w:hAnsi="Times New Roman"/>
+                <w:sz w:val="20"/>
+              </w:rPr>
+              <w:t>🎯 **HOÀN THÀNH MỤC TIÊU:** Duy không nói slide, tránh đổi micro.</w:t>
+            </w:r>
+          </w:p>
+        </w:tc>
+      </w:tr>
+      <w:tr>
+        <w:tc>
+          <w:tcPr>
+            <w:tcW w:type="dxa" w:w="1104"/>
+          </w:tcPr>
+          <w:p>
+            <w:r>
+              <w:rPr>
+                <w:rFonts w:ascii="Times New Roman" w:hAnsi="Times New Roman"/>
+                <w:sz w:val="20"/>
+              </w:rPr>
+              <w:t>**7**</w:t>
+            </w:r>
+          </w:p>
+        </w:tc>
+        <w:tc>
+          <w:tcPr>
+            <w:tcW w:type="dxa" w:w="1104"/>
+          </w:tcPr>
+          <w:p>
+            <w:r>
+              <w:rPr>
+                <w:rFonts w:ascii="Times New Roman" w:hAnsi="Times New Roman"/>
+                <w:sz w:val="20"/>
+              </w:rPr>
+              <w:t>**Phạm Thành Trung**</w:t>
+            </w:r>
+          </w:p>
+        </w:tc>
+        <w:tc>
+          <w:tcPr>
+            <w:tcW w:type="dxa" w:w="1104"/>
+          </w:tcPr>
+          <w:p>
+            <w:r>
+              <w:rPr>
+                <w:rFonts w:ascii="Times New Roman" w:hAnsi="Times New Roman"/>
+                <w:sz w:val="20"/>
+              </w:rPr>
+              <w:t>**Slide 19, 20 + Cảm ơn**</w:t>
+            </w:r>
+          </w:p>
+        </w:tc>
+        <w:tc>
+          <w:tcPr>
+            <w:tcW w:type="dxa" w:w="1104"/>
+          </w:tcPr>
+          <w:p>
+            <w:r>
+              <w:rPr>
+                <w:rFonts w:ascii="Times New Roman" w:hAnsi="Times New Roman"/>
+                <w:sz w:val="20"/>
+              </w:rPr>
+              <w:t>Giới thiệu Dashboard, nêu 3 kịch bản, Live Demo, 4 đóng góp, Cảm ơn &amp; Mời Q&amp;A.</w:t>
+            </w:r>
+          </w:p>
+        </w:tc>
+        <w:tc>
+          <w:tcPr>
+            <w:tcW w:type="dxa" w:w="1104"/>
+          </w:tcPr>
+          <w:p>
+            <w:r>
+              <w:rPr>
+                <w:rFonts w:ascii="Times New Roman" w:hAnsi="Times New Roman"/>
+                <w:sz w:val="20"/>
+              </w:rPr>
+              <w:t>**2 phút 40s** *(160s)*</w:t>
+            </w:r>
+          </w:p>
+        </w:tc>
+        <w:tc>
+          <w:tcPr>
+            <w:tcW w:type="dxa" w:w="1104"/>
+          </w:tcPr>
+          <w:p>
+            <w:r>
+              <w:rPr>
+                <w:rFonts w:ascii="Times New Roman" w:hAnsi="Times New Roman"/>
+                <w:sz w:val="20"/>
+              </w:rPr>
+              <w:t>**3 phút 50s** *(230s)*</w:t>
+            </w:r>
+          </w:p>
+        </w:tc>
+        <w:tc>
+          <w:tcPr>
+            <w:tcW w:type="dxa" w:w="1104"/>
+          </w:tcPr>
+          <w:p>
+            <w:r>
+              <w:rPr>
+                <w:rFonts w:ascii="Times New Roman" w:hAnsi="Times New Roman"/>
+                <w:sz w:val="20"/>
+              </w:rPr>
+              <w:t>*5 phút 04s* *(304s)*</w:t>
+            </w:r>
+          </w:p>
+        </w:tc>
+        <w:tc>
+          <w:tcPr>
+            <w:tcW w:type="dxa" w:w="1104"/>
+          </w:tcPr>
+          <w:p>
+            <w:r>
+              <w:rPr>
+                <w:rFonts w:ascii="Times New Roman" w:hAnsi="Times New Roman"/>
+                <w:sz w:val="20"/>
+              </w:rPr>
+              <w:t>🔴 **Vượt +1m10s** *(+44%)*</w:t>
+            </w:r>
+          </w:p>
+        </w:tc>
+        <w:tc>
+          <w:tcPr>
+            <w:tcW w:type="dxa" w:w="1104"/>
+          </w:tcPr>
+          <w:p>
+            <w:r>
+              <w:rPr>
+                <w:rFonts w:ascii="Times New Roman" w:hAnsi="Times New Roman"/>
+                <w:sz w:val="20"/>
+              </w:rPr>
+              <w:t>⚠️ **Cần demo nhanh:** Bấm 2 preset mẫu, không gõ tay dữ liệu.</w:t>
+            </w:r>
+          </w:p>
+        </w:tc>
+      </w:tr>
+      <w:tr>
+        <w:tc>
+          <w:tcPr>
+            <w:tcW w:type="dxa" w:w="1104"/>
+          </w:tcPr>
+          <w:p>
+            <w:r>
+              <w:rPr>
+                <w:rFonts w:ascii="Times New Roman" w:hAnsi="Times New Roman"/>
+                <w:sz w:val="20"/>
+              </w:rPr>
+              <w:t>⏩</w:t>
+            </w:r>
+          </w:p>
+        </w:tc>
+        <w:tc>
+          <w:tcPr>
+            <w:tcW w:type="dxa" w:w="1104"/>
+          </w:tcPr>
+          <w:p>
+            <w:r>
+              <w:rPr>
+                <w:rFonts w:ascii="Times New Roman" w:hAnsi="Times New Roman"/>
+                <w:sz w:val="20"/>
+              </w:rPr>
+              <w:t>**Slide 21**</w:t>
+            </w:r>
+          </w:p>
+        </w:tc>
+        <w:tc>
+          <w:tcPr>
+            <w:tcW w:type="dxa" w:w="1104"/>
+          </w:tcPr>
+          <w:p>
+            <w:r>
+              <w:rPr>
+                <w:rFonts w:ascii="Times New Roman" w:hAnsi="Times New Roman"/>
+                <w:sz w:val="20"/>
+              </w:rPr>
+              <w:t>*Bỏ qua*</w:t>
+            </w:r>
+          </w:p>
+        </w:tc>
+        <w:tc>
+          <w:tcPr>
+            <w:tcW w:type="dxa" w:w="1104"/>
+          </w:tcPr>
+          <w:p>
+            <w:r>
+              <w:rPr>
+                <w:rFonts w:ascii="Times New Roman" w:hAnsi="Times New Roman"/>
+                <w:sz w:val="20"/>
+              </w:rPr>
+              <w:t>Trung nói cảm ơn trực tiếp tại cuối Slide 20, không quay lại Slide 21.</w:t>
+            </w:r>
+          </w:p>
+        </w:tc>
+        <w:tc>
+          <w:tcPr>
+            <w:tcW w:type="dxa" w:w="1104"/>
+          </w:tcPr>
+          <w:p>
+            <w:r>
+              <w:rPr>
+                <w:rFonts w:ascii="Times New Roman" w:hAnsi="Times New Roman"/>
+                <w:sz w:val="20"/>
+              </w:rPr>
+              <w:t>**0 phút 00s** *(0s)*</w:t>
+            </w:r>
+          </w:p>
+        </w:tc>
+        <w:tc>
+          <w:tcPr>
+            <w:tcW w:type="dxa" w:w="1104"/>
+          </w:tcPr>
+          <w:p>
+            <w:r>
+              <w:rPr>
+                <w:rFonts w:ascii="Times New Roman" w:hAnsi="Times New Roman"/>
+                <w:sz w:val="20"/>
+              </w:rPr>
+              <w:t>**0 phút 00s** *(0s)*</w:t>
+            </w:r>
+          </w:p>
+        </w:tc>
+        <w:tc>
+          <w:tcPr>
+            <w:tcW w:type="dxa" w:w="1104"/>
+          </w:tcPr>
+          <w:p>
+            <w:r>
+              <w:rPr>
+                <w:rFonts w:ascii="Times New Roman" w:hAnsi="Times New Roman"/>
+                <w:sz w:val="20"/>
+              </w:rPr>
+              <w:t>*45s*</w:t>
+            </w:r>
+          </w:p>
+        </w:tc>
+        <w:tc>
+          <w:tcPr>
+            <w:tcW w:type="dxa" w:w="1104"/>
+          </w:tcPr>
+          <w:p>
+            <w:r>
+              <w:rPr>
+                <w:rFonts w:ascii="Times New Roman" w:hAnsi="Times New Roman"/>
+                <w:sz w:val="20"/>
+              </w:rPr>
+              <w:t>🟢 **`0s` (Khớp tuyệt đối)**</w:t>
+            </w:r>
+          </w:p>
+        </w:tc>
+        <w:tc>
+          <w:tcPr>
+            <w:tcW w:type="dxa" w:w="1104"/>
+          </w:tcPr>
+          <w:p>
+            <w:r>
+              <w:rPr>
+                <w:rFonts w:ascii="Times New Roman" w:hAnsi="Times New Roman"/>
+                <w:sz w:val="20"/>
+              </w:rPr>
+              <w:t>🎯 **HOÀN THÀNH MỤC TIÊU:** Cắt bỏ hoàn toàn độ trễ switch slide.</w:t>
+            </w:r>
+          </w:p>
+        </w:tc>
+      </w:tr>
+      <w:tr>
+        <w:tc>
+          <w:tcPr>
+            <w:tcW w:type="dxa" w:w="1104"/>
+          </w:tcPr>
+          <w:p>
+            <w:r>
+              <w:rPr>
+                <w:rFonts w:ascii="Times New Roman" w:hAnsi="Times New Roman"/>
+                <w:sz w:val="20"/>
+              </w:rPr>
+              <w:t>⏱️</w:t>
+            </w:r>
+          </w:p>
+        </w:tc>
+        <w:tc>
+          <w:tcPr>
+            <w:tcW w:type="dxa" w:w="1104"/>
+          </w:tcPr>
+          <w:p>
+            <w:r>
+              <w:rPr>
+                <w:rFonts w:ascii="Times New Roman" w:hAnsi="Times New Roman"/>
+                <w:sz w:val="20"/>
+              </w:rPr>
+              <w:t>**Dự phòng (Buffer)**</w:t>
+            </w:r>
+          </w:p>
+        </w:tc>
+        <w:tc>
+          <w:tcPr>
+            <w:tcW w:type="dxa" w:w="1104"/>
+          </w:tcPr>
+          <w:p>
+            <w:r>
+              <w:rPr>
+                <w:rFonts w:ascii="Times New Roman" w:hAnsi="Times New Roman"/>
+                <w:sz w:val="20"/>
+              </w:rPr>
+              <w:t>—</w:t>
+            </w:r>
+          </w:p>
+        </w:tc>
+        <w:tc>
+          <w:tcPr>
+            <w:tcW w:type="dxa" w:w="1104"/>
+          </w:tcPr>
+          <w:p>
+            <w:r>
+              <w:rPr>
+                <w:rFonts w:ascii="Times New Roman" w:hAnsi="Times New Roman"/>
+                <w:sz w:val="20"/>
+              </w:rPr>
+              <w:t>Độ trễ chuyển slide giữa các thành viên và kết nối micro.</w:t>
+            </w:r>
+          </w:p>
+        </w:tc>
+        <w:tc>
+          <w:tcPr>
+            <w:tcW w:type="dxa" w:w="1104"/>
+          </w:tcPr>
+          <w:p>
+            <w:r>
+              <w:rPr>
+                <w:rFonts w:ascii="Times New Roman" w:hAnsi="Times New Roman"/>
+                <w:sz w:val="20"/>
+              </w:rPr>
+              <w:t>**1 phút 20s** *(80s)*</w:t>
+            </w:r>
+          </w:p>
+        </w:tc>
+        <w:tc>
+          <w:tcPr>
+            <w:tcW w:type="dxa" w:w="1104"/>
+          </w:tcPr>
+          <w:p>
+            <w:r>
+              <w:rPr>
+                <w:rFonts w:ascii="Times New Roman" w:hAnsi="Times New Roman"/>
+                <w:sz w:val="20"/>
+              </w:rPr>
+              <w:t>—</w:t>
+            </w:r>
+          </w:p>
+        </w:tc>
+        <w:tc>
+          <w:tcPr>
+            <w:tcW w:type="dxa" w:w="1104"/>
+          </w:tcPr>
+          <w:p>
+            <w:r>
+              <w:rPr>
+                <w:rFonts w:ascii="Times New Roman" w:hAnsi="Times New Roman"/>
+                <w:sz w:val="20"/>
+              </w:rPr>
+              <w:t>—</w:t>
+            </w:r>
+          </w:p>
+        </w:tc>
+        <w:tc>
+          <w:tcPr>
+            <w:tcW w:type="dxa" w:w="1104"/>
+          </w:tcPr>
+          <w:p>
+            <w:r>
+              <w:rPr>
+                <w:rFonts w:ascii="Times New Roman" w:hAnsi="Times New Roman"/>
+                <w:sz w:val="20"/>
+              </w:rPr>
+              <w:t>—</w:t>
+            </w:r>
+          </w:p>
+        </w:tc>
+        <w:tc>
+          <w:tcPr>
+            <w:tcW w:type="dxa" w:w="1104"/>
+          </w:tcPr>
+          <w:p>
+            <w:r>
+              <w:rPr>
+                <w:rFonts w:ascii="Times New Roman" w:hAnsi="Times New Roman"/>
+                <w:sz w:val="20"/>
+              </w:rPr>
+              <w:t>Dành cho việc chuyển slide và kết nối âm thanh.</w:t>
+            </w:r>
+          </w:p>
+        </w:tc>
+      </w:tr>
+      <w:tr>
+        <w:tc>
+          <w:tcPr>
+            <w:tcW w:type="dxa" w:w="1104"/>
+          </w:tcPr>
+          <w:p>
+            <w:r>
+              <w:rPr>
+                <w:rFonts w:ascii="Times New Roman" w:hAnsi="Times New Roman"/>
+                <w:sz w:val="20"/>
+              </w:rPr>
+              <w:t>🏁</w:t>
+            </w:r>
+          </w:p>
+        </w:tc>
+        <w:tc>
+          <w:tcPr>
+            <w:tcW w:type="dxa" w:w="1104"/>
+          </w:tcPr>
+          <w:p>
+            <w:r>
+              <w:rPr>
+                <w:rFonts w:ascii="Times New Roman" w:hAnsi="Times New Roman"/>
+                <w:sz w:val="20"/>
+              </w:rPr>
+              <w:t>**TỔNG TOÀN BÀI**</w:t>
+            </w:r>
+          </w:p>
+        </w:tc>
+        <w:tc>
+          <w:tcPr>
+            <w:tcW w:type="dxa" w:w="1104"/>
+          </w:tcPr>
+          <w:p>
+            <w:r>
+              <w:rPr>
+                <w:rFonts w:ascii="Times New Roman" w:hAnsi="Times New Roman"/>
+                <w:sz w:val="20"/>
+              </w:rPr>
+              <w:t>**20 Slides**</w:t>
+            </w:r>
+          </w:p>
+        </w:tc>
+        <w:tc>
+          <w:tcPr>
+            <w:tcW w:type="dxa" w:w="1104"/>
+          </w:tcPr>
+          <w:p>
+            <w:r>
+              <w:rPr>
+                <w:rFonts w:ascii="Times New Roman" w:hAnsi="Times New Roman"/>
+                <w:sz w:val="20"/>
+              </w:rPr>
+              <w:t>**6 thành viên nói + Live Demo**</w:t>
+            </w:r>
+          </w:p>
+        </w:tc>
+        <w:tc>
+          <w:tcPr>
+            <w:tcW w:type="dxa" w:w="1104"/>
+          </w:tcPr>
+          <w:p>
+            <w:r>
+              <w:rPr>
+                <w:rFonts w:ascii="Times New Roman" w:hAnsi="Times New Roman"/>
+                <w:sz w:val="20"/>
+              </w:rPr>
+              <w:t>**15 phút 00s** *(900s)*</w:t>
+            </w:r>
+          </w:p>
+        </w:tc>
+        <w:tc>
+          <w:tcPr>
+            <w:tcW w:type="dxa" w:w="1104"/>
+          </w:tcPr>
+          <w:p>
+            <w:r>
+              <w:rPr>
+                <w:rFonts w:ascii="Times New Roman" w:hAnsi="Times New Roman"/>
+                <w:sz w:val="20"/>
+              </w:rPr>
+              <w:t>**23 phút 04s** *(1,384s)*</w:t>
+            </w:r>
+          </w:p>
+        </w:tc>
+        <w:tc>
+          <w:tcPr>
+            <w:tcW w:type="dxa" w:w="1104"/>
+          </w:tcPr>
+          <w:p>
+            <w:r>
+              <w:rPr>
+                <w:rFonts w:ascii="Times New Roman" w:hAnsi="Times New Roman"/>
+                <w:sz w:val="20"/>
+              </w:rPr>
+              <w:t>*~35m02s (Thuần nói)*</w:t>
+            </w:r>
+          </w:p>
+        </w:tc>
+        <w:tc>
+          <w:tcPr>
+            <w:tcW w:type="dxa" w:w="1104"/>
+          </w:tcPr>
+          <w:p>
+            <w:r>
+              <w:rPr>
+                <w:rFonts w:ascii="Times New Roman" w:hAnsi="Times New Roman"/>
+                <w:sz w:val="20"/>
+              </w:rPr>
+              <w:t>🔴 **VƯỢT +8m04s (+53%)**</w:t>
+            </w:r>
+          </w:p>
+        </w:tc>
+        <w:tc>
+          <w:tcPr>
+            <w:tcW w:type="dxa" w:w="1104"/>
+          </w:tcPr>
+          <w:p>
+            <w:r>
+              <w:rPr>
+                <w:rFonts w:ascii="Times New Roman" w:hAnsi="Times New Roman"/>
+                <w:sz w:val="20"/>
+              </w:rPr>
+              <w:t>❌ **CẦN NÓI Ý CHÍNH (INSIGHT), TUYỆT ĐỐI KHÔNG ĐỌC LẠI SLIDE!**</w:t>
             </w:r>
           </w:p>
         </w:tc>

</xml_diff>

<commit_message>
docs(slide): update slide 1 and 2 introduction and refine script formatting
</commit_message>
<xml_diff>
--- a/draft/fraud-detection/slide/scripts/SCRIPT_THUYET_TRINH_TOAN_TEAM_CS106.docx
+++ b/draft/fraud-detection/slide/scripts/SCRIPT_THUYET_TRINH_TOAN_TEAM_CS106.docx
@@ -664,3928 +664,6 @@
     </w:p>
     <w:p>
       <w:pPr>
-        <w:spacing w:before="80" w:after="80"/>
-      </w:pPr>
-    </w:p>
-    <w:p>
-      <w:pPr>
-        <w:pStyle w:val="Heading1"/>
-      </w:pPr>
-      <w:r>
-        <w:rPr>
-          <w:rFonts w:ascii="Times New Roman" w:hAnsi="Times New Roman"/>
-          <w:b/>
-          <w:color w:val="1F497D"/>
-          <w:sz w:val="28"/>
-        </w:rPr>
-        <w:t>👥 BẢNG PHÂN CÔNG THUYẾT TRÌNH &amp; THỜI LƯỢNG CHUẨN HÓA</w:t>
-      </w:r>
-    </w:p>
-    <w:p>
-      <w:r>
-        <w:rPr>
-          <w:rFonts w:ascii="Times New Roman" w:hAnsi="Times New Roman"/>
-        </w:rPr>
-      </w:r>
-      <w:r>
-        <w:rPr>
-          <w:rFonts w:ascii="Times New Roman" w:hAnsi="Times New Roman"/>
-          <w:i/>
-        </w:rPr>
-        <w:t>(Căn cứ phân công chính thức trong `AGENTS.md`, `plan.md` và thống nhất tại buổi họp 18/09/2026)</w:t>
-      </w:r>
-      <w:r>
-        <w:rPr>
-          <w:rFonts w:ascii="Times New Roman" w:hAnsi="Times New Roman"/>
-        </w:rPr>
-      </w:r>
-    </w:p>
-    <w:tbl>
-      <w:tblPr>
-        <w:tblStyle w:val="TableGrid"/>
-        <w:tblW w:type="auto" w:w="0"/>
-        <w:tblLook w:firstColumn="1" w:firstRow="1" w:lastColumn="0" w:lastRow="0" w:noHBand="0" w:noVBand="1" w:val="04A0"/>
-      </w:tblPr>
-      <w:tblGrid>
-        <w:gridCol w:w="1419"/>
-        <w:gridCol w:w="1419"/>
-        <w:gridCol w:w="1419"/>
-        <w:gridCol w:w="1419"/>
-        <w:gridCol w:w="1419"/>
-        <w:gridCol w:w="1419"/>
-        <w:gridCol w:w="1419"/>
-      </w:tblGrid>
-      <w:tr>
-        <w:tc>
-          <w:tcPr>
-            <w:tcW w:type="dxa" w:w="1419"/>
-            <w:shd w:fill="1F497D"/>
-          </w:tcPr>
-          <w:p>
-            <w:pPr>
-              <w:jc w:val="center"/>
-            </w:pPr>
-            <w:r>
-              <w:rPr>
-                <w:rFonts w:ascii="Times New Roman" w:hAnsi="Times New Roman"/>
-                <w:b/>
-                <w:color w:val="FFFFFF"/>
-              </w:rPr>
-              <w:t>STT</w:t>
-            </w:r>
-          </w:p>
-        </w:tc>
-        <w:tc>
-          <w:tcPr>
-            <w:tcW w:type="dxa" w:w="1419"/>
-            <w:shd w:fill="1F497D"/>
-          </w:tcPr>
-          <w:p>
-            <w:pPr>
-              <w:jc w:val="center"/>
-            </w:pPr>
-            <w:r>
-              <w:rPr>
-                <w:rFonts w:ascii="Times New Roman" w:hAnsi="Times New Roman"/>
-                <w:b/>
-                <w:color w:val="FFFFFF"/>
-              </w:rPr>
-              <w:t>Thành viên</w:t>
-            </w:r>
-          </w:p>
-        </w:tc>
-        <w:tc>
-          <w:tcPr>
-            <w:tcW w:type="dxa" w:w="1419"/>
-            <w:shd w:fill="1F497D"/>
-          </w:tcPr>
-          <w:p>
-            <w:pPr>
-              <w:jc w:val="center"/>
-            </w:pPr>
-            <w:r>
-              <w:rPr>
-                <w:rFonts w:ascii="Times New Roman" w:hAnsi="Times New Roman"/>
-                <w:b/>
-                <w:color w:val="FFFFFF"/>
-              </w:rPr>
-              <w:t>Task chính trong Đồ án</w:t>
-            </w:r>
-          </w:p>
-        </w:tc>
-        <w:tc>
-          <w:tcPr>
-            <w:tcW w:type="dxa" w:w="1419"/>
-            <w:shd w:fill="1F497D"/>
-          </w:tcPr>
-          <w:p>
-            <w:pPr>
-              <w:jc w:val="center"/>
-            </w:pPr>
-            <w:r>
-              <w:rPr>
-                <w:rFonts w:ascii="Times New Roman" w:hAnsi="Times New Roman"/>
-                <w:b/>
-                <w:color w:val="FFFFFF"/>
-              </w:rPr>
-              <w:t>Slide phụ trách</w:t>
-            </w:r>
-          </w:p>
-        </w:tc>
-        <w:tc>
-          <w:tcPr>
-            <w:tcW w:type="dxa" w:w="1419"/>
-            <w:shd w:fill="1F497D"/>
-          </w:tcPr>
-          <w:p>
-            <w:pPr>
-              <w:jc w:val="center"/>
-            </w:pPr>
-            <w:r>
-              <w:rPr>
-                <w:rFonts w:ascii="Times New Roman" w:hAnsi="Times New Roman"/>
-                <w:b/>
-                <w:color w:val="FFFFFF"/>
-              </w:rPr>
-              <w:t>Tốc độ thực tế (WPM)</w:t>
-            </w:r>
-          </w:p>
-        </w:tc>
-        <w:tc>
-          <w:tcPr>
-            <w:tcW w:type="dxa" w:w="1419"/>
-            <w:shd w:fill="1F497D"/>
-          </w:tcPr>
-          <w:p>
-            <w:pPr>
-              <w:jc w:val="center"/>
-            </w:pPr>
-            <w:r>
-              <w:rPr>
-                <w:rFonts w:ascii="Times New Roman" w:hAnsi="Times New Roman"/>
-                <w:b/>
-                <w:color w:val="FFFFFF"/>
-              </w:rPr>
-              <w:t>Thời lượng mục tiêu</w:t>
-            </w:r>
-          </w:p>
-        </w:tc>
-        <w:tc>
-          <w:tcPr>
-            <w:tcW w:type="dxa" w:w="1419"/>
-            <w:shd w:fill="1F497D"/>
-          </w:tcPr>
-          <w:p>
-            <w:pPr>
-              <w:jc w:val="center"/>
-            </w:pPr>
-            <w:r>
-              <w:rPr>
-                <w:rFonts w:ascii="Times New Roman" w:hAnsi="Times New Roman"/>
-                <w:b/>
-                <w:color w:val="FFFFFF"/>
-              </w:rPr>
-              <w:t>Nội dung thuyết trình phụ trách</w:t>
-            </w:r>
-          </w:p>
-        </w:tc>
-      </w:tr>
-      <w:tr>
-        <w:tc>
-          <w:tcPr>
-            <w:tcW w:type="dxa" w:w="1419"/>
-          </w:tcPr>
-          <w:p>
-            <w:r>
-              <w:rPr>
-                <w:rFonts w:ascii="Times New Roman" w:hAnsi="Times New Roman"/>
-                <w:sz w:val="20"/>
-              </w:rPr>
-              <w:t>1</w:t>
-            </w:r>
-          </w:p>
-        </w:tc>
-        <w:tc>
-          <w:tcPr>
-            <w:tcW w:type="dxa" w:w="1419"/>
-          </w:tcPr>
-          <w:p>
-            <w:r>
-              <w:rPr>
-                <w:rFonts w:ascii="Times New Roman" w:hAnsi="Times New Roman"/>
-                <w:sz w:val="20"/>
-              </w:rPr>
-              <w:t>**Trần Hoàng Hôn** *(26410046)*</w:t>
-            </w:r>
-          </w:p>
-        </w:tc>
-        <w:tc>
-          <w:tcPr>
-            <w:tcW w:type="dxa" w:w="1419"/>
-          </w:tcPr>
-          <w:p>
-            <w:r>
-              <w:rPr>
-                <w:rFonts w:ascii="Times New Roman" w:hAnsi="Times New Roman"/>
-                <w:sz w:val="20"/>
-              </w:rPr>
-              <w:t>**PM + PPT + Submit Package** *(Phase 07 &amp; 08)*</w:t>
-            </w:r>
-          </w:p>
-        </w:tc>
-        <w:tc>
-          <w:tcPr>
-            <w:tcW w:type="dxa" w:w="1419"/>
-          </w:tcPr>
-          <w:p>
-            <w:r>
-              <w:rPr>
-                <w:rFonts w:ascii="Times New Roman" w:hAnsi="Times New Roman"/>
-                <w:sz w:val="20"/>
-              </w:rPr>
-              <w:t>**Slide 1, 2, 21**</w:t>
-            </w:r>
-          </w:p>
-        </w:tc>
-        <w:tc>
-          <w:tcPr>
-            <w:tcW w:type="dxa" w:w="1419"/>
-          </w:tcPr>
-          <w:p>
-            <w:r>
-              <w:rPr>
-                <w:rFonts w:ascii="Times New Roman" w:hAnsi="Times New Roman"/>
-                <w:sz w:val="20"/>
-              </w:rPr>
-              <w:t>156.4 WPM</w:t>
-            </w:r>
-          </w:p>
-        </w:tc>
-        <w:tc>
-          <w:tcPr>
-            <w:tcW w:type="dxa" w:w="1419"/>
-          </w:tcPr>
-          <w:p>
-            <w:r>
-              <w:rPr>
-                <w:rFonts w:ascii="Times New Roman" w:hAnsi="Times New Roman"/>
-                <w:sz w:val="20"/>
-              </w:rPr>
-              <w:t>**~3m00s** (180s)</w:t>
-            </w:r>
-          </w:p>
-        </w:tc>
-        <w:tc>
-          <w:tcPr>
-            <w:tcW w:type="dxa" w:w="1419"/>
-          </w:tcPr>
-          <w:p>
-            <w:r>
-              <w:rPr>
-                <w:rFonts w:ascii="Times New Roman" w:hAnsi="Times New Roman"/>
-                <w:sz w:val="20"/>
-              </w:rPr>
-              <w:t>Mở đầu, Giới thiệu thành viên, Lộ trình báo cáo &amp; Tổng kết, Cảm ơn, Điều phối phiên Q&amp;A</w:t>
-            </w:r>
-          </w:p>
-        </w:tc>
-      </w:tr>
-      <w:tr>
-        <w:tc>
-          <w:tcPr>
-            <w:tcW w:type="dxa" w:w="1419"/>
-          </w:tcPr>
-          <w:p>
-            <w:r>
-              <w:rPr>
-                <w:rFonts w:ascii="Times New Roman" w:hAnsi="Times New Roman"/>
-                <w:sz w:val="20"/>
-              </w:rPr>
-              <w:t>2</w:t>
-            </w:r>
-          </w:p>
-        </w:tc>
-        <w:tc>
-          <w:tcPr>
-            <w:tcW w:type="dxa" w:w="1419"/>
-          </w:tcPr>
-          <w:p>
-            <w:r>
-              <w:rPr>
-                <w:rFonts w:ascii="Times New Roman" w:hAnsi="Times New Roman"/>
-                <w:sz w:val="20"/>
-              </w:rPr>
-              <w:t>**Đặng Chí Thanh** *(25730067)*</w:t>
-            </w:r>
-          </w:p>
-        </w:tc>
-        <w:tc>
-          <w:tcPr>
-            <w:tcW w:type="dxa" w:w="1419"/>
-          </w:tcPr>
-          <w:p>
-            <w:r>
-              <w:rPr>
-                <w:rFonts w:ascii="Times New Roman" w:hAnsi="Times New Roman"/>
-                <w:sz w:val="20"/>
-              </w:rPr>
-              <w:t>**EDA + Preprocessing + 14 Features** *(Phase 00 &amp; 01)*</w:t>
-            </w:r>
-          </w:p>
-        </w:tc>
-        <w:tc>
-          <w:tcPr>
-            <w:tcW w:type="dxa" w:w="1419"/>
-          </w:tcPr>
-          <w:p>
-            <w:r>
-              <w:rPr>
-                <w:rFonts w:ascii="Times New Roman" w:hAnsi="Times New Roman"/>
-                <w:sz w:val="20"/>
-              </w:rPr>
-              <w:t>**Slide 3, 4, 5, 6, 7, 8**</w:t>
-            </w:r>
-          </w:p>
-        </w:tc>
-        <w:tc>
-          <w:tcPr>
-            <w:tcW w:type="dxa" w:w="1419"/>
-          </w:tcPr>
-          <w:p>
-            <w:r>
-              <w:rPr>
-                <w:rFonts w:ascii="Times New Roman" w:hAnsi="Times New Roman"/>
-                <w:sz w:val="20"/>
-              </w:rPr>
-              <w:t>186.2 WPM</w:t>
-            </w:r>
-          </w:p>
-        </w:tc>
-        <w:tc>
-          <w:tcPr>
-            <w:tcW w:type="dxa" w:w="1419"/>
-          </w:tcPr>
-          <w:p>
-            <w:r>
-              <w:rPr>
-                <w:rFonts w:ascii="Times New Roman" w:hAnsi="Times New Roman"/>
-                <w:sz w:val="20"/>
-              </w:rPr>
-              <w:t>**~5m30s** (330s)</w:t>
-            </w:r>
-          </w:p>
-        </w:tc>
-        <w:tc>
-          <w:tcPr>
-            <w:tcW w:type="dxa" w:w="1419"/>
-          </w:tcPr>
-          <w:p>
-            <w:r>
-              <w:rPr>
-                <w:rFonts w:ascii="Times New Roman" w:hAnsi="Times New Roman"/>
-                <w:sz w:val="20"/>
-              </w:rPr>
-              <w:t>Phần 1: Bối cảnh, Thách thức Imbalance &amp; Dữ liệu PaySim.&lt;br&gt;Phần 2: Khám phá EDA, 3 Dấu vết hành vi &amp; Kỹ thuật 14 đặc trưng miền kế toán</w:t>
-            </w:r>
-          </w:p>
-        </w:tc>
-      </w:tr>
-      <w:tr>
-        <w:tc>
-          <w:tcPr>
-            <w:tcW w:type="dxa" w:w="1419"/>
-          </w:tcPr>
-          <w:p>
-            <w:r>
-              <w:rPr>
-                <w:rFonts w:ascii="Times New Roman" w:hAnsi="Times New Roman"/>
-                <w:sz w:val="20"/>
-              </w:rPr>
-              <w:t>3</w:t>
-            </w:r>
-          </w:p>
-        </w:tc>
-        <w:tc>
-          <w:tcPr>
-            <w:tcW w:type="dxa" w:w="1419"/>
-          </w:tcPr>
-          <w:p>
-            <w:r>
-              <w:rPr>
-                <w:rFonts w:ascii="Times New Roman" w:hAnsi="Times New Roman"/>
-                <w:sz w:val="20"/>
-              </w:rPr>
-              <w:t>**Hoàng Cao Sơn** *(25730061)*</w:t>
-            </w:r>
-          </w:p>
-        </w:tc>
-        <w:tc>
-          <w:tcPr>
-            <w:tcW w:type="dxa" w:w="1419"/>
-          </w:tcPr>
-          <w:p>
-            <w:r>
-              <w:rPr>
-                <w:rFonts w:ascii="Times New Roman" w:hAnsi="Times New Roman"/>
-                <w:sz w:val="20"/>
-              </w:rPr>
-              <w:t>**Imbalance (SMOTE/ADASYN) + Random Forest** *(Phase 02 &amp; 03)*</w:t>
-            </w:r>
-          </w:p>
-        </w:tc>
-        <w:tc>
-          <w:tcPr>
-            <w:tcW w:type="dxa" w:w="1419"/>
-          </w:tcPr>
-          <w:p>
-            <w:r>
-              <w:rPr>
-                <w:rFonts w:ascii="Times New Roman" w:hAnsi="Times New Roman"/>
-                <w:sz w:val="20"/>
-              </w:rPr>
-              <w:t>**Slide 9, 10, 11, 12 (phần RF)**</w:t>
-            </w:r>
-          </w:p>
-        </w:tc>
-        <w:tc>
-          <w:tcPr>
-            <w:tcW w:type="dxa" w:w="1419"/>
-          </w:tcPr>
-          <w:p>
-            <w:r>
-              <w:rPr>
-                <w:rFonts w:ascii="Times New Roman" w:hAnsi="Times New Roman"/>
-                <w:sz w:val="20"/>
-              </w:rPr>
-              <w:t>152.3 WPM</w:t>
-            </w:r>
-          </w:p>
-        </w:tc>
-        <w:tc>
-          <w:tcPr>
-            <w:tcW w:type="dxa" w:w="1419"/>
-          </w:tcPr>
-          <w:p>
-            <w:r>
-              <w:rPr>
-                <w:rFonts w:ascii="Times New Roman" w:hAnsi="Times New Roman"/>
-                <w:sz w:val="20"/>
-              </w:rPr>
-              <w:t>**~3m45s** (225s)</w:t>
-            </w:r>
-          </w:p>
-        </w:tc>
-        <w:tc>
-          <w:tcPr>
-            <w:tcW w:type="dxa" w:w="1419"/>
-          </w:tcPr>
-          <w:p>
-            <w:r>
-              <w:rPr>
-                <w:rFonts w:ascii="Times New Roman" w:hAnsi="Times New Roman"/>
-                <w:sz w:val="20"/>
-              </w:rPr>
-              <w:t>Phần 2: Xử lý mất cân bằng SMOTENC vs. ADASYN.&lt;br&gt;Phần 3: Kiến trúc Pipeline chuẩn Leak-Free (4 chốt chặn) &amp; Mô hình Random Forest</w:t>
-            </w:r>
-          </w:p>
-        </w:tc>
-      </w:tr>
-      <w:tr>
-        <w:tc>
-          <w:tcPr>
-            <w:tcW w:type="dxa" w:w="1419"/>
-          </w:tcPr>
-          <w:p>
-            <w:r>
-              <w:rPr>
-                <w:rFonts w:ascii="Times New Roman" w:hAnsi="Times New Roman"/>
-                <w:sz w:val="20"/>
-              </w:rPr>
-              <w:t>4</w:t>
-            </w:r>
-          </w:p>
-        </w:tc>
-        <w:tc>
-          <w:tcPr>
-            <w:tcW w:type="dxa" w:w="1419"/>
-          </w:tcPr>
-          <w:p>
-            <w:r>
-              <w:rPr>
-                <w:rFonts w:ascii="Times New Roman" w:hAnsi="Times New Roman"/>
-                <w:sz w:val="20"/>
-              </w:rPr>
-              <w:t>**Bùi Thị Mỷ Cẩm** *(25730013)*</w:t>
-            </w:r>
-          </w:p>
-        </w:tc>
-        <w:tc>
-          <w:tcPr>
-            <w:tcW w:type="dxa" w:w="1419"/>
-          </w:tcPr>
-          <w:p>
-            <w:r>
-              <w:rPr>
-                <w:rFonts w:ascii="Times New Roman" w:hAnsi="Times New Roman"/>
-                <w:sz w:val="20"/>
-              </w:rPr>
-              <w:t>**XGBoost + Deep Autoencoder** *(Phase 04)*</w:t>
-            </w:r>
-          </w:p>
-        </w:tc>
-        <w:tc>
-          <w:tcPr>
-            <w:tcW w:type="dxa" w:w="1419"/>
-          </w:tcPr>
-          <w:p>
-            <w:r>
-              <w:rPr>
-                <w:rFonts w:ascii="Times New Roman" w:hAnsi="Times New Roman"/>
-                <w:sz w:val="20"/>
-              </w:rPr>
-              <w:t>**Slide 12 (phần XGB), 13, 18**</w:t>
-            </w:r>
-          </w:p>
-        </w:tc>
-        <w:tc>
-          <w:tcPr>
-            <w:tcW w:type="dxa" w:w="1419"/>
-          </w:tcPr>
-          <w:p>
-            <w:r>
-              <w:rPr>
-                <w:rFonts w:ascii="Times New Roman" w:hAnsi="Times New Roman"/>
-                <w:sz w:val="20"/>
-              </w:rPr>
-              <w:t>135.5 WPM</w:t>
-            </w:r>
-          </w:p>
-        </w:tc>
-        <w:tc>
-          <w:tcPr>
-            <w:tcW w:type="dxa" w:w="1419"/>
-          </w:tcPr>
-          <w:p>
-            <w:r>
-              <w:rPr>
-                <w:rFonts w:ascii="Times New Roman" w:hAnsi="Times New Roman"/>
-                <w:sz w:val="20"/>
-              </w:rPr>
-              <w:t>**~3m55s** (235s)</w:t>
-            </w:r>
-          </w:p>
-        </w:tc>
-        <w:tc>
-          <w:tcPr>
-            <w:tcW w:type="dxa" w:w="1419"/>
-          </w:tcPr>
-          <w:p>
-            <w:r>
-              <w:rPr>
-                <w:rFonts w:ascii="Times New Roman" w:hAnsi="Times New Roman"/>
-                <w:sz w:val="20"/>
-              </w:rPr>
-              <w:t>Phần 3: Mô hình XGBoost siêu tốc (41.7s) &amp; Mô hình không giám sát Deep Autoencoder bắt Zero-Day.&lt;br&gt;Phần 4: Phân bố sai số tái tạo MSE &amp; Ngưỡng Anomaly</w:t>
-            </w:r>
-          </w:p>
-        </w:tc>
-      </w:tr>
-      <w:tr>
-        <w:tc>
-          <w:tcPr>
-            <w:tcW w:type="dxa" w:w="1419"/>
-          </w:tcPr>
-          <w:p>
-            <w:r>
-              <w:rPr>
-                <w:rFonts w:ascii="Times New Roman" w:hAnsi="Times New Roman"/>
-                <w:sz w:val="20"/>
-              </w:rPr>
-              <w:t>5</w:t>
-            </w:r>
-          </w:p>
-        </w:tc>
-        <w:tc>
-          <w:tcPr>
-            <w:tcW w:type="dxa" w:w="1419"/>
-          </w:tcPr>
-          <w:p>
-            <w:r>
-              <w:rPr>
-                <w:rFonts w:ascii="Times New Roman" w:hAnsi="Times New Roman"/>
-                <w:sz w:val="20"/>
-              </w:rPr>
-              <w:t>**Nguyễn Duy Khang** *(26410055)*</w:t>
-            </w:r>
-          </w:p>
-        </w:tc>
-        <w:tc>
-          <w:tcPr>
-            <w:tcW w:type="dxa" w:w="1419"/>
-          </w:tcPr>
-          <w:p>
-            <w:r>
-              <w:rPr>
-                <w:rFonts w:ascii="Times New Roman" w:hAnsi="Times New Roman"/>
-                <w:sz w:val="20"/>
-              </w:rPr>
-              <w:t>**Evaluation &amp; Cross-Model Comparison** *(Phase 05)*</w:t>
-            </w:r>
-          </w:p>
-        </w:tc>
-        <w:tc>
-          <w:tcPr>
-            <w:tcW w:type="dxa" w:w="1419"/>
-          </w:tcPr>
-          <w:p>
-            <w:r>
-              <w:rPr>
-                <w:rFonts w:ascii="Times New Roman" w:hAnsi="Times New Roman"/>
-                <w:sz w:val="20"/>
-              </w:rPr>
-              <w:t>**Slide 14, 15, 16, 17**</w:t>
-            </w:r>
-          </w:p>
-        </w:tc>
-        <w:tc>
-          <w:tcPr>
-            <w:tcW w:type="dxa" w:w="1419"/>
-          </w:tcPr>
-          <w:p>
-            <w:r>
-              <w:rPr>
-                <w:rFonts w:ascii="Times New Roman" w:hAnsi="Times New Roman"/>
-                <w:sz w:val="20"/>
-              </w:rPr>
-              <w:t>119.8 WPM</w:t>
-            </w:r>
-          </w:p>
-        </w:tc>
-        <w:tc>
-          <w:tcPr>
-            <w:tcW w:type="dxa" w:w="1419"/>
-          </w:tcPr>
-          <w:p>
-            <w:r>
-              <w:rPr>
-                <w:rFonts w:ascii="Times New Roman" w:hAnsi="Times New Roman"/>
-                <w:sz w:val="20"/>
-              </w:rPr>
-              <w:t>**~4m30s** (270s)</w:t>
-            </w:r>
-          </w:p>
-        </w:tc>
-        <w:tc>
-          <w:tcPr>
-            <w:tcW w:type="dxa" w:w="1419"/>
-          </w:tcPr>
-          <w:p>
-            <w:r>
-              <w:rPr>
-                <w:rFonts w:ascii="Times New Roman" w:hAnsi="Times New Roman"/>
-                <w:sz w:val="20"/>
-              </w:rPr>
-              <w:t>Phần 4: Nghiệm thu thực nghiệm, Đối chuẩn đa chỉ số Benchmark, Phân tích Ma trận nhầm lẫn &amp; Feature Importance (97.1%)</w:t>
-            </w:r>
-          </w:p>
-        </w:tc>
-      </w:tr>
-      <w:tr>
-        <w:tc>
-          <w:tcPr>
-            <w:tcW w:type="dxa" w:w="1419"/>
-          </w:tcPr>
-          <w:p>
-            <w:r>
-              <w:rPr>
-                <w:rFonts w:ascii="Times New Roman" w:hAnsi="Times New Roman"/>
-                <w:sz w:val="20"/>
-              </w:rPr>
-              <w:t>6</w:t>
-            </w:r>
-          </w:p>
-        </w:tc>
-        <w:tc>
-          <w:tcPr>
-            <w:tcW w:type="dxa" w:w="1419"/>
-          </w:tcPr>
-          <w:p>
-            <w:r>
-              <w:rPr>
-                <w:rFonts w:ascii="Times New Roman" w:hAnsi="Times New Roman"/>
-                <w:sz w:val="20"/>
-              </w:rPr>
-              <w:t>**Vũ Văn Duy** *(26410031)*</w:t>
-            </w:r>
-          </w:p>
-        </w:tc>
-        <w:tc>
-          <w:tcPr>
-            <w:tcW w:type="dxa" w:w="1419"/>
-          </w:tcPr>
-          <w:p>
-            <w:r>
-              <w:rPr>
-                <w:rFonts w:ascii="Times New Roman" w:hAnsi="Times New Roman"/>
-                <w:sz w:val="20"/>
-              </w:rPr>
-              <w:t>**Báo cáo Word + Test Scenarios** *(Phase 07)*</w:t>
-            </w:r>
-          </w:p>
-        </w:tc>
-        <w:tc>
-          <w:tcPr>
-            <w:tcW w:type="dxa" w:w="1419"/>
-          </w:tcPr>
-          <w:p>
-            <w:r>
-              <w:rPr>
-                <w:rFonts w:ascii="Times New Roman" w:hAnsi="Times New Roman"/>
-                <w:sz w:val="20"/>
-              </w:rPr>
-              <w:t>**Slide 20 (Phần Test Cases)**</w:t>
-            </w:r>
-          </w:p>
-        </w:tc>
-        <w:tc>
-          <w:tcPr>
-            <w:tcW w:type="dxa" w:w="1419"/>
-          </w:tcPr>
-          <w:p>
-            <w:r>
-              <w:rPr>
-                <w:rFonts w:ascii="Times New Roman" w:hAnsi="Times New Roman"/>
-                <w:sz w:val="20"/>
-              </w:rPr>
-              <w:t>~115.0 WPM</w:t>
-            </w:r>
-          </w:p>
-        </w:tc>
-        <w:tc>
-          <w:tcPr>
-            <w:tcW w:type="dxa" w:w="1419"/>
-          </w:tcPr>
-          <w:p>
-            <w:r>
-              <w:rPr>
-                <w:rFonts w:ascii="Times New Roman" w:hAnsi="Times New Roman"/>
-                <w:sz w:val="20"/>
-              </w:rPr>
-              <w:t>**~1m25s** (85s)</w:t>
-            </w:r>
-          </w:p>
-        </w:tc>
-        <w:tc>
-          <w:tcPr>
-            <w:tcW w:type="dxa" w:w="1419"/>
-          </w:tcPr>
-          <w:p>
-            <w:r>
-              <w:rPr>
-                <w:rFonts w:ascii="Times New Roman" w:hAnsi="Times New Roman"/>
-                <w:sz w:val="20"/>
-              </w:rPr>
-              <w:t>Phần 5: Trình bày chi tiết 3 Kịch bản Kiểm thử Thực tế (Giao dịch an toàn, Gian lận rút cạn, Bất thường Zero-Day) trước khi Demo</w:t>
-            </w:r>
-          </w:p>
-        </w:tc>
-      </w:tr>
-      <w:tr>
-        <w:tc>
-          <w:tcPr>
-            <w:tcW w:type="dxa" w:w="1419"/>
-          </w:tcPr>
-          <w:p>
-            <w:r>
-              <w:rPr>
-                <w:rFonts w:ascii="Times New Roman" w:hAnsi="Times New Roman"/>
-                <w:sz w:val="20"/>
-              </w:rPr>
-              <w:t>7</w:t>
-            </w:r>
-          </w:p>
-        </w:tc>
-        <w:tc>
-          <w:tcPr>
-            <w:tcW w:type="dxa" w:w="1419"/>
-          </w:tcPr>
-          <w:p>
-            <w:r>
-              <w:rPr>
-                <w:rFonts w:ascii="Times New Roman" w:hAnsi="Times New Roman"/>
-                <w:sz w:val="20"/>
-              </w:rPr>
-              <w:t>**Phạm Thành Trung** *(26410141)*</w:t>
-            </w:r>
-          </w:p>
-        </w:tc>
-        <w:tc>
-          <w:tcPr>
-            <w:tcW w:type="dxa" w:w="1419"/>
-          </w:tcPr>
-          <w:p>
-            <w:r>
-              <w:rPr>
-                <w:rFonts w:ascii="Times New Roman" w:hAnsi="Times New Roman"/>
-                <w:sz w:val="20"/>
-              </w:rPr>
-              <w:t>**Demo UI Streamlit + Video Clip** *(Phase 06)*</w:t>
-            </w:r>
-          </w:p>
-        </w:tc>
-        <w:tc>
-          <w:tcPr>
-            <w:tcW w:type="dxa" w:w="1419"/>
-          </w:tcPr>
-          <w:p>
-            <w:r>
-              <w:rPr>
-                <w:rFonts w:ascii="Times New Roman" w:hAnsi="Times New Roman"/>
-                <w:sz w:val="20"/>
-              </w:rPr>
-              <w:t>**Slide 19, 20 (Live Demo &amp; Đóng góp)**</w:t>
-            </w:r>
-          </w:p>
-        </w:tc>
-        <w:tc>
-          <w:tcPr>
-            <w:tcW w:type="dxa" w:w="1419"/>
-          </w:tcPr>
-          <w:p>
-            <w:r>
-              <w:rPr>
-                <w:rFonts w:ascii="Times New Roman" w:hAnsi="Times New Roman"/>
-                <w:sz w:val="20"/>
-              </w:rPr>
-              <w:t>147.0 WPM</w:t>
-            </w:r>
-          </w:p>
-        </w:tc>
-        <w:tc>
-          <w:tcPr>
-            <w:tcW w:type="dxa" w:w="1419"/>
-          </w:tcPr>
-          <w:p>
-            <w:r>
-              <w:rPr>
-                <w:rFonts w:ascii="Times New Roman" w:hAnsi="Times New Roman"/>
-                <w:sz w:val="20"/>
-              </w:rPr>
-              <w:t>**~3m20s** (200s)</w:t>
-            </w:r>
-          </w:p>
-        </w:tc>
-        <w:tc>
-          <w:tcPr>
-            <w:tcW w:type="dxa" w:w="1419"/>
-          </w:tcPr>
-          <w:p>
-            <w:r>
-              <w:rPr>
-                <w:rFonts w:ascii="Times New Roman" w:hAnsi="Times New Roman"/>
-                <w:sz w:val="20"/>
-              </w:rPr>
-              <w:t>Phần 5: Chuyển giao màn hình, thao tác Trực tiếp Live Demo Streamlit Dashboard theo 3 kịch bản, 3 góc nhìn trực quan, phân tích lịch sử &amp; Tổng kết 4 đóng góp</w:t>
-            </w:r>
-          </w:p>
-        </w:tc>
-      </w:tr>
-    </w:tbl>
-    <w:p/>
-    <w:p>
-      <w:pPr>
-        <w:spacing w:before="80" w:after="80"/>
-      </w:pPr>
-    </w:p>
-    <w:p>
-      <w:pPr>
-        <w:pStyle w:val="Heading1"/>
-      </w:pPr>
-      <w:r>
-        <w:rPr>
-          <w:rFonts w:ascii="Times New Roman" w:hAnsi="Times New Roman"/>
-          <w:b/>
-          <w:color w:val="1F497D"/>
-          <w:sz w:val="28"/>
-        </w:rPr>
-        <w:t>📊 BẢNG ĐỐI CHUẨN THỜI LƯỢNG CHI TIẾT TỪNG SLIDE (THEO DỮ LIỆU THỰC TẾ)</w:t>
-      </w:r>
-    </w:p>
-    <w:tbl>
-      <w:tblPr>
-        <w:tblStyle w:val="TableGrid"/>
-        <w:tblW w:type="auto" w:w="0"/>
-        <w:tblLook w:firstColumn="1" w:firstRow="1" w:lastColumn="0" w:lastRow="0" w:noHBand="0" w:noVBand="1" w:val="04A0"/>
-      </w:tblPr>
-      <w:tblGrid>
-        <w:gridCol w:w="1104"/>
-        <w:gridCol w:w="1104"/>
-        <w:gridCol w:w="1104"/>
-        <w:gridCol w:w="1104"/>
-        <w:gridCol w:w="1104"/>
-        <w:gridCol w:w="1104"/>
-        <w:gridCol w:w="1104"/>
-        <w:gridCol w:w="1104"/>
-        <w:gridCol w:w="1104"/>
-      </w:tblGrid>
-      <w:tr>
-        <w:tc>
-          <w:tcPr>
-            <w:tcW w:type="dxa" w:w="1104"/>
-            <w:shd w:fill="1F497D"/>
-          </w:tcPr>
-          <w:p>
-            <w:pPr>
-              <w:jc w:val="center"/>
-            </w:pPr>
-            <w:r>
-              <w:rPr>
-                <w:rFonts w:ascii="Times New Roman" w:hAnsi="Times New Roman"/>
-                <w:b/>
-                <w:color w:val="FFFFFF"/>
-              </w:rPr>
-              <w:t>Slide</w:t>
-            </w:r>
-          </w:p>
-        </w:tc>
-        <w:tc>
-          <w:tcPr>
-            <w:tcW w:type="dxa" w:w="1104"/>
-            <w:shd w:fill="1F497D"/>
-          </w:tcPr>
-          <w:p>
-            <w:pPr>
-              <w:jc w:val="center"/>
-            </w:pPr>
-            <w:r>
-              <w:rPr>
-                <w:rFonts w:ascii="Times New Roman" w:hAnsi="Times New Roman"/>
-                <w:b/>
-                <w:color w:val="FFFFFF"/>
-              </w:rPr>
-              <w:t>Tiêu đề Slide</w:t>
-            </w:r>
-          </w:p>
-        </w:tc>
-        <w:tc>
-          <w:tcPr>
-            <w:tcW w:type="dxa" w:w="1104"/>
-            <w:shd w:fill="1F497D"/>
-          </w:tcPr>
-          <w:p>
-            <w:pPr>
-              <w:jc w:val="center"/>
-            </w:pPr>
-            <w:r>
-              <w:rPr>
-                <w:rFonts w:ascii="Times New Roman" w:hAnsi="Times New Roman"/>
-                <w:b/>
-                <w:color w:val="FFFFFF"/>
-              </w:rPr>
-              <w:t>Người nói</w:t>
-            </w:r>
-          </w:p>
-        </w:tc>
-        <w:tc>
-          <w:tcPr>
-            <w:tcW w:type="dxa" w:w="1104"/>
-            <w:shd w:fill="1F497D"/>
-          </w:tcPr>
-          <w:p>
-            <w:pPr>
-              <w:jc w:val="center"/>
-            </w:pPr>
-            <w:r>
-              <w:rPr>
-                <w:rFonts w:ascii="Times New Roman" w:hAnsi="Times New Roman"/>
-                <w:b/>
-                <w:color w:val="FFFFFF"/>
-              </w:rPr>
-              <w:t>Số từ Script</w:t>
-            </w:r>
-          </w:p>
-        </w:tc>
-        <w:tc>
-          <w:tcPr>
-            <w:tcW w:type="dxa" w:w="1104"/>
-            <w:shd w:fill="1F497D"/>
-          </w:tcPr>
-          <w:p>
-            <w:pPr>
-              <w:jc w:val="center"/>
-            </w:pPr>
-            <w:r>
-              <w:rPr>
-                <w:rFonts w:ascii="Times New Roman" w:hAnsi="Times New Roman"/>
-                <w:b/>
-                <w:color w:val="FFFFFF"/>
-              </w:rPr>
-              <w:t>Tốc độ đo được</w:t>
-            </w:r>
-          </w:p>
-        </w:tc>
-        <w:tc>
-          <w:tcPr>
-            <w:tcW w:type="dxa" w:w="1104"/>
-            <w:shd w:fill="1F497D"/>
-          </w:tcPr>
-          <w:p>
-            <w:pPr>
-              <w:jc w:val="center"/>
-            </w:pPr>
-            <w:r>
-              <w:rPr>
-                <w:rFonts w:ascii="Times New Roman" w:hAnsi="Times New Roman"/>
-                <w:b/>
-                <w:color w:val="FFFFFF"/>
-              </w:rPr>
-              <w:t>Thời lượng cũ (bản nháp)</w:t>
-            </w:r>
-          </w:p>
-        </w:tc>
-        <w:tc>
-          <w:tcPr>
-            <w:tcW w:type="dxa" w:w="1104"/>
-            <w:shd w:fill="1F497D"/>
-          </w:tcPr>
-          <w:p>
-            <w:pPr>
-              <w:jc w:val="center"/>
-            </w:pPr>
-            <w:r>
-              <w:rPr>
-                <w:rFonts w:ascii="Times New Roman" w:hAnsi="Times New Roman"/>
-                <w:b/>
-                <w:color w:val="FFFFFF"/>
-              </w:rPr>
-              <w:t>Thực tế chạy thử trong Meeting</w:t>
-            </w:r>
-          </w:p>
-        </w:tc>
-        <w:tc>
-          <w:tcPr>
-            <w:tcW w:type="dxa" w:w="1104"/>
-            <w:shd w:fill="1F497D"/>
-          </w:tcPr>
-          <w:p>
-            <w:pPr>
-              <w:jc w:val="center"/>
-            </w:pPr>
-            <w:r>
-              <w:rPr>
-                <w:rFonts w:ascii="Times New Roman" w:hAnsi="Times New Roman"/>
-                <w:b/>
-                <w:color w:val="FFFFFF"/>
-              </w:rPr>
-              <w:t>Thời lượng chuẩn hóa mục tiêu</w:t>
-            </w:r>
-          </w:p>
-        </w:tc>
-        <w:tc>
-          <w:tcPr>
-            <w:tcW w:type="dxa" w:w="1104"/>
-            <w:shd w:fill="1F497D"/>
-          </w:tcPr>
-          <w:p>
-            <w:pPr>
-              <w:jc w:val="center"/>
-            </w:pPr>
-            <w:r>
-              <w:rPr>
-                <w:rFonts w:ascii="Times New Roman" w:hAnsi="Times New Roman"/>
-                <w:b/>
-                <w:color w:val="FFFFFF"/>
-              </w:rPr>
-              <w:t>Ghi chú &amp; Rút kinh nghiệm từ Cuộc họp</w:t>
-            </w:r>
-          </w:p>
-        </w:tc>
-      </w:tr>
-      <w:tr>
-        <w:tc>
-          <w:tcPr>
-            <w:tcW w:type="dxa" w:w="1104"/>
-          </w:tcPr>
-          <w:p>
-            <w:r>
-              <w:rPr>
-                <w:rFonts w:ascii="Times New Roman" w:hAnsi="Times New Roman"/>
-                <w:sz w:val="20"/>
-              </w:rPr>
-              <w:t>**01**</w:t>
-            </w:r>
-          </w:p>
-        </w:tc>
-        <w:tc>
-          <w:tcPr>
-            <w:tcW w:type="dxa" w:w="1104"/>
-          </w:tcPr>
-          <w:p>
-            <w:r>
-              <w:rPr>
-                <w:rFonts w:ascii="Times New Roman" w:hAnsi="Times New Roman"/>
-                <w:sz w:val="20"/>
-              </w:rPr>
-              <w:t>Tiêu đề &amp; Giới thiệu thành viên</w:t>
-            </w:r>
-          </w:p>
-        </w:tc>
-        <w:tc>
-          <w:tcPr>
-            <w:tcW w:type="dxa" w:w="1104"/>
-          </w:tcPr>
-          <w:p>
-            <w:r>
-              <w:rPr>
-                <w:rFonts w:ascii="Times New Roman" w:hAnsi="Times New Roman"/>
-                <w:sz w:val="20"/>
-              </w:rPr>
-              <w:t>Trần Hoàng Hôn</w:t>
-            </w:r>
-          </w:p>
-        </w:tc>
-        <w:tc>
-          <w:tcPr>
-            <w:tcW w:type="dxa" w:w="1104"/>
-          </w:tcPr>
-          <w:p>
-            <w:r>
-              <w:rPr>
-                <w:rFonts w:ascii="Times New Roman" w:hAnsi="Times New Roman"/>
-                <w:sz w:val="20"/>
-              </w:rPr>
-              <w:t>243 từ</w:t>
-            </w:r>
-          </w:p>
-        </w:tc>
-        <w:tc>
-          <w:tcPr>
-            <w:tcW w:type="dxa" w:w="1104"/>
-          </w:tcPr>
-          <w:p>
-            <w:r>
-              <w:rPr>
-                <w:rFonts w:ascii="Times New Roman" w:hAnsi="Times New Roman"/>
-                <w:sz w:val="20"/>
-              </w:rPr>
-              <w:t>156.4 WPM</w:t>
-            </w:r>
-          </w:p>
-        </w:tc>
-        <w:tc>
-          <w:tcPr>
-            <w:tcW w:type="dxa" w:w="1104"/>
-          </w:tcPr>
-          <w:p>
-            <w:r>
-              <w:rPr>
-                <w:rFonts w:ascii="Times New Roman" w:hAnsi="Times New Roman"/>
-                <w:sz w:val="20"/>
-              </w:rPr>
-              <w:t>~60s</w:t>
-            </w:r>
-          </w:p>
-        </w:tc>
-        <w:tc>
-          <w:tcPr>
-            <w:tcW w:type="dxa" w:w="1104"/>
-          </w:tcPr>
-          <w:p>
-            <w:r>
-              <w:rPr>
-                <w:rFonts w:ascii="Times New Roman" w:hAnsi="Times New Roman"/>
-                <w:sz w:val="20"/>
-              </w:rPr>
-              <w:t>*110s (chung S1-S2: 196s)*</w:t>
-            </w:r>
-          </w:p>
-        </w:tc>
-        <w:tc>
-          <w:tcPr>
-            <w:tcW w:type="dxa" w:w="1104"/>
-          </w:tcPr>
-          <w:p>
-            <w:r>
-              <w:rPr>
-                <w:rFonts w:ascii="Times New Roman" w:hAnsi="Times New Roman"/>
-                <w:sz w:val="20"/>
-              </w:rPr>
-              <w:t>**~95s – 100s** (~1m35s)</w:t>
-            </w:r>
-          </w:p>
-        </w:tc>
-        <w:tc>
-          <w:tcPr>
-            <w:tcW w:type="dxa" w:w="1104"/>
-          </w:tcPr>
-          <w:p>
-            <w:r>
-              <w:rPr>
-                <w:rFonts w:ascii="Times New Roman" w:hAnsi="Times New Roman"/>
-                <w:sz w:val="20"/>
-              </w:rPr>
-              <w:t>Giới thiệu 7 thành viên mạch lạc, phát âm chuẩn tên và nhiệm vụ</w:t>
-            </w:r>
-          </w:p>
-        </w:tc>
-      </w:tr>
-      <w:tr>
-        <w:tc>
-          <w:tcPr>
-            <w:tcW w:type="dxa" w:w="1104"/>
-          </w:tcPr>
-          <w:p>
-            <w:r>
-              <w:rPr>
-                <w:rFonts w:ascii="Times New Roman" w:hAnsi="Times New Roman"/>
-                <w:sz w:val="20"/>
-              </w:rPr>
-              <w:t>**02**</w:t>
-            </w:r>
-          </w:p>
-        </w:tc>
-        <w:tc>
-          <w:tcPr>
-            <w:tcW w:type="dxa" w:w="1104"/>
-          </w:tcPr>
-          <w:p>
-            <w:r>
-              <w:rPr>
-                <w:rFonts w:ascii="Times New Roman" w:hAnsi="Times New Roman"/>
-                <w:sz w:val="20"/>
-              </w:rPr>
-              <w:t>Nội dung báo cáo &amp; Lộ trình (Agenda)</w:t>
-            </w:r>
-          </w:p>
-        </w:tc>
-        <w:tc>
-          <w:tcPr>
-            <w:tcW w:type="dxa" w:w="1104"/>
-          </w:tcPr>
-          <w:p>
-            <w:r>
-              <w:rPr>
-                <w:rFonts w:ascii="Times New Roman" w:hAnsi="Times New Roman"/>
-                <w:sz w:val="20"/>
-              </w:rPr>
-              <w:t>Trần Hoàng Hôn</w:t>
-            </w:r>
-          </w:p>
-        </w:tc>
-        <w:tc>
-          <w:tcPr>
-            <w:tcW w:type="dxa" w:w="1104"/>
-          </w:tcPr>
-          <w:p>
-            <w:r>
-              <w:rPr>
-                <w:rFonts w:ascii="Times New Roman" w:hAnsi="Times New Roman"/>
-                <w:sz w:val="20"/>
-              </w:rPr>
-              <w:t>157 từ</w:t>
-            </w:r>
-          </w:p>
-        </w:tc>
-        <w:tc>
-          <w:tcPr>
-            <w:tcW w:type="dxa" w:w="1104"/>
-          </w:tcPr>
-          <w:p>
-            <w:r>
-              <w:rPr>
-                <w:rFonts w:ascii="Times New Roman" w:hAnsi="Times New Roman"/>
-                <w:sz w:val="20"/>
-              </w:rPr>
-              <w:t>156.4 WPM</w:t>
-            </w:r>
-          </w:p>
-        </w:tc>
-        <w:tc>
-          <w:tcPr>
-            <w:tcW w:type="dxa" w:w="1104"/>
-          </w:tcPr>
-          <w:p>
-            <w:r>
-              <w:rPr>
-                <w:rFonts w:ascii="Times New Roman" w:hAnsi="Times New Roman"/>
-                <w:sz w:val="20"/>
-              </w:rPr>
-              <w:t>~40s</w:t>
-            </w:r>
-          </w:p>
-        </w:tc>
-        <w:tc>
-          <w:tcPr>
-            <w:tcW w:type="dxa" w:w="1104"/>
-          </w:tcPr>
-          <w:p>
-            <w:r>
-              <w:rPr>
-                <w:rFonts w:ascii="Times New Roman" w:hAnsi="Times New Roman"/>
-                <w:sz w:val="20"/>
-              </w:rPr>
-              <w:t>*86s*</w:t>
-            </w:r>
-          </w:p>
-        </w:tc>
-        <w:tc>
-          <w:tcPr>
-            <w:tcW w:type="dxa" w:w="1104"/>
-          </w:tcPr>
-          <w:p>
-            <w:r>
-              <w:rPr>
-                <w:rFonts w:ascii="Times New Roman" w:hAnsi="Times New Roman"/>
-                <w:sz w:val="20"/>
-              </w:rPr>
-              <w:t>**~60s – 65s** (~1m00s)</w:t>
-            </w:r>
-          </w:p>
-        </w:tc>
-        <w:tc>
-          <w:tcPr>
-            <w:tcW w:type="dxa" w:w="1104"/>
-          </w:tcPr>
-          <w:p>
-            <w:r>
-              <w:rPr>
-                <w:rFonts w:ascii="Times New Roman" w:hAnsi="Times New Roman"/>
-                <w:sz w:val="20"/>
-              </w:rPr>
-              <w:t>Đi nhanh 5 phần chính, chuyển giao dứt khoát cho Thanh</w:t>
-            </w:r>
-          </w:p>
-        </w:tc>
-      </w:tr>
-      <w:tr>
-        <w:tc>
-          <w:tcPr>
-            <w:tcW w:type="dxa" w:w="1104"/>
-          </w:tcPr>
-          <w:p>
-            <w:r>
-              <w:rPr>
-                <w:rFonts w:ascii="Times New Roman" w:hAnsi="Times New Roman"/>
-                <w:sz w:val="20"/>
-              </w:rPr>
-              <w:t>**03**</w:t>
-            </w:r>
-          </w:p>
-        </w:tc>
-        <w:tc>
-          <w:tcPr>
-            <w:tcW w:type="dxa" w:w="1104"/>
-          </w:tcPr>
-          <w:p>
-            <w:r>
-              <w:rPr>
-                <w:rFonts w:ascii="Times New Roman" w:hAnsi="Times New Roman"/>
-                <w:sz w:val="20"/>
-              </w:rPr>
-              <w:t>Phần 1: Tổng quan đề tài &amp; Dữ liệu</w:t>
-            </w:r>
-          </w:p>
-        </w:tc>
-        <w:tc>
-          <w:tcPr>
-            <w:tcW w:type="dxa" w:w="1104"/>
-          </w:tcPr>
-          <w:p>
-            <w:r>
-              <w:rPr>
-                <w:rFonts w:ascii="Times New Roman" w:hAnsi="Times New Roman"/>
-                <w:sz w:val="20"/>
-              </w:rPr>
-              <w:t>Đặng Chí Thanh</w:t>
-            </w:r>
-          </w:p>
-        </w:tc>
-        <w:tc>
-          <w:tcPr>
-            <w:tcW w:type="dxa" w:w="1104"/>
-          </w:tcPr>
-          <w:p>
-            <w:r>
-              <w:rPr>
-                <w:rFonts w:ascii="Times New Roman" w:hAnsi="Times New Roman"/>
-                <w:sz w:val="20"/>
-              </w:rPr>
-              <w:t>48 từ</w:t>
-            </w:r>
-          </w:p>
-        </w:tc>
-        <w:tc>
-          <w:tcPr>
-            <w:tcW w:type="dxa" w:w="1104"/>
-          </w:tcPr>
-          <w:p>
-            <w:r>
-              <w:rPr>
-                <w:rFonts w:ascii="Times New Roman" w:hAnsi="Times New Roman"/>
-                <w:sz w:val="20"/>
-              </w:rPr>
-              <w:t>186.2 WPM</w:t>
-            </w:r>
-          </w:p>
-        </w:tc>
-        <w:tc>
-          <w:tcPr>
-            <w:tcW w:type="dxa" w:w="1104"/>
-          </w:tcPr>
-          <w:p>
-            <w:r>
-              <w:rPr>
-                <w:rFonts w:ascii="Times New Roman" w:hAnsi="Times New Roman"/>
-                <w:sz w:val="20"/>
-              </w:rPr>
-              <w:t>~10s</w:t>
-            </w:r>
-          </w:p>
-        </w:tc>
-        <w:tc>
-          <w:tcPr>
-            <w:tcW w:type="dxa" w:w="1104"/>
-          </w:tcPr>
-          <w:p>
-            <w:r>
-              <w:rPr>
-                <w:rFonts w:ascii="Times New Roman" w:hAnsi="Times New Roman"/>
-                <w:sz w:val="20"/>
-              </w:rPr>
-              <w:t>*15s*</w:t>
-            </w:r>
-          </w:p>
-        </w:tc>
-        <w:tc>
-          <w:tcPr>
-            <w:tcW w:type="dxa" w:w="1104"/>
-          </w:tcPr>
-          <w:p>
-            <w:r>
-              <w:rPr>
-                <w:rFonts w:ascii="Times New Roman" w:hAnsi="Times New Roman"/>
-                <w:sz w:val="20"/>
-              </w:rPr>
-              <w:t>**~15s**</w:t>
-            </w:r>
-          </w:p>
-        </w:tc>
-        <w:tc>
-          <w:tcPr>
-            <w:tcW w:type="dxa" w:w="1104"/>
-          </w:tcPr>
-          <w:p>
-            <w:r>
-              <w:rPr>
-                <w:rFonts w:ascii="Times New Roman" w:hAnsi="Times New Roman"/>
-                <w:sz w:val="20"/>
-              </w:rPr>
-              <w:t>Lời chào và mở đầu Phần 1 ngắn gọn, dứt khoát</w:t>
-            </w:r>
-          </w:p>
-        </w:tc>
-      </w:tr>
-      <w:tr>
-        <w:tc>
-          <w:tcPr>
-            <w:tcW w:type="dxa" w:w="1104"/>
-          </w:tcPr>
-          <w:p>
-            <w:r>
-              <w:rPr>
-                <w:rFonts w:ascii="Times New Roman" w:hAnsi="Times New Roman"/>
-                <w:sz w:val="20"/>
-              </w:rPr>
-              <w:t>**04**</w:t>
-            </w:r>
-          </w:p>
-        </w:tc>
-        <w:tc>
-          <w:tcPr>
-            <w:tcW w:type="dxa" w:w="1104"/>
-          </w:tcPr>
-          <w:p>
-            <w:r>
-              <w:rPr>
-                <w:rFonts w:ascii="Times New Roman" w:hAnsi="Times New Roman"/>
-                <w:sz w:val="20"/>
-              </w:rPr>
-              <w:t>Động lực nghiên cứu &amp; Thách thức kỹ thuật</w:t>
-            </w:r>
-          </w:p>
-        </w:tc>
-        <w:tc>
-          <w:tcPr>
-            <w:tcW w:type="dxa" w:w="1104"/>
-          </w:tcPr>
-          <w:p>
-            <w:r>
-              <w:rPr>
-                <w:rFonts w:ascii="Times New Roman" w:hAnsi="Times New Roman"/>
-                <w:sz w:val="20"/>
-              </w:rPr>
-              <w:t>Đặng Chí Thanh</w:t>
-            </w:r>
-          </w:p>
-        </w:tc>
-        <w:tc>
-          <w:tcPr>
-            <w:tcW w:type="dxa" w:w="1104"/>
-          </w:tcPr>
-          <w:p>
-            <w:r>
-              <w:rPr>
-                <w:rFonts w:ascii="Times New Roman" w:hAnsi="Times New Roman"/>
-                <w:sz w:val="20"/>
-              </w:rPr>
-              <w:t>301 từ</w:t>
-            </w:r>
-          </w:p>
-        </w:tc>
-        <w:tc>
-          <w:tcPr>
-            <w:tcW w:type="dxa" w:w="1104"/>
-          </w:tcPr>
-          <w:p>
-            <w:r>
-              <w:rPr>
-                <w:rFonts w:ascii="Times New Roman" w:hAnsi="Times New Roman"/>
-                <w:sz w:val="20"/>
-              </w:rPr>
-              <w:t>186.2 WPM</w:t>
-            </w:r>
-          </w:p>
-        </w:tc>
-        <w:tc>
-          <w:tcPr>
-            <w:tcW w:type="dxa" w:w="1104"/>
-          </w:tcPr>
-          <w:p>
-            <w:r>
-              <w:rPr>
-                <w:rFonts w:ascii="Times New Roman" w:hAnsi="Times New Roman"/>
-                <w:sz w:val="20"/>
-              </w:rPr>
-              <w:t>~60s</w:t>
-            </w:r>
-          </w:p>
-        </w:tc>
-        <w:tc>
-          <w:tcPr>
-            <w:tcW w:type="dxa" w:w="1104"/>
-          </w:tcPr>
-          <w:p>
-            <w:r>
-              <w:rPr>
-                <w:rFonts w:ascii="Times New Roman" w:hAnsi="Times New Roman"/>
-                <w:sz w:val="20"/>
-              </w:rPr>
-              <w:t>*118s*</w:t>
-            </w:r>
-          </w:p>
-        </w:tc>
-        <w:tc>
-          <w:tcPr>
-            <w:tcW w:type="dxa" w:w="1104"/>
-          </w:tcPr>
-          <w:p>
-            <w:r>
-              <w:rPr>
-                <w:rFonts w:ascii="Times New Roman" w:hAnsi="Times New Roman"/>
-                <w:sz w:val="20"/>
-              </w:rPr>
-              <w:t>**~95s – 100s** (~1m35s)</w:t>
-            </w:r>
-          </w:p>
-        </w:tc>
-        <w:tc>
-          <w:tcPr>
-            <w:tcW w:type="dxa" w:w="1104"/>
-          </w:tcPr>
-          <w:p>
-            <w:r>
-              <w:rPr>
-                <w:rFonts w:ascii="Times New Roman" w:hAnsi="Times New Roman"/>
-                <w:sz w:val="20"/>
-              </w:rPr>
-              <w:t>Nhấn mạnh 3 thách thức: Imbalance 0.13%, Cost Asymmetry, Non-stationarity</w:t>
-            </w:r>
-          </w:p>
-        </w:tc>
-      </w:tr>
-      <w:tr>
-        <w:tc>
-          <w:tcPr>
-            <w:tcW w:type="dxa" w:w="1104"/>
-          </w:tcPr>
-          <w:p>
-            <w:r>
-              <w:rPr>
-                <w:rFonts w:ascii="Times New Roman" w:hAnsi="Times New Roman"/>
-                <w:sz w:val="20"/>
-              </w:rPr>
-              <w:t>**05**</w:t>
-            </w:r>
-          </w:p>
-        </w:tc>
-        <w:tc>
-          <w:tcPr>
-            <w:tcW w:type="dxa" w:w="1104"/>
-          </w:tcPr>
-          <w:p>
-            <w:r>
-              <w:rPr>
-                <w:rFonts w:ascii="Times New Roman" w:hAnsi="Times New Roman"/>
-                <w:sz w:val="20"/>
-              </w:rPr>
-              <w:t>Tập dữ liệu PaySim: Thuộc tính thống kê</w:t>
-            </w:r>
-          </w:p>
-        </w:tc>
-        <w:tc>
-          <w:tcPr>
-            <w:tcW w:type="dxa" w:w="1104"/>
-          </w:tcPr>
-          <w:p>
-            <w:r>
-              <w:rPr>
-                <w:rFonts w:ascii="Times New Roman" w:hAnsi="Times New Roman"/>
-                <w:sz w:val="20"/>
-              </w:rPr>
-              <w:t>Đặng Chí Thanh</w:t>
-            </w:r>
-          </w:p>
-        </w:tc>
-        <w:tc>
-          <w:tcPr>
-            <w:tcW w:type="dxa" w:w="1104"/>
-          </w:tcPr>
-          <w:p>
-            <w:r>
-              <w:rPr>
-                <w:rFonts w:ascii="Times New Roman" w:hAnsi="Times New Roman"/>
-                <w:sz w:val="20"/>
-              </w:rPr>
-              <w:t>189 từ</w:t>
-            </w:r>
-          </w:p>
-        </w:tc>
-        <w:tc>
-          <w:tcPr>
-            <w:tcW w:type="dxa" w:w="1104"/>
-          </w:tcPr>
-          <w:p>
-            <w:r>
-              <w:rPr>
-                <w:rFonts w:ascii="Times New Roman" w:hAnsi="Times New Roman"/>
-                <w:sz w:val="20"/>
-              </w:rPr>
-              <w:t>186.2 WPM</w:t>
-            </w:r>
-          </w:p>
-        </w:tc>
-        <w:tc>
-          <w:tcPr>
-            <w:tcW w:type="dxa" w:w="1104"/>
-          </w:tcPr>
-          <w:p>
-            <w:r>
-              <w:rPr>
-                <w:rFonts w:ascii="Times New Roman" w:hAnsi="Times New Roman"/>
-                <w:sz w:val="20"/>
-              </w:rPr>
-              <w:t>~50s</w:t>
-            </w:r>
-          </w:p>
-        </w:tc>
-        <w:tc>
-          <w:tcPr>
-            <w:tcW w:type="dxa" w:w="1104"/>
-          </w:tcPr>
-          <w:p>
-            <w:r>
-              <w:rPr>
-                <w:rFonts w:ascii="Times New Roman" w:hAnsi="Times New Roman"/>
-                <w:sz w:val="20"/>
-              </w:rPr>
-              <w:t>*94s*</w:t>
-            </w:r>
-          </w:p>
-        </w:tc>
-        <w:tc>
-          <w:tcPr>
-            <w:tcW w:type="dxa" w:w="1104"/>
-          </w:tcPr>
-          <w:p>
-            <w:r>
-              <w:rPr>
-                <w:rFonts w:ascii="Times New Roman" w:hAnsi="Times New Roman"/>
-                <w:sz w:val="20"/>
-              </w:rPr>
-              <w:t>**~60s – 65s** (~1m00s)</w:t>
-            </w:r>
-          </w:p>
-        </w:tc>
-        <w:tc>
-          <w:tcPr>
-            <w:tcW w:type="dxa" w:w="1104"/>
-          </w:tcPr>
-          <w:p>
-            <w:r>
-              <w:rPr>
-                <w:rFonts w:ascii="Times New Roman" w:hAnsi="Times New Roman"/>
-                <w:sz w:val="20"/>
-              </w:rPr>
-              <w:t>Rút kinh nghiệm: Nhấn mạnh 100% gian lận ở TRANSFER &amp; CASH_OUT, lướt qua bảng thuộc tính thô</w:t>
-            </w:r>
-          </w:p>
-        </w:tc>
-      </w:tr>
-      <w:tr>
-        <w:tc>
-          <w:tcPr>
-            <w:tcW w:type="dxa" w:w="1104"/>
-          </w:tcPr>
-          <w:p>
-            <w:r>
-              <w:rPr>
-                <w:rFonts w:ascii="Times New Roman" w:hAnsi="Times New Roman"/>
-                <w:sz w:val="20"/>
-              </w:rPr>
-              <w:t>**06**</w:t>
-            </w:r>
-          </w:p>
-        </w:tc>
-        <w:tc>
-          <w:tcPr>
-            <w:tcW w:type="dxa" w:w="1104"/>
-          </w:tcPr>
-          <w:p>
-            <w:r>
-              <w:rPr>
-                <w:rFonts w:ascii="Times New Roman" w:hAnsi="Times New Roman"/>
-                <w:sz w:val="20"/>
-              </w:rPr>
-              <w:t>Phần 2: Tiền xử lý &amp; Kỹ thuật đặc trưng</w:t>
-            </w:r>
-          </w:p>
-        </w:tc>
-        <w:tc>
-          <w:tcPr>
-            <w:tcW w:type="dxa" w:w="1104"/>
-          </w:tcPr>
-          <w:p>
-            <w:r>
-              <w:rPr>
-                <w:rFonts w:ascii="Times New Roman" w:hAnsi="Times New Roman"/>
-                <w:sz w:val="20"/>
-              </w:rPr>
-              <w:t>Đặng Chí Thanh</w:t>
-            </w:r>
-          </w:p>
-        </w:tc>
-        <w:tc>
-          <w:tcPr>
-            <w:tcW w:type="dxa" w:w="1104"/>
-          </w:tcPr>
-          <w:p>
-            <w:r>
-              <w:rPr>
-                <w:rFonts w:ascii="Times New Roman" w:hAnsi="Times New Roman"/>
-                <w:sz w:val="20"/>
-              </w:rPr>
-              <w:t>31 từ</w:t>
-            </w:r>
-          </w:p>
-        </w:tc>
-        <w:tc>
-          <w:tcPr>
-            <w:tcW w:type="dxa" w:w="1104"/>
-          </w:tcPr>
-          <w:p>
-            <w:r>
-              <w:rPr>
-                <w:rFonts w:ascii="Times New Roman" w:hAnsi="Times New Roman"/>
-                <w:sz w:val="20"/>
-              </w:rPr>
-              <w:t>186.2 WPM</w:t>
-            </w:r>
-          </w:p>
-        </w:tc>
-        <w:tc>
-          <w:tcPr>
-            <w:tcW w:type="dxa" w:w="1104"/>
-          </w:tcPr>
-          <w:p>
-            <w:r>
-              <w:rPr>
-                <w:rFonts w:ascii="Times New Roman" w:hAnsi="Times New Roman"/>
-                <w:sz w:val="20"/>
-              </w:rPr>
-              <w:t>~10s</w:t>
-            </w:r>
-          </w:p>
-        </w:tc>
-        <w:tc>
-          <w:tcPr>
-            <w:tcW w:type="dxa" w:w="1104"/>
-          </w:tcPr>
-          <w:p>
-            <w:r>
-              <w:rPr>
-                <w:rFonts w:ascii="Times New Roman" w:hAnsi="Times New Roman"/>
-                <w:sz w:val="20"/>
-              </w:rPr>
-              <w:t>*10s*</w:t>
-            </w:r>
-          </w:p>
-        </w:tc>
-        <w:tc>
-          <w:tcPr>
-            <w:tcW w:type="dxa" w:w="1104"/>
-          </w:tcPr>
-          <w:p>
-            <w:r>
-              <w:rPr>
-                <w:rFonts w:ascii="Times New Roman" w:hAnsi="Times New Roman"/>
-                <w:sz w:val="20"/>
-              </w:rPr>
-              <w:t>**~10s**</w:t>
-            </w:r>
-          </w:p>
-        </w:tc>
-        <w:tc>
-          <w:tcPr>
-            <w:tcW w:type="dxa" w:w="1104"/>
-          </w:tcPr>
-          <w:p>
-            <w:r>
-              <w:rPr>
-                <w:rFonts w:ascii="Times New Roman" w:hAnsi="Times New Roman"/>
-                <w:sz w:val="20"/>
-              </w:rPr>
-              <w:t>Chuyển tiếp nhanh vào 3 dấu vết hành vi</w:t>
-            </w:r>
-          </w:p>
-        </w:tc>
-      </w:tr>
-      <w:tr>
-        <w:tc>
-          <w:tcPr>
-            <w:tcW w:type="dxa" w:w="1104"/>
-          </w:tcPr>
-          <w:p>
-            <w:r>
-              <w:rPr>
-                <w:rFonts w:ascii="Times New Roman" w:hAnsi="Times New Roman"/>
-                <w:sz w:val="20"/>
-              </w:rPr>
-              <w:t>**07**</w:t>
-            </w:r>
-          </w:p>
-        </w:tc>
-        <w:tc>
-          <w:tcPr>
-            <w:tcW w:type="dxa" w:w="1104"/>
-          </w:tcPr>
-          <w:p>
-            <w:r>
-              <w:rPr>
-                <w:rFonts w:ascii="Times New Roman" w:hAnsi="Times New Roman"/>
-                <w:sz w:val="20"/>
-              </w:rPr>
-              <w:t>Phân tích EDA: 3 Dấu vết hành vi cốt lõi</w:t>
-            </w:r>
-          </w:p>
-        </w:tc>
-        <w:tc>
-          <w:tcPr>
-            <w:tcW w:type="dxa" w:w="1104"/>
-          </w:tcPr>
-          <w:p>
-            <w:r>
-              <w:rPr>
-                <w:rFonts w:ascii="Times New Roman" w:hAnsi="Times New Roman"/>
-                <w:sz w:val="20"/>
-              </w:rPr>
-              <w:t>Đặng Chí Thanh</w:t>
-            </w:r>
-          </w:p>
-        </w:tc>
-        <w:tc>
-          <w:tcPr>
-            <w:tcW w:type="dxa" w:w="1104"/>
-          </w:tcPr>
-          <w:p>
-            <w:r>
-              <w:rPr>
-                <w:rFonts w:ascii="Times New Roman" w:hAnsi="Times New Roman"/>
-                <w:sz w:val="20"/>
-              </w:rPr>
-              <w:t>242 từ</w:t>
-            </w:r>
-          </w:p>
-        </w:tc>
-        <w:tc>
-          <w:tcPr>
-            <w:tcW w:type="dxa" w:w="1104"/>
-          </w:tcPr>
-          <w:p>
-            <w:r>
-              <w:rPr>
-                <w:rFonts w:ascii="Times New Roman" w:hAnsi="Times New Roman"/>
-                <w:sz w:val="20"/>
-              </w:rPr>
-              <w:t>186.2 WPM</w:t>
-            </w:r>
-          </w:p>
-        </w:tc>
-        <w:tc>
-          <w:tcPr>
-            <w:tcW w:type="dxa" w:w="1104"/>
-          </w:tcPr>
-          <w:p>
-            <w:r>
-              <w:rPr>
-                <w:rFonts w:ascii="Times New Roman" w:hAnsi="Times New Roman"/>
-                <w:sz w:val="20"/>
-              </w:rPr>
-              <w:t>~60s</w:t>
-            </w:r>
-          </w:p>
-        </w:tc>
-        <w:tc>
-          <w:tcPr>
-            <w:tcW w:type="dxa" w:w="1104"/>
-          </w:tcPr>
-          <w:p>
-            <w:r>
-              <w:rPr>
-                <w:rFonts w:ascii="Times New Roman" w:hAnsi="Times New Roman"/>
-                <w:sz w:val="20"/>
-              </w:rPr>
-              <w:t>*110s*</w:t>
-            </w:r>
-          </w:p>
-        </w:tc>
-        <w:tc>
-          <w:tcPr>
-            <w:tcW w:type="dxa" w:w="1104"/>
-          </w:tcPr>
-          <w:p>
-            <w:r>
-              <w:rPr>
-                <w:rFonts w:ascii="Times New Roman" w:hAnsi="Times New Roman"/>
-                <w:sz w:val="20"/>
-              </w:rPr>
-              <w:t>**~75s – 80s** (~1m15s)</w:t>
-            </w:r>
-          </w:p>
-        </w:tc>
-        <w:tc>
-          <w:tcPr>
-            <w:tcW w:type="dxa" w:w="1104"/>
-          </w:tcPr>
-          <w:p>
-            <w:r>
-              <w:rPr>
-                <w:rFonts w:ascii="Times New Roman" w:hAnsi="Times New Roman"/>
-                <w:sz w:val="20"/>
-              </w:rPr>
-              <w:t>Nêu bật: Khoanh vùng 2 loại giao dịch, Rút cạn số dư 97.56%, Lệch số dư tài khoản đích</w:t>
-            </w:r>
-          </w:p>
-        </w:tc>
-      </w:tr>
-      <w:tr>
-        <w:tc>
-          <w:tcPr>
-            <w:tcW w:type="dxa" w:w="1104"/>
-          </w:tcPr>
-          <w:p>
-            <w:r>
-              <w:rPr>
-                <w:rFonts w:ascii="Times New Roman" w:hAnsi="Times New Roman"/>
-                <w:sz w:val="20"/>
-              </w:rPr>
-              <w:t>**08**</w:t>
-            </w:r>
-          </w:p>
-        </w:tc>
-        <w:tc>
-          <w:tcPr>
-            <w:tcW w:type="dxa" w:w="1104"/>
-          </w:tcPr>
-          <w:p>
-            <w:r>
-              <w:rPr>
-                <w:rFonts w:ascii="Times New Roman" w:hAnsi="Times New Roman"/>
-                <w:sz w:val="20"/>
-              </w:rPr>
-              <w:t>Kỹ thuật đặc trưng: 14 thuộc tính cốt lõi</w:t>
-            </w:r>
-          </w:p>
-        </w:tc>
-        <w:tc>
-          <w:tcPr>
-            <w:tcW w:type="dxa" w:w="1104"/>
-          </w:tcPr>
-          <w:p>
-            <w:r>
-              <w:rPr>
-                <w:rFonts w:ascii="Times New Roman" w:hAnsi="Times New Roman"/>
-                <w:sz w:val="20"/>
-              </w:rPr>
-              <w:t>Đặng Chí Thanh</w:t>
-            </w:r>
-          </w:p>
-        </w:tc>
-        <w:tc>
-          <w:tcPr>
-            <w:tcW w:type="dxa" w:w="1104"/>
-          </w:tcPr>
-          <w:p>
-            <w:r>
-              <w:rPr>
-                <w:rFonts w:ascii="Times New Roman" w:hAnsi="Times New Roman"/>
-                <w:sz w:val="20"/>
-              </w:rPr>
-              <w:t>213 từ</w:t>
-            </w:r>
-          </w:p>
-        </w:tc>
-        <w:tc>
-          <w:tcPr>
-            <w:tcW w:type="dxa" w:w="1104"/>
-          </w:tcPr>
-          <w:p>
-            <w:r>
-              <w:rPr>
-                <w:rFonts w:ascii="Times New Roman" w:hAnsi="Times New Roman"/>
-                <w:sz w:val="20"/>
-              </w:rPr>
-              <w:t>186.2 WPM</w:t>
-            </w:r>
-          </w:p>
-        </w:tc>
-        <w:tc>
-          <w:tcPr>
-            <w:tcW w:type="dxa" w:w="1104"/>
-          </w:tcPr>
-          <w:p>
-            <w:r>
-              <w:rPr>
-                <w:rFonts w:ascii="Times New Roman" w:hAnsi="Times New Roman"/>
-                <w:sz w:val="20"/>
-              </w:rPr>
-              <w:t>~60s</w:t>
-            </w:r>
-          </w:p>
-        </w:tc>
-        <w:tc>
-          <w:tcPr>
-            <w:tcW w:type="dxa" w:w="1104"/>
-          </w:tcPr>
-          <w:p>
-            <w:r>
-              <w:rPr>
-                <w:rFonts w:ascii="Times New Roman" w:hAnsi="Times New Roman"/>
-                <w:sz w:val="20"/>
-              </w:rPr>
-              <w:t>*127s*</w:t>
-            </w:r>
-          </w:p>
-        </w:tc>
-        <w:tc>
-          <w:tcPr>
-            <w:tcW w:type="dxa" w:w="1104"/>
-          </w:tcPr>
-          <w:p>
-            <w:r>
-              <w:rPr>
-                <w:rFonts w:ascii="Times New Roman" w:hAnsi="Times New Roman"/>
-                <w:sz w:val="20"/>
-              </w:rPr>
-              <w:t>**~70s – 75s** (~1m10s)</w:t>
-            </w:r>
-          </w:p>
-        </w:tc>
-        <w:tc>
-          <w:tcPr>
-            <w:tcW w:type="dxa" w:w="1104"/>
-          </w:tcPr>
-          <w:p>
-            <w:r>
-              <w:rPr>
-                <w:rFonts w:ascii="Times New Roman" w:hAnsi="Times New Roman"/>
-                <w:sz w:val="20"/>
-              </w:rPr>
-              <w:t>Rút kinh nghiệm: Không đọc lại công thức, chỉ nhấn mạnh `errorBalanceOrig` &amp; `newbalanceOrig` chiếm &gt;97%</w:t>
-            </w:r>
-          </w:p>
-        </w:tc>
-      </w:tr>
-      <w:tr>
-        <w:tc>
-          <w:tcPr>
-            <w:tcW w:type="dxa" w:w="1104"/>
-          </w:tcPr>
-          <w:p>
-            <w:r>
-              <w:rPr>
-                <w:rFonts w:ascii="Times New Roman" w:hAnsi="Times New Roman"/>
-                <w:sz w:val="20"/>
-              </w:rPr>
-              <w:t>**09**</w:t>
-            </w:r>
-          </w:p>
-        </w:tc>
-        <w:tc>
-          <w:tcPr>
-            <w:tcW w:type="dxa" w:w="1104"/>
-          </w:tcPr>
-          <w:p>
-            <w:r>
-              <w:rPr>
-                <w:rFonts w:ascii="Times New Roman" w:hAnsi="Times New Roman"/>
-                <w:sz w:val="20"/>
-              </w:rPr>
-              <w:t>Xử lý mất cân bằng lớp: SMOTE &amp; ADASYN</w:t>
-            </w:r>
-          </w:p>
-        </w:tc>
-        <w:tc>
-          <w:tcPr>
-            <w:tcW w:type="dxa" w:w="1104"/>
-          </w:tcPr>
-          <w:p>
-            <w:r>
-              <w:rPr>
-                <w:rFonts w:ascii="Times New Roman" w:hAnsi="Times New Roman"/>
-                <w:sz w:val="20"/>
-              </w:rPr>
-              <w:t>Hoàng Cao Sơn</w:t>
-            </w:r>
-          </w:p>
-        </w:tc>
-        <w:tc>
-          <w:tcPr>
-            <w:tcW w:type="dxa" w:w="1104"/>
-          </w:tcPr>
-          <w:p>
-            <w:r>
-              <w:rPr>
-                <w:rFonts w:ascii="Times New Roman" w:hAnsi="Times New Roman"/>
-                <w:sz w:val="20"/>
-              </w:rPr>
-              <w:t>186 từ</w:t>
-            </w:r>
-          </w:p>
-        </w:tc>
-        <w:tc>
-          <w:tcPr>
-            <w:tcW w:type="dxa" w:w="1104"/>
-          </w:tcPr>
-          <w:p>
-            <w:r>
-              <w:rPr>
-                <w:rFonts w:ascii="Times New Roman" w:hAnsi="Times New Roman"/>
-                <w:sz w:val="20"/>
-              </w:rPr>
-              <w:t>152.3 WPM</w:t>
-            </w:r>
-          </w:p>
-        </w:tc>
-        <w:tc>
-          <w:tcPr>
-            <w:tcW w:type="dxa" w:w="1104"/>
-          </w:tcPr>
-          <w:p>
-            <w:r>
-              <w:rPr>
-                <w:rFonts w:ascii="Times New Roman" w:hAnsi="Times New Roman"/>
-                <w:sz w:val="20"/>
-              </w:rPr>
-              <w:t>~50s</w:t>
-            </w:r>
-          </w:p>
-        </w:tc>
-        <w:tc>
-          <w:tcPr>
-            <w:tcW w:type="dxa" w:w="1104"/>
-          </w:tcPr>
-          <w:p>
-            <w:r>
-              <w:rPr>
-                <w:rFonts w:ascii="Times New Roman" w:hAnsi="Times New Roman"/>
-                <w:sz w:val="20"/>
-              </w:rPr>
-              <w:t>*153s*</w:t>
-            </w:r>
-          </w:p>
-        </w:tc>
-        <w:tc>
-          <w:tcPr>
-            <w:tcW w:type="dxa" w:w="1104"/>
-          </w:tcPr>
-          <w:p>
-            <w:r>
-              <w:rPr>
-                <w:rFonts w:ascii="Times New Roman" w:hAnsi="Times New Roman"/>
-                <w:sz w:val="20"/>
-              </w:rPr>
-              <w:t>**~75s – 80s** (~1m15s)</w:t>
-            </w:r>
-          </w:p>
-        </w:tc>
-        <w:tc>
-          <w:tcPr>
-            <w:tcW w:type="dxa" w:w="1104"/>
-          </w:tcPr>
-          <w:p>
-            <w:r>
-              <w:rPr>
-                <w:rFonts w:ascii="Times New Roman" w:hAnsi="Times New Roman"/>
-                <w:sz w:val="20"/>
-              </w:rPr>
-              <w:t>Rút kinh nghiệm: Giảm giải thích khái niệm lý thuyết, nói thẳng lý do chọn SMOTENC (không méo biên, giữ nguyên 0/1)</w:t>
-            </w:r>
-          </w:p>
-        </w:tc>
-      </w:tr>
-      <w:tr>
-        <w:tc>
-          <w:tcPr>
-            <w:tcW w:type="dxa" w:w="1104"/>
-          </w:tcPr>
-          <w:p>
-            <w:r>
-              <w:rPr>
-                <w:rFonts w:ascii="Times New Roman" w:hAnsi="Times New Roman"/>
-                <w:sz w:val="20"/>
-              </w:rPr>
-              <w:t>**10**</w:t>
-            </w:r>
-          </w:p>
-        </w:tc>
-        <w:tc>
-          <w:tcPr>
-            <w:tcW w:type="dxa" w:w="1104"/>
-          </w:tcPr>
-          <w:p>
-            <w:r>
-              <w:rPr>
-                <w:rFonts w:ascii="Times New Roman" w:hAnsi="Times New Roman"/>
-                <w:sz w:val="20"/>
-              </w:rPr>
-              <w:t>Phần 3: Phương pháp &amp; Mô hình học máy</w:t>
-            </w:r>
-          </w:p>
-        </w:tc>
-        <w:tc>
-          <w:tcPr>
-            <w:tcW w:type="dxa" w:w="1104"/>
-          </w:tcPr>
-          <w:p>
-            <w:r>
-              <w:rPr>
-                <w:rFonts w:ascii="Times New Roman" w:hAnsi="Times New Roman"/>
-                <w:sz w:val="20"/>
-              </w:rPr>
-              <w:t>Hoàng Cao Sơn</w:t>
-            </w:r>
-          </w:p>
-        </w:tc>
-        <w:tc>
-          <w:tcPr>
-            <w:tcW w:type="dxa" w:w="1104"/>
-          </w:tcPr>
-          <w:p>
-            <w:r>
-              <w:rPr>
-                <w:rFonts w:ascii="Times New Roman" w:hAnsi="Times New Roman"/>
-                <w:sz w:val="20"/>
-              </w:rPr>
-              <w:t>24 từ</w:t>
-            </w:r>
-          </w:p>
-        </w:tc>
-        <w:tc>
-          <w:tcPr>
-            <w:tcW w:type="dxa" w:w="1104"/>
-          </w:tcPr>
-          <w:p>
-            <w:r>
-              <w:rPr>
-                <w:rFonts w:ascii="Times New Roman" w:hAnsi="Times New Roman"/>
-                <w:sz w:val="20"/>
-              </w:rPr>
-              <w:t>152.3 WPM</w:t>
-            </w:r>
-          </w:p>
-        </w:tc>
-        <w:tc>
-          <w:tcPr>
-            <w:tcW w:type="dxa" w:w="1104"/>
-          </w:tcPr>
-          <w:p>
-            <w:r>
-              <w:rPr>
-                <w:rFonts w:ascii="Times New Roman" w:hAnsi="Times New Roman"/>
-                <w:sz w:val="20"/>
-              </w:rPr>
-              <w:t>~10s</w:t>
-            </w:r>
-          </w:p>
-        </w:tc>
-        <w:tc>
-          <w:tcPr>
-            <w:tcW w:type="dxa" w:w="1104"/>
-          </w:tcPr>
-          <w:p>
-            <w:r>
-              <w:rPr>
-                <w:rFonts w:ascii="Times New Roman" w:hAnsi="Times New Roman"/>
-                <w:sz w:val="20"/>
-              </w:rPr>
-              <w:t>*10s*</w:t>
-            </w:r>
-          </w:p>
-        </w:tc>
-        <w:tc>
-          <w:tcPr>
-            <w:tcW w:type="dxa" w:w="1104"/>
-          </w:tcPr>
-          <w:p>
-            <w:r>
-              <w:rPr>
-                <w:rFonts w:ascii="Times New Roman" w:hAnsi="Times New Roman"/>
-                <w:sz w:val="20"/>
-              </w:rPr>
-              <w:t>**~10s**</w:t>
-            </w:r>
-          </w:p>
-        </w:tc>
-        <w:tc>
-          <w:tcPr>
-            <w:tcW w:type="dxa" w:w="1104"/>
-          </w:tcPr>
-          <w:p>
-            <w:r>
-              <w:rPr>
-                <w:rFonts w:ascii="Times New Roman" w:hAnsi="Times New Roman"/>
-                <w:sz w:val="20"/>
-              </w:rPr>
-              <w:t>Cầu nối ngắn gọn sang kiến trúc Pipeline</w:t>
-            </w:r>
-          </w:p>
-        </w:tc>
-      </w:tr>
-      <w:tr>
-        <w:tc>
-          <w:tcPr>
-            <w:tcW w:type="dxa" w:w="1104"/>
-          </w:tcPr>
-          <w:p>
-            <w:r>
-              <w:rPr>
-                <w:rFonts w:ascii="Times New Roman" w:hAnsi="Times New Roman"/>
-                <w:sz w:val="20"/>
-              </w:rPr>
-              <w:t>**11**</w:t>
-            </w:r>
-          </w:p>
-        </w:tc>
-        <w:tc>
-          <w:tcPr>
-            <w:tcW w:type="dxa" w:w="1104"/>
-          </w:tcPr>
-          <w:p>
-            <w:r>
-              <w:rPr>
-                <w:rFonts w:ascii="Times New Roman" w:hAnsi="Times New Roman"/>
-                <w:sz w:val="20"/>
-              </w:rPr>
-              <w:t>Kiến trúc Pipeline chuẩn Leak-Free</w:t>
-            </w:r>
-          </w:p>
-        </w:tc>
-        <w:tc>
-          <w:tcPr>
-            <w:tcW w:type="dxa" w:w="1104"/>
-          </w:tcPr>
-          <w:p>
-            <w:r>
-              <w:rPr>
-                <w:rFonts w:ascii="Times New Roman" w:hAnsi="Times New Roman"/>
-                <w:sz w:val="20"/>
-              </w:rPr>
-              <w:t>Hoàng Cao Sơn</w:t>
-            </w:r>
-          </w:p>
-        </w:tc>
-        <w:tc>
-          <w:tcPr>
-            <w:tcW w:type="dxa" w:w="1104"/>
-          </w:tcPr>
-          <w:p>
-            <w:r>
-              <w:rPr>
-                <w:rFonts w:ascii="Times New Roman" w:hAnsi="Times New Roman"/>
-                <w:sz w:val="20"/>
-              </w:rPr>
-              <w:t>212 từ</w:t>
-            </w:r>
-          </w:p>
-        </w:tc>
-        <w:tc>
-          <w:tcPr>
-            <w:tcW w:type="dxa" w:w="1104"/>
-          </w:tcPr>
-          <w:p>
-            <w:r>
-              <w:rPr>
-                <w:rFonts w:ascii="Times New Roman" w:hAnsi="Times New Roman"/>
-                <w:sz w:val="20"/>
-              </w:rPr>
-              <w:t>152.3 WPM</w:t>
-            </w:r>
-          </w:p>
-        </w:tc>
-        <w:tc>
-          <w:tcPr>
-            <w:tcW w:type="dxa" w:w="1104"/>
-          </w:tcPr>
-          <w:p>
-            <w:r>
-              <w:rPr>
-                <w:rFonts w:ascii="Times New Roman" w:hAnsi="Times New Roman"/>
-                <w:sz w:val="20"/>
-              </w:rPr>
-              <w:t>~60s</w:t>
-            </w:r>
-          </w:p>
-        </w:tc>
-        <w:tc>
-          <w:tcPr>
-            <w:tcW w:type="dxa" w:w="1104"/>
-          </w:tcPr>
-          <w:p>
-            <w:r>
-              <w:rPr>
-                <w:rFonts w:ascii="Times New Roman" w:hAnsi="Times New Roman"/>
-                <w:sz w:val="20"/>
-              </w:rPr>
-              <w:t>*140s*</w:t>
-            </w:r>
-          </w:p>
-        </w:tc>
-        <w:tc>
-          <w:tcPr>
-            <w:tcW w:type="dxa" w:w="1104"/>
-          </w:tcPr>
-          <w:p>
-            <w:r>
-              <w:rPr>
-                <w:rFonts w:ascii="Times New Roman" w:hAnsi="Times New Roman"/>
-                <w:sz w:val="20"/>
-              </w:rPr>
-              <w:t>**~85s – 90s** (~1m25s)</w:t>
-            </w:r>
-          </w:p>
-        </w:tc>
-        <w:tc>
-          <w:tcPr>
-            <w:tcW w:type="dxa" w:w="1104"/>
-          </w:tcPr>
-          <w:p>
-            <w:r>
-              <w:rPr>
-                <w:rFonts w:ascii="Times New Roman" w:hAnsi="Times New Roman"/>
-                <w:sz w:val="20"/>
-              </w:rPr>
-              <w:t>Nêu bật 4 chốt chặn bảo vệ tính trung thực: Split trước, Resample train-only, Scaler độc lập, CV nội bộ</w:t>
-            </w:r>
-          </w:p>
-        </w:tc>
-      </w:tr>
-      <w:tr>
-        <w:tc>
-          <w:tcPr>
-            <w:tcW w:type="dxa" w:w="1104"/>
-          </w:tcPr>
-          <w:p>
-            <w:r>
-              <w:rPr>
-                <w:rFonts w:ascii="Times New Roman" w:hAnsi="Times New Roman"/>
-                <w:sz w:val="20"/>
-              </w:rPr>
-              <w:t>**12**</w:t>
-            </w:r>
-          </w:p>
-        </w:tc>
-        <w:tc>
-          <w:tcPr>
-            <w:tcW w:type="dxa" w:w="1104"/>
-          </w:tcPr>
-          <w:p>
-            <w:r>
-              <w:rPr>
-                <w:rFonts w:ascii="Times New Roman" w:hAnsi="Times New Roman"/>
-                <w:sz w:val="20"/>
-              </w:rPr>
-              <w:t>Mô hình giám sát: Random Forest &amp; XGBoost</w:t>
-            </w:r>
-          </w:p>
-        </w:tc>
-        <w:tc>
-          <w:tcPr>
-            <w:tcW w:type="dxa" w:w="1104"/>
-          </w:tcPr>
-          <w:p>
-            <w:r>
-              <w:rPr>
-                <w:rFonts w:ascii="Times New Roman" w:hAnsi="Times New Roman"/>
-                <w:sz w:val="20"/>
-              </w:rPr>
-              <w:t>Sơn (RF) / Cẩm (XGB)</w:t>
-            </w:r>
-          </w:p>
-        </w:tc>
-        <w:tc>
-          <w:tcPr>
-            <w:tcW w:type="dxa" w:w="1104"/>
-          </w:tcPr>
-          <w:p>
-            <w:r>
-              <w:rPr>
-                <w:rFonts w:ascii="Times New Roman" w:hAnsi="Times New Roman"/>
-                <w:sz w:val="20"/>
-              </w:rPr>
-              <w:t>211 từ</w:t>
-            </w:r>
-          </w:p>
-        </w:tc>
-        <w:tc>
-          <w:tcPr>
-            <w:tcW w:type="dxa" w:w="1104"/>
-          </w:tcPr>
-          <w:p>
-            <w:r>
-              <w:rPr>
-                <w:rFonts w:ascii="Times New Roman" w:hAnsi="Times New Roman"/>
-                <w:sz w:val="20"/>
-              </w:rPr>
-              <w:t>Sơn: 152 WPM&lt;br&gt;Cẩm: 136 WPM</w:t>
-            </w:r>
-          </w:p>
-        </w:tc>
-        <w:tc>
-          <w:tcPr>
-            <w:tcW w:type="dxa" w:w="1104"/>
-          </w:tcPr>
-          <w:p>
-            <w:r>
-              <w:rPr>
-                <w:rFonts w:ascii="Times New Roman" w:hAnsi="Times New Roman"/>
-                <w:sz w:val="20"/>
-              </w:rPr>
-              <w:t>~60s</w:t>
-            </w:r>
-          </w:p>
-        </w:tc>
-        <w:tc>
-          <w:tcPr>
-            <w:tcW w:type="dxa" w:w="1104"/>
-          </w:tcPr>
-          <w:p>
-            <w:r>
-              <w:rPr>
-                <w:rFonts w:ascii="Times New Roman" w:hAnsi="Times New Roman"/>
-                <w:sz w:val="20"/>
-              </w:rPr>
-              <w:t>*200s (Sơn 134s + Cẩm 66s)*</w:t>
-            </w:r>
-          </w:p>
-        </w:tc>
-        <w:tc>
-          <w:tcPr>
-            <w:tcW w:type="dxa" w:w="1104"/>
-          </w:tcPr>
-          <w:p>
-            <w:r>
-              <w:rPr>
-                <w:rFonts w:ascii="Times New Roman" w:hAnsi="Times New Roman"/>
-                <w:sz w:val="20"/>
-              </w:rPr>
-              <w:t>**~90s – 95s**&lt;br&gt;*(Sơn ~40s, Cẩm ~50s)*</w:t>
-            </w:r>
-          </w:p>
-        </w:tc>
-        <w:tc>
-          <w:tcPr>
-            <w:tcW w:type="dxa" w:w="1104"/>
-          </w:tcPr>
-          <w:p>
-            <w:r>
-              <w:rPr>
-                <w:rFonts w:ascii="Times New Roman" w:hAnsi="Times New Roman"/>
-                <w:sz w:val="20"/>
-              </w:rPr>
-              <w:t>Sơn chốt RF (F1 99.73% nhưng mất 20p train) ➔ Cẩm tiếp lời XGBoost (F1 99.63% chỉ 41.7s, latency &lt;0.5ms)</w:t>
-            </w:r>
-          </w:p>
-        </w:tc>
-      </w:tr>
-      <w:tr>
-        <w:tc>
-          <w:tcPr>
-            <w:tcW w:type="dxa" w:w="1104"/>
-          </w:tcPr>
-          <w:p>
-            <w:r>
-              <w:rPr>
-                <w:rFonts w:ascii="Times New Roman" w:hAnsi="Times New Roman"/>
-                <w:sz w:val="20"/>
-              </w:rPr>
-              <w:t>**13**</w:t>
-            </w:r>
-          </w:p>
-        </w:tc>
-        <w:tc>
-          <w:tcPr>
-            <w:tcW w:type="dxa" w:w="1104"/>
-          </w:tcPr>
-          <w:p>
-            <w:r>
-              <w:rPr>
-                <w:rFonts w:ascii="Times New Roman" w:hAnsi="Times New Roman"/>
-                <w:sz w:val="20"/>
-              </w:rPr>
-              <w:t>Mô hình không giám sát: Deep Autoencoder</w:t>
-            </w:r>
-          </w:p>
-        </w:tc>
-        <w:tc>
-          <w:tcPr>
-            <w:tcW w:type="dxa" w:w="1104"/>
-          </w:tcPr>
-          <w:p>
-            <w:r>
-              <w:rPr>
-                <w:rFonts w:ascii="Times New Roman" w:hAnsi="Times New Roman"/>
-                <w:sz w:val="20"/>
-              </w:rPr>
-              <w:t>Bùi Thị Mỷ Cẩm</w:t>
-            </w:r>
-          </w:p>
-        </w:tc>
-        <w:tc>
-          <w:tcPr>
-            <w:tcW w:type="dxa" w:w="1104"/>
-          </w:tcPr>
-          <w:p>
-            <w:r>
-              <w:rPr>
-                <w:rFonts w:ascii="Times New Roman" w:hAnsi="Times New Roman"/>
-                <w:sz w:val="20"/>
-              </w:rPr>
-              <w:t>247 từ</w:t>
-            </w:r>
-          </w:p>
-        </w:tc>
-        <w:tc>
-          <w:tcPr>
-            <w:tcW w:type="dxa" w:w="1104"/>
-          </w:tcPr>
-          <w:p>
-            <w:r>
-              <w:rPr>
-                <w:rFonts w:ascii="Times New Roman" w:hAnsi="Times New Roman"/>
-                <w:sz w:val="20"/>
-              </w:rPr>
-              <w:t>135.5 WPM</w:t>
-            </w:r>
-          </w:p>
-        </w:tc>
-        <w:tc>
-          <w:tcPr>
-            <w:tcW w:type="dxa" w:w="1104"/>
-          </w:tcPr>
-          <w:p>
-            <w:r>
-              <w:rPr>
-                <w:rFonts w:ascii="Times New Roman" w:hAnsi="Times New Roman"/>
-                <w:sz w:val="20"/>
-              </w:rPr>
-              <w:t>~60s</w:t>
-            </w:r>
-          </w:p>
-        </w:tc>
-        <w:tc>
-          <w:tcPr>
-            <w:tcW w:type="dxa" w:w="1104"/>
-          </w:tcPr>
-          <w:p>
-            <w:r>
-              <w:rPr>
-                <w:rFonts w:ascii="Times New Roman" w:hAnsi="Times New Roman"/>
-                <w:sz w:val="20"/>
-              </w:rPr>
-              <w:t>*85s*</w:t>
-            </w:r>
-          </w:p>
-        </w:tc>
-        <w:tc>
-          <w:tcPr>
-            <w:tcW w:type="dxa" w:w="1104"/>
-          </w:tcPr>
-          <w:p>
-            <w:r>
-              <w:rPr>
-                <w:rFonts w:ascii="Times New Roman" w:hAnsi="Times New Roman"/>
-                <w:sz w:val="20"/>
-              </w:rPr>
-              <w:t>**~105s – 110s** (~1m45s)</w:t>
-            </w:r>
-          </w:p>
-        </w:tc>
-        <w:tc>
-          <w:tcPr>
-            <w:tcW w:type="dxa" w:w="1104"/>
-          </w:tcPr>
-          <w:p>
-            <w:r>
-              <w:rPr>
-                <w:rFonts w:ascii="Times New Roman" w:hAnsi="Times New Roman"/>
-                <w:sz w:val="20"/>
-              </w:rPr>
-              <w:t>Đặt câu hỏi bắt Zero-Day, kiến trúc đối xứng 14-8-4-8-14, nguyên lý lỗi tái tạo MSE tăng vọt, Recall 75.23%</w:t>
-            </w:r>
-          </w:p>
-        </w:tc>
-      </w:tr>
-      <w:tr>
-        <w:tc>
-          <w:tcPr>
-            <w:tcW w:type="dxa" w:w="1104"/>
-          </w:tcPr>
-          <w:p>
-            <w:r>
-              <w:rPr>
-                <w:rFonts w:ascii="Times New Roman" w:hAnsi="Times New Roman"/>
-                <w:sz w:val="20"/>
-              </w:rPr>
-              <w:t>**14**</w:t>
-            </w:r>
-          </w:p>
-        </w:tc>
-        <w:tc>
-          <w:tcPr>
-            <w:tcW w:type="dxa" w:w="1104"/>
-          </w:tcPr>
-          <w:p>
-            <w:r>
-              <w:rPr>
-                <w:rFonts w:ascii="Times New Roman" w:hAnsi="Times New Roman"/>
-                <w:sz w:val="20"/>
-              </w:rPr>
-              <w:t>Phần 4: Kết quả thực nghiệm &amp; Phân tích</w:t>
-            </w:r>
-          </w:p>
-        </w:tc>
-        <w:tc>
-          <w:tcPr>
-            <w:tcW w:type="dxa" w:w="1104"/>
-          </w:tcPr>
-          <w:p>
-            <w:r>
-              <w:rPr>
-                <w:rFonts w:ascii="Times New Roman" w:hAnsi="Times New Roman"/>
-                <w:sz w:val="20"/>
-              </w:rPr>
-              <w:t>Nguyễn Duy Khang</w:t>
-            </w:r>
-          </w:p>
-        </w:tc>
-        <w:tc>
-          <w:tcPr>
-            <w:tcW w:type="dxa" w:w="1104"/>
-          </w:tcPr>
-          <w:p>
-            <w:r>
-              <w:rPr>
-                <w:rFonts w:ascii="Times New Roman" w:hAnsi="Times New Roman"/>
-                <w:sz w:val="20"/>
-              </w:rPr>
-              <w:t>50 từ</w:t>
-            </w:r>
-          </w:p>
-        </w:tc>
-        <w:tc>
-          <w:tcPr>
-            <w:tcW w:type="dxa" w:w="1104"/>
-          </w:tcPr>
-          <w:p>
-            <w:r>
-              <w:rPr>
-                <w:rFonts w:ascii="Times New Roman" w:hAnsi="Times New Roman"/>
-                <w:sz w:val="20"/>
-              </w:rPr>
-              <w:t>119.8 WPM</w:t>
-            </w:r>
-          </w:p>
-        </w:tc>
-        <w:tc>
-          <w:tcPr>
-            <w:tcW w:type="dxa" w:w="1104"/>
-          </w:tcPr>
-          <w:p>
-            <w:r>
-              <w:rPr>
-                <w:rFonts w:ascii="Times New Roman" w:hAnsi="Times New Roman"/>
-                <w:sz w:val="20"/>
-              </w:rPr>
-              <w:t>~10s</w:t>
-            </w:r>
-          </w:p>
-        </w:tc>
-        <w:tc>
-          <w:tcPr>
-            <w:tcW w:type="dxa" w:w="1104"/>
-          </w:tcPr>
-          <w:p>
-            <w:r>
-              <w:rPr>
-                <w:rFonts w:ascii="Times New Roman" w:hAnsi="Times New Roman"/>
-                <w:sz w:val="20"/>
-              </w:rPr>
-              <w:t>*25s*</w:t>
-            </w:r>
-          </w:p>
-        </w:tc>
-        <w:tc>
-          <w:tcPr>
-            <w:tcW w:type="dxa" w:w="1104"/>
-          </w:tcPr>
-          <w:p>
-            <w:r>
-              <w:rPr>
-                <w:rFonts w:ascii="Times New Roman" w:hAnsi="Times New Roman"/>
-                <w:sz w:val="20"/>
-              </w:rPr>
-              <w:t>**~25s**</w:t>
-            </w:r>
-          </w:p>
-        </w:tc>
-        <w:tc>
-          <w:tcPr>
-            <w:tcW w:type="dxa" w:w="1104"/>
-          </w:tcPr>
-          <w:p>
-            <w:r>
-              <w:rPr>
-                <w:rFonts w:ascii="Times New Roman" w:hAnsi="Times New Roman"/>
-                <w:sz w:val="20"/>
-              </w:rPr>
-              <w:t>Mở đầu module đánh giá độc lập</w:t>
-            </w:r>
-          </w:p>
-        </w:tc>
-      </w:tr>
-      <w:tr>
-        <w:tc>
-          <w:tcPr>
-            <w:tcW w:type="dxa" w:w="1104"/>
-          </w:tcPr>
-          <w:p>
-            <w:r>
-              <w:rPr>
-                <w:rFonts w:ascii="Times New Roman" w:hAnsi="Times New Roman"/>
-                <w:sz w:val="20"/>
-              </w:rPr>
-              <w:t>**15**</w:t>
-            </w:r>
-          </w:p>
-        </w:tc>
-        <w:tc>
-          <w:tcPr>
-            <w:tcW w:type="dxa" w:w="1104"/>
-          </w:tcPr>
-          <w:p>
-            <w:r>
-              <w:rPr>
-                <w:rFonts w:ascii="Times New Roman" w:hAnsi="Times New Roman"/>
-                <w:sz w:val="20"/>
-              </w:rPr>
-              <w:t>Bảng so sánh đa chỉ số Benchmark</w:t>
-            </w:r>
-          </w:p>
-        </w:tc>
-        <w:tc>
-          <w:tcPr>
-            <w:tcW w:type="dxa" w:w="1104"/>
-          </w:tcPr>
-          <w:p>
-            <w:r>
-              <w:rPr>
-                <w:rFonts w:ascii="Times New Roman" w:hAnsi="Times New Roman"/>
-                <w:sz w:val="20"/>
-              </w:rPr>
-              <w:t>Nguyễn Duy Khang</w:t>
-            </w:r>
-          </w:p>
-        </w:tc>
-        <w:tc>
-          <w:tcPr>
-            <w:tcW w:type="dxa" w:w="1104"/>
-          </w:tcPr>
-          <w:p>
-            <w:r>
-              <w:rPr>
-                <w:rFonts w:ascii="Times New Roman" w:hAnsi="Times New Roman"/>
-                <w:sz w:val="20"/>
-              </w:rPr>
-              <w:t>165 từ</w:t>
-            </w:r>
-          </w:p>
-        </w:tc>
-        <w:tc>
-          <w:tcPr>
-            <w:tcW w:type="dxa" w:w="1104"/>
-          </w:tcPr>
-          <w:p>
-            <w:r>
-              <w:rPr>
-                <w:rFonts w:ascii="Times New Roman" w:hAnsi="Times New Roman"/>
-                <w:sz w:val="20"/>
-              </w:rPr>
-              <w:t>119.8 WPM</w:t>
-            </w:r>
-          </w:p>
-        </w:tc>
-        <w:tc>
-          <w:tcPr>
-            <w:tcW w:type="dxa" w:w="1104"/>
-          </w:tcPr>
-          <w:p>
-            <w:r>
-              <w:rPr>
-                <w:rFonts w:ascii="Times New Roman" w:hAnsi="Times New Roman"/>
-                <w:sz w:val="20"/>
-              </w:rPr>
-              <w:t>~60s</w:t>
-            </w:r>
-          </w:p>
-        </w:tc>
-        <w:tc>
-          <w:tcPr>
-            <w:tcW w:type="dxa" w:w="1104"/>
-          </w:tcPr>
-          <w:p>
-            <w:r>
-              <w:rPr>
-                <w:rFonts w:ascii="Times New Roman" w:hAnsi="Times New Roman"/>
-                <w:sz w:val="20"/>
-              </w:rPr>
-              <w:t>*80s*</w:t>
-            </w:r>
-          </w:p>
-        </w:tc>
-        <w:tc>
-          <w:tcPr>
-            <w:tcW w:type="dxa" w:w="1104"/>
-          </w:tcPr>
-          <w:p>
-            <w:r>
-              <w:rPr>
-                <w:rFonts w:ascii="Times New Roman" w:hAnsi="Times New Roman"/>
-                <w:sz w:val="20"/>
-              </w:rPr>
-              <w:t>**~80s – 85s** (~1m20s)</w:t>
-            </w:r>
-          </w:p>
-        </w:tc>
-        <w:tc>
-          <w:tcPr>
-            <w:tcW w:type="dxa" w:w="1104"/>
-          </w:tcPr>
-          <w:p>
-            <w:r>
-              <w:rPr>
-                <w:rFonts w:ascii="Times New Roman" w:hAnsi="Times New Roman"/>
-                <w:sz w:val="20"/>
-              </w:rPr>
-              <w:t>Rút kinh nghiệm: Tập trung vào mô hình tốt nhất (RF F1 99.73%, XGB 99.63% siêu tốc), lướt các chỉ số phụ</w:t>
-            </w:r>
-          </w:p>
-        </w:tc>
-      </w:tr>
-      <w:tr>
-        <w:tc>
-          <w:tcPr>
-            <w:tcW w:type="dxa" w:w="1104"/>
-          </w:tcPr>
-          <w:p>
-            <w:r>
-              <w:rPr>
-                <w:rFonts w:ascii="Times New Roman" w:hAnsi="Times New Roman"/>
-                <w:sz w:val="20"/>
-              </w:rPr>
-              <w:t>**16**</w:t>
-            </w:r>
-          </w:p>
-        </w:tc>
-        <w:tc>
-          <w:tcPr>
-            <w:tcW w:type="dxa" w:w="1104"/>
-          </w:tcPr>
-          <w:p>
-            <w:r>
-              <w:rPr>
-                <w:rFonts w:ascii="Times New Roman" w:hAnsi="Times New Roman"/>
-                <w:sz w:val="20"/>
-              </w:rPr>
-              <w:t>Phân tích Ma trận nhầm lẫn &amp; Đánh đổi sai số</w:t>
-            </w:r>
-          </w:p>
-        </w:tc>
-        <w:tc>
-          <w:tcPr>
-            <w:tcW w:type="dxa" w:w="1104"/>
-          </w:tcPr>
-          <w:p>
-            <w:r>
-              <w:rPr>
-                <w:rFonts w:ascii="Times New Roman" w:hAnsi="Times New Roman"/>
-                <w:sz w:val="20"/>
-              </w:rPr>
-              <w:t>Nguyễn Duy Khang</w:t>
-            </w:r>
-          </w:p>
-        </w:tc>
-        <w:tc>
-          <w:tcPr>
-            <w:tcW w:type="dxa" w:w="1104"/>
-          </w:tcPr>
-          <w:p>
-            <w:r>
-              <w:rPr>
-                <w:rFonts w:ascii="Times New Roman" w:hAnsi="Times New Roman"/>
-                <w:sz w:val="20"/>
-              </w:rPr>
-              <w:t>171 từ</w:t>
-            </w:r>
-          </w:p>
-        </w:tc>
-        <w:tc>
-          <w:tcPr>
-            <w:tcW w:type="dxa" w:w="1104"/>
-          </w:tcPr>
-          <w:p>
-            <w:r>
-              <w:rPr>
-                <w:rFonts w:ascii="Times New Roman" w:hAnsi="Times New Roman"/>
-                <w:sz w:val="20"/>
-              </w:rPr>
-              <w:t>119.8 WPM</w:t>
-            </w:r>
-          </w:p>
-        </w:tc>
-        <w:tc>
-          <w:tcPr>
-            <w:tcW w:type="dxa" w:w="1104"/>
-          </w:tcPr>
-          <w:p>
-            <w:r>
-              <w:rPr>
-                <w:rFonts w:ascii="Times New Roman" w:hAnsi="Times New Roman"/>
-                <w:sz w:val="20"/>
-              </w:rPr>
-              <w:t>~60s</w:t>
-            </w:r>
-          </w:p>
-        </w:tc>
-        <w:tc>
-          <w:tcPr>
-            <w:tcW w:type="dxa" w:w="1104"/>
-          </w:tcPr>
-          <w:p>
-            <w:r>
-              <w:rPr>
-                <w:rFonts w:ascii="Times New Roman" w:hAnsi="Times New Roman"/>
-                <w:sz w:val="20"/>
-              </w:rPr>
-              <w:t>*80s*</w:t>
-            </w:r>
-          </w:p>
-        </w:tc>
-        <w:tc>
-          <w:tcPr>
-            <w:tcW w:type="dxa" w:w="1104"/>
-          </w:tcPr>
-          <w:p>
-            <w:r>
-              <w:rPr>
-                <w:rFonts w:ascii="Times New Roman" w:hAnsi="Times New Roman"/>
-                <w:sz w:val="20"/>
-              </w:rPr>
-              <w:t>**~80s – 85s** (~1m20s)</w:t>
-            </w:r>
-          </w:p>
-        </w:tc>
-        <w:tc>
-          <w:tcPr>
-            <w:tcW w:type="dxa" w:w="1104"/>
-          </w:tcPr>
-          <w:p>
-            <w:r>
-              <w:rPr>
-                <w:rFonts w:ascii="Times New Roman" w:hAnsi="Times New Roman"/>
-                <w:sz w:val="20"/>
-              </w:rPr>
-              <w:t>Phân tích TP/FN/FP của RF (lọt 8 vụ, nhầm 1 ca), XGBoost (lọt 8, nhầm 4 ca) và Autoencoder (bắt 1,236 vụ không nhãn)</w:t>
-            </w:r>
-          </w:p>
-        </w:tc>
-      </w:tr>
-      <w:tr>
-        <w:tc>
-          <w:tcPr>
-            <w:tcW w:type="dxa" w:w="1104"/>
-          </w:tcPr>
-          <w:p>
-            <w:r>
-              <w:rPr>
-                <w:rFonts w:ascii="Times New Roman" w:hAnsi="Times New Roman"/>
-                <w:sz w:val="20"/>
-              </w:rPr>
-              <w:t>**17**</w:t>
-            </w:r>
-          </w:p>
-        </w:tc>
-        <w:tc>
-          <w:tcPr>
-            <w:tcW w:type="dxa" w:w="1104"/>
-          </w:tcPr>
-          <w:p>
-            <w:r>
-              <w:rPr>
-                <w:rFonts w:ascii="Times New Roman" w:hAnsi="Times New Roman"/>
-                <w:sz w:val="20"/>
-              </w:rPr>
-              <w:t>Phân tích đóng góp đặc trưng (Feature Importance)</w:t>
-            </w:r>
-          </w:p>
-        </w:tc>
-        <w:tc>
-          <w:tcPr>
-            <w:tcW w:type="dxa" w:w="1104"/>
-          </w:tcPr>
-          <w:p>
-            <w:r>
-              <w:rPr>
-                <w:rFonts w:ascii="Times New Roman" w:hAnsi="Times New Roman"/>
-                <w:sz w:val="20"/>
-              </w:rPr>
-              <w:t>Nguyễn Duy Khang</w:t>
-            </w:r>
-          </w:p>
-        </w:tc>
-        <w:tc>
-          <w:tcPr>
-            <w:tcW w:type="dxa" w:w="1104"/>
-          </w:tcPr>
-          <w:p>
-            <w:r>
-              <w:rPr>
-                <w:rFonts w:ascii="Times New Roman" w:hAnsi="Times New Roman"/>
-                <w:sz w:val="20"/>
-              </w:rPr>
-              <w:t>172 từ</w:t>
-            </w:r>
-          </w:p>
-        </w:tc>
-        <w:tc>
-          <w:tcPr>
-            <w:tcW w:type="dxa" w:w="1104"/>
-          </w:tcPr>
-          <w:p>
-            <w:r>
-              <w:rPr>
-                <w:rFonts w:ascii="Times New Roman" w:hAnsi="Times New Roman"/>
-                <w:sz w:val="20"/>
-              </w:rPr>
-              <w:t>119.8 WPM</w:t>
-            </w:r>
-          </w:p>
-        </w:tc>
-        <w:tc>
-          <w:tcPr>
-            <w:tcW w:type="dxa" w:w="1104"/>
-          </w:tcPr>
-          <w:p>
-            <w:r>
-              <w:rPr>
-                <w:rFonts w:ascii="Times New Roman" w:hAnsi="Times New Roman"/>
-                <w:sz w:val="20"/>
-              </w:rPr>
-              <w:t>~50s</w:t>
-            </w:r>
-          </w:p>
-        </w:tc>
-        <w:tc>
-          <w:tcPr>
-            <w:tcW w:type="dxa" w:w="1104"/>
-          </w:tcPr>
-          <w:p>
-            <w:r>
-              <w:rPr>
-                <w:rFonts w:ascii="Times New Roman" w:hAnsi="Times New Roman"/>
-                <w:sz w:val="20"/>
-              </w:rPr>
-              <w:t>*82s*</w:t>
-            </w:r>
-          </w:p>
-        </w:tc>
-        <w:tc>
-          <w:tcPr>
-            <w:tcW w:type="dxa" w:w="1104"/>
-          </w:tcPr>
-          <w:p>
-            <w:r>
-              <w:rPr>
-                <w:rFonts w:ascii="Times New Roman" w:hAnsi="Times New Roman"/>
-                <w:sz w:val="20"/>
-              </w:rPr>
-              <w:t>**~80s – 85s** (~1m20s)</w:t>
-            </w:r>
-          </w:p>
-        </w:tc>
-        <w:tc>
-          <w:tcPr>
-            <w:tcW w:type="dxa" w:w="1104"/>
-          </w:tcPr>
-          <w:p>
-            <w:r>
-              <w:rPr>
-                <w:rFonts w:ascii="Times New Roman" w:hAnsi="Times New Roman"/>
-                <w:sz w:val="20"/>
-              </w:rPr>
-              <w:t>Chốt hạ thông điệp: Kẻ gian chia nhỏ tiền được nhưng không xóa được sai lệch kế toán (2 đặc trưng chiếm 97.1%)</w:t>
-            </w:r>
-          </w:p>
-        </w:tc>
-      </w:tr>
-      <w:tr>
-        <w:tc>
-          <w:tcPr>
-            <w:tcW w:type="dxa" w:w="1104"/>
-          </w:tcPr>
-          <w:p>
-            <w:r>
-              <w:rPr>
-                <w:rFonts w:ascii="Times New Roman" w:hAnsi="Times New Roman"/>
-                <w:sz w:val="20"/>
-              </w:rPr>
-              <w:t>**18**</w:t>
-            </w:r>
-          </w:p>
-        </w:tc>
-        <w:tc>
-          <w:tcPr>
-            <w:tcW w:type="dxa" w:w="1104"/>
-          </w:tcPr>
-          <w:p>
-            <w:r>
-              <w:rPr>
-                <w:rFonts w:ascii="Times New Roman" w:hAnsi="Times New Roman"/>
-                <w:sz w:val="20"/>
-              </w:rPr>
-              <w:t>Phân bố sai số tái tạo &amp; Ngưỡng Anomaly</w:t>
-            </w:r>
-          </w:p>
-        </w:tc>
-        <w:tc>
-          <w:tcPr>
-            <w:tcW w:type="dxa" w:w="1104"/>
-          </w:tcPr>
-          <w:p>
-            <w:r>
-              <w:rPr>
-                <w:rFonts w:ascii="Times New Roman" w:hAnsi="Times New Roman"/>
-                <w:sz w:val="20"/>
-              </w:rPr>
-              <w:t>Bùi Thị Mỷ Cẩm</w:t>
-            </w:r>
-          </w:p>
-        </w:tc>
-        <w:tc>
-          <w:tcPr>
-            <w:tcW w:type="dxa" w:w="1104"/>
-          </w:tcPr>
-          <w:p>
-            <w:r>
-              <w:rPr>
-                <w:rFonts w:ascii="Times New Roman" w:hAnsi="Times New Roman"/>
-                <w:sz w:val="20"/>
-              </w:rPr>
-              <w:t>155 từ</w:t>
-            </w:r>
-          </w:p>
-        </w:tc>
-        <w:tc>
-          <w:tcPr>
-            <w:tcW w:type="dxa" w:w="1104"/>
-          </w:tcPr>
-          <w:p>
-            <w:r>
-              <w:rPr>
-                <w:rFonts w:ascii="Times New Roman" w:hAnsi="Times New Roman"/>
-                <w:sz w:val="20"/>
-              </w:rPr>
-              <w:t>122.3 WPM</w:t>
-            </w:r>
-          </w:p>
-        </w:tc>
-        <w:tc>
-          <w:tcPr>
-            <w:tcW w:type="dxa" w:w="1104"/>
-          </w:tcPr>
-          <w:p>
-            <w:r>
-              <w:rPr>
-                <w:rFonts w:ascii="Times New Roman" w:hAnsi="Times New Roman"/>
-                <w:sz w:val="20"/>
-              </w:rPr>
-              <w:t>~50s</w:t>
-            </w:r>
-          </w:p>
-        </w:tc>
-        <w:tc>
-          <w:tcPr>
-            <w:tcW w:type="dxa" w:w="1104"/>
-          </w:tcPr>
-          <w:p>
-            <w:r>
-              <w:rPr>
-                <w:rFonts w:ascii="Times New Roman" w:hAnsi="Times New Roman"/>
-                <w:sz w:val="20"/>
-              </w:rPr>
-              <w:t>*104s*</w:t>
-            </w:r>
-          </w:p>
-        </w:tc>
-        <w:tc>
-          <w:tcPr>
-            <w:tcW w:type="dxa" w:w="1104"/>
-          </w:tcPr>
-          <w:p>
-            <w:r>
-              <w:rPr>
-                <w:rFonts w:ascii="Times New Roman" w:hAnsi="Times New Roman"/>
-                <w:sz w:val="20"/>
-              </w:rPr>
-              <w:t>**~75s – 80s** (~1m15s)</w:t>
-            </w:r>
-          </w:p>
-        </w:tc>
-        <w:tc>
-          <w:tcPr>
-            <w:tcW w:type="dxa" w:w="1104"/>
-          </w:tcPr>
-          <w:p>
-            <w:r>
-              <w:rPr>
-                <w:rFonts w:ascii="Times New Roman" w:hAnsi="Times New Roman"/>
-                <w:sz w:val="20"/>
-              </w:rPr>
-              <w:t>Biểu đồ phân bố MSE tách biệt và quyết định chọn điểm cắt phân vị 95th (tau = 0.0455)</w:t>
-            </w:r>
-          </w:p>
-        </w:tc>
-      </w:tr>
-      <w:tr>
-        <w:tc>
-          <w:tcPr>
-            <w:tcW w:type="dxa" w:w="1104"/>
-          </w:tcPr>
-          <w:p>
-            <w:r>
-              <w:rPr>
-                <w:rFonts w:ascii="Times New Roman" w:hAnsi="Times New Roman"/>
-                <w:sz w:val="20"/>
-              </w:rPr>
-              <w:t>**19**</w:t>
-            </w:r>
-          </w:p>
-        </w:tc>
-        <w:tc>
-          <w:tcPr>
-            <w:tcW w:type="dxa" w:w="1104"/>
-          </w:tcPr>
-          <w:p>
-            <w:r>
-              <w:rPr>
-                <w:rFonts w:ascii="Times New Roman" w:hAnsi="Times New Roman"/>
-                <w:sz w:val="20"/>
-              </w:rPr>
-              <w:t>Phần 5: Demo hệ thống &amp; Kết luận</w:t>
-            </w:r>
-          </w:p>
-        </w:tc>
-        <w:tc>
-          <w:tcPr>
-            <w:tcW w:type="dxa" w:w="1104"/>
-          </w:tcPr>
-          <w:p>
-            <w:r>
-              <w:rPr>
-                <w:rFonts w:ascii="Times New Roman" w:hAnsi="Times New Roman"/>
-                <w:sz w:val="20"/>
-              </w:rPr>
-              <w:t>Phạm Thành Trung</w:t>
-            </w:r>
-          </w:p>
-        </w:tc>
-        <w:tc>
-          <w:tcPr>
-            <w:tcW w:type="dxa" w:w="1104"/>
-          </w:tcPr>
-          <w:p>
-            <w:r>
-              <w:rPr>
-                <w:rFonts w:ascii="Times New Roman" w:hAnsi="Times New Roman"/>
-                <w:sz w:val="20"/>
-              </w:rPr>
-              <w:t>40 từ</w:t>
-            </w:r>
-          </w:p>
-        </w:tc>
-        <w:tc>
-          <w:tcPr>
-            <w:tcW w:type="dxa" w:w="1104"/>
-          </w:tcPr>
-          <w:p>
-            <w:r>
-              <w:rPr>
-                <w:rFonts w:ascii="Times New Roman" w:hAnsi="Times New Roman"/>
-                <w:sz w:val="20"/>
-              </w:rPr>
-              <w:t>147.0 WPM</w:t>
-            </w:r>
-          </w:p>
-        </w:tc>
-        <w:tc>
-          <w:tcPr>
-            <w:tcW w:type="dxa" w:w="1104"/>
-          </w:tcPr>
-          <w:p>
-            <w:r>
-              <w:rPr>
-                <w:rFonts w:ascii="Times New Roman" w:hAnsi="Times New Roman"/>
-                <w:sz w:val="20"/>
-              </w:rPr>
-              <w:t>~10s</w:t>
-            </w:r>
-          </w:p>
-        </w:tc>
-        <w:tc>
-          <w:tcPr>
-            <w:tcW w:type="dxa" w:w="1104"/>
-          </w:tcPr>
-          <w:p>
-            <w:r>
-              <w:rPr>
-                <w:rFonts w:ascii="Times New Roman" w:hAnsi="Times New Roman"/>
-                <w:sz w:val="20"/>
-              </w:rPr>
-              <w:t>*Chuyển share màn hình*</w:t>
-            </w:r>
-          </w:p>
-        </w:tc>
-        <w:tc>
-          <w:tcPr>
-            <w:tcW w:type="dxa" w:w="1104"/>
-          </w:tcPr>
-          <w:p>
-            <w:r>
-              <w:rPr>
-                <w:rFonts w:ascii="Times New Roman" w:hAnsi="Times New Roman"/>
-                <w:sz w:val="20"/>
-              </w:rPr>
-              <w:t>**~20s**</w:t>
-            </w:r>
-          </w:p>
-        </w:tc>
-        <w:tc>
-          <w:tcPr>
-            <w:tcW w:type="dxa" w:w="1104"/>
-          </w:tcPr>
-          <w:p>
-            <w:r>
-              <w:rPr>
-                <w:rFonts w:ascii="Times New Roman" w:hAnsi="Times New Roman"/>
-                <w:sz w:val="20"/>
-              </w:rPr>
-              <w:t>Bắt nhịp, mở đầu chuyển sang phần kiểm thử và trình diễn ứng dụng</w:t>
-            </w:r>
-          </w:p>
-        </w:tc>
-      </w:tr>
-      <w:tr>
-        <w:tc>
-          <w:tcPr>
-            <w:tcW w:type="dxa" w:w="1104"/>
-          </w:tcPr>
-          <w:p>
-            <w:r>
-              <w:rPr>
-                <w:rFonts w:ascii="Times New Roman" w:hAnsi="Times New Roman"/>
-                <w:sz w:val="20"/>
-              </w:rPr>
-              <w:t>**20**</w:t>
-            </w:r>
-          </w:p>
-        </w:tc>
-        <w:tc>
-          <w:tcPr>
-            <w:tcW w:type="dxa" w:w="1104"/>
-          </w:tcPr>
-          <w:p>
-            <w:r>
-              <w:rPr>
-                <w:rFonts w:ascii="Times New Roman" w:hAnsi="Times New Roman"/>
-                <w:sz w:val="20"/>
-              </w:rPr>
-              <w:t>Hệ thống Demo Streamlit &amp; Kịch bản kiểm thử</w:t>
-            </w:r>
-          </w:p>
-        </w:tc>
-        <w:tc>
-          <w:tcPr>
-            <w:tcW w:type="dxa" w:w="1104"/>
-          </w:tcPr>
-          <w:p>
-            <w:r>
-              <w:rPr>
-                <w:rFonts w:ascii="Times New Roman" w:hAnsi="Times New Roman"/>
-                <w:sz w:val="20"/>
-              </w:rPr>
-              <w:t>Duy (Test Cases)&lt;br&gt;Trung (Live Demo)</w:t>
-            </w:r>
-          </w:p>
-        </w:tc>
-        <w:tc>
-          <w:tcPr>
-            <w:tcW w:type="dxa" w:w="1104"/>
-          </w:tcPr>
-          <w:p>
-            <w:r>
-              <w:rPr>
-                <w:rFonts w:ascii="Times New Roman" w:hAnsi="Times New Roman"/>
-                <w:sz w:val="20"/>
-              </w:rPr>
-              <w:t>359 từ + Live Demo</w:t>
-            </w:r>
-          </w:p>
-        </w:tc>
-        <w:tc>
-          <w:tcPr>
-            <w:tcW w:type="dxa" w:w="1104"/>
-          </w:tcPr>
-          <w:p>
-            <w:r>
-              <w:rPr>
-                <w:rFonts w:ascii="Times New Roman" w:hAnsi="Times New Roman"/>
-                <w:sz w:val="20"/>
-              </w:rPr>
-              <w:t>Duy: ~115 WPM&lt;br&gt;Trung: 147 WPM</w:t>
-            </w:r>
-          </w:p>
-        </w:tc>
-        <w:tc>
-          <w:tcPr>
-            <w:tcW w:type="dxa" w:w="1104"/>
-          </w:tcPr>
-          <w:p>
-            <w:r>
-              <w:rPr>
-                <w:rFonts w:ascii="Times New Roman" w:hAnsi="Times New Roman"/>
-                <w:sz w:val="20"/>
-              </w:rPr>
-              <w:t>~75s *(quá phi lý)*</w:t>
-            </w:r>
-          </w:p>
-        </w:tc>
-        <w:tc>
-          <w:tcPr>
-            <w:tcW w:type="dxa" w:w="1104"/>
-          </w:tcPr>
-          <w:p>
-            <w:r>
-              <w:rPr>
-                <w:rFonts w:ascii="Times New Roman" w:hAnsi="Times New Roman"/>
-                <w:sz w:val="20"/>
-              </w:rPr>
-              <w:t>*Duy: 149s&lt;br&gt;Trung Demo: 304s&lt;br&gt;(Tổng: 453s = 7m33s)*</w:t>
-            </w:r>
-          </w:p>
-        </w:tc>
-        <w:tc>
-          <w:tcPr>
-            <w:tcW w:type="dxa" w:w="1104"/>
-          </w:tcPr>
-          <w:p>
-            <w:r>
-              <w:rPr>
-                <w:rFonts w:ascii="Times New Roman" w:hAnsi="Times New Roman"/>
-                <w:sz w:val="20"/>
-              </w:rPr>
-              <w:t>**~240s – 270s** (~4m00s – 4m30s)&lt;br&gt;*(Duy ~85s, Trung Demo ~160s-185s)*</w:t>
-            </w:r>
-          </w:p>
-        </w:tc>
-        <w:tc>
-          <w:tcPr>
-            <w:tcW w:type="dxa" w:w="1104"/>
-          </w:tcPr>
-          <w:p>
-            <w:r>
-              <w:rPr>
-                <w:rFonts w:ascii="Times New Roman" w:hAnsi="Times New Roman"/>
-                <w:sz w:val="20"/>
-              </w:rPr>
-              <w:t>**Thống nhất thứ tự mới:** Duy trình bày 3 Kịch bản trước ➔ Trung thao tác Live Demo Streamlit trên 3 kịch bản đó ➔ Trung tổng kết 4 đóng góp</w:t>
-            </w:r>
-          </w:p>
-        </w:tc>
-      </w:tr>
-      <w:tr>
-        <w:tc>
-          <w:tcPr>
-            <w:tcW w:type="dxa" w:w="1104"/>
-          </w:tcPr>
-          <w:p>
-            <w:r>
-              <w:rPr>
-                <w:rFonts w:ascii="Times New Roman" w:hAnsi="Times New Roman"/>
-                <w:sz w:val="20"/>
-              </w:rPr>
-              <w:t>**21**</w:t>
-            </w:r>
-          </w:p>
-        </w:tc>
-        <w:tc>
-          <w:tcPr>
-            <w:tcW w:type="dxa" w:w="1104"/>
-          </w:tcPr>
-          <w:p>
-            <w:r>
-              <w:rPr>
-                <w:rFonts w:ascii="Times New Roman" w:hAnsi="Times New Roman"/>
-                <w:sz w:val="20"/>
-              </w:rPr>
-              <w:t>Tổng kết, Tài liệu tham khảo &amp; Phiên hỏi đáp</w:t>
-            </w:r>
-          </w:p>
-        </w:tc>
-        <w:tc>
-          <w:tcPr>
-            <w:tcW w:type="dxa" w:w="1104"/>
-          </w:tcPr>
-          <w:p>
-            <w:r>
-              <w:rPr>
-                <w:rFonts w:ascii="Times New Roman" w:hAnsi="Times New Roman"/>
-                <w:sz w:val="20"/>
-              </w:rPr>
-              <w:t>Trần Hoàng Hôn</w:t>
-            </w:r>
-          </w:p>
-        </w:tc>
-        <w:tc>
-          <w:tcPr>
-            <w:tcW w:type="dxa" w:w="1104"/>
-          </w:tcPr>
-          <w:p>
-            <w:r>
-              <w:rPr>
-                <w:rFonts w:ascii="Times New Roman" w:hAnsi="Times New Roman"/>
-                <w:sz w:val="20"/>
-              </w:rPr>
-              <w:t>93 từ</w:t>
-            </w:r>
-          </w:p>
-        </w:tc>
-        <w:tc>
-          <w:tcPr>
-            <w:tcW w:type="dxa" w:w="1104"/>
-          </w:tcPr>
-          <w:p>
-            <w:r>
-              <w:rPr>
-                <w:rFonts w:ascii="Times New Roman" w:hAnsi="Times New Roman"/>
-                <w:sz w:val="20"/>
-              </w:rPr>
-              <w:t>156.4 WPM</w:t>
-            </w:r>
-          </w:p>
-        </w:tc>
-        <w:tc>
-          <w:tcPr>
-            <w:tcW w:type="dxa" w:w="1104"/>
-          </w:tcPr>
-          <w:p>
-            <w:r>
-              <w:rPr>
-                <w:rFonts w:ascii="Times New Roman" w:hAnsi="Times New Roman"/>
-                <w:sz w:val="20"/>
-              </w:rPr>
-              <w:t>~45s</w:t>
-            </w:r>
-          </w:p>
-        </w:tc>
-        <w:tc>
-          <w:tcPr>
-            <w:tcW w:type="dxa" w:w="1104"/>
-          </w:tcPr>
-          <w:p>
-            <w:r>
-              <w:rPr>
-                <w:rFonts w:ascii="Times New Roman" w:hAnsi="Times New Roman"/>
-                <w:sz w:val="20"/>
-              </w:rPr>
-              <w:t>*Chốt kết thúc buổi họp*</w:t>
-            </w:r>
-          </w:p>
-        </w:tc>
-        <w:tc>
-          <w:tcPr>
-            <w:tcW w:type="dxa" w:w="1104"/>
-          </w:tcPr>
-          <w:p>
-            <w:r>
-              <w:rPr>
-                <w:rFonts w:ascii="Times New Roman" w:hAnsi="Times New Roman"/>
-                <w:sz w:val="20"/>
-              </w:rPr>
-              <w:t>**~45s – 50s**</w:t>
-            </w:r>
-          </w:p>
-        </w:tc>
-        <w:tc>
-          <w:tcPr>
-            <w:tcW w:type="dxa" w:w="1104"/>
-          </w:tcPr>
-          <w:p>
-            <w:r>
-              <w:rPr>
-                <w:rFonts w:ascii="Times New Roman" w:hAnsi="Times New Roman"/>
-                <w:sz w:val="20"/>
-              </w:rPr>
-              <w:t>Cảm ơn Thầy và các bạn, mở phiên thảo luận &amp; phản biện Q&amp;A</w:t>
-            </w:r>
-          </w:p>
-        </w:tc>
-      </w:tr>
-      <w:tr>
-        <w:tc>
-          <w:tcPr>
-            <w:tcW w:type="dxa" w:w="1104"/>
-          </w:tcPr>
-          <w:p>
-            <w:r>
-              <w:rPr>
-                <w:rFonts w:ascii="Times New Roman" w:hAnsi="Times New Roman"/>
-                <w:sz w:val="20"/>
-              </w:rPr>
-              <w:t>**TỔNG CỘNG**</w:t>
-            </w:r>
-          </w:p>
-        </w:tc>
-        <w:tc>
-          <w:tcPr>
-            <w:tcW w:type="dxa" w:w="1104"/>
-          </w:tcPr>
-          <w:p>
-            <w:r>
-              <w:rPr>
-                <w:rFonts w:ascii="Times New Roman" w:hAnsi="Times New Roman"/>
-                <w:sz w:val="20"/>
-              </w:rPr>
-              <w:t>**Toàn bộ bài báo cáo 21 Slides + Live Demo**</w:t>
-            </w:r>
-          </w:p>
-        </w:tc>
-        <w:tc>
-          <w:tcPr>
-            <w:tcW w:type="dxa" w:w="1104"/>
-          </w:tcPr>
-          <w:p>
-            <w:r>
-              <w:rPr>
-                <w:rFonts w:ascii="Times New Roman" w:hAnsi="Times New Roman"/>
-                <w:sz w:val="20"/>
-              </w:rPr>
-              <w:t>**7 thành viên**</w:t>
-            </w:r>
-          </w:p>
-        </w:tc>
-        <w:tc>
-          <w:tcPr>
-            <w:tcW w:type="dxa" w:w="1104"/>
-          </w:tcPr>
-          <w:p>
-            <w:r>
-              <w:rPr>
-                <w:rFonts w:ascii="Times New Roman" w:hAnsi="Times New Roman"/>
-                <w:sz w:val="20"/>
-              </w:rPr>
-              <w:t>**3,000+ từ**</w:t>
-            </w:r>
-          </w:p>
-        </w:tc>
-        <w:tc>
-          <w:tcPr>
-            <w:tcW w:type="dxa" w:w="1104"/>
-          </w:tcPr>
-          <w:p>
-            <w:r>
-              <w:rPr>
-                <w:rFonts w:ascii="Times New Roman" w:hAnsi="Times New Roman"/>
-                <w:sz w:val="20"/>
-              </w:rPr>
-              <w:t>**Trung bình ~145 WPM**</w:t>
-            </w:r>
-          </w:p>
-        </w:tc>
-        <w:tc>
-          <w:tcPr>
-            <w:tcW w:type="dxa" w:w="1104"/>
-          </w:tcPr>
-          <w:p>
-            <w:r>
-              <w:rPr>
-                <w:rFonts w:ascii="Times New Roman" w:hAnsi="Times New Roman"/>
-                <w:sz w:val="20"/>
-              </w:rPr>
-              <w:t>**~15 phút 50s** *(Ước tính cũ)*</w:t>
-            </w:r>
-          </w:p>
-        </w:tc>
-        <w:tc>
-          <w:tcPr>
-            <w:tcW w:type="dxa" w:w="1104"/>
-          </w:tcPr>
-          <w:p>
-            <w:r>
-              <w:rPr>
-                <w:rFonts w:ascii="Times New Roman" w:hAnsi="Times New Roman"/>
-                <w:sz w:val="20"/>
-              </w:rPr>
-              <w:t>**~35m02s** *(Meeting nói thuần)*&lt;br&gt;**~40 phút** *(Gồm chuyển giao)*</w:t>
-            </w:r>
-          </w:p>
-        </w:tc>
-        <w:tc>
-          <w:tcPr>
-            <w:tcW w:type="dxa" w:w="1104"/>
-          </w:tcPr>
-          <w:p>
-            <w:r>
-              <w:rPr>
-                <w:rFonts w:ascii="Times New Roman" w:hAnsi="Times New Roman"/>
-                <w:sz w:val="20"/>
-              </w:rPr>
-              <w:t>**~23 phút 30s – 25 phút** *(Chuẩn hóa tối ưu thực tế)*</w:t>
-            </w:r>
-          </w:p>
-        </w:tc>
-        <w:tc>
-          <w:tcPr>
-            <w:tcW w:type="dxa" w:w="1104"/>
-          </w:tcPr>
-          <w:p>
-            <w:r>
-              <w:rPr>
-                <w:rFonts w:ascii="Times New Roman" w:hAnsi="Times New Roman"/>
-                <w:sz w:val="20"/>
-              </w:rPr>
-              <w:t>**Đạt tiêu chuẩn vàng cho buổi bảo vệ đồ án chuyên sâu môn Trí tuệ Nhân tạo tại UIT!**</w:t>
-            </w:r>
-          </w:p>
-        </w:tc>
-      </w:tr>
-    </w:tbl>
-    <w:p/>
-    <w:p>
-      <w:pPr>
-        <w:spacing w:before="80" w:after="80"/>
-      </w:pPr>
-    </w:p>
-    <w:p>
-      <w:pPr>
         <w:pStyle w:val="Heading1"/>
       </w:pPr>
       <w:r>
@@ -4625,6 +703,14 @@
           <w:i/>
           <w:color w:val="444444"/>
         </w:rPr>
+      </w:r>
+    </w:p>
+    <w:p>
+      <w:r>
+        <w:rPr>
+          <w:rFonts w:ascii="Times New Roman" w:hAnsi="Times New Roman"/>
+        </w:rPr>
+        <w:t>&gt;</w:t>
       </w:r>
     </w:p>
     <w:p>
@@ -4986,7 +1072,7 @@
                 <w:rFonts w:ascii="Times New Roman" w:hAnsi="Times New Roman"/>
                 <w:sz w:val="20"/>
               </w:rPr>
-              <w:t>🔴 **Vượt +1m20s** *(+106%)*</w:t>
+              <w:t>🔴**Vượt +1m20s** *(+106%)*</w:t>
             </w:r>
           </w:p>
         </w:tc>
@@ -5000,7 +1086,7 @@
                 <w:rFonts w:ascii="Times New Roman" w:hAnsi="Times New Roman"/>
                 <w:sz w:val="20"/>
               </w:rPr>
-              <w:t>⚠️ **Cần rút gọn:** Đọc nhanh tên 7 bạn (45s) + lướt nhanh Agenda (30s).</w:t>
+              <w:t>⚠️**Cần rút gọn:** Đọc nhanh tên 7 bạn (45s) + lướt nhanh Agenda (30s).</w:t>
             </w:r>
           </w:p>
         </w:tc>
@@ -5114,7 +1200,7 @@
                 <w:rFonts w:ascii="Times New Roman" w:hAnsi="Times New Roman"/>
                 <w:sz w:val="20"/>
               </w:rPr>
-              <w:t>🔴 **Vượt +1m52s** *(+53%)*</w:t>
+              <w:t>🔴**Vượt +1m52s** *(+53%)*</w:t>
             </w:r>
           </w:p>
         </w:tc>
@@ -5128,7 +1214,7 @@
                 <w:rFonts w:ascii="Times New Roman" w:hAnsi="Times New Roman"/>
                 <w:sz w:val="20"/>
               </w:rPr>
-              <w:t>⚠️ **Cần nói lướt:** Đi thẳng vào 2 biến quyết định 97.1% (PR #37).</w:t>
+              <w:t>⚠️**Cần nói lướt:** Đi thẳng vào 2 biến quyết định 97.1% (PR #37).</w:t>
             </w:r>
           </w:p>
         </w:tc>
@@ -5242,7 +1328,7 @@
                 <w:rFonts w:ascii="Times New Roman" w:hAnsi="Times New Roman"/>
                 <w:sz w:val="20"/>
               </w:rPr>
-              <w:t>🔴 **Vượt +1m30s** *(+75%)*</w:t>
+              <w:t>🔴**Vượt +1m30s** *(+75%)*</w:t>
             </w:r>
           </w:p>
         </w:tc>
@@ -5256,7 +1342,7 @@
                 <w:rFonts w:ascii="Times New Roman" w:hAnsi="Times New Roman"/>
                 <w:sz w:val="20"/>
               </w:rPr>
-              <w:t>⚠️ **Cắt lý thuyết:** Bỏ giải thích ADASYN, chỉ nêu kết quả RF F1=0.9973.</w:t>
+              <w:t>⚠️**Cắt lý thuyết:** Bỏ giải thích ADASYN, chỉ nêu kết quả RF F1=0.9973.</w:t>
             </w:r>
           </w:p>
         </w:tc>
@@ -5370,7 +1456,7 @@
                 <w:rFonts w:ascii="Times New Roman" w:hAnsi="Times New Roman"/>
                 <w:sz w:val="20"/>
               </w:rPr>
-              <w:t>🔴 **Vượt +1m43s** *(+86%)*</w:t>
+              <w:t>🔴**Vượt +1m43s** *(+86%)*</w:t>
             </w:r>
           </w:p>
         </w:tc>
@@ -5384,7 +1470,7 @@
                 <w:rFonts w:ascii="Times New Roman" w:hAnsi="Times New Roman"/>
                 <w:sz w:val="20"/>
               </w:rPr>
-              <w:t>⚠️ **Cần cô đọng:** XGB 40s + Autoencoder &amp; ngưỡng 95th 80s.</w:t>
+              <w:t>⚠️**Cần cô đọng:** XGB 40s + Autoencoder &amp; ngưỡng 95th 80s.</w:t>
             </w:r>
           </w:p>
         </w:tc>
@@ -5498,7 +1584,7 @@
                 <w:rFonts w:ascii="Times New Roman" w:hAnsi="Times New Roman"/>
                 <w:sz w:val="20"/>
               </w:rPr>
-              <w:t>🔴 **Vượt +2m24s** *(+106%)*</w:t>
+              <w:t>🔴**Vượt +2m24s** *(+106%)*</w:t>
             </w:r>
           </w:p>
         </w:tc>
@@ -5512,7 +1598,7 @@
                 <w:rFonts w:ascii="Times New Roman" w:hAnsi="Times New Roman"/>
                 <w:sz w:val="20"/>
               </w:rPr>
-              <w:t>⚠️ **Không đọc bảng:** Chỉ nêu bật RF &amp; XGBoost dẫn đầu, lướt các chỉ số phụ.</w:t>
+              <w:t>⚠️**Không đọc bảng:** Chỉ nêu bật RF &amp; XGBoost dẫn đầu, lướt các chỉ số phụ.</w:t>
             </w:r>
           </w:p>
         </w:tc>
@@ -5626,7 +1712,7 @@
                 <w:rFonts w:ascii="Times New Roman" w:hAnsi="Times New Roman"/>
                 <w:sz w:val="20"/>
               </w:rPr>
-              <w:t>🟢 **`0s` (Khớp tuyệt đối)**</w:t>
+              <w:t>🟢**`0s` (Khớp tuyệt đối)**</w:t>
             </w:r>
           </w:p>
         </w:tc>
@@ -5640,7 +1726,7 @@
                 <w:rFonts w:ascii="Times New Roman" w:hAnsi="Times New Roman"/>
                 <w:sz w:val="20"/>
               </w:rPr>
-              <w:t>🎯 **HOÀN THÀNH MỤC TIÊU:** Duy không nói slide, tránh đổi micro.</w:t>
+              <w:t>🎯**HOÀN THÀNH MỤC TIÊU:** Duy không nói slide, tránh đổi micro.</w:t>
             </w:r>
           </w:p>
         </w:tc>
@@ -5754,7 +1840,7 @@
                 <w:rFonts w:ascii="Times New Roman" w:hAnsi="Times New Roman"/>
                 <w:sz w:val="20"/>
               </w:rPr>
-              <w:t>🔴 **Vượt +1m10s** *(+44%)*</w:t>
+              <w:t>🔴**Vượt +1m10s** *(+44%)*</w:t>
             </w:r>
           </w:p>
         </w:tc>
@@ -5768,7 +1854,7 @@
                 <w:rFonts w:ascii="Times New Roman" w:hAnsi="Times New Roman"/>
                 <w:sz w:val="20"/>
               </w:rPr>
-              <w:t>⚠️ **Cần demo nhanh:** Bấm 2 preset mẫu, không gõ tay dữ liệu.</w:t>
+              <w:t>⚠️**Cần demo nhanh:** Bấm 2 preset mẫu, không gõ tay dữ liệu.</w:t>
             </w:r>
           </w:p>
         </w:tc>
@@ -5882,7 +1968,7 @@
                 <w:rFonts w:ascii="Times New Roman" w:hAnsi="Times New Roman"/>
                 <w:sz w:val="20"/>
               </w:rPr>
-              <w:t>🟢 **`0s` (Khớp tuyệt đối)**</w:t>
+              <w:t>🟢**`0s` (Khớp tuyệt đối)**</w:t>
             </w:r>
           </w:p>
         </w:tc>
@@ -5896,7 +1982,7 @@
                 <w:rFonts w:ascii="Times New Roman" w:hAnsi="Times New Roman"/>
                 <w:sz w:val="20"/>
               </w:rPr>
-              <w:t>🎯 **HOÀN THÀNH MỤC TIÊU:** Cắt bỏ hoàn toàn độ trễ switch slide.</w:t>
+              <w:t>🎯**HOÀN THÀNH MỤC TIÊU:** Cắt bỏ hoàn toàn độ trễ switch slide.</w:t>
             </w:r>
           </w:p>
         </w:tc>
@@ -6138,7 +2224,7 @@
                 <w:rFonts w:ascii="Times New Roman" w:hAnsi="Times New Roman"/>
                 <w:sz w:val="20"/>
               </w:rPr>
-              <w:t>🔴 **VƯỢT +8m04s (+53%)**</w:t>
+              <w:t>🔴**VƯỢT +8m04s (+53%)**</w:t>
             </w:r>
           </w:p>
         </w:tc>
@@ -6152,7 +2238,7 @@
                 <w:rFonts w:ascii="Times New Roman" w:hAnsi="Times New Roman"/>
                 <w:sz w:val="20"/>
               </w:rPr>
-              <w:t>❌ **CẦN NÓI Ý CHÍNH (INSIGHT), TUYỆT ĐỐI KHÔNG ĐỌC LẠI SLIDE!**</w:t>
+              <w:t>❌**CẦN NÓI Ý CHÍNH (INSIGHT), TUYỆT ĐỐI KHÔNG ĐỌC LẠI SLIDE!**</w:t>
             </w:r>
           </w:p>
         </w:tc>
@@ -6256,7 +2342,7 @@
         <w:rPr>
           <w:rFonts w:ascii="Times New Roman" w:hAnsi="Times New Roman"/>
         </w:rPr>
-        <w:t xml:space="preserve">. Hôm nay, nhóm chúng em xin trình bày báo cáo đồ án cuối kỳ môn Trí tuệ Nhân tạo với đề tài: </w:t>
+        <w:t xml:space="preserve">. Hôm nay, nhóm em xin trình bày báo cáo với đề tài: </w:t>
       </w:r>
       <w:r>
         <w:rPr>
@@ -6277,7 +2363,7 @@
         <w:rPr>
           <w:rFonts w:ascii="Times New Roman" w:hAnsi="Times New Roman"/>
         </w:rPr>
-        <w:t>Trước khi đi vào nội dung chi tiết, em xin phép giới thiệu 7 thành viên của Nhóm và nhiệm vụ cụ thể của từng bạn:</w:t>
+        <w:t>Em xin phép giới thiệu 7 thành viên của Nhóm:</w:t>
       </w:r>
     </w:p>
     <w:p>
@@ -6301,14 +2387,14 @@
         <w:rPr>
           <w:rFonts w:ascii="Times New Roman" w:hAnsi="Times New Roman"/>
         </w:rPr>
-        <w:t xml:space="preserve"> — phụ trách phần </w:t>
+        <w:t xml:space="preserve"> — phụ trách </w:t>
       </w:r>
       <w:r>
         <w:rPr>
           <w:rFonts w:ascii="Times New Roman" w:hAnsi="Times New Roman"/>
           <w:b/>
         </w:rPr>
-        <w:t>EDA, Tiền xử lý dữ liệu và trích xuất 14 đặc trưng miền kế toán</w:t>
+        <w:t>EDA, Tiền xử lý dữ liệu và trích xuất 14 đặc trưng</w:t>
       </w:r>
       <w:r>
         <w:rPr>
@@ -6345,7 +2431,7 @@
           <w:rFonts w:ascii="Times New Roman" w:hAnsi="Times New Roman"/>
           <w:b/>
         </w:rPr>
-        <w:t>Xử lý mất cân bằng dữ liệu bằng SMOTENC/ADASYN và huấn luyện mô hình Random Forest</w:t>
+        <w:t>Xử lý mất cân bằng dữ liệu và huấn luyện mô hình Random Forest</w:t>
       </w:r>
       <w:r>
         <w:rPr>
@@ -6382,13 +2468,13 @@
           <w:rFonts w:ascii="Times New Roman" w:hAnsi="Times New Roman"/>
           <w:b/>
         </w:rPr>
-        <w:t>XGBoost siêu tốc, mạng Deep Autoencoder không giám sát</w:t>
-      </w:r>
-      <w:r>
-        <w:rPr>
-          <w:rFonts w:ascii="Times New Roman" w:hAnsi="Times New Roman"/>
-        </w:rPr>
-        <w:t xml:space="preserve"> và xuất các file model artifact.</w:t>
+        <w:t>XGBoost, mạng Deep Autoencoder</w:t>
+      </w:r>
+      <w:r>
+        <w:rPr>
+          <w:rFonts w:ascii="Times New Roman" w:hAnsi="Times New Roman"/>
+        </w:rPr>
+        <w:t>.</w:t>
       </w:r>
     </w:p>
     <w:p>
@@ -6419,7 +2505,7 @@
           <w:rFonts w:ascii="Times New Roman" w:hAnsi="Times New Roman"/>
           <w:b/>
         </w:rPr>
-        <w:t>Đánh giá kiểm thử độc lập, vẽ biểu đồ ROC/PR và lập bảng đối chuẩn giữa các mô hình</w:t>
+        <w:t>Đánh giá kiểm thử độc lập và lập bảng đối chuẩn giữa các mô hình</w:t>
       </w:r>
       <w:r>
         <w:rPr>
@@ -6456,7 +2542,7 @@
           <w:rFonts w:ascii="Times New Roman" w:hAnsi="Times New Roman"/>
           <w:b/>
         </w:rPr>
-        <w:t>Báo cáo khoa học Word chuẩn UIT và thiết kế 3 kịch bản kiểm thử Test Cases</w:t>
+        <w:t>Báo cáo</w:t>
       </w:r>
       <w:r>
         <w:rPr>
@@ -6486,14 +2572,14 @@
         <w:rPr>
           <w:rFonts w:ascii="Times New Roman" w:hAnsi="Times New Roman"/>
         </w:rPr>
-        <w:t xml:space="preserve"> — phụ trách </w:t>
+        <w:t xml:space="preserve"> — phụ trách  </w:t>
       </w:r>
       <w:r>
         <w:rPr>
           <w:rFonts w:ascii="Times New Roman" w:hAnsi="Times New Roman"/>
           <w:b/>
         </w:rPr>
-        <w:t>Lập trình giao diện Dashboard Streamlit thời gian thực và thực hiện Live Demo</w:t>
+        <w:t>giao diện và thực hiện Demo</w:t>
       </w:r>
       <w:r>
         <w:rPr>
@@ -6523,7 +2609,7 @@
         <w:rPr>
           <w:rFonts w:ascii="Times New Roman" w:hAnsi="Times New Roman"/>
         </w:rPr>
-        <w:t>, phụ trách quản lý tiến độ, thiết kế slide thuyết trình học thuật và đóng gói sản phẩm giao nộp.</w:t>
+        <w:t>, phụ trách quản lý tiến độ, thiết kế và đóng gói sản phẩm.</w:t>
       </w:r>
     </w:p>
     <w:p>
@@ -6577,7 +2663,7 @@
         <w:rPr>
           <w:rFonts w:ascii="Times New Roman" w:hAnsi="Times New Roman"/>
         </w:rPr>
-        <w:t xml:space="preserve">Để Thầy và các bạn tiện theo dõi, bài thuyết trình của nhóm em sẽ đi qua </w:t>
+        <w:t xml:space="preserve">Bài thuyết trình của nhóm em sẽ đi qua </w:t>
       </w:r>
       <w:r>
         <w:rPr>
@@ -6636,7 +2722,7 @@
         <w:rPr>
           <w:rFonts w:ascii="Times New Roman" w:hAnsi="Times New Roman"/>
         </w:rPr>
-        <w:t>: Bạn Thanh và bạn Sơn sẽ phân tích 3 dấu vết hành vi của kẻ gian, 14 đặc trưng kế toán và kỹ thuật xử lý mất cân bằng dữ liệu.</w:t>
+        <w:t>: Bạn Thanh và bạn Sơn sẽ phân tích 3 dấu vết hành vi của kẻ gian, 14 đặc trưng và kỹ thuật xử lý mất cân bằng dữ liệu.</w:t>
       </w:r>
     </w:p>
     <w:p>
@@ -6659,7 +2745,7 @@
         <w:rPr>
           <w:rFonts w:ascii="Times New Roman" w:hAnsi="Times New Roman"/>
         </w:rPr>
-        <w:t>: Bạn Sơn và bạn Cẩm sẽ trình bày kiến trúc Pipeline chuẩn Leak-Free cùng 3 mô hình học máy: Random Forest, XGBoost và Deep Autoencoder.</w:t>
+        <w:t>: Bạn Sơn và bạn Cẩm sẽ trình bày kiến trúc Pipeline cùng 3 mô hình học máy: Random Forest, XGBoost và Deep Autoencoder.</w:t>
       </w:r>
     </w:p>
     <w:p>
@@ -6705,7 +2791,7 @@
         <w:rPr>
           <w:rFonts w:ascii="Times New Roman" w:hAnsi="Times New Roman"/>
         </w:rPr>
-        <w:t>: Anh Duy và bạn Trung sẽ trình diễn các kịch bản kiểm thử cùng hệ thống Live Demo Streamlit thực tế và tổng kết.</w:t>
+        <w:t>: Bạn Trung sẽ Demo thực tế và tổng kết.</w:t>
       </w:r>
     </w:p>
     <w:p>
@@ -6726,7 +2812,7 @@
         <w:rPr>
           <w:rFonts w:ascii="Times New Roman" w:hAnsi="Times New Roman"/>
         </w:rPr>
-        <w:t xml:space="preserve"> bắt đầu với Phần 1 và Phần 2 ạ. Em mời Thanh!</w:t>
+        <w:t xml:space="preserve"> bắt đầu với Phần 1 và Phần 2 ạ. Mời Thanh!</w:t>
       </w:r>
     </w:p>
     <w:p>
@@ -7082,13 +3168,6 @@
         </w:rPr>
         <w:t>Đặc biệt, qua phân tích phân bố ban đầu, em phát hiện ra một quy luật rất đắt giá ở khung màu xanh bên dưới:</w:t>
       </w:r>
-    </w:p>
-    <w:p>
-      <w:r>
-        <w:rPr>
-          <w:rFonts w:ascii="Times New Roman" w:hAnsi="Times New Roman"/>
-        </w:rPr>
-      </w:r>
       <w:r>
         <w:rPr>
           <w:rFonts w:ascii="Times New Roman" w:hAnsi="Times New Roman"/>
@@ -9609,22 +5688,7 @@
         <w:rPr>
           <w:rFonts w:ascii="Times New Roman" w:hAnsi="Times New Roman"/>
         </w:rPr>
-      </w:r>
-    </w:p>
-    <w:p>
-      <w:r>
-        <w:rPr>
-          <w:rFonts w:ascii="Times New Roman" w:hAnsi="Times New Roman"/>
-        </w:rPr>
-        <w:t>Giao dịch chuyển khoản thông thường với dòng tiền cân đối, số dư trước và sau trừ tiền khớp chuẩn 100% về mặt sổ sách kế toán.</w:t>
-      </w:r>
-    </w:p>
-    <w:p>
-      <w:r>
-        <w:rPr>
-          <w:rFonts w:ascii="Times New Roman" w:hAnsi="Times New Roman"/>
-        </w:rPr>
-        <w:t>➔ *Kỳ vọng:* Hệ thống đánh giá an toàn, xác suất gian lận cực thấp dưới 0.1%, trả về trạng thái Hợp lệ.</w:t>
+        <w:t>Giao dịch chuyển khoản thông thường với dòng tiền cân đối, số dư trước và sau trừ tiền khớp chuẩn 100% về mặt sổ sách kế toán.➔ *Kỳ vọng:* Hệ thống đánh giá an toàn, xác suất gian lận cực thấp dưới 0.1%, trả về trạng thái Hợp lệ.</w:t>
       </w:r>
     </w:p>
     <w:p>
@@ -9647,22 +5711,7 @@
         <w:rPr>
           <w:rFonts w:ascii="Times New Roman" w:hAnsi="Times New Roman"/>
         </w:rPr>
-      </w:r>
-    </w:p>
-    <w:p>
-      <w:r>
-        <w:rPr>
-          <w:rFonts w:ascii="Times New Roman" w:hAnsi="Times New Roman"/>
-        </w:rPr>
-        <w:t>Mô phỏng hành vi tội phạm vét sạch tài khoản nạn nhân về đúng bằng 0 (`newbalanceOrig = 0`), số tiền chuyển đi lớn hơn số dư hiện có và xuất hiện sai lệch kế toán nghiêm trọng.</w:t>
-      </w:r>
-    </w:p>
-    <w:p>
-      <w:r>
-        <w:rPr>
-          <w:rFonts w:ascii="Times New Roman" w:hAnsi="Times New Roman"/>
-        </w:rPr>
-        <w:t>➔ *Kỳ vọng:* Mô hình XGBoost lập tức phát hiện với xác suất gian lận trên 88%, kích hoạt cờ đỏ khóa giao dịch ngay lập tức.</w:t>
+        <w:t>Mô phỏng hành vi tội phạm vét sạch tài khoản nạn nhân về đúng bằng 0 (`newbalanceOrig = 0`), số tiền chuyển đi lớn hơn số dư hiện có và xuất hiện sai lệch kế toán nghiêm trọng.➔ *Kỳ vọng:* Mô hình XGBoost lập tức phát hiện với xác suất gian lận trên 88%, kích hoạt cờ đỏ khóa giao dịch ngay lập tức.</w:t>
       </w:r>
     </w:p>
     <w:p>
@@ -10283,6 +6332,31 @@
         </w:rPr>
         <w:t xml:space="preserve"> _(EDA &amp; Preprocessing)_</w:t>
       </w:r>
+      <w:r>
+        <w:rPr>
+          <w:rFonts w:ascii="Times New Roman" w:hAnsi="Times New Roman"/>
+          <w:b/>
+          <w:i/>
+          <w:color w:val="444444"/>
+        </w:rPr>
+        <w:t>Hướng trả lời:</w:t>
+      </w:r>
+      <w:r>
+        <w:rPr>
+          <w:rFonts w:ascii="Times New Roman" w:hAnsi="Times New Roman"/>
+          <w:i/>
+          <w:color w:val="444444"/>
+        </w:rPr>
+        <w:t>"Dạ thưa thầy, nhóm em đã kiểm soát rất chặt nguy cơ rò rỉ dữ liệu qua 4 chốt chặn Leak-Free nghiêm ngặt:</w:t>
+      </w:r>
+    </w:p>
+    <w:p>
+      <w:r>
+        <w:rPr>
+          <w:rFonts w:ascii="Times New Roman" w:hAnsi="Times New Roman"/>
+        </w:rPr>
+        <w:t>&gt;</w:t>
+      </w:r>
     </w:p>
     <w:p>
       <w:pPr>
@@ -10294,22 +6368,7 @@
           <w:i/>
           <w:color w:val="444444"/>
         </w:rPr>
-      </w:r>
-      <w:r>
-        <w:rPr>
-          <w:rFonts w:ascii="Times New Roman" w:hAnsi="Times New Roman"/>
-          <w:b/>
-          <w:i/>
-          <w:color w:val="444444"/>
-        </w:rPr>
-        <w:t>Hướng trả lời:</w:t>
-      </w:r>
-      <w:r>
-        <w:rPr>
-          <w:rFonts w:ascii="Times New Roman" w:hAnsi="Times New Roman"/>
-          <w:i/>
-          <w:color w:val="444444"/>
-        </w:rPr>
+        <w:t>1. Tập Test độc lập (20%) được tách riêng đầu tiên trước mọi bước xử lý.</w:t>
       </w:r>
     </w:p>
     <w:p>
@@ -10322,7 +6381,7 @@
           <w:i/>
           <w:color w:val="444444"/>
         </w:rPr>
-        <w:t>"Dạ thưa thầy, nhóm em đã kiểm soát rất chặt nguy cơ rò rỉ dữ liệu qua 4 chốt chặn Leak-Free nghiêm ngặt:</w:t>
+        <w:t>2. SMOTENC chỉ chạy trên 80% tập Train. Tập Test hoàn toàn giữ nguyên phân bố tự nhiên 0.13% và tuyệt đối không có mẫu nhân tạo nào.</w:t>
       </w:r>
     </w:p>
     <w:p>
@@ -10335,7 +6394,7 @@
           <w:i/>
           <w:color w:val="444444"/>
         </w:rPr>
-        <w:t>1. Tập Test độc lập (20%) được tách riêng đầu tiên trước mọi bước xử lý.</w:t>
+        <w:t>3. StandardScaler chỉ `fit` trên Train và `transform` mù trên Test.</w:t>
       </w:r>
     </w:p>
     <w:p>
@@ -10348,7 +6407,7 @@
           <w:i/>
           <w:color w:val="444444"/>
         </w:rPr>
-        <w:t>2. SMOTENC chỉ chạy trên 80% tập Train. Tập Test hoàn toàn giữ nguyên phân bố tự nhiên 0.13% và tuyệt đối không có mẫu nhân tạo nào.</w:t>
+        <w:t>4. Toàn bộ quá trình chọn ngưỡng và tinh chỉnh tham số đều dùng 5-Fold Cross Validation nội bộ trên Train.</w:t>
       </w:r>
     </w:p>
     <w:p>
@@ -10361,33 +6420,7 @@
           <w:i/>
           <w:color w:val="444444"/>
         </w:rPr>
-        <w:t>3. StandardScaler chỉ `fit` trên Train và `transform` mù trên Test.</w:t>
-      </w:r>
-    </w:p>
-    <w:p>
-      <w:pPr>
-        <w:ind w:left="432" w:right="432"/>
-      </w:pPr>
-      <w:r>
-        <w:rPr>
-          <w:rFonts w:ascii="Times New Roman" w:hAnsi="Times New Roman"/>
-          <w:i/>
-          <w:color w:val="444444"/>
-        </w:rPr>
-        <w:t>4. Toàn bộ quá trình chọn ngưỡng và tinh chỉnh tham số đều dùng 5-Fold Cross Validation nội bộ trên Train.</w:t>
-      </w:r>
-    </w:p>
-    <w:p>
-      <w:pPr>
-        <w:ind w:left="432" w:right="432"/>
-      </w:pPr>
-      <w:r>
-        <w:rPr>
-          <w:rFonts w:ascii="Times New Roman" w:hAnsi="Times New Roman"/>
-          <w:i/>
-          <w:color w:val="444444"/>
-        </w:rPr>
-        <w:t>Điểm số cao thực chất là nhờ 2 đặc trưng miền `errorBalanceOrig` và `newbalanceOrig` do em thiết kế đã giải thích đúng bản chất kế toán của hành vi gian lận (chiếm &gt;97% split gains), giúp biến bài toán phân lớp phi tuyến phức tạp thành ranh giới tuyến tính phân tách rõ rệt thay vì do mô hình học vẹt ạ."</w:t>
+        <w:t xml:space="preserve">   Điểm số cao thực chất là nhờ 2 đặc trưng miền `errorBalanceOrig` và `newbalanceOrig` do em thiết kế đã giải thích đúng bản chất kế toán của hành vi gian lận (chiếm &gt;97% split gains), giúp biến bài toán phân lớp phi tuyến phức tạp thành ranh giới tuyến tính phân tách rõ rệt thay vì do mô hình học vẹt ạ."</w:t>
       </w:r>
     </w:p>
     <w:p>

</xml_diff>

<commit_message>
docs(scripts): cap nhat bang doi chieu 15 phut va cot tinh trang script thanh vien
</commit_message>
<xml_diff>
--- a/draft/fraud-detection/slide/scripts/SCRIPT_THUYET_TRINH_TOAN_TEAM_CS106.docx
+++ b/draft/fraud-detection/slide/scripts/SCRIPT_THUYET_TRINH_TOAN_TEAM_CS106.docx
@@ -780,20 +780,21 @@
         <w:tblLook w:firstColumn="1" w:firstRow="1" w:lastColumn="0" w:lastRow="0" w:noHBand="0" w:noVBand="1" w:val="04A0"/>
       </w:tblPr>
       <w:tblGrid>
-        <w:gridCol w:w="1104"/>
-        <w:gridCol w:w="1104"/>
-        <w:gridCol w:w="1104"/>
-        <w:gridCol w:w="1104"/>
-        <w:gridCol w:w="1104"/>
-        <w:gridCol w:w="1104"/>
-        <w:gridCol w:w="1104"/>
-        <w:gridCol w:w="1104"/>
-        <w:gridCol w:w="1104"/>
+        <w:gridCol w:w="994"/>
+        <w:gridCol w:w="994"/>
+        <w:gridCol w:w="994"/>
+        <w:gridCol w:w="994"/>
+        <w:gridCol w:w="994"/>
+        <w:gridCol w:w="994"/>
+        <w:gridCol w:w="994"/>
+        <w:gridCol w:w="994"/>
+        <w:gridCol w:w="994"/>
+        <w:gridCol w:w="994"/>
       </w:tblGrid>
       <w:tr>
         <w:tc>
           <w:tcPr>
-            <w:tcW w:type="dxa" w:w="1104"/>
+            <w:tcW w:type="dxa" w:w="994"/>
             <w:shd w:fill="1F497D"/>
           </w:tcPr>
           <w:p>
@@ -812,7 +813,7 @@
         </w:tc>
         <w:tc>
           <w:tcPr>
-            <w:tcW w:type="dxa" w:w="1104"/>
+            <w:tcW w:type="dxa" w:w="994"/>
             <w:shd w:fill="1F497D"/>
           </w:tcPr>
           <w:p>
@@ -831,7 +832,7 @@
         </w:tc>
         <w:tc>
           <w:tcPr>
-            <w:tcW w:type="dxa" w:w="1104"/>
+            <w:tcW w:type="dxa" w:w="994"/>
             <w:shd w:fill="1F497D"/>
           </w:tcPr>
           <w:p>
@@ -850,7 +851,26 @@
         </w:tc>
         <w:tc>
           <w:tcPr>
-            <w:tcW w:type="dxa" w:w="1104"/>
+            <w:tcW w:type="dxa" w:w="994"/>
+            <w:shd w:fill="1F497D"/>
+          </w:tcPr>
+          <w:p>
+            <w:pPr>
+              <w:jc w:val="center"/>
+            </w:pPr>
+            <w:r>
+              <w:rPr>
+                <w:rFonts w:ascii="Times New Roman" w:hAnsi="Times New Roman"/>
+                <w:b/>
+                <w:color w:val="FFFFFF"/>
+              </w:rPr>
+              <w:t>Tình trạng cập nhật script</w:t>
+            </w:r>
+          </w:p>
+        </w:tc>
+        <w:tc>
+          <w:tcPr>
+            <w:tcW w:type="dxa" w:w="994"/>
             <w:shd w:fill="1F497D"/>
           </w:tcPr>
           <w:p>
@@ -869,7 +889,7 @@
         </w:tc>
         <w:tc>
           <w:tcPr>
-            <w:tcW w:type="dxa" w:w="1104"/>
+            <w:tcW w:type="dxa" w:w="994"/>
             <w:shd w:fill="1F497D"/>
           </w:tcPr>
           <w:p>
@@ -888,7 +908,7 @@
         </w:tc>
         <w:tc>
           <w:tcPr>
-            <w:tcW w:type="dxa" w:w="1104"/>
+            <w:tcW w:type="dxa" w:w="994"/>
             <w:shd w:fill="1F497D"/>
           </w:tcPr>
           <w:p>
@@ -907,7 +927,7 @@
         </w:tc>
         <w:tc>
           <w:tcPr>
-            <w:tcW w:type="dxa" w:w="1104"/>
+            <w:tcW w:type="dxa" w:w="994"/>
             <w:shd w:fill="1F497D"/>
           </w:tcPr>
           <w:p>
@@ -926,7 +946,7 @@
         </w:tc>
         <w:tc>
           <w:tcPr>
-            <w:tcW w:type="dxa" w:w="1104"/>
+            <w:tcW w:type="dxa" w:w="994"/>
             <w:shd w:fill="1F497D"/>
           </w:tcPr>
           <w:p>
@@ -945,7 +965,7 @@
         </w:tc>
         <w:tc>
           <w:tcPr>
-            <w:tcW w:type="dxa" w:w="1104"/>
+            <w:tcW w:type="dxa" w:w="994"/>
             <w:shd w:fill="1F497D"/>
           </w:tcPr>
           <w:p>
@@ -966,7 +986,7 @@
       <w:tr>
         <w:tc>
           <w:tcPr>
-            <w:tcW w:type="dxa" w:w="1104"/>
+            <w:tcW w:type="dxa" w:w="994"/>
           </w:tcPr>
           <w:p>
             <w:r>
@@ -980,7 +1000,7 @@
         </w:tc>
         <w:tc>
           <w:tcPr>
-            <w:tcW w:type="dxa" w:w="1104"/>
+            <w:tcW w:type="dxa" w:w="994"/>
           </w:tcPr>
           <w:p>
             <w:r>
@@ -994,7 +1014,7 @@
         </w:tc>
         <w:tc>
           <w:tcPr>
-            <w:tcW w:type="dxa" w:w="1104"/>
+            <w:tcW w:type="dxa" w:w="994"/>
           </w:tcPr>
           <w:p>
             <w:r>
@@ -1008,7 +1028,21 @@
         </w:tc>
         <w:tc>
           <w:tcPr>
-            <w:tcW w:type="dxa" w:w="1104"/>
+            <w:tcW w:type="dxa" w:w="994"/>
+          </w:tcPr>
+          <w:p>
+            <w:r>
+              <w:rPr>
+                <w:rFonts w:ascii="Times New Roman" w:hAnsi="Times New Roman"/>
+                <w:sz w:val="20"/>
+              </w:rPr>
+              <w:t>🟢 **Đã cập nhật** *(Rút gọn Slide 1 &amp; 2)*</w:t>
+            </w:r>
+          </w:p>
+        </w:tc>
+        <w:tc>
+          <w:tcPr>
+            <w:tcW w:type="dxa" w:w="994"/>
           </w:tcPr>
           <w:p>
             <w:r>
@@ -1022,7 +1056,7 @@
         </w:tc>
         <w:tc>
           <w:tcPr>
-            <w:tcW w:type="dxa" w:w="1104"/>
+            <w:tcW w:type="dxa" w:w="994"/>
           </w:tcPr>
           <w:p>
             <w:r>
@@ -1036,7 +1070,7 @@
         </w:tc>
         <w:tc>
           <w:tcPr>
-            <w:tcW w:type="dxa" w:w="1104"/>
+            <w:tcW w:type="dxa" w:w="994"/>
           </w:tcPr>
           <w:p>
             <w:r>
@@ -1044,13 +1078,13 @@
                 <w:rFonts w:ascii="Times New Roman" w:hAnsi="Times New Roman"/>
                 <w:sz w:val="20"/>
               </w:rPr>
-              <w:t>**2 phút 35s** *(155s)*</w:t>
+              <w:t>**1 phút 22s** *(82s)*</w:t>
             </w:r>
           </w:p>
         </w:tc>
         <w:tc>
           <w:tcPr>
-            <w:tcW w:type="dxa" w:w="1104"/>
+            <w:tcW w:type="dxa" w:w="994"/>
           </w:tcPr>
           <w:p>
             <w:r>
@@ -1064,7 +1098,7 @@
         </w:tc>
         <w:tc>
           <w:tcPr>
-            <w:tcW w:type="dxa" w:w="1104"/>
+            <w:tcW w:type="dxa" w:w="994"/>
           </w:tcPr>
           <w:p>
             <w:r>
@@ -1072,13 +1106,13 @@
                 <w:rFonts w:ascii="Times New Roman" w:hAnsi="Times New Roman"/>
                 <w:sz w:val="20"/>
               </w:rPr>
-              <w:t>🔴**Vượt +1m20s** *(+106%)*</w:t>
+              <w:t>🟢 **Vượt +7s** *(+9%)*</w:t>
             </w:r>
           </w:p>
         </w:tc>
         <w:tc>
           <w:tcPr>
-            <w:tcW w:type="dxa" w:w="1104"/>
+            <w:tcW w:type="dxa" w:w="994"/>
           </w:tcPr>
           <w:p>
             <w:r>
@@ -1086,7 +1120,7 @@
                 <w:rFonts w:ascii="Times New Roman" w:hAnsi="Times New Roman"/>
                 <w:sz w:val="20"/>
               </w:rPr>
-              <w:t>⚠️**Cần rút gọn:** Đọc nhanh tên 7 bạn (45s) + lướt nhanh Agenda (30s).</w:t>
+              <w:t>✅ **ĐẠT CHUẨN** (Khớp mục tiêu sau khi rút gọn).</w:t>
             </w:r>
           </w:p>
         </w:tc>
@@ -1094,7 +1128,7 @@
       <w:tr>
         <w:tc>
           <w:tcPr>
-            <w:tcW w:type="dxa" w:w="1104"/>
+            <w:tcW w:type="dxa" w:w="994"/>
           </w:tcPr>
           <w:p>
             <w:r>
@@ -1108,7 +1142,7 @@
         </w:tc>
         <w:tc>
           <w:tcPr>
-            <w:tcW w:type="dxa" w:w="1104"/>
+            <w:tcW w:type="dxa" w:w="994"/>
           </w:tcPr>
           <w:p>
             <w:r>
@@ -1122,7 +1156,7 @@
         </w:tc>
         <w:tc>
           <w:tcPr>
-            <w:tcW w:type="dxa" w:w="1104"/>
+            <w:tcW w:type="dxa" w:w="994"/>
           </w:tcPr>
           <w:p>
             <w:r>
@@ -1136,7 +1170,21 @@
         </w:tc>
         <w:tc>
           <w:tcPr>
-            <w:tcW w:type="dxa" w:w="1104"/>
+            <w:tcW w:type="dxa" w:w="994"/>
+          </w:tcPr>
+          <w:p>
+            <w:r>
+              <w:rPr>
+                <w:rFonts w:ascii="Times New Roman" w:hAnsi="Times New Roman"/>
+                <w:sz w:val="20"/>
+              </w:rPr>
+              <w:t>🟢 **Đã cập nhật** *(Rút gọn Slide 3–8 PR #37)*</w:t>
+            </w:r>
+          </w:p>
+        </w:tc>
+        <w:tc>
+          <w:tcPr>
+            <w:tcW w:type="dxa" w:w="994"/>
           </w:tcPr>
           <w:p>
             <w:r>
@@ -1150,7 +1198,7 @@
         </w:tc>
         <w:tc>
           <w:tcPr>
-            <w:tcW w:type="dxa" w:w="1104"/>
+            <w:tcW w:type="dxa" w:w="994"/>
           </w:tcPr>
           <w:p>
             <w:r>
@@ -1164,7 +1212,7 @@
         </w:tc>
         <w:tc>
           <w:tcPr>
-            <w:tcW w:type="dxa" w:w="1104"/>
+            <w:tcW w:type="dxa" w:w="994"/>
           </w:tcPr>
           <w:p>
             <w:r>
@@ -1178,7 +1226,7 @@
         </w:tc>
         <w:tc>
           <w:tcPr>
-            <w:tcW w:type="dxa" w:w="1104"/>
+            <w:tcW w:type="dxa" w:w="994"/>
           </w:tcPr>
           <w:p>
             <w:r>
@@ -1192,7 +1240,7 @@
         </w:tc>
         <w:tc>
           <w:tcPr>
-            <w:tcW w:type="dxa" w:w="1104"/>
+            <w:tcW w:type="dxa" w:w="994"/>
           </w:tcPr>
           <w:p>
             <w:r>
@@ -1200,13 +1248,13 @@
                 <w:rFonts w:ascii="Times New Roman" w:hAnsi="Times New Roman"/>
                 <w:sz w:val="20"/>
               </w:rPr>
-              <w:t>🔴**Vượt +1m52s** *(+53%)*</w:t>
+              <w:t>🔴 **Vượt +1m52s** *(+53%)*</w:t>
             </w:r>
           </w:p>
         </w:tc>
         <w:tc>
           <w:tcPr>
-            <w:tcW w:type="dxa" w:w="1104"/>
+            <w:tcW w:type="dxa" w:w="994"/>
           </w:tcPr>
           <w:p>
             <w:r>
@@ -1214,7 +1262,7 @@
                 <w:rFonts w:ascii="Times New Roman" w:hAnsi="Times New Roman"/>
                 <w:sz w:val="20"/>
               </w:rPr>
-              <w:t>⚠️**Cần nói lướt:** Đi thẳng vào 2 biến quyết định 97.1% (PR #37).</w:t>
+              <w:t>⚠️ **Cần nói lướt:** Đi thẳng vào 2 biến quyết định 97.1%.</w:t>
             </w:r>
           </w:p>
         </w:tc>
@@ -1222,7 +1270,7 @@
       <w:tr>
         <w:tc>
           <w:tcPr>
-            <w:tcW w:type="dxa" w:w="1104"/>
+            <w:tcW w:type="dxa" w:w="994"/>
           </w:tcPr>
           <w:p>
             <w:r>
@@ -1236,7 +1284,7 @@
         </w:tc>
         <w:tc>
           <w:tcPr>
-            <w:tcW w:type="dxa" w:w="1104"/>
+            <w:tcW w:type="dxa" w:w="994"/>
           </w:tcPr>
           <w:p>
             <w:r>
@@ -1250,7 +1298,7 @@
         </w:tc>
         <w:tc>
           <w:tcPr>
-            <w:tcW w:type="dxa" w:w="1104"/>
+            <w:tcW w:type="dxa" w:w="994"/>
           </w:tcPr>
           <w:p>
             <w:r>
@@ -1264,7 +1312,21 @@
         </w:tc>
         <w:tc>
           <w:tcPr>
-            <w:tcW w:type="dxa" w:w="1104"/>
+            <w:tcW w:type="dxa" w:w="994"/>
+          </w:tcPr>
+          <w:p>
+            <w:r>
+              <w:rPr>
+                <w:rFonts w:ascii="Times New Roman" w:hAnsi="Times New Roman"/>
+                <w:sz w:val="20"/>
+              </w:rPr>
+              <w:t>🔴 **Chưa cập nhật** *(Giữ nguyên bản cũ)*</w:t>
+            </w:r>
+          </w:p>
+        </w:tc>
+        <w:tc>
+          <w:tcPr>
+            <w:tcW w:type="dxa" w:w="994"/>
           </w:tcPr>
           <w:p>
             <w:r>
@@ -1278,7 +1340,7 @@
         </w:tc>
         <w:tc>
           <w:tcPr>
-            <w:tcW w:type="dxa" w:w="1104"/>
+            <w:tcW w:type="dxa" w:w="994"/>
           </w:tcPr>
           <w:p>
             <w:r>
@@ -1292,7 +1354,7 @@
         </w:tc>
         <w:tc>
           <w:tcPr>
-            <w:tcW w:type="dxa" w:w="1104"/>
+            <w:tcW w:type="dxa" w:w="994"/>
           </w:tcPr>
           <w:p>
             <w:r>
@@ -1306,7 +1368,7 @@
         </w:tc>
         <w:tc>
           <w:tcPr>
-            <w:tcW w:type="dxa" w:w="1104"/>
+            <w:tcW w:type="dxa" w:w="994"/>
           </w:tcPr>
           <w:p>
             <w:r>
@@ -1320,7 +1382,7 @@
         </w:tc>
         <w:tc>
           <w:tcPr>
-            <w:tcW w:type="dxa" w:w="1104"/>
+            <w:tcW w:type="dxa" w:w="994"/>
           </w:tcPr>
           <w:p>
             <w:r>
@@ -1328,13 +1390,13 @@
                 <w:rFonts w:ascii="Times New Roman" w:hAnsi="Times New Roman"/>
                 <w:sz w:val="20"/>
               </w:rPr>
-              <w:t>🔴**Vượt +1m30s** *(+75%)*</w:t>
+              <w:t>🔴 **Vượt +1m30s** *(+75%)*</w:t>
             </w:r>
           </w:p>
         </w:tc>
         <w:tc>
           <w:tcPr>
-            <w:tcW w:type="dxa" w:w="1104"/>
+            <w:tcW w:type="dxa" w:w="994"/>
           </w:tcPr>
           <w:p>
             <w:r>
@@ -1342,7 +1404,7 @@
                 <w:rFonts w:ascii="Times New Roman" w:hAnsi="Times New Roman"/>
                 <w:sz w:val="20"/>
               </w:rPr>
-              <w:t>⚠️**Cắt lý thuyết:** Bỏ giải thích ADASYN, chỉ nêu kết quả RF F1=0.9973.</w:t>
+              <w:t>⚠️ **Cắt lý thuyết:** Bỏ giải thích ADASYN, chỉ nêu kết quả RF F1=0.9973.</w:t>
             </w:r>
           </w:p>
         </w:tc>
@@ -1350,7 +1412,7 @@
       <w:tr>
         <w:tc>
           <w:tcPr>
-            <w:tcW w:type="dxa" w:w="1104"/>
+            <w:tcW w:type="dxa" w:w="994"/>
           </w:tcPr>
           <w:p>
             <w:r>
@@ -1364,7 +1426,7 @@
         </w:tc>
         <w:tc>
           <w:tcPr>
-            <w:tcW w:type="dxa" w:w="1104"/>
+            <w:tcW w:type="dxa" w:w="994"/>
           </w:tcPr>
           <w:p>
             <w:r>
@@ -1378,7 +1440,7 @@
         </w:tc>
         <w:tc>
           <w:tcPr>
-            <w:tcW w:type="dxa" w:w="1104"/>
+            <w:tcW w:type="dxa" w:w="994"/>
           </w:tcPr>
           <w:p>
             <w:r>
@@ -1392,7 +1454,21 @@
         </w:tc>
         <w:tc>
           <w:tcPr>
-            <w:tcW w:type="dxa" w:w="1104"/>
+            <w:tcW w:type="dxa" w:w="994"/>
+          </w:tcPr>
+          <w:p>
+            <w:r>
+              <w:rPr>
+                <w:rFonts w:ascii="Times New Roman" w:hAnsi="Times New Roman"/>
+                <w:sz w:val="20"/>
+              </w:rPr>
+              <w:t>🔴 **Chưa cập nhật** *(Giữ nguyên bản cũ)*</w:t>
+            </w:r>
+          </w:p>
+        </w:tc>
+        <w:tc>
+          <w:tcPr>
+            <w:tcW w:type="dxa" w:w="994"/>
           </w:tcPr>
           <w:p>
             <w:r>
@@ -1406,7 +1482,7 @@
         </w:tc>
         <w:tc>
           <w:tcPr>
-            <w:tcW w:type="dxa" w:w="1104"/>
+            <w:tcW w:type="dxa" w:w="994"/>
           </w:tcPr>
           <w:p>
             <w:r>
@@ -1420,7 +1496,7 @@
         </w:tc>
         <w:tc>
           <w:tcPr>
-            <w:tcW w:type="dxa" w:w="1104"/>
+            <w:tcW w:type="dxa" w:w="994"/>
           </w:tcPr>
           <w:p>
             <w:r>
@@ -1434,7 +1510,7 @@
         </w:tc>
         <w:tc>
           <w:tcPr>
-            <w:tcW w:type="dxa" w:w="1104"/>
+            <w:tcW w:type="dxa" w:w="994"/>
           </w:tcPr>
           <w:p>
             <w:r>
@@ -1448,7 +1524,7 @@
         </w:tc>
         <w:tc>
           <w:tcPr>
-            <w:tcW w:type="dxa" w:w="1104"/>
+            <w:tcW w:type="dxa" w:w="994"/>
           </w:tcPr>
           <w:p>
             <w:r>
@@ -1456,13 +1532,13 @@
                 <w:rFonts w:ascii="Times New Roman" w:hAnsi="Times New Roman"/>
                 <w:sz w:val="20"/>
               </w:rPr>
-              <w:t>🔴**Vượt +1m43s** *(+86%)*</w:t>
+              <w:t>🔴 **Vượt +1m43s** *(+86%)*</w:t>
             </w:r>
           </w:p>
         </w:tc>
         <w:tc>
           <w:tcPr>
-            <w:tcW w:type="dxa" w:w="1104"/>
+            <w:tcW w:type="dxa" w:w="994"/>
           </w:tcPr>
           <w:p>
             <w:r>
@@ -1470,7 +1546,7 @@
                 <w:rFonts w:ascii="Times New Roman" w:hAnsi="Times New Roman"/>
                 <w:sz w:val="20"/>
               </w:rPr>
-              <w:t>⚠️**Cần cô đọng:** XGB 40s + Autoencoder &amp; ngưỡng 95th 80s.</w:t>
+              <w:t>⚠️ **Cần cô đọng:** XGB 40s + Autoencoder &amp; ngưỡng 95th 80s.</w:t>
             </w:r>
           </w:p>
         </w:tc>
@@ -1478,7 +1554,7 @@
       <w:tr>
         <w:tc>
           <w:tcPr>
-            <w:tcW w:type="dxa" w:w="1104"/>
+            <w:tcW w:type="dxa" w:w="994"/>
           </w:tcPr>
           <w:p>
             <w:r>
@@ -1492,7 +1568,7 @@
         </w:tc>
         <w:tc>
           <w:tcPr>
-            <w:tcW w:type="dxa" w:w="1104"/>
+            <w:tcW w:type="dxa" w:w="994"/>
           </w:tcPr>
           <w:p>
             <w:r>
@@ -1506,7 +1582,7 @@
         </w:tc>
         <w:tc>
           <w:tcPr>
-            <w:tcW w:type="dxa" w:w="1104"/>
+            <w:tcW w:type="dxa" w:w="994"/>
           </w:tcPr>
           <w:p>
             <w:r>
@@ -1520,7 +1596,21 @@
         </w:tc>
         <w:tc>
           <w:tcPr>
-            <w:tcW w:type="dxa" w:w="1104"/>
+            <w:tcW w:type="dxa" w:w="994"/>
+          </w:tcPr>
+          <w:p>
+            <w:r>
+              <w:rPr>
+                <w:rFonts w:ascii="Times New Roman" w:hAnsi="Times New Roman"/>
+                <w:sz w:val="20"/>
+              </w:rPr>
+              <w:t>🔴 **Chưa cập nhật** *(Giữ nguyên bản cũ)*</w:t>
+            </w:r>
+          </w:p>
+        </w:tc>
+        <w:tc>
+          <w:tcPr>
+            <w:tcW w:type="dxa" w:w="994"/>
           </w:tcPr>
           <w:p>
             <w:r>
@@ -1534,7 +1624,7 @@
         </w:tc>
         <w:tc>
           <w:tcPr>
-            <w:tcW w:type="dxa" w:w="1104"/>
+            <w:tcW w:type="dxa" w:w="994"/>
           </w:tcPr>
           <w:p>
             <w:r>
@@ -1548,7 +1638,7 @@
         </w:tc>
         <w:tc>
           <w:tcPr>
-            <w:tcW w:type="dxa" w:w="1104"/>
+            <w:tcW w:type="dxa" w:w="994"/>
           </w:tcPr>
           <w:p>
             <w:r>
@@ -1562,7 +1652,7 @@
         </w:tc>
         <w:tc>
           <w:tcPr>
-            <w:tcW w:type="dxa" w:w="1104"/>
+            <w:tcW w:type="dxa" w:w="994"/>
           </w:tcPr>
           <w:p>
             <w:r>
@@ -1576,7 +1666,7 @@
         </w:tc>
         <w:tc>
           <w:tcPr>
-            <w:tcW w:type="dxa" w:w="1104"/>
+            <w:tcW w:type="dxa" w:w="994"/>
           </w:tcPr>
           <w:p>
             <w:r>
@@ -1584,13 +1674,13 @@
                 <w:rFonts w:ascii="Times New Roman" w:hAnsi="Times New Roman"/>
                 <w:sz w:val="20"/>
               </w:rPr>
-              <w:t>🔴**Vượt +2m24s** *(+106%)*</w:t>
+              <w:t>🔴 **Vượt +2m24s** *(+106%)*</w:t>
             </w:r>
           </w:p>
         </w:tc>
         <w:tc>
           <w:tcPr>
-            <w:tcW w:type="dxa" w:w="1104"/>
+            <w:tcW w:type="dxa" w:w="994"/>
           </w:tcPr>
           <w:p>
             <w:r>
@@ -1598,7 +1688,7 @@
                 <w:rFonts w:ascii="Times New Roman" w:hAnsi="Times New Roman"/>
                 <w:sz w:val="20"/>
               </w:rPr>
-              <w:t>⚠️**Không đọc bảng:** Chỉ nêu bật RF &amp; XGBoost dẫn đầu, lướt các chỉ số phụ.</w:t>
+              <w:t>⚠️ **Không đọc bảng:** Chỉ nêu bật RF &amp; XGBoost dẫn đầu, lướt các chỉ số phụ.</w:t>
             </w:r>
           </w:p>
         </w:tc>
@@ -1606,7 +1696,7 @@
       <w:tr>
         <w:tc>
           <w:tcPr>
-            <w:tcW w:type="dxa" w:w="1104"/>
+            <w:tcW w:type="dxa" w:w="994"/>
           </w:tcPr>
           <w:p>
             <w:r>
@@ -1620,7 +1710,7 @@
         </w:tc>
         <w:tc>
           <w:tcPr>
-            <w:tcW w:type="dxa" w:w="1104"/>
+            <w:tcW w:type="dxa" w:w="994"/>
           </w:tcPr>
           <w:p>
             <w:r>
@@ -1634,7 +1724,7 @@
         </w:tc>
         <w:tc>
           <w:tcPr>
-            <w:tcW w:type="dxa" w:w="1104"/>
+            <w:tcW w:type="dxa" w:w="994"/>
           </w:tcPr>
           <w:p>
             <w:r>
@@ -1648,7 +1738,21 @@
         </w:tc>
         <w:tc>
           <w:tcPr>
-            <w:tcW w:type="dxa" w:w="1104"/>
+            <w:tcW w:type="dxa" w:w="994"/>
+          </w:tcPr>
+          <w:p>
+            <w:r>
+              <w:rPr>
+                <w:rFonts w:ascii="Times New Roman" w:hAnsi="Times New Roman"/>
+                <w:sz w:val="20"/>
+              </w:rPr>
+              <w:t>🟢 **Đã cập nhật** *(0s — Chuyển sang Q&amp;A)*</w:t>
+            </w:r>
+          </w:p>
+        </w:tc>
+        <w:tc>
+          <w:tcPr>
+            <w:tcW w:type="dxa" w:w="994"/>
           </w:tcPr>
           <w:p>
             <w:r>
@@ -1662,7 +1766,7 @@
         </w:tc>
         <w:tc>
           <w:tcPr>
-            <w:tcW w:type="dxa" w:w="1104"/>
+            <w:tcW w:type="dxa" w:w="994"/>
           </w:tcPr>
           <w:p>
             <w:r>
@@ -1676,7 +1780,7 @@
         </w:tc>
         <w:tc>
           <w:tcPr>
-            <w:tcW w:type="dxa" w:w="1104"/>
+            <w:tcW w:type="dxa" w:w="994"/>
           </w:tcPr>
           <w:p>
             <w:r>
@@ -1690,7 +1794,7 @@
         </w:tc>
         <w:tc>
           <w:tcPr>
-            <w:tcW w:type="dxa" w:w="1104"/>
+            <w:tcW w:type="dxa" w:w="994"/>
           </w:tcPr>
           <w:p>
             <w:r>
@@ -1704,7 +1808,7 @@
         </w:tc>
         <w:tc>
           <w:tcPr>
-            <w:tcW w:type="dxa" w:w="1104"/>
+            <w:tcW w:type="dxa" w:w="994"/>
           </w:tcPr>
           <w:p>
             <w:r>
@@ -1712,13 +1816,13 @@
                 <w:rFonts w:ascii="Times New Roman" w:hAnsi="Times New Roman"/>
                 <w:sz w:val="20"/>
               </w:rPr>
-              <w:t>🟢**`0s` (Khớp tuyệt đối)**</w:t>
+              <w:t>🟢 **`0s` (Khớp tuyệt đối)**</w:t>
             </w:r>
           </w:p>
         </w:tc>
         <w:tc>
           <w:tcPr>
-            <w:tcW w:type="dxa" w:w="1104"/>
+            <w:tcW w:type="dxa" w:w="994"/>
           </w:tcPr>
           <w:p>
             <w:r>
@@ -1726,7 +1830,7 @@
                 <w:rFonts w:ascii="Times New Roman" w:hAnsi="Times New Roman"/>
                 <w:sz w:val="20"/>
               </w:rPr>
-              <w:t>🎯**HOÀN THÀNH MỤC TIÊU:** Duy không nói slide, tránh đổi micro.</w:t>
+              <w:t>🎯 **HOÀN THÀNH MỤC TIÊU:** Duy không nói slide, tránh đổi micro.</w:t>
             </w:r>
           </w:p>
         </w:tc>
@@ -1734,7 +1838,7 @@
       <w:tr>
         <w:tc>
           <w:tcPr>
-            <w:tcW w:type="dxa" w:w="1104"/>
+            <w:tcW w:type="dxa" w:w="994"/>
           </w:tcPr>
           <w:p>
             <w:r>
@@ -1748,7 +1852,7 @@
         </w:tc>
         <w:tc>
           <w:tcPr>
-            <w:tcW w:type="dxa" w:w="1104"/>
+            <w:tcW w:type="dxa" w:w="994"/>
           </w:tcPr>
           <w:p>
             <w:r>
@@ -1762,7 +1866,7 @@
         </w:tc>
         <w:tc>
           <w:tcPr>
-            <w:tcW w:type="dxa" w:w="1104"/>
+            <w:tcW w:type="dxa" w:w="994"/>
           </w:tcPr>
           <w:p>
             <w:r>
@@ -1776,7 +1880,21 @@
         </w:tc>
         <w:tc>
           <w:tcPr>
-            <w:tcW w:type="dxa" w:w="1104"/>
+            <w:tcW w:type="dxa" w:w="994"/>
+          </w:tcPr>
+          <w:p>
+            <w:r>
+              <w:rPr>
+                <w:rFonts w:ascii="Times New Roman" w:hAnsi="Times New Roman"/>
+                <w:sz w:val="20"/>
+              </w:rPr>
+              <w:t>🔴 **Chưa cập nhật** *(Chưa gộp kịch bản Slide 20)*</w:t>
+            </w:r>
+          </w:p>
+        </w:tc>
+        <w:tc>
+          <w:tcPr>
+            <w:tcW w:type="dxa" w:w="994"/>
           </w:tcPr>
           <w:p>
             <w:r>
@@ -1790,7 +1908,7 @@
         </w:tc>
         <w:tc>
           <w:tcPr>
-            <w:tcW w:type="dxa" w:w="1104"/>
+            <w:tcW w:type="dxa" w:w="994"/>
           </w:tcPr>
           <w:p>
             <w:r>
@@ -1804,7 +1922,7 @@
         </w:tc>
         <w:tc>
           <w:tcPr>
-            <w:tcW w:type="dxa" w:w="1104"/>
+            <w:tcW w:type="dxa" w:w="994"/>
           </w:tcPr>
           <w:p>
             <w:r>
@@ -1818,7 +1936,7 @@
         </w:tc>
         <w:tc>
           <w:tcPr>
-            <w:tcW w:type="dxa" w:w="1104"/>
+            <w:tcW w:type="dxa" w:w="994"/>
           </w:tcPr>
           <w:p>
             <w:r>
@@ -1832,7 +1950,7 @@
         </w:tc>
         <w:tc>
           <w:tcPr>
-            <w:tcW w:type="dxa" w:w="1104"/>
+            <w:tcW w:type="dxa" w:w="994"/>
           </w:tcPr>
           <w:p>
             <w:r>
@@ -1840,13 +1958,13 @@
                 <w:rFonts w:ascii="Times New Roman" w:hAnsi="Times New Roman"/>
                 <w:sz w:val="20"/>
               </w:rPr>
-              <w:t>🔴**Vượt +1m10s** *(+44%)*</w:t>
+              <w:t>🔴 **Vượt +1m10s** *(+44%)*</w:t>
             </w:r>
           </w:p>
         </w:tc>
         <w:tc>
           <w:tcPr>
-            <w:tcW w:type="dxa" w:w="1104"/>
+            <w:tcW w:type="dxa" w:w="994"/>
           </w:tcPr>
           <w:p>
             <w:r>
@@ -1854,7 +1972,7 @@
                 <w:rFonts w:ascii="Times New Roman" w:hAnsi="Times New Roman"/>
                 <w:sz w:val="20"/>
               </w:rPr>
-              <w:t>⚠️**Cần demo nhanh:** Bấm 2 preset mẫu, không gõ tay dữ liệu.</w:t>
+              <w:t>⚠️ **Cần demo nhanh:** Bấm 2 preset mẫu, không gõ tay dữ liệu.</w:t>
             </w:r>
           </w:p>
         </w:tc>
@@ -1862,7 +1980,7 @@
       <w:tr>
         <w:tc>
           <w:tcPr>
-            <w:tcW w:type="dxa" w:w="1104"/>
+            <w:tcW w:type="dxa" w:w="994"/>
           </w:tcPr>
           <w:p>
             <w:r>
@@ -1876,7 +1994,7 @@
         </w:tc>
         <w:tc>
           <w:tcPr>
-            <w:tcW w:type="dxa" w:w="1104"/>
+            <w:tcW w:type="dxa" w:w="994"/>
           </w:tcPr>
           <w:p>
             <w:r>
@@ -1890,7 +2008,7 @@
         </w:tc>
         <w:tc>
           <w:tcPr>
-            <w:tcW w:type="dxa" w:w="1104"/>
+            <w:tcW w:type="dxa" w:w="994"/>
           </w:tcPr>
           <w:p>
             <w:r>
@@ -1904,7 +2022,21 @@
         </w:tc>
         <w:tc>
           <w:tcPr>
-            <w:tcW w:type="dxa" w:w="1104"/>
+            <w:tcW w:type="dxa" w:w="994"/>
+          </w:tcPr>
+          <w:p>
+            <w:r>
+              <w:rPr>
+                <w:rFonts w:ascii="Times New Roman" w:hAnsi="Times New Roman"/>
+                <w:sz w:val="20"/>
+              </w:rPr>
+              <w:t>🟢 **Đã cập nhật** *(Cắt bỏ khỏi bài)*</w:t>
+            </w:r>
+          </w:p>
+        </w:tc>
+        <w:tc>
+          <w:tcPr>
+            <w:tcW w:type="dxa" w:w="994"/>
           </w:tcPr>
           <w:p>
             <w:r>
@@ -1918,7 +2050,7 @@
         </w:tc>
         <w:tc>
           <w:tcPr>
-            <w:tcW w:type="dxa" w:w="1104"/>
+            <w:tcW w:type="dxa" w:w="994"/>
           </w:tcPr>
           <w:p>
             <w:r>
@@ -1932,7 +2064,7 @@
         </w:tc>
         <w:tc>
           <w:tcPr>
-            <w:tcW w:type="dxa" w:w="1104"/>
+            <w:tcW w:type="dxa" w:w="994"/>
           </w:tcPr>
           <w:p>
             <w:r>
@@ -1946,7 +2078,7 @@
         </w:tc>
         <w:tc>
           <w:tcPr>
-            <w:tcW w:type="dxa" w:w="1104"/>
+            <w:tcW w:type="dxa" w:w="994"/>
           </w:tcPr>
           <w:p>
             <w:r>
@@ -1960,7 +2092,7 @@
         </w:tc>
         <w:tc>
           <w:tcPr>
-            <w:tcW w:type="dxa" w:w="1104"/>
+            <w:tcW w:type="dxa" w:w="994"/>
           </w:tcPr>
           <w:p>
             <w:r>
@@ -1968,13 +2100,13 @@
                 <w:rFonts w:ascii="Times New Roman" w:hAnsi="Times New Roman"/>
                 <w:sz w:val="20"/>
               </w:rPr>
-              <w:t>🟢**`0s` (Khớp tuyệt đối)**</w:t>
+              <w:t>🟢 **`0s` (Khớp tuyệt đối)**</w:t>
             </w:r>
           </w:p>
         </w:tc>
         <w:tc>
           <w:tcPr>
-            <w:tcW w:type="dxa" w:w="1104"/>
+            <w:tcW w:type="dxa" w:w="994"/>
           </w:tcPr>
           <w:p>
             <w:r>
@@ -1982,7 +2114,7 @@
                 <w:rFonts w:ascii="Times New Roman" w:hAnsi="Times New Roman"/>
                 <w:sz w:val="20"/>
               </w:rPr>
-              <w:t>🎯**HOÀN THÀNH MỤC TIÊU:** Cắt bỏ hoàn toàn độ trễ switch slide.</w:t>
+              <w:t>🎯 **HOÀN THÀNH MỤC TIÊU:** Cắt bỏ hoàn toàn độ trễ switch slide.</w:t>
             </w:r>
           </w:p>
         </w:tc>
@@ -1990,7 +2122,7 @@
       <w:tr>
         <w:tc>
           <w:tcPr>
-            <w:tcW w:type="dxa" w:w="1104"/>
+            <w:tcW w:type="dxa" w:w="994"/>
           </w:tcPr>
           <w:p>
             <w:r>
@@ -2004,7 +2136,7 @@
         </w:tc>
         <w:tc>
           <w:tcPr>
-            <w:tcW w:type="dxa" w:w="1104"/>
+            <w:tcW w:type="dxa" w:w="994"/>
           </w:tcPr>
           <w:p>
             <w:r>
@@ -2018,7 +2150,7 @@
         </w:tc>
         <w:tc>
           <w:tcPr>
-            <w:tcW w:type="dxa" w:w="1104"/>
+            <w:tcW w:type="dxa" w:w="994"/>
           </w:tcPr>
           <w:p>
             <w:r>
@@ -2032,7 +2164,21 @@
         </w:tc>
         <w:tc>
           <w:tcPr>
-            <w:tcW w:type="dxa" w:w="1104"/>
+            <w:tcW w:type="dxa" w:w="994"/>
+          </w:tcPr>
+          <w:p>
+            <w:r>
+              <w:rPr>
+                <w:rFonts w:ascii="Times New Roman" w:hAnsi="Times New Roman"/>
+                <w:sz w:val="20"/>
+              </w:rPr>
+              <w:t>—</w:t>
+            </w:r>
+          </w:p>
+        </w:tc>
+        <w:tc>
+          <w:tcPr>
+            <w:tcW w:type="dxa" w:w="994"/>
           </w:tcPr>
           <w:p>
             <w:r>
@@ -2046,7 +2192,7 @@
         </w:tc>
         <w:tc>
           <w:tcPr>
-            <w:tcW w:type="dxa" w:w="1104"/>
+            <w:tcW w:type="dxa" w:w="994"/>
           </w:tcPr>
           <w:p>
             <w:r>
@@ -2060,7 +2206,7 @@
         </w:tc>
         <w:tc>
           <w:tcPr>
-            <w:tcW w:type="dxa" w:w="1104"/>
+            <w:tcW w:type="dxa" w:w="994"/>
           </w:tcPr>
           <w:p>
             <w:r>
@@ -2074,7 +2220,7 @@
         </w:tc>
         <w:tc>
           <w:tcPr>
-            <w:tcW w:type="dxa" w:w="1104"/>
+            <w:tcW w:type="dxa" w:w="994"/>
           </w:tcPr>
           <w:p>
             <w:r>
@@ -2088,7 +2234,7 @@
         </w:tc>
         <w:tc>
           <w:tcPr>
-            <w:tcW w:type="dxa" w:w="1104"/>
+            <w:tcW w:type="dxa" w:w="994"/>
           </w:tcPr>
           <w:p>
             <w:r>
@@ -2102,7 +2248,7 @@
         </w:tc>
         <w:tc>
           <w:tcPr>
-            <w:tcW w:type="dxa" w:w="1104"/>
+            <w:tcW w:type="dxa" w:w="994"/>
           </w:tcPr>
           <w:p>
             <w:r>
@@ -2118,7 +2264,7 @@
       <w:tr>
         <w:tc>
           <w:tcPr>
-            <w:tcW w:type="dxa" w:w="1104"/>
+            <w:tcW w:type="dxa" w:w="994"/>
           </w:tcPr>
           <w:p>
             <w:r>
@@ -2132,7 +2278,7 @@
         </w:tc>
         <w:tc>
           <w:tcPr>
-            <w:tcW w:type="dxa" w:w="1104"/>
+            <w:tcW w:type="dxa" w:w="994"/>
           </w:tcPr>
           <w:p>
             <w:r>
@@ -2146,7 +2292,7 @@
         </w:tc>
         <w:tc>
           <w:tcPr>
-            <w:tcW w:type="dxa" w:w="1104"/>
+            <w:tcW w:type="dxa" w:w="994"/>
           </w:tcPr>
           <w:p>
             <w:r>
@@ -2160,7 +2306,21 @@
         </w:tc>
         <w:tc>
           <w:tcPr>
-            <w:tcW w:type="dxa" w:w="1104"/>
+            <w:tcW w:type="dxa" w:w="994"/>
+          </w:tcPr>
+          <w:p>
+            <w:r>
+              <w:rPr>
+                <w:rFonts w:ascii="Times New Roman" w:hAnsi="Times New Roman"/>
+                <w:sz w:val="20"/>
+              </w:rPr>
+              <w:t>**3/7 bạn đã tối ưu**</w:t>
+            </w:r>
+          </w:p>
+        </w:tc>
+        <w:tc>
+          <w:tcPr>
+            <w:tcW w:type="dxa" w:w="994"/>
           </w:tcPr>
           <w:p>
             <w:r>
@@ -2174,7 +2334,7 @@
         </w:tc>
         <w:tc>
           <w:tcPr>
-            <w:tcW w:type="dxa" w:w="1104"/>
+            <w:tcW w:type="dxa" w:w="994"/>
           </w:tcPr>
           <w:p>
             <w:r>
@@ -2188,7 +2348,7 @@
         </w:tc>
         <w:tc>
           <w:tcPr>
-            <w:tcW w:type="dxa" w:w="1104"/>
+            <w:tcW w:type="dxa" w:w="994"/>
           </w:tcPr>
           <w:p>
             <w:r>
@@ -2196,13 +2356,13 @@
                 <w:rFonts w:ascii="Times New Roman" w:hAnsi="Times New Roman"/>
                 <w:sz w:val="20"/>
               </w:rPr>
-              <w:t>**23 phút 04s** *(1,384s)*</w:t>
+              <w:t>**19 phút 06s** *(1,146s)*</w:t>
             </w:r>
           </w:p>
         </w:tc>
         <w:tc>
           <w:tcPr>
-            <w:tcW w:type="dxa" w:w="1104"/>
+            <w:tcW w:type="dxa" w:w="994"/>
           </w:tcPr>
           <w:p>
             <w:r>
@@ -2216,7 +2376,7 @@
         </w:tc>
         <w:tc>
           <w:tcPr>
-            <w:tcW w:type="dxa" w:w="1104"/>
+            <w:tcW w:type="dxa" w:w="994"/>
           </w:tcPr>
           <w:p>
             <w:r>
@@ -2224,13 +2384,13 @@
                 <w:rFonts w:ascii="Times New Roman" w:hAnsi="Times New Roman"/>
                 <w:sz w:val="20"/>
               </w:rPr>
-              <w:t>🔴**VƯỢT +8m04s (+53%)**</w:t>
+              <w:t>🔴 **VƯỢT +4m06s (+27%)**</w:t>
             </w:r>
           </w:p>
         </w:tc>
         <w:tc>
           <w:tcPr>
-            <w:tcW w:type="dxa" w:w="1104"/>
+            <w:tcW w:type="dxa" w:w="994"/>
           </w:tcPr>
           <w:p>
             <w:r>
@@ -2238,7 +2398,7 @@
                 <w:rFonts w:ascii="Times New Roman" w:hAnsi="Times New Roman"/>
                 <w:sz w:val="20"/>
               </w:rPr>
-              <w:t>❌**CẦN NÓI Ý CHÍNH (INSIGHT), TUYỆT ĐỐI KHÔNG ĐỌC LẠI SLIDE!**</w:t>
+              <w:t>⚠️ **ĐÃ GIẢM GẦN 4 PHÚT! CẦN NÓI Ý CHÍNH ĐỂ VỀ ĐÚNG 15P.**</w:t>
             </w:r>
           </w:p>
         </w:tc>

</xml_diff>

<commit_message>
docs(scripts): bo sung goi y toc do noi chuan va cong thuc viet kich ban
</commit_message>
<xml_diff>
--- a/draft/fraud-detection/slide/scripts/SCRIPT_THUYET_TRINH_TOAN_TEAM_CS106.docx
+++ b/draft/fraud-detection/slide/scripts/SCRIPT_THUYET_TRINH_TOAN_TEAM_CS106.docx
@@ -651,7 +651,7 @@
           <w:i/>
           <w:color w:val="444444"/>
         </w:rPr>
-        <w:t>~23 – 25 phút</w:t>
+        <w:t>~15 phút</w:t>
       </w:r>
       <w:r>
         <w:rPr>
@@ -1036,7 +1036,7 @@
                 <w:rFonts w:ascii="Times New Roman" w:hAnsi="Times New Roman"/>
                 <w:sz w:val="20"/>
               </w:rPr>
-              <w:t>🟢 **Đã cập nhật** *(Rút gọn Slide 1 &amp; 2)*</w:t>
+              <w:t>🟢**Đã cập nhật** *(Rút gọn Slide 1 &amp; 2)*</w:t>
             </w:r>
           </w:p>
         </w:tc>
@@ -1106,7 +1106,7 @@
                 <w:rFonts w:ascii="Times New Roman" w:hAnsi="Times New Roman"/>
                 <w:sz w:val="20"/>
               </w:rPr>
-              <w:t>🟢 **Vượt +7s** *(+9%)*</w:t>
+              <w:t>🟢**Vượt +7s** *(+9%)*</w:t>
             </w:r>
           </w:p>
         </w:tc>
@@ -1120,7 +1120,7 @@
                 <w:rFonts w:ascii="Times New Roman" w:hAnsi="Times New Roman"/>
                 <w:sz w:val="20"/>
               </w:rPr>
-              <w:t>✅ **ĐẠT CHUẨN** (Khớp mục tiêu sau khi rút gọn).</w:t>
+              <w:t>✅**ĐẠT CHUẨN** (Khớp mục tiêu sau khi rút gọn).</w:t>
             </w:r>
           </w:p>
         </w:tc>
@@ -1178,7 +1178,7 @@
                 <w:rFonts w:ascii="Times New Roman" w:hAnsi="Times New Roman"/>
                 <w:sz w:val="20"/>
               </w:rPr>
-              <w:t>🟢 **Đã cập nhật** *(Rút gọn Slide 3–8 PR #37)*</w:t>
+              <w:t>🟢**Đã cập nhật** *(Rút gọn Slide 3–8 PR #37)*</w:t>
             </w:r>
           </w:p>
         </w:tc>
@@ -1248,7 +1248,7 @@
                 <w:rFonts w:ascii="Times New Roman" w:hAnsi="Times New Roman"/>
                 <w:sz w:val="20"/>
               </w:rPr>
-              <w:t>🔴 **Vượt +1m52s** *(+53%)*</w:t>
+              <w:t>🔴**Vượt +1m52s** *(+53%)*</w:t>
             </w:r>
           </w:p>
         </w:tc>
@@ -1262,7 +1262,7 @@
                 <w:rFonts w:ascii="Times New Roman" w:hAnsi="Times New Roman"/>
                 <w:sz w:val="20"/>
               </w:rPr>
-              <w:t>⚠️ **Cần nói lướt:** Đi thẳng vào 2 biến quyết định 97.1%.</w:t>
+              <w:t>⚠️**Cần nói lướt:** Đi thẳng vào 2 biến quyết định 97.1%.</w:t>
             </w:r>
           </w:p>
         </w:tc>
@@ -1320,7 +1320,7 @@
                 <w:rFonts w:ascii="Times New Roman" w:hAnsi="Times New Roman"/>
                 <w:sz w:val="20"/>
               </w:rPr>
-              <w:t>🔴 **Chưa cập nhật** *(Giữ nguyên bản cũ)*</w:t>
+              <w:t>🔴**Chưa cập nhật** *(Giữ nguyên bản cũ)*</w:t>
             </w:r>
           </w:p>
         </w:tc>
@@ -1390,7 +1390,7 @@
                 <w:rFonts w:ascii="Times New Roman" w:hAnsi="Times New Roman"/>
                 <w:sz w:val="20"/>
               </w:rPr>
-              <w:t>🔴 **Vượt +1m30s** *(+75%)*</w:t>
+              <w:t>🔴**Vượt +1m30s** *(+75%)*</w:t>
             </w:r>
           </w:p>
         </w:tc>
@@ -1404,7 +1404,7 @@
                 <w:rFonts w:ascii="Times New Roman" w:hAnsi="Times New Roman"/>
                 <w:sz w:val="20"/>
               </w:rPr>
-              <w:t>⚠️ **Cắt lý thuyết:** Bỏ giải thích ADASYN, chỉ nêu kết quả RF F1=0.9973.</w:t>
+              <w:t>⚠️**Cắt lý thuyết:** Bỏ giải thích ADASYN, chỉ nêu kết quả RF F1=0.9973.</w:t>
             </w:r>
           </w:p>
         </w:tc>
@@ -1462,7 +1462,7 @@
                 <w:rFonts w:ascii="Times New Roman" w:hAnsi="Times New Roman"/>
                 <w:sz w:val="20"/>
               </w:rPr>
-              <w:t>🔴 **Chưa cập nhật** *(Giữ nguyên bản cũ)*</w:t>
+              <w:t>🔴**Chưa cập nhật** *(Giữ nguyên bản cũ)*</w:t>
             </w:r>
           </w:p>
         </w:tc>
@@ -1532,7 +1532,7 @@
                 <w:rFonts w:ascii="Times New Roman" w:hAnsi="Times New Roman"/>
                 <w:sz w:val="20"/>
               </w:rPr>
-              <w:t>🔴 **Vượt +1m43s** *(+86%)*</w:t>
+              <w:t>🔴**Vượt +1m43s** *(+86%)*</w:t>
             </w:r>
           </w:p>
         </w:tc>
@@ -1546,7 +1546,7 @@
                 <w:rFonts w:ascii="Times New Roman" w:hAnsi="Times New Roman"/>
                 <w:sz w:val="20"/>
               </w:rPr>
-              <w:t>⚠️ **Cần cô đọng:** XGB 40s + Autoencoder &amp; ngưỡng 95th 80s.</w:t>
+              <w:t>⚠️**Cần cô đọng:** XGB 40s + Autoencoder &amp; ngưỡng 95th 80s.</w:t>
             </w:r>
           </w:p>
         </w:tc>
@@ -1604,7 +1604,7 @@
                 <w:rFonts w:ascii="Times New Roman" w:hAnsi="Times New Roman"/>
                 <w:sz w:val="20"/>
               </w:rPr>
-              <w:t>🔴 **Chưa cập nhật** *(Giữ nguyên bản cũ)*</w:t>
+              <w:t>🔴**Chưa cập nhật** *(Giữ nguyên bản cũ)*</w:t>
             </w:r>
           </w:p>
         </w:tc>
@@ -1674,7 +1674,7 @@
                 <w:rFonts w:ascii="Times New Roman" w:hAnsi="Times New Roman"/>
                 <w:sz w:val="20"/>
               </w:rPr>
-              <w:t>🔴 **Vượt +2m24s** *(+106%)*</w:t>
+              <w:t>🔴**Vượt +2m24s** *(+106%)*</w:t>
             </w:r>
           </w:p>
         </w:tc>
@@ -1688,7 +1688,7 @@
                 <w:rFonts w:ascii="Times New Roman" w:hAnsi="Times New Roman"/>
                 <w:sz w:val="20"/>
               </w:rPr>
-              <w:t>⚠️ **Không đọc bảng:** Chỉ nêu bật RF &amp; XGBoost dẫn đầu, lướt các chỉ số phụ.</w:t>
+              <w:t>⚠️**Không đọc bảng:** Chỉ nêu bật RF &amp; XGBoost dẫn đầu, lướt các chỉ số phụ.</w:t>
             </w:r>
           </w:p>
         </w:tc>
@@ -1746,7 +1746,7 @@
                 <w:rFonts w:ascii="Times New Roman" w:hAnsi="Times New Roman"/>
                 <w:sz w:val="20"/>
               </w:rPr>
-              <w:t>🟢 **Đã cập nhật** *(0s — Chuyển sang Q&amp;A)*</w:t>
+              <w:t>🟢**Đã cập nhật** *(0s — Chuyển sang Q&amp;A)*</w:t>
             </w:r>
           </w:p>
         </w:tc>
@@ -1816,7 +1816,7 @@
                 <w:rFonts w:ascii="Times New Roman" w:hAnsi="Times New Roman"/>
                 <w:sz w:val="20"/>
               </w:rPr>
-              <w:t>🟢 **`0s` (Khớp tuyệt đối)**</w:t>
+              <w:t>🟢**`0s` (Khớp tuyệt đối)**</w:t>
             </w:r>
           </w:p>
         </w:tc>
@@ -1830,7 +1830,7 @@
                 <w:rFonts w:ascii="Times New Roman" w:hAnsi="Times New Roman"/>
                 <w:sz w:val="20"/>
               </w:rPr>
-              <w:t>🎯 **HOÀN THÀNH MỤC TIÊU:** Duy không nói slide, tránh đổi micro.</w:t>
+              <w:t>🎯**HOÀN THÀNH MỤC TIÊU:** Duy không nói slide, tránh đổi micro.</w:t>
             </w:r>
           </w:p>
         </w:tc>
@@ -1888,7 +1888,7 @@
                 <w:rFonts w:ascii="Times New Roman" w:hAnsi="Times New Roman"/>
                 <w:sz w:val="20"/>
               </w:rPr>
-              <w:t>🔴 **Chưa cập nhật** *(Chưa gộp kịch bản Slide 20)*</w:t>
+              <w:t>🔴**Chưa cập nhật** *(Chưa gộp kịch bản Slide 20)*</w:t>
             </w:r>
           </w:p>
         </w:tc>
@@ -1958,7 +1958,7 @@
                 <w:rFonts w:ascii="Times New Roman" w:hAnsi="Times New Roman"/>
                 <w:sz w:val="20"/>
               </w:rPr>
-              <w:t>🔴 **Vượt +1m10s** *(+44%)*</w:t>
+              <w:t>🔴**Vượt +1m10s** *(+44%)*</w:t>
             </w:r>
           </w:p>
         </w:tc>
@@ -1972,7 +1972,7 @@
                 <w:rFonts w:ascii="Times New Roman" w:hAnsi="Times New Roman"/>
                 <w:sz w:val="20"/>
               </w:rPr>
-              <w:t>⚠️ **Cần demo nhanh:** Bấm 2 preset mẫu, không gõ tay dữ liệu.</w:t>
+              <w:t>⚠️**Cần demo nhanh:** Bấm 2 preset mẫu, không gõ tay dữ liệu.</w:t>
             </w:r>
           </w:p>
         </w:tc>
@@ -2030,7 +2030,7 @@
                 <w:rFonts w:ascii="Times New Roman" w:hAnsi="Times New Roman"/>
                 <w:sz w:val="20"/>
               </w:rPr>
-              <w:t>🟢 **Đã cập nhật** *(Cắt bỏ khỏi bài)*</w:t>
+              <w:t>🟢**Đã cập nhật** *(Cắt bỏ khỏi bài)*</w:t>
             </w:r>
           </w:p>
         </w:tc>
@@ -2100,7 +2100,7 @@
                 <w:rFonts w:ascii="Times New Roman" w:hAnsi="Times New Roman"/>
                 <w:sz w:val="20"/>
               </w:rPr>
-              <w:t>🟢 **`0s` (Khớp tuyệt đối)**</w:t>
+              <w:t>🟢**`0s` (Khớp tuyệt đối)**</w:t>
             </w:r>
           </w:p>
         </w:tc>
@@ -2114,7 +2114,7 @@
                 <w:rFonts w:ascii="Times New Roman" w:hAnsi="Times New Roman"/>
                 <w:sz w:val="20"/>
               </w:rPr>
-              <w:t>🎯 **HOÀN THÀNH MỤC TIÊU:** Cắt bỏ hoàn toàn độ trễ switch slide.</w:t>
+              <w:t>🎯**HOÀN THÀNH MỤC TIÊU:** Cắt bỏ hoàn toàn độ trễ switch slide.</w:t>
             </w:r>
           </w:p>
         </w:tc>
@@ -2384,7 +2384,7 @@
                 <w:rFonts w:ascii="Times New Roman" w:hAnsi="Times New Roman"/>
                 <w:sz w:val="20"/>
               </w:rPr>
-              <w:t>🔴 **VƯỢT +4m06s (+27%)**</w:t>
+              <w:t>🔴**VƯỢT +4m06s (+27%)**</w:t>
             </w:r>
           </w:p>
         </w:tc>
@@ -2398,13 +2398,442 @@
                 <w:rFonts w:ascii="Times New Roman" w:hAnsi="Times New Roman"/>
                 <w:sz w:val="20"/>
               </w:rPr>
-              <w:t>⚠️ **ĐÃ GIẢM GẦN 4 PHÚT! CẦN NÓI Ý CHÍNH ĐỂ VỀ ĐÚNG 15P.**</w:t>
+              <w:t>⚠️**ĐÃ GIẢM GẦN 4 PHÚT! CẦN NÓI Ý CHÍNH ĐỂ VỀ ĐÚNG 15P.**</w:t>
             </w:r>
           </w:p>
         </w:tc>
       </w:tr>
     </w:tbl>
     <w:p/>
+    <w:p>
+      <w:pPr>
+        <w:pStyle w:val="Heading2"/>
+      </w:pPr>
+      <w:r>
+        <w:rPr>
+          <w:rFonts w:ascii="Times New Roman" w:hAnsi="Times New Roman"/>
+          <w:b/>
+          <w:color w:val="2E75B6"/>
+          <w:sz w:val="24"/>
+        </w:rPr>
+        <w:t>💡 GỢI Ý TỐC ĐỘ NÓI CHUẨN &amp; CÔNG THỨC VIẾT KỊCH BẢN (KHÔNG CHÁY GIỜ)</w:t>
+      </w:r>
+    </w:p>
+    <w:p>
+      <w:pPr>
+        <w:ind w:left="432" w:right="432"/>
+      </w:pPr>
+      <w:r>
+        <w:rPr>
+          <w:rFonts w:ascii="Times New Roman" w:hAnsi="Times New Roman"/>
+          <w:i/>
+          <w:color w:val="444444"/>
+        </w:rPr>
+        <w:t xml:space="preserve">📌 </w:t>
+      </w:r>
+      <w:r>
+        <w:rPr>
+          <w:rFonts w:ascii="Times New Roman" w:hAnsi="Times New Roman"/>
+          <w:b/>
+          <w:i/>
+          <w:color w:val="444444"/>
+        </w:rPr>
+        <w:t>Tốc độ chuẩn thuyết trình kỹ thuật:</w:t>
+      </w:r>
+      <w:r>
+        <w:rPr>
+          <w:rFonts w:ascii="Times New Roman" w:hAnsi="Times New Roman"/>
+          <w:i/>
+          <w:color w:val="444444"/>
+        </w:rPr>
+        <w:t xml:space="preserve"> </w:t>
+      </w:r>
+      <w:r>
+        <w:rPr>
+          <w:rFonts w:ascii="Times New Roman" w:hAnsi="Times New Roman"/>
+          <w:b/>
+          <w:i/>
+          <w:color w:val="444444"/>
+        </w:rPr>
+        <w:t>2.0 – 2.3 từ / giây</w:t>
+      </w:r>
+      <w:r>
+        <w:rPr>
+          <w:rFonts w:ascii="Times New Roman" w:hAnsi="Times New Roman"/>
+          <w:i/>
+          <w:color w:val="444444"/>
+        </w:rPr>
+        <w:t xml:space="preserve"> *(tương đương </w:t>
+      </w:r>
+      <w:r>
+        <w:rPr>
+          <w:rFonts w:ascii="Times New Roman" w:hAnsi="Times New Roman"/>
+          <w:b/>
+          <w:i/>
+          <w:color w:val="444444"/>
+        </w:rPr>
+        <w:t>120 – 140 từ / phút</w:t>
+      </w:r>
+      <w:r>
+        <w:rPr>
+          <w:rFonts w:ascii="Times New Roman" w:hAnsi="Times New Roman"/>
+          <w:i/>
+          <w:color w:val="444444"/>
+        </w:rPr>
+        <w:t>)*.</w:t>
+      </w:r>
+    </w:p>
+    <w:p>
+      <w:pPr>
+        <w:ind w:left="432" w:right="432"/>
+      </w:pPr>
+      <w:r>
+        <w:rPr>
+          <w:rFonts w:ascii="Times New Roman" w:hAnsi="Times New Roman"/>
+          <w:i/>
+          <w:color w:val="444444"/>
+        </w:rPr>
+        <w:t>Không nên nói nhanh hơn 2.5 từ/s (người nghe không kịp tiếp nhận các thuật ngữ AI và số liệu), và không nói chậm dưới 1.8 từ/s (gây buồn ngủ và cháy giờ).</w:t>
+      </w:r>
+    </w:p>
+    <w:p>
+      <w:r>
+        <w:rPr>
+          <w:rFonts w:ascii="Times New Roman" w:hAnsi="Times New Roman"/>
+        </w:rPr>
+        <w:t>&gt;</w:t>
+      </w:r>
+    </w:p>
+    <w:p>
+      <w:pPr>
+        <w:ind w:left="432" w:right="432"/>
+      </w:pPr>
+      <w:r>
+        <w:rPr>
+          <w:rFonts w:ascii="Times New Roman" w:hAnsi="Times New Roman"/>
+          <w:i/>
+          <w:color w:val="444444"/>
+        </w:rPr>
+        <w:t xml:space="preserve">📏 </w:t>
+      </w:r>
+      <w:r>
+        <w:rPr>
+          <w:rFonts w:ascii="Times New Roman" w:hAnsi="Times New Roman"/>
+          <w:b/>
+          <w:i/>
+          <w:color w:val="444444"/>
+        </w:rPr>
+        <w:t>Công thức ước lượng dung lượng kịch bản:</w:t>
+      </w:r>
+      <w:r>
+        <w:rPr>
+          <w:rFonts w:ascii="Times New Roman" w:hAnsi="Times New Roman"/>
+          <w:i/>
+          <w:color w:val="444444"/>
+        </w:rPr>
+      </w:r>
+    </w:p>
+    <w:p>
+      <w:pPr>
+        <w:ind w:left="432" w:right="432"/>
+      </w:pPr>
+      <w:r>
+        <w:rPr>
+          <w:rFonts w:ascii="Times New Roman" w:hAnsi="Times New Roman"/>
+          <w:i/>
+          <w:color w:val="444444"/>
+        </w:rPr>
+      </w:r>
+      <w:r>
+        <w:rPr>
+          <w:rFonts w:ascii="Times New Roman" w:hAnsi="Times New Roman"/>
+          <w:b/>
+          <w:i/>
+          <w:color w:val="444444"/>
+        </w:rPr>
+        <w:t>Số từ kịch bản tối đa</w:t>
+      </w:r>
+      <w:r>
+        <w:rPr>
+          <w:rFonts w:ascii="Times New Roman" w:hAnsi="Times New Roman"/>
+          <w:i/>
+          <w:color w:val="444444"/>
+        </w:rPr>
+        <w:t xml:space="preserve"> $\approx$ </w:t>
+      </w:r>
+      <w:r>
+        <w:rPr>
+          <w:rFonts w:ascii="Times New Roman" w:hAnsi="Times New Roman"/>
+          <w:b/>
+          <w:i/>
+          <w:color w:val="444444"/>
+        </w:rPr>
+        <w:t>Thời gian mục tiêu (giây)</w:t>
+      </w:r>
+      <w:r>
+        <w:rPr>
+          <w:rFonts w:ascii="Times New Roman" w:hAnsi="Times New Roman"/>
+          <w:i/>
+          <w:color w:val="444444"/>
+        </w:rPr>
+        <w:t xml:space="preserve"> $\times$ </w:t>
+      </w:r>
+      <w:r>
+        <w:rPr>
+          <w:rFonts w:ascii="Times New Roman" w:hAnsi="Times New Roman"/>
+          <w:b/>
+          <w:i/>
+          <w:color w:val="444444"/>
+        </w:rPr>
+        <w:t>2.1</w:t>
+      </w:r>
+      <w:r>
+        <w:rPr>
+          <w:rFonts w:ascii="Times New Roman" w:hAnsi="Times New Roman"/>
+          <w:i/>
+          <w:color w:val="444444"/>
+        </w:rPr>
+      </w:r>
+    </w:p>
+    <w:p>
+      <w:pPr>
+        <w:ind w:left="432" w:right="432"/>
+      </w:pPr>
+      <w:r>
+        <w:rPr>
+          <w:rFonts w:ascii="Times New Roman" w:hAnsi="Times New Roman"/>
+          <w:i/>
+          <w:color w:val="444444"/>
+        </w:rPr>
+        <w:t xml:space="preserve">- </w:t>
+      </w:r>
+      <w:r>
+        <w:rPr>
+          <w:rFonts w:ascii="Times New Roman" w:hAnsi="Times New Roman"/>
+          <w:b/>
+          <w:i/>
+          <w:color w:val="444444"/>
+        </w:rPr>
+        <w:t>1 phút (60s):</w:t>
+      </w:r>
+      <w:r>
+        <w:rPr>
+          <w:rFonts w:ascii="Times New Roman" w:hAnsi="Times New Roman"/>
+          <w:i/>
+          <w:color w:val="444444"/>
+        </w:rPr>
+        <w:t xml:space="preserve"> ~</w:t>
+      </w:r>
+      <w:r>
+        <w:rPr>
+          <w:rFonts w:ascii="Times New Roman" w:hAnsi="Times New Roman"/>
+          <w:b/>
+          <w:i/>
+          <w:color w:val="444444"/>
+        </w:rPr>
+        <w:t>125 từ</w:t>
+      </w:r>
+      <w:r>
+        <w:rPr>
+          <w:rFonts w:ascii="Times New Roman" w:hAnsi="Times New Roman"/>
+          <w:i/>
+          <w:color w:val="444444"/>
+        </w:rPr>
+      </w:r>
+    </w:p>
+    <w:p>
+      <w:pPr>
+        <w:ind w:left="432" w:right="432"/>
+      </w:pPr>
+      <w:r>
+        <w:rPr>
+          <w:rFonts w:ascii="Times New Roman" w:hAnsi="Times New Roman"/>
+          <w:i/>
+          <w:color w:val="444444"/>
+        </w:rPr>
+        <w:t xml:space="preserve">- </w:t>
+      </w:r>
+      <w:r>
+        <w:rPr>
+          <w:rFonts w:ascii="Times New Roman" w:hAnsi="Times New Roman"/>
+          <w:b/>
+          <w:i/>
+          <w:color w:val="444444"/>
+        </w:rPr>
+        <w:t>1 phút 30s (90s):</w:t>
+      </w:r>
+      <w:r>
+        <w:rPr>
+          <w:rFonts w:ascii="Times New Roman" w:hAnsi="Times New Roman"/>
+          <w:i/>
+          <w:color w:val="444444"/>
+        </w:rPr>
+        <w:t xml:space="preserve"> ~</w:t>
+      </w:r>
+      <w:r>
+        <w:rPr>
+          <w:rFonts w:ascii="Times New Roman" w:hAnsi="Times New Roman"/>
+          <w:b/>
+          <w:i/>
+          <w:color w:val="444444"/>
+        </w:rPr>
+        <w:t>190 từ</w:t>
+      </w:r>
+      <w:r>
+        <w:rPr>
+          <w:rFonts w:ascii="Times New Roman" w:hAnsi="Times New Roman"/>
+          <w:i/>
+          <w:color w:val="444444"/>
+        </w:rPr>
+      </w:r>
+    </w:p>
+    <w:p>
+      <w:pPr>
+        <w:ind w:left="432" w:right="432"/>
+      </w:pPr>
+      <w:r>
+        <w:rPr>
+          <w:rFonts w:ascii="Times New Roman" w:hAnsi="Times New Roman"/>
+          <w:i/>
+          <w:color w:val="444444"/>
+        </w:rPr>
+        <w:t xml:space="preserve">- </w:t>
+      </w:r>
+      <w:r>
+        <w:rPr>
+          <w:rFonts w:ascii="Times New Roman" w:hAnsi="Times New Roman"/>
+          <w:b/>
+          <w:i/>
+          <w:color w:val="444444"/>
+        </w:rPr>
+        <w:t>2 phút (120s):</w:t>
+      </w:r>
+      <w:r>
+        <w:rPr>
+          <w:rFonts w:ascii="Times New Roman" w:hAnsi="Times New Roman"/>
+          <w:i/>
+          <w:color w:val="444444"/>
+        </w:rPr>
+        <w:t xml:space="preserve"> ~</w:t>
+      </w:r>
+      <w:r>
+        <w:rPr>
+          <w:rFonts w:ascii="Times New Roman" w:hAnsi="Times New Roman"/>
+          <w:b/>
+          <w:i/>
+          <w:color w:val="444444"/>
+        </w:rPr>
+        <w:t>250 từ</w:t>
+      </w:r>
+      <w:r>
+        <w:rPr>
+          <w:rFonts w:ascii="Times New Roman" w:hAnsi="Times New Roman"/>
+          <w:i/>
+          <w:color w:val="444444"/>
+        </w:rPr>
+      </w:r>
+    </w:p>
+    <w:p>
+      <w:pPr>
+        <w:ind w:left="432" w:right="432"/>
+      </w:pPr>
+      <w:r>
+        <w:rPr>
+          <w:rFonts w:ascii="Times New Roman" w:hAnsi="Times New Roman"/>
+          <w:i/>
+          <w:color w:val="444444"/>
+        </w:rPr>
+        <w:t xml:space="preserve">- </w:t>
+      </w:r>
+      <w:r>
+        <w:rPr>
+          <w:rFonts w:ascii="Times New Roman" w:hAnsi="Times New Roman"/>
+          <w:b/>
+          <w:i/>
+          <w:color w:val="444444"/>
+        </w:rPr>
+        <w:t>3 phút (180s):</w:t>
+      </w:r>
+      <w:r>
+        <w:rPr>
+          <w:rFonts w:ascii="Times New Roman" w:hAnsi="Times New Roman"/>
+          <w:i/>
+          <w:color w:val="444444"/>
+        </w:rPr>
+        <w:t xml:space="preserve"> ~</w:t>
+      </w:r>
+      <w:r>
+        <w:rPr>
+          <w:rFonts w:ascii="Times New Roman" w:hAnsi="Times New Roman"/>
+          <w:b/>
+          <w:i/>
+          <w:color w:val="444444"/>
+        </w:rPr>
+        <w:t>380 từ</w:t>
+      </w:r>
+      <w:r>
+        <w:rPr>
+          <w:rFonts w:ascii="Times New Roman" w:hAnsi="Times New Roman"/>
+          <w:i/>
+          <w:color w:val="444444"/>
+        </w:rPr>
+      </w:r>
+    </w:p>
+    <w:p>
+      <w:r>
+        <w:rPr>
+          <w:rFonts w:ascii="Times New Roman" w:hAnsi="Times New Roman"/>
+        </w:rPr>
+        <w:t>&gt;</w:t>
+      </w:r>
+    </w:p>
+    <w:p>
+      <w:pPr>
+        <w:ind w:left="432" w:right="432"/>
+      </w:pPr>
+      <w:r>
+        <w:rPr>
+          <w:rFonts w:ascii="Times New Roman" w:hAnsi="Times New Roman"/>
+          <w:i/>
+          <w:color w:val="444444"/>
+        </w:rPr>
+        <w:t xml:space="preserve">🎯 </w:t>
+      </w:r>
+      <w:r>
+        <w:rPr>
+          <w:rFonts w:ascii="Times New Roman" w:hAnsi="Times New Roman"/>
+          <w:b/>
+          <w:i/>
+          <w:color w:val="444444"/>
+        </w:rPr>
+        <w:t>Mẹo kiểm soát nhịp độ khi tập luyện:</w:t>
+      </w:r>
+      <w:r>
+        <w:rPr>
+          <w:rFonts w:ascii="Times New Roman" w:hAnsi="Times New Roman"/>
+          <w:i/>
+          <w:color w:val="444444"/>
+        </w:rPr>
+        <w:t xml:space="preserve"> Khi tập với đồng hồ bấm giờ, cứ mỗi 30 giây cần đi qua được khoảng 60–65 từ. Nếu kịch bản vượt quá số từ này, </w:t>
+      </w:r>
+      <w:r>
+        <w:rPr>
+          <w:rFonts w:ascii="Times New Roman" w:hAnsi="Times New Roman"/>
+          <w:b/>
+          <w:i/>
+          <w:color w:val="444444"/>
+        </w:rPr>
+        <w:t>cắt bỏ giải thích lý thuyết, chỉ đọc số liệu và kết luận chính (insight)</w:t>
+      </w:r>
+      <w:r>
+        <w:rPr>
+          <w:rFonts w:ascii="Times New Roman" w:hAnsi="Times New Roman"/>
+          <w:i/>
+          <w:color w:val="444444"/>
+        </w:rPr>
+        <w:t>.</w:t>
+      </w:r>
+    </w:p>
     <w:p>
       <w:pPr>
         <w:spacing w:before="80" w:after="80"/>

</xml_diff>

<commit_message>
docs(script): update 15-minute budget comparison table to reflect PR #38 refinements
</commit_message>
<xml_diff>
--- a/draft/fraud-detection/slide/scripts/SCRIPT_THUYET_TRINH_TOAN_TEAM_CS106.docx
+++ b/draft/fraud-detection/slide/scripts/SCRIPT_THUYET_TRINH_TOAN_TEAM_CS106.docx
@@ -1178,7 +1178,7 @@
                 <w:rFonts w:ascii="Times New Roman" w:hAnsi="Times New Roman"/>
                 <w:sz w:val="20"/>
               </w:rPr>
-              <w:t>🟢**Đã cập nhật** *(Rút gọn Slide 3–8 PR #37)*</w:t>
+              <w:t>🟢**Đã cập nhật** *(Rút gọn Slide 3–8 PR #37 &amp; #38)*</w:t>
             </w:r>
           </w:p>
         </w:tc>
@@ -1220,7 +1220,7 @@
                 <w:rFonts w:ascii="Times New Roman" w:hAnsi="Times New Roman"/>
                 <w:sz w:val="20"/>
               </w:rPr>
-              <w:t>**5 phút 22s** *(322s)*</w:t>
+              <w:t>**4 phút 48s** *(288s)*</w:t>
             </w:r>
           </w:p>
         </w:tc>
@@ -1248,7 +1248,7 @@
                 <w:rFonts w:ascii="Times New Roman" w:hAnsi="Times New Roman"/>
                 <w:sz w:val="20"/>
               </w:rPr>
-              <w:t>🔴**Vượt +1m52s** *(+53%)*</w:t>
+              <w:t>🔴**Vượt +1m18s** *(+37%)*</w:t>
             </w:r>
           </w:p>
         </w:tc>
@@ -1262,7 +1262,7 @@
                 <w:rFonts w:ascii="Times New Roman" w:hAnsi="Times New Roman"/>
                 <w:sz w:val="20"/>
               </w:rPr>
-              <w:t>⚠️**Cần nói lướt:** Đi thẳng vào 2 biến quyết định 97.1%.</w:t>
+              <w:t>✅**Đã rút gọn ~34s (PR #38):** Lời thoại ngắn gọn, đi thẳng vào 2 biến 97.1%.</w:t>
             </w:r>
           </w:p>
         </w:tc>
@@ -2356,7 +2356,7 @@
                 <w:rFonts w:ascii="Times New Roman" w:hAnsi="Times New Roman"/>
                 <w:sz w:val="20"/>
               </w:rPr>
-              <w:t>**19 phút 06s** *(1,146s)*</w:t>
+              <w:t>**18 phút 32s** *(1,112s)*</w:t>
             </w:r>
           </w:p>
         </w:tc>
@@ -2384,7 +2384,7 @@
                 <w:rFonts w:ascii="Times New Roman" w:hAnsi="Times New Roman"/>
                 <w:sz w:val="20"/>
               </w:rPr>
-              <w:t>🔴**VƯỢT +4m06s (+27%)**</w:t>
+              <w:t>🔴**VƯỢT +3m32s (+24%)**</w:t>
             </w:r>
           </w:p>
         </w:tc>
@@ -2398,7 +2398,7 @@
                 <w:rFonts w:ascii="Times New Roman" w:hAnsi="Times New Roman"/>
                 <w:sz w:val="20"/>
               </w:rPr>
-              <w:t>⚠️**ĐÃ GIẢM GẦN 4 PHÚT! CẦN NÓI Ý CHÍNH ĐỂ VỀ ĐÚNG 15P.**</w:t>
+              <w:t>⚠️**ĐÃ GIẢM GẦN 4.5 PHÚT! CẦN NÓI Ý CHÍNH ĐỂ VỀ ĐÚNG 15P.**</w:t>
             </w:r>
           </w:p>
         </w:tc>

</xml_diff>

<commit_message>
docs(script): update 15-minute budget comparison table for PR #38 (#40)
## Summary
- Cập nhật Bảng đối chiếu thời gian theo mục tiêu 15 phút (900 giây) tại
\SCRIPT_THUYET_TRINH_TOAN_TEAM_CS106.md\ và
\SCRIPT_THUYET_TRINH_TOAN_TEAM_CS106.docx\:
- Dòng 2 (Đặng Chí Thanh): Cập nhật thời gian kịch bản từ 5 phút 22s
(322s) xuống **4 phút 48s (288s)**, mức chênh lệch giảm từ +1m52s xuống
**+1m18s (+37%)** sau khi rút gọn qua PR #38.
- Dòng Tổng toàn bài: Cập nhật tổng thời gian kịch bản từ 19 phút 06s
(1,146s) xuống **18 phút 32s (1,112s)**, mức vượt giảm từ +4m06s (+27%)
xuống **+3m32s (+24%)**.
- Đã tái biên dịch tệp \SCRIPT_THUYET_TRINH_TOAN_TEAM_CS106.docx\ đồng
bộ 100%.
</commit_message>
<xml_diff>
--- a/draft/fraud-detection/slide/scripts/SCRIPT_THUYET_TRINH_TOAN_TEAM_CS106.docx
+++ b/draft/fraud-detection/slide/scripts/SCRIPT_THUYET_TRINH_TOAN_TEAM_CS106.docx
@@ -1178,7 +1178,7 @@
                 <w:rFonts w:ascii="Times New Roman" w:hAnsi="Times New Roman"/>
                 <w:sz w:val="20"/>
               </w:rPr>
-              <w:t>🟢**Đã cập nhật** *(Rút gọn Slide 3–8 PR #37)*</w:t>
+              <w:t>🟢**Đã cập nhật** *(Rút gọn Slide 3–8 PR #37 &amp; #38)*</w:t>
             </w:r>
           </w:p>
         </w:tc>
@@ -1220,7 +1220,7 @@
                 <w:rFonts w:ascii="Times New Roman" w:hAnsi="Times New Roman"/>
                 <w:sz w:val="20"/>
               </w:rPr>
-              <w:t>**5 phút 22s** *(322s)*</w:t>
+              <w:t>**4 phút 48s** *(288s)*</w:t>
             </w:r>
           </w:p>
         </w:tc>
@@ -1248,7 +1248,7 @@
                 <w:rFonts w:ascii="Times New Roman" w:hAnsi="Times New Roman"/>
                 <w:sz w:val="20"/>
               </w:rPr>
-              <w:t>🔴**Vượt +1m52s** *(+53%)*</w:t>
+              <w:t>🔴**Vượt +1m18s** *(+37%)*</w:t>
             </w:r>
           </w:p>
         </w:tc>
@@ -1262,7 +1262,7 @@
                 <w:rFonts w:ascii="Times New Roman" w:hAnsi="Times New Roman"/>
                 <w:sz w:val="20"/>
               </w:rPr>
-              <w:t>⚠️**Cần nói lướt:** Đi thẳng vào 2 biến quyết định 97.1%.</w:t>
+              <w:t>✅**Đã rút gọn ~34s (PR #38):** Lời thoại ngắn gọn, đi thẳng vào 2 biến 97.1%.</w:t>
             </w:r>
           </w:p>
         </w:tc>
@@ -2356,7 +2356,7 @@
                 <w:rFonts w:ascii="Times New Roman" w:hAnsi="Times New Roman"/>
                 <w:sz w:val="20"/>
               </w:rPr>
-              <w:t>**19 phút 06s** *(1,146s)*</w:t>
+              <w:t>**18 phút 32s** *(1,112s)*</w:t>
             </w:r>
           </w:p>
         </w:tc>
@@ -2384,7 +2384,7 @@
                 <w:rFonts w:ascii="Times New Roman" w:hAnsi="Times New Roman"/>
                 <w:sz w:val="20"/>
               </w:rPr>
-              <w:t>🔴**VƯỢT +4m06s (+27%)**</w:t>
+              <w:t>🔴**VƯỢT +3m32s (+24%)**</w:t>
             </w:r>
           </w:p>
         </w:tc>
@@ -2398,7 +2398,7 @@
                 <w:rFonts w:ascii="Times New Roman" w:hAnsi="Times New Roman"/>
                 <w:sz w:val="20"/>
               </w:rPr>
-              <w:t>⚠️**ĐÃ GIẢM GẦN 4 PHÚT! CẦN NÓI Ý CHÍNH ĐỂ VỀ ĐÚNG 15P.**</w:t>
+              <w:t>⚠️**ĐÃ GIẢM GẦN 4.5 PHÚT! CẦN NÓI Ý CHÍNH ĐỂ VỀ ĐÚNG 15P.**</w:t>
             </w:r>
           </w:p>
         </w:tc>

</xml_diff>

<commit_message>
docs(script): gộp kịch bản XGBoost/Autoencoder của Cẩm lên main hiện tại
Giữ phần Random Forest đã rút gọn của Sơn, đưa lời thoại Slide 12/13/18 và Q&A 2–3, 5–8 của Cẩm, đồng thời đếm lại thời lượng nói thành 7 phút 56 giây.

Co-authored-by: Cursor <cursoragent@cursor.com>
</commit_message>
<xml_diff>
--- a/draft/fraud-detection/slide/scripts/SCRIPT_THUYET_TRINH_TOAN_TEAM_CS106.docx
+++ b/draft/fraud-detection/slide/scripts/SCRIPT_THUYET_TRINH_TOAN_TEAM_CS106.docx
@@ -1320,7 +1320,7 @@
                 <w:rFonts w:ascii="Times New Roman" w:hAnsi="Times New Roman"/>
                 <w:sz w:val="20"/>
               </w:rPr>
-              <w:t>🔴**Chưa cập nhật** *(Giữ nguyên bản cũ)*</w:t>
+              <w:t>🟢**Đã cập nhật** *(Rút gọn Slide 9–12 PR #42)*</w:t>
             </w:r>
           </w:p>
         </w:tc>
@@ -1362,7 +1362,7 @@
                 <w:rFonts w:ascii="Times New Roman" w:hAnsi="Times New Roman"/>
                 <w:sz w:val="20"/>
               </w:rPr>
-              <w:t>**3 phút 30s** *(210s)*</w:t>
+              <w:t>**2 phút 30s** *(150s)*</w:t>
             </w:r>
           </w:p>
         </w:tc>
@@ -1390,7 +1390,7 @@
                 <w:rFonts w:ascii="Times New Roman" w:hAnsi="Times New Roman"/>
                 <w:sz w:val="20"/>
               </w:rPr>
-              <w:t>🔴**Vượt +1m30s** *(+75%)*</w:t>
+              <w:t>🟢**Vượt +30s** *(+25%)*</w:t>
             </w:r>
           </w:p>
         </w:tc>
@@ -1404,7 +1404,7 @@
                 <w:rFonts w:ascii="Times New Roman" w:hAnsi="Times New Roman"/>
                 <w:sz w:val="20"/>
               </w:rPr>
-              <w:t>⚠️**Cắt lý thuyết:** Bỏ giải thích ADASYN, chỉ nêu kết quả RF F1=0.9973.</w:t>
+              <w:t>✅**Đã rút gọn (PR #42):** Bám sát slide, 4 nguyên tắc Leak-Free &amp; kết quả RF F1=0.9973.</w:t>
             </w:r>
           </w:p>
         </w:tc>
@@ -1462,7 +1462,7 @@
                 <w:rFonts w:ascii="Times New Roman" w:hAnsi="Times New Roman"/>
                 <w:sz w:val="20"/>
               </w:rPr>
-              <w:t>🔴**Chưa cập nhật** *(Giữ nguyên bản cũ)*</w:t>
+              <w:t>🟢**Đã cập nhật** *(Script mới của Cẩm, 20/09 — gộp local)*</w:t>
             </w:r>
           </w:p>
         </w:tc>
@@ -1476,7 +1476,7 @@
                 <w:rFonts w:ascii="Times New Roman" w:hAnsi="Times New Roman"/>
                 <w:sz w:val="20"/>
               </w:rPr>
-              <w:t>XGBoost siêu tốc (41s, JSON 410KB) và Deep Autoencoder bắt Zero-Day.</w:t>
+              <w:t>XGBoost (huấn luyện chưa tới 1 phút, nhanh hơn RF hơn 20 lần) và Deep Autoencoder: lớp phòng thủ thứ cấp, chọn ngưỡng phân vị 95.</w:t>
             </w:r>
           </w:p>
         </w:tc>
@@ -1504,7 +1504,7 @@
                 <w:rFonts w:ascii="Times New Roman" w:hAnsi="Times New Roman"/>
                 <w:sz w:val="20"/>
               </w:rPr>
-              <w:t>**3 phút 43s** *(223s)*</w:t>
+              <w:t>**7 phút 56s** *(476s)* *(đếm lại: 1,074 từ ÷ 135.5 WPM; Slide 12 XGB 258 từ / 114s, Slide 13 409 từ / 181s, Slide 18 407 từ / 180s)*</w:t>
             </w:r>
           </w:p>
         </w:tc>
@@ -1532,7 +1532,7 @@
                 <w:rFonts w:ascii="Times New Roman" w:hAnsi="Times New Roman"/>
                 <w:sz w:val="20"/>
               </w:rPr>
-              <w:t>🔴**Vượt +1m43s** *(+86%)*</w:t>
+              <w:t>🔴**Vượt +5m56s** *(+297%)*</w:t>
             </w:r>
           </w:p>
         </w:tc>
@@ -1546,7 +1546,7 @@
                 <w:rFonts w:ascii="Times New Roman" w:hAnsi="Times New Roman"/>
                 <w:sz w:val="20"/>
               </w:rPr>
-              <w:t>⚠️**Cần cô đọng:** XGB 40s + Autoencoder &amp; ngưỡng 95th 80s.</w:t>
+              <w:t>⚠️**Cần cắt mạnh:** kịch bản dài gần 4 lần ngân sách 2 phút; không có mốc **[có thể bỏ]** trong lời thoại. Ưu tiên giữ ngưỡng 95th, Recall 75.2%, và vai trò lớp phòng thủ thứ hai.</w:t>
             </w:r>
           </w:p>
         </w:tc>
@@ -2314,7 +2314,7 @@
                 <w:rFonts w:ascii="Times New Roman" w:hAnsi="Times New Roman"/>
                 <w:sz w:val="20"/>
               </w:rPr>
-              <w:t>**3/7 bạn đã tối ưu**</w:t>
+              <w:t>**5/7 bạn đã cập nhật; 4/7 đã tối ưu**</w:t>
             </w:r>
           </w:p>
         </w:tc>
@@ -2356,7 +2356,7 @@
                 <w:rFonts w:ascii="Times New Roman" w:hAnsi="Times New Roman"/>
                 <w:sz w:val="20"/>
               </w:rPr>
-              <w:t>**18 phút 32s** *(1,112s)*</w:t>
+              <w:t>**21 phút 45s** *(1,305s)*</w:t>
             </w:r>
           </w:p>
         </w:tc>
@@ -2384,7 +2384,7 @@
                 <w:rFonts w:ascii="Times New Roman" w:hAnsi="Times New Roman"/>
                 <w:sz w:val="20"/>
               </w:rPr>
-              <w:t>🔴**VƯỢT +3m32s (+24%)**</w:t>
+              <w:t>🔴**VƯỢT +6m45s (+45%)**</w:t>
             </w:r>
           </w:p>
         </w:tc>
@@ -2398,7 +2398,7 @@
                 <w:rFonts w:ascii="Times New Roman" w:hAnsi="Times New Roman"/>
                 <w:sz w:val="20"/>
               </w:rPr>
-              <w:t>⚠️**ĐÃ GIẢM GẦN 4.5 PHÚT! CẦN NÓI Ý CHÍNH ĐỂ VỀ ĐÚNG 15P.**</w:t>
+              <w:t>⚠️**CẨM ĐÃ CẬP NHẬT NỘI DUNG NHƯNG CẦN CẮT VỀ 2 PHÚT. KHANG, TRUNG TIẾP TỤC RÚT GỌN.**</w:t>
             </w:r>
           </w:p>
         </w:tc>
@@ -3719,14 +3719,27 @@
         <w:rPr>
           <w:rFonts w:ascii="Times New Roman" w:hAnsi="Times New Roman"/>
         </w:rPr>
-        <w:t xml:space="preserve">Em chào thầy và các bạn, mình là </w:t>
+        <w:t xml:space="preserve">Cảm ơn Thanh. Chào Thầy và các bạn, mình là </w:t>
       </w:r>
       <w:r>
         <w:rPr>
           <w:rFonts w:ascii="Times New Roman" w:hAnsi="Times New Roman"/>
           <w:b/>
         </w:rPr>
-        <w:t>Hoàng Cao Sơn</w:t>
+        <w:t>Sơn</w:t>
+      </w:r>
+      <w:r>
+        <w:rPr>
+          <w:rFonts w:ascii="Times New Roman" w:hAnsi="Times New Roman"/>
+        </w:rPr>
+        <w:t xml:space="preserve">. Sau khi em Thanh đã trích xuất 14 đặc trưng, mình tiếp nhận bài toán và xử lý thách thức cốt lõi đầu tiên: </w:t>
+      </w:r>
+      <w:r>
+        <w:rPr>
+          <w:rFonts w:ascii="Times New Roman" w:hAnsi="Times New Roman"/>
+          <w:b/>
+        </w:rPr>
+        <w:t>Dữ liệu bị mất cân bằng (Imbalanced Data) cực đoan ~0.13%</w:t>
       </w:r>
       <w:r>
         <w:rPr>
@@ -3740,20 +3753,85 @@
         <w:rPr>
           <w:rFonts w:ascii="Times New Roman" w:hAnsi="Times New Roman"/>
         </w:rPr>
-        <w:t xml:space="preserve">Ở phần trước thì Thanh đã phân tích rất rõ về 14 đặc trưng trích xuất. Nhưng khi bước sang huấn luyện mô hình, thách thức lớn nhất là tỷ lệ gian lận cực đoan chỉ chiếm </w:t>
+        <w:t xml:space="preserve">Nhìn vào khung cảnh báo màu đỏ ở trên cùng: Đây là </w:t>
       </w:r>
       <w:r>
         <w:rPr>
           <w:rFonts w:ascii="Times New Roman" w:hAnsi="Times New Roman"/>
           <w:b/>
         </w:rPr>
-        <w:t>0.13%</w:t>
-      </w:r>
-      <w:r>
-        <w:rPr>
-          <w:rFonts w:ascii="Times New Roman" w:hAnsi="Times New Roman"/>
-        </w:rPr>
-        <w:t>. Nếu để nguyên dữ liệu gốc, mô hình sẽ bị rơi vào cái bẫy 'bộ phân lớp hiển nhiên' (Majority Classifier) — đoán tất cả là bình thường thì Accuracy vẫn 99.87% nhưng hoàn toàn vô dụng.</w:t>
+        <w:t>Accuracy Paradox (nghịch lý độ chính xác)</w:t>
+      </w:r>
+      <w:r>
+        <w:rPr>
+          <w:rFonts w:ascii="Times New Roman" w:hAnsi="Times New Roman"/>
+        </w:rPr>
+        <w:t xml:space="preserve">. Nếu mô hình ngây thơ đoán 100% giao dịch là bình thường thì </w:t>
+      </w:r>
+      <w:r>
+        <w:rPr>
+          <w:rFonts w:ascii="Times New Roman" w:hAnsi="Times New Roman"/>
+          <w:b/>
+        </w:rPr>
+        <w:t>Accuracy (độ chính xác tổng thể)</w:t>
+      </w:r>
+      <w:r>
+        <w:rPr>
+          <w:rFonts w:ascii="Times New Roman" w:hAnsi="Times New Roman"/>
+        </w:rPr>
+        <w:t xml:space="preserve"> vẫn đạt 99.87% nhưng bỏ sót toàn bộ gian lận. Do đó, việc đánh giá bắt buộc phải dẫn dắt bởi </w:t>
+      </w:r>
+      <w:r>
+        <w:rPr>
+          <w:rFonts w:ascii="Times New Roman" w:hAnsi="Times New Roman"/>
+          <w:b/>
+        </w:rPr>
+        <w:t>Precision (độ chuẩn xác)</w:t>
+      </w:r>
+      <w:r>
+        <w:rPr>
+          <w:rFonts w:ascii="Times New Roman" w:hAnsi="Times New Roman"/>
+        </w:rPr>
+        <w:t xml:space="preserve">, </w:t>
+      </w:r>
+      <w:r>
+        <w:rPr>
+          <w:rFonts w:ascii="Times New Roman" w:hAnsi="Times New Roman"/>
+          <w:b/>
+        </w:rPr>
+        <w:t>Recall (độ phủ)</w:t>
+      </w:r>
+      <w:r>
+        <w:rPr>
+          <w:rFonts w:ascii="Times New Roman" w:hAnsi="Times New Roman"/>
+        </w:rPr>
+        <w:t xml:space="preserve">, </w:t>
+      </w:r>
+      <w:r>
+        <w:rPr>
+          <w:rFonts w:ascii="Times New Roman" w:hAnsi="Times New Roman"/>
+          <w:b/>
+        </w:rPr>
+        <w:t>F1-Score</w:t>
+      </w:r>
+      <w:r>
+        <w:rPr>
+          <w:rFonts w:ascii="Times New Roman" w:hAnsi="Times New Roman"/>
+        </w:rPr>
+        <w:t xml:space="preserve"> và </w:t>
+      </w:r>
+      <w:r>
+        <w:rPr>
+          <w:rFonts w:ascii="Times New Roman" w:hAnsi="Times New Roman"/>
+          <w:b/>
+        </w:rPr>
+        <w:t>PR-AUC</w:t>
+      </w:r>
+      <w:r>
+        <w:rPr>
+          <w:rFonts w:ascii="Times New Roman" w:hAnsi="Times New Roman"/>
+        </w:rPr>
+        <w:t>.</w:t>
       </w:r>
     </w:p>
     <w:p>
@@ -3761,33 +3839,7 @@
         <w:rPr>
           <w:rFonts w:ascii="Times New Roman" w:hAnsi="Times New Roman"/>
         </w:rPr>
-        <w:t xml:space="preserve">Để xử lý, nhóm đã thử nghiệm đối chuẩn 2 kỹ thuật sinh mẫu nhân tạo là </w:t>
-      </w:r>
-      <w:r>
-        <w:rPr>
-          <w:rFonts w:ascii="Times New Roman" w:hAnsi="Times New Roman"/>
-          <w:b/>
-        </w:rPr>
-        <w:t>SMOTENC</w:t>
-      </w:r>
-      <w:r>
-        <w:rPr>
-          <w:rFonts w:ascii="Times New Roman" w:hAnsi="Times New Roman"/>
-        </w:rPr>
-        <w:t xml:space="preserve"> và </w:t>
-      </w:r>
-      <w:r>
-        <w:rPr>
-          <w:rFonts w:ascii="Times New Roman" w:hAnsi="Times New Roman"/>
-          <w:b/>
-        </w:rPr>
-        <w:t>ADASYN</w:t>
-      </w:r>
-      <w:r>
-        <w:rPr>
-          <w:rFonts w:ascii="Times New Roman" w:hAnsi="Times New Roman"/>
-        </w:rPr>
-        <w:t>:</w:t>
+        <w:t>Để cân bằng dữ liệu, mình đưa 2 kỹ thuật sinh mẫu vào đối chuẩn:</w:t>
       </w:r>
     </w:p>
     <w:p>
@@ -3798,33 +3850,46 @@
         <w:rPr>
           <w:rFonts w:ascii="Times New Roman" w:hAnsi="Times New Roman"/>
         </w:rPr>
-        <w:t xml:space="preserve">Với </w:t>
+        <w:t xml:space="preserve">Ở khung màu xanh bên trái: Như công thức hiển thị, bản chất của </w:t>
       </w:r>
       <w:r>
         <w:rPr>
           <w:rFonts w:ascii="Times New Roman" w:hAnsi="Times New Roman"/>
           <w:b/>
         </w:rPr>
-        <w:t>ADASYN</w:t>
-      </w:r>
-      <w:r>
-        <w:rPr>
-          <w:rFonts w:ascii="Times New Roman" w:hAnsi="Times New Roman"/>
-        </w:rPr>
-        <w:t xml:space="preserve">: Thuật toán ưu tiên sinh mẫu ở các vùng biên khó. Tuy nhiên trong dữ liệu gian lận, vùng biên thường bị nhiễu do kẻ gian ngụy trang. ADASYN tập trung sinh dày đặc mẫu nhân tạo vào vùng nhiễu này, làm méo mó ranh giới quyết định và dẫn tới </w:t>
+        <w:t>SMOTE (Kỹ thuật nội suy mẫu tổng hợp)</w:t>
+      </w:r>
+      <w:r>
+        <w:rPr>
+          <w:rFonts w:ascii="Times New Roman" w:hAnsi="Times New Roman"/>
+        </w:rPr>
+        <w:t xml:space="preserve"> là nội suy mẫu nhân tạo dọc theo đoạn thẳng nối các láng giềng </w:t>
       </w:r>
       <w:r>
         <w:rPr>
           <w:rFonts w:ascii="Times New Roman" w:hAnsi="Times New Roman"/>
           <w:b/>
         </w:rPr>
-        <w:t>tỷ lệ báo động giả (False Alarm) tăng vọt</w:t>
-      </w:r>
-      <w:r>
-        <w:rPr>
-          <w:rFonts w:ascii="Times New Roman" w:hAnsi="Times New Roman"/>
-        </w:rPr>
-        <w:t>, khách hàng bình thường cũng bị chặn thẻ.</w:t>
+        <w:t>k-NN (k láng giềng gần nhất)</w:t>
+      </w:r>
+      <w:r>
+        <w:rPr>
+          <w:rFonts w:ascii="Times New Roman" w:hAnsi="Times New Roman"/>
+        </w:rPr>
+        <w:t xml:space="preserve">, tạo ra đường biên phân tách phẳng và rõ nét. Điểm mấu chốt là mình dùng biến thể </w:t>
+      </w:r>
+      <w:r>
+        <w:rPr>
+          <w:rFonts w:ascii="Times New Roman" w:hAnsi="Times New Roman"/>
+          <w:b/>
+        </w:rPr>
+        <w:t>SMOTENC (Nominal &amp; Continuous - biến định danh và liên tục)</w:t>
+      </w:r>
+      <w:r>
+        <w:rPr>
+          <w:rFonts w:ascii="Times New Roman" w:hAnsi="Times New Roman"/>
+        </w:rPr>
+        <w:t xml:space="preserve"> để bảo toàn nguyên vẹn giá trị 0-1 của các cờ nhị phân.</w:t>
       </w:r>
     </w:p>
     <w:p>
@@ -3835,33 +3900,33 @@
         <w:rPr>
           <w:rFonts w:ascii="Times New Roman" w:hAnsi="Times New Roman"/>
         </w:rPr>
-        <w:t xml:space="preserve">Với </w:t>
+        <w:t xml:space="preserve">Ngược lại, ở khung màu xám bên phải là </w:t>
       </w:r>
       <w:r>
         <w:rPr>
           <w:rFonts w:ascii="Times New Roman" w:hAnsi="Times New Roman"/>
           <w:b/>
         </w:rPr>
-        <w:t>SMOTENC</w:t>
-      </w:r>
-      <w:r>
-        <w:rPr>
-          <w:rFonts w:ascii="Times New Roman" w:hAnsi="Times New Roman"/>
-        </w:rPr>
-        <w:t xml:space="preserve">: Thuật toán nội suy tuyến tính láng giềng k-NN trong không gian ẩn ổn định hơn, tạo ra ranh giới phẳng và phân cách rõ ràng. Điểm mấu chốt là nhóm dùng biến thể </w:t>
+        <w:t>ADASYN (Lấy mẫu thích ứng theo mật độ)</w:t>
+      </w:r>
+      <w:r>
+        <w:rPr>
+          <w:rFonts w:ascii="Times New Roman" w:hAnsi="Times New Roman"/>
+        </w:rPr>
+        <w:t xml:space="preserve">: Do cố sinh mẫu theo mật độ vùng biên khó, mà kẻ gian lại ngụy trang tinh vi, ADASYN đã đẻ mẫu quá đà ở vùng chồng lấn nhiễu, làm tăng </w:t>
       </w:r>
       <w:r>
         <w:rPr>
           <w:rFonts w:ascii="Times New Roman" w:hAnsi="Times New Roman"/>
           <w:b/>
         </w:rPr>
-        <w:t>SMOTENC (Nominal and Continuous)</w:t>
-      </w:r>
-      <w:r>
-        <w:rPr>
-          <w:rFonts w:ascii="Times New Roman" w:hAnsi="Times New Roman"/>
-        </w:rPr>
-        <w:t>: vì dữ liệu có 4 cờ nhị phân quan trọng (như cờ rút cạn, giao dịch đêm), SMOTENC bảo toàn nguyên vẹn giá trị 0 hoặc 1, không bao giờ nội suy ra các số thực lẻ vô nghĩa như 0.4 hay 0.7.</w:t>
+        <w:t>False Positives (báo động giả)</w:t>
+      </w:r>
+      <w:r>
+        <w:rPr>
+          <w:rFonts w:ascii="Times New Roman" w:hAnsi="Times New Roman"/>
+        </w:rPr>
+        <w:t>.</w:t>
       </w:r>
     </w:p>
     <w:p>
@@ -3869,19 +3934,20 @@
         <w:rPr>
           <w:rFonts w:ascii="Times New Roman" w:hAnsi="Times New Roman"/>
         </w:rPr>
+        <w:t xml:space="preserve">👉 </w:t>
       </w:r>
       <w:r>
         <w:rPr>
           <w:rFonts w:ascii="Times New Roman" w:hAnsi="Times New Roman"/>
           <w:b/>
         </w:rPr>
-        <w:t>Kết luận thực nghiệm:</w:t>
-      </w:r>
-      <w:r>
-        <w:rPr>
-          <w:rFonts w:ascii="Times New Roman" w:hAnsi="Times New Roman"/>
-        </w:rPr>
-        <w:t xml:space="preserve"> Nhóm chọn </w:t>
+        <w:t>Chốt lại:</w:t>
+      </w:r>
+      <w:r>
+        <w:rPr>
+          <w:rFonts w:ascii="Times New Roman" w:hAnsi="Times New Roman"/>
+        </w:rPr>
+        <w:t xml:space="preserve"> Mình chọn </w:t>
       </w:r>
       <w:r>
         <w:rPr>
@@ -3894,20 +3960,20 @@
         <w:rPr>
           <w:rFonts w:ascii="Times New Roman" w:hAnsi="Times New Roman"/>
         </w:rPr>
-        <w:t xml:space="preserve"> làm phương pháp xử lý chính thức, tạo ra tập huấn luyện cân bằng gồm </w:t>
+        <w:t xml:space="preserve">, tạo ra tập train cân bằng </w:t>
       </w:r>
       <w:r>
         <w:rPr>
           <w:rFonts w:ascii="Times New Roman" w:hAnsi="Times New Roman"/>
           <w:b/>
         </w:rPr>
-        <w:t>230,145 dòng</w:t>
-      </w:r>
-      <w:r>
-        <w:rPr>
-          <w:rFonts w:ascii="Times New Roman" w:hAnsi="Times New Roman"/>
-        </w:rPr>
-        <w:t>, giúp mô hình triệt tiêu tối đa các ca báo động giả.</w:t>
+        <w:t>230.145 dòng</w:t>
+      </w:r>
+      <w:r>
+        <w:rPr>
+          <w:rFonts w:ascii="Times New Roman" w:hAnsi="Times New Roman"/>
+        </w:rPr>
+        <w:t xml:space="preserve"> (theo tỷ lệ 1:2 tối ưu), triệt tiêu tối đa báo động giả.</w:t>
       </w:r>
     </w:p>
     <w:p>
@@ -3953,7 +4019,7 @@
         <w:rPr>
           <w:rFonts w:ascii="Times New Roman" w:hAnsi="Times New Roman"/>
         </w:rPr>
-        <w:t>Tiếp theo, em xin đi vào Phần 3: Kiến trúc Pipeline chuẩn Leak-Free và chi tiết 3 mô hình học máy mà nhóm đã xây dựng.</w:t>
+        <w:t>Tiếp theo, mình xin đi vào Phần 3: Kiến trúc Pipeline chuẩn Leak-Free và Mô hình Random Forest do mình huấn luyện.</w:t>
       </w:r>
     </w:p>
     <w:p>
@@ -3999,20 +4065,33 @@
         <w:rPr>
           <w:rFonts w:ascii="Times New Roman" w:hAnsi="Times New Roman"/>
         </w:rPr>
-        <w:t xml:space="preserve">Kính thưa Thầy, trong các hệ thống AI tài chính, rủi ro lớn nhất là </w:t>
+        <w:t xml:space="preserve">Bước sang Slide 11 là kiến trúc </w:t>
       </w:r>
       <w:r>
         <w:rPr>
           <w:rFonts w:ascii="Times New Roman" w:hAnsi="Times New Roman"/>
           <w:b/>
         </w:rPr>
-        <w:t>Rò rỉ dữ liệu (Data Leakage)</w:t>
-      </w:r>
-      <w:r>
-        <w:rPr>
-          <w:rFonts w:ascii="Times New Roman" w:hAnsi="Times New Roman"/>
-        </w:rPr>
-        <w:t xml:space="preserve"> — mô hình nhìn trộm dữ liệu kiểm thử, dẫn đến điểm số trên máy thì cao chót vót nhưng đem ra chạy thực tế thì thất bại hoàn toàn.</w:t>
+        <w:t>Pipeline (chuỗi quy trình xử lý)</w:t>
+      </w:r>
+      <w:r>
+        <w:rPr>
+          <w:rFonts w:ascii="Times New Roman" w:hAnsi="Times New Roman"/>
+        </w:rPr>
+        <w:t xml:space="preserve"> gồm 6 bước của nhóm (từ Lọc dữ liệu, Trích xuất đặc trưng, Chia tập, Tái lấy mẫu, Huấn luyện đến Đánh giá), được thiết kế để triệt tiêu hoàn toàn nguy cơ </w:t>
+      </w:r>
+      <w:r>
+        <w:rPr>
+          <w:rFonts w:ascii="Times New Roman" w:hAnsi="Times New Roman"/>
+          <w:b/>
+        </w:rPr>
+        <w:t>Data Leakage (rò rỉ dữ liệu)</w:t>
+      </w:r>
+      <w:r>
+        <w:rPr>
+          <w:rFonts w:ascii="Times New Roman" w:hAnsi="Times New Roman"/>
+        </w:rPr>
+        <w:t>.</w:t>
       </w:r>
     </w:p>
     <w:p>
@@ -4020,20 +4099,20 @@
         <w:rPr>
           <w:rFonts w:ascii="Times New Roman" w:hAnsi="Times New Roman"/>
         </w:rPr>
-        <w:t xml:space="preserve">Để đảm bảo tính trung thực và khách quan tuyệt đối, nhóm đã thiết kế quy trình gồm 6 bước với </w:t>
+        <w:t xml:space="preserve">Mọi người có thể thấy </w:t>
       </w:r>
       <w:r>
         <w:rPr>
           <w:rFonts w:ascii="Times New Roman" w:hAnsi="Times New Roman"/>
           <w:b/>
         </w:rPr>
-        <w:t>4 nguyên tắc bảo vệ Leak-Free nghiêm ngặt</w:t>
-      </w:r>
-      <w:r>
-        <w:rPr>
-          <w:rFonts w:ascii="Times New Roman" w:hAnsi="Times New Roman"/>
-        </w:rPr>
-        <w:t>:</w:t>
+        <w:t>4 quy chuẩn bảo vệ nghiêm ngặt</w:t>
+      </w:r>
+      <w:r>
+        <w:rPr>
+          <w:rFonts w:ascii="Times New Roman" w:hAnsi="Times New Roman"/>
+        </w:rPr>
+        <w:t xml:space="preserve"> ở khung bên dưới:</w:t>
       </w:r>
     </w:p>
     <w:p>
@@ -4050,13 +4129,13 @@
           <w:rFonts w:ascii="Times New Roman" w:hAnsi="Times New Roman"/>
           <w:b/>
         </w:rPr>
-        <w:t>Stratified Split (80/20) TRƯỚC TIÊN</w:t>
-      </w:r>
-      <w:r>
-        <w:rPr>
-          <w:rFonts w:ascii="Times New Roman" w:hAnsi="Times New Roman"/>
-        </w:rPr>
-        <w:t>: Chốt chặn đầu tiên tách riêng tập Train (160,000 dòng) và Test (40,000 dòng) trước khi thực hiện bất kỳ phép biến đổi nào.</w:t>
+        <w:t>Stratified Split (chia phân tầng) 80/20</w:t>
+      </w:r>
+      <w:r>
+        <w:rPr>
+          <w:rFonts w:ascii="Times New Roman" w:hAnsi="Times New Roman"/>
+        </w:rPr>
+        <w:t xml:space="preserve"> được chốt chặn trước bất kỳ bước tái lấy mẫu hay chuẩn hóa nào.</w:t>
       </w:r>
     </w:p>
     <w:p>
@@ -4073,26 +4152,39 @@
           <w:rFonts w:ascii="Times New Roman" w:hAnsi="Times New Roman"/>
           <w:b/>
         </w:rPr>
-        <w:t>Cô lập Resampling tuyệt đối</w:t>
-      </w:r>
-      <w:r>
-        <w:rPr>
-          <w:rFonts w:ascii="Times New Roman" w:hAnsi="Times New Roman"/>
-        </w:rPr>
-        <w:t xml:space="preserve">: Quá trình sinh mẫu SMOTENC </w:t>
+        <w:t>Resampling (tái lấy mẫu)</w:t>
+      </w:r>
+      <w:r>
+        <w:rPr>
+          <w:rFonts w:ascii="Times New Roman" w:hAnsi="Times New Roman"/>
+        </w:rPr>
+        <w:t xml:space="preserve"> ở Bước 4 </w:t>
       </w:r>
       <w:r>
         <w:rPr>
           <w:rFonts w:ascii="Times New Roman" w:hAnsi="Times New Roman"/>
           <w:b/>
         </w:rPr>
-        <w:t>chỉ chạy trên 80% tập Train</w:t>
-      </w:r>
-      <w:r>
-        <w:rPr>
-          <w:rFonts w:ascii="Times New Roman" w:hAnsi="Times New Roman"/>
-        </w:rPr>
-        <w:t>. Tập Test 40,000 mẫu được giữ nguyên vẹn 100% tỷ lệ thực tế ngoài đời, tuyệt đối không có một mẫu nhân tạo nào lọt vào.</w:t>
+        <w:t>tuyệt đối chỉ chạy trên tập Train (huấn luyện)</w:t>
+      </w:r>
+      <w:r>
+        <w:rPr>
+          <w:rFonts w:ascii="Times New Roman" w:hAnsi="Times New Roman"/>
+        </w:rPr>
+        <w:t xml:space="preserve">; tập </w:t>
+      </w:r>
+      <w:r>
+        <w:rPr>
+          <w:rFonts w:ascii="Times New Roman" w:hAnsi="Times New Roman"/>
+          <w:b/>
+        </w:rPr>
+        <w:t>Test (kiểm thử)</w:t>
+      </w:r>
+      <w:r>
+        <w:rPr>
+          <w:rFonts w:ascii="Times New Roman" w:hAnsi="Times New Roman"/>
+        </w:rPr>
+        <w:t xml:space="preserve"> 40.000 mẫu được giữ nguyên vẹn 100% tỷ lệ thực tế ngoài đời, không một mẫu nhân tạo nào được lọt vào.</w:t>
       </w:r>
     </w:p>
     <w:p>
@@ -4109,13 +4201,13 @@
           <w:rFonts w:ascii="Times New Roman" w:hAnsi="Times New Roman"/>
           <w:b/>
         </w:rPr>
-        <w:t>Chuẩn hóa Scaler độc lập</w:t>
-      </w:r>
-      <w:r>
-        <w:rPr>
-          <w:rFonts w:ascii="Times New Roman" w:hAnsi="Times New Roman"/>
-        </w:rPr>
-        <w:t>: Bộ `StandardScaler` chỉ được `fit` trên tập Train để lấy trung bình và phương sai, rồi dùng nguyên tham số đó `transform` trên Test.</w:t>
+        <w:t>StandardScaler (chuẩn hóa độ lệch chuẩn)</w:t>
+      </w:r>
+      <w:r>
+        <w:rPr>
+          <w:rFonts w:ascii="Times New Roman" w:hAnsi="Times New Roman"/>
+        </w:rPr>
+        <w:t xml:space="preserve"> chỉ `fit` (học tham số) trên Train rồi mới `transform` (áp dụng chuyển đổi) mù sang Test.</w:t>
       </w:r>
     </w:p>
     <w:p>
@@ -4126,32 +4218,33 @@
         <w:rPr>
           <w:rFonts w:ascii="Times New Roman" w:hAnsi="Times New Roman"/>
         </w:rPr>
+        <w:t xml:space="preserve">Toàn bộ khâu chọn ngưỡng và dò </w:t>
       </w:r>
       <w:r>
         <w:rPr>
           <w:rFonts w:ascii="Times New Roman" w:hAnsi="Times New Roman"/>
           <w:b/>
         </w:rPr>
-        <w:t>Tối ưu siêu tham số độc lập</w:t>
-      </w:r>
-      <w:r>
-        <w:rPr>
-          <w:rFonts w:ascii="Times New Roman" w:hAnsi="Times New Roman"/>
-        </w:rPr>
-        <w:t xml:space="preserve">: Toàn bộ khâu chọn ngưỡng và tune model đều dùng </w:t>
+        <w:t>Hyperparameters (siêu tham số)</w:t>
+      </w:r>
+      <w:r>
+        <w:rPr>
+          <w:rFonts w:ascii="Times New Roman" w:hAnsi="Times New Roman"/>
+        </w:rPr>
+        <w:t xml:space="preserve"> đều dùng </w:t>
       </w:r>
       <w:r>
         <w:rPr>
           <w:rFonts w:ascii="Times New Roman" w:hAnsi="Times New Roman"/>
           <w:b/>
         </w:rPr>
-        <w:t>5-Fold Stratified Cross-Validation nội bộ trên Train</w:t>
-      </w:r>
-      <w:r>
-        <w:rPr>
-          <w:rFonts w:ascii="Times New Roman" w:hAnsi="Times New Roman"/>
-        </w:rPr>
-        <w:t>, không chạm vào Test.</w:t>
+        <w:t>Cross-Validation (kiểm định chéo)</w:t>
+      </w:r>
+      <w:r>
+        <w:rPr>
+          <w:rFonts w:ascii="Times New Roman" w:hAnsi="Times New Roman"/>
+        </w:rPr>
+        <w:t xml:space="preserve"> nội bộ trên Train, không chạm vào Test.</w:t>
       </w:r>
     </w:p>
     <w:p>
@@ -4159,7 +4252,7 @@
         <w:rPr>
           <w:rFonts w:ascii="Times New Roman" w:hAnsi="Times New Roman"/>
         </w:rPr>
-        <w:t>Nhờ 4 nguyên tắc này, toàn bộ kết quả thực nghiệm của nhóm đều là số liệu thật và có giá trị tin cậy cao.</w:t>
+        <w:t>Nhờ 4 nguyên tắc này, toàn bộ kết quả thực nghiệm của nhóm đều đảm bảo tính khách quan và trung thực tuyệt đối.</w:t>
       </w:r>
     </w:p>
     <w:p>
@@ -4192,7 +4285,7 @@
           <w:rFonts w:ascii="Times New Roman" w:hAnsi="Times New Roman"/>
           <w:i/>
         </w:rPr>
-        <w:t>(Thời lượng chuẩn hóa: **~90s – 95s** [Sơn ~40s, Cẩm ~50s] [Meeting thực tế: ~200s] | Người nói: **Hoàng Cao Sơn** [phần RF] &amp; **Bùi Thị Mỷ Cẩm** [phần XGB])</w:t>
+        <w:t>(Thời lượng chuẩn hóa: **~154s** [Sơn ~40s, Cẩm ~114s / 258 từ] [Meeting thực tế: ~200s] | Người nói: **Hoàng Cao Sơn** [phần RF] &amp; **Bùi Thị Mỷ Cẩm** [phần XGB])</w:t>
       </w:r>
       <w:r>
         <w:rPr>
@@ -4211,7 +4304,7 @@
           <w:rFonts w:ascii="Times New Roman" w:hAnsi="Times New Roman"/>
           <w:i/>
         </w:rPr>
-        <w:t>(Phần 1 - Random Forest: **Hoàng Cao Sơn** trình bày)</w:t>
+        <w:t>(Phần 1 - Random Forest: **Hoàng Cao Sơn** trình bày - ~40s)</w:t>
       </w:r>
       <w:r>
         <w:rPr>
@@ -4224,20 +4317,20 @@
         <w:rPr>
           <w:rFonts w:ascii="Times New Roman" w:hAnsi="Times New Roman"/>
         </w:rPr>
-        <w:t xml:space="preserve">Dựa trên pipeline đó, mô hình có giám sát đầu tiên nhóm xây dựng là </w:t>
+        <w:t xml:space="preserve">Tại Slide 12, ở nửa bên trái là mô hình </w:t>
       </w:r>
       <w:r>
         <w:rPr>
           <w:rFonts w:ascii="Times New Roman" w:hAnsi="Times New Roman"/>
           <w:b/>
         </w:rPr>
-        <w:t>Random Forest</w:t>
-      </w:r>
-      <w:r>
-        <w:rPr>
-          <w:rFonts w:ascii="Times New Roman" w:hAnsi="Times New Roman"/>
-        </w:rPr>
-        <w:t xml:space="preserve"> ở bên trái. Nhóm sử dụng cơ chế Ensemble Bagging với 200 cây quyết định độc lập, tối ưu qua `RandomizedSearchCV` 50 vòng lặp, khống chế `max_depth = 20`, đồng thời áp dụng trọng số lớp cân bằng theo từng cây con.</w:t>
+        <w:t>Random Forest (Rừng ngẫu nhiên)</w:t>
+      </w:r>
+      <w:r>
+        <w:rPr>
+          <w:rFonts w:ascii="Times New Roman" w:hAnsi="Times New Roman"/>
+        </w:rPr>
+        <w:t xml:space="preserve"> do mình huấn luyện.</w:t>
       </w:r>
     </w:p>
     <w:p>
@@ -4245,46 +4338,59 @@
         <w:rPr>
           <w:rFonts w:ascii="Times New Roman" w:hAnsi="Times New Roman"/>
         </w:rPr>
-        <w:t xml:space="preserve">Khi kiểm thử trên 40,000 mẫu tập Test, mô hình đạt độ chính xác cực cao: </w:t>
+        <w:t xml:space="preserve">Về kiến trúc, mô hình tập hợp </w:t>
       </w:r>
       <w:r>
         <w:rPr>
           <w:rFonts w:ascii="Times New Roman" w:hAnsi="Times New Roman"/>
           <w:b/>
         </w:rPr>
-        <w:t>Precision = 99.94%</w:t>
-      </w:r>
-      <w:r>
-        <w:rPr>
-          <w:rFonts w:ascii="Times New Roman" w:hAnsi="Times New Roman"/>
-        </w:rPr>
-        <w:t xml:space="preserve"> (trên 38,357 giao dịch bình thường chỉ đoán nhầm đúng 1 ca), </w:t>
+        <w:t>200 Decision Trees (cây quyết định độc lập)</w:t>
+      </w:r>
+      <w:r>
+        <w:rPr>
+          <w:rFonts w:ascii="Times New Roman" w:hAnsi="Times New Roman"/>
+        </w:rPr>
+        <w:t xml:space="preserve"> theo cơ chế </w:t>
       </w:r>
       <w:r>
         <w:rPr>
           <w:rFonts w:ascii="Times New Roman" w:hAnsi="Times New Roman"/>
           <w:b/>
         </w:rPr>
-        <w:t>Recall = 99.51%</w:t>
-      </w:r>
-      <w:r>
-        <w:rPr>
-          <w:rFonts w:ascii="Times New Roman" w:hAnsi="Times New Roman"/>
-        </w:rPr>
-        <w:t xml:space="preserve">, và </w:t>
+        <w:t>Ensemble Bagging (học kết hợp đóng bao)</w:t>
+      </w:r>
+      <w:r>
+        <w:rPr>
+          <w:rFonts w:ascii="Times New Roman" w:hAnsi="Times New Roman"/>
+        </w:rPr>
+        <w:t xml:space="preserve">, phân nhánh tối ưu theo độ tinh khiết </w:t>
       </w:r>
       <w:r>
         <w:rPr>
           <w:rFonts w:ascii="Times New Roman" w:hAnsi="Times New Roman"/>
           <w:b/>
         </w:rPr>
-        <w:t>F1-Score = 0.9973</w:t>
-      </w:r>
-      <w:r>
-        <w:rPr>
-          <w:rFonts w:ascii="Times New Roman" w:hAnsi="Times New Roman"/>
-        </w:rPr>
-        <w:t>. Tuy nhiên, hạn chế của Random Forest là thời gian huấn luyện khá lâu, mất gần 20 phút.</w:t>
+        <w:t>Gini</w:t>
+      </w:r>
+      <w:r>
+        <w:rPr>
+          <w:rFonts w:ascii="Times New Roman" w:hAnsi="Times New Roman"/>
+        </w:rPr>
+        <w:t xml:space="preserve"> như công thức trên slide. Để chống </w:t>
+      </w:r>
+      <w:r>
+        <w:rPr>
+          <w:rFonts w:ascii="Times New Roman" w:hAnsi="Times New Roman"/>
+          <w:b/>
+        </w:rPr>
+        <w:t>Overfitting (học vẹt)</w:t>
+      </w:r>
+      <w:r>
+        <w:rPr>
+          <w:rFonts w:ascii="Times New Roman" w:hAnsi="Times New Roman"/>
+        </w:rPr>
+        <w:t>, mình khống chế độ sâu tối đa `max_depth = 20`.</w:t>
       </w:r>
     </w:p>
     <w:p>
@@ -4292,94 +4398,101 @@
         <w:rPr>
           <w:rFonts w:ascii="Times New Roman" w:hAnsi="Times New Roman"/>
         </w:rPr>
-        <w:t xml:space="preserve">Để giải quyết bài toán tốc độ, phần tiếp theo sẽ do bạn </w:t>
+        <w:t xml:space="preserve">🎯 </w:t>
       </w:r>
       <w:r>
         <w:rPr>
           <w:rFonts w:ascii="Times New Roman" w:hAnsi="Times New Roman"/>
           <w:b/>
         </w:rPr>
-        <w:t>Bùi Thị Mỷ Cẩm</w:t>
-      </w:r>
-      <w:r>
-        <w:rPr>
-          <w:rFonts w:ascii="Times New Roman" w:hAnsi="Times New Roman"/>
-        </w:rPr>
-        <w:t xml:space="preserve"> trình bày về mô hình XGBoost.</w:t>
+        <w:t>Kết quả thực nghiệm nổi bật:</w:t>
+      </w:r>
+      <w:r>
+        <w:rPr>
+          <w:rFonts w:ascii="Times New Roman" w:hAnsi="Times New Roman"/>
+        </w:rPr>
       </w:r>
     </w:p>
     <w:p>
-      <w:r>
-        <w:rPr>
-          <w:rFonts w:ascii="Times New Roman" w:hAnsi="Times New Roman"/>
-        </w:rPr>
-      </w:r>
-      <w:r>
-        <w:rPr>
-          <w:rFonts w:ascii="Times New Roman" w:hAnsi="Times New Roman"/>
-          <w:i/>
-        </w:rPr>
-        <w:t>(Phần 2 - XGBoost: **Bùi Thị Mỷ Cẩm** tiếp lời)</w:t>
-      </w:r>
-      <w:r>
-        <w:rPr>
-          <w:rFonts w:ascii="Times New Roman" w:hAnsi="Times New Roman"/>
-        </w:rPr>
+      <w:pPr>
+        <w:pStyle w:val="ListBullet"/>
+      </w:pPr>
+      <w:r>
+        <w:rPr>
+          <w:rFonts w:ascii="Times New Roman" w:hAnsi="Times New Roman"/>
+        </w:rPr>
+      </w:r>
+      <w:r>
+        <w:rPr>
+          <w:rFonts w:ascii="Times New Roman" w:hAnsi="Times New Roman"/>
+          <w:b/>
+        </w:rPr>
+        <w:t>Peak Precision (độ chuẩn xác đỉnh cao) đạt 99.94%:</w:t>
+      </w:r>
+      <w:r>
+        <w:rPr>
+          <w:rFonts w:ascii="Times New Roman" w:hAnsi="Times New Roman"/>
+        </w:rPr>
+        <w:t xml:space="preserve"> Trong 38.357 giao dịch hợp lệ, mô hình chỉ báo nhầm duy nhất </w:t>
+      </w:r>
+      <w:r>
+        <w:rPr>
+          <w:rFonts w:ascii="Times New Roman" w:hAnsi="Times New Roman"/>
+          <w:b/>
+        </w:rPr>
+        <w:t>đúng 1 ca</w:t>
+      </w:r>
+      <w:r>
+        <w:rPr>
+          <w:rFonts w:ascii="Times New Roman" w:hAnsi="Times New Roman"/>
+        </w:rPr>
+        <w:t>!</w:t>
       </w:r>
     </w:p>
     <w:p>
-      <w:r>
-        <w:rPr>
-          <w:rFonts w:ascii="Times New Roman" w:hAnsi="Times New Roman"/>
-        </w:rPr>
-        <w:t xml:space="preserve">Dạ em chào thầy và các bạn, em là </w:t>
+      <w:pPr>
+        <w:pStyle w:val="ListBullet"/>
+      </w:pPr>
+      <w:r>
+        <w:rPr>
+          <w:rFonts w:ascii="Times New Roman" w:hAnsi="Times New Roman"/>
+        </w:rPr>
       </w:r>
       <w:r>
         <w:rPr>
           <w:rFonts w:ascii="Times New Roman" w:hAnsi="Times New Roman"/>
           <w:b/>
         </w:rPr>
-        <w:t>Bùi Thị Mỷ Cẩm</w:t>
-      </w:r>
-      <w:r>
-        <w:rPr>
-          <w:rFonts w:ascii="Times New Roman" w:hAnsi="Times New Roman"/>
-        </w:rPr>
-        <w:t xml:space="preserve">. Em đảm nhận việc huấn luyện mô hình </w:t>
-      </w:r>
-      <w:r>
-        <w:rPr>
-          <w:rFonts w:ascii="Times New Roman" w:hAnsi="Times New Roman"/>
-          <w:b/>
-        </w:rPr>
-        <w:t>XGBoost</w:t>
-      </w:r>
-      <w:r>
-        <w:rPr>
-          <w:rFonts w:ascii="Times New Roman" w:hAnsi="Times New Roman"/>
-        </w:rPr>
-        <w:t xml:space="preserve"> ở bên phải:</w:t>
+        <w:t>F1-Score đạt 0.9973:</w:t>
+      </w:r>
+      <w:r>
+        <w:rPr>
+          <w:rFonts w:ascii="Times New Roman" w:hAnsi="Times New Roman"/>
+        </w:rPr>
+        <w:t xml:space="preserve"> Đưa Random Forest trở thành mô hình có độ chính xác cao nhất toàn đồ án.</w:t>
       </w:r>
     </w:p>
     <w:p>
-      <w:r>
-        <w:rPr>
-          <w:rFonts w:ascii="Times New Roman" w:hAnsi="Times New Roman"/>
-        </w:rPr>
-        <w:t>Về cơ chế, XGBoost tối ưu hàm mục tiêu xấp xỉ bậc 2 sử dụng cả Gradient bậc 1 ($g</w:t>
-      </w:r>
-      <w:r>
-        <w:rPr>
-          <w:rFonts w:ascii="Times New Roman" w:hAnsi="Times New Roman"/>
-          <w:i/>
-        </w:rPr>
-        <w:t>i$) và Hessian bậc 2 ($h</w:t>
-      </w:r>
-      <w:r>
-        <w:rPr>
-          <w:rFonts w:ascii="Times New Roman" w:hAnsi="Times New Roman"/>
-        </w:rPr>
-        <w:t>i$) của hàm mất mát, kết hợp số hạng điều chuẩn $\Omega(f_t)$ để kiểm soát độ sâu cây và chống Overfitting.</w:t>
+      <w:pPr>
+        <w:pStyle w:val="ListBullet"/>
+      </w:pPr>
+      <w:r>
+        <w:rPr>
+          <w:rFonts w:ascii="Times New Roman" w:hAnsi="Times New Roman"/>
+        </w:rPr>
+      </w:r>
+      <w:r>
+        <w:rPr>
+          <w:rFonts w:ascii="Times New Roman" w:hAnsi="Times New Roman"/>
+          <w:b/>
+        </w:rPr>
+        <w:t>Hạn chế:</w:t>
+      </w:r>
+      <w:r>
+        <w:rPr>
+          <w:rFonts w:ascii="Times New Roman" w:hAnsi="Times New Roman"/>
+        </w:rPr>
+        <w:t xml:space="preserve"> Thời gian huấn luyện khá lâu, mất gần 20 phút (~1187 giây).</w:t>
       </w:r>
     </w:p>
     <w:p>
@@ -4387,58 +4500,259 @@
         <w:rPr>
           <w:rFonts w:ascii="Times New Roman" w:hAnsi="Times New Roman"/>
         </w:rPr>
+        <w:t xml:space="preserve">Để giải quyết bài toán tốc độ, phần tiếp theo sẽ do bạn </w:t>
       </w:r>
       <w:r>
         <w:rPr>
           <w:rFonts w:ascii="Times New Roman" w:hAnsi="Times New Roman"/>
           <w:b/>
         </w:rPr>
-        <w:t>Ưu thế vượt trội:</w:t>
-      </w:r>
-      <w:r>
-        <w:rPr>
-          <w:rFonts w:ascii="Times New Roman" w:hAnsi="Times New Roman"/>
-        </w:rPr>
-        <w:t xml:space="preserve"> XGBoost đạt </w:t>
+        <w:t>Bùi Thị Mỷ Cẩm</w:t>
+      </w:r>
+      <w:r>
+        <w:rPr>
+          <w:rFonts w:ascii="Times New Roman" w:hAnsi="Times New Roman"/>
+        </w:rPr>
+        <w:t xml:space="preserve"> trình bày về mô hình XGBoost.</w:t>
+      </w:r>
+    </w:p>
+    <w:p>
+      <w:r>
+        <w:rPr>
+          <w:rFonts w:ascii="Times New Roman" w:hAnsi="Times New Roman"/>
+        </w:rPr>
+      </w:r>
+      <w:r>
+        <w:rPr>
+          <w:rFonts w:ascii="Times New Roman" w:hAnsi="Times New Roman"/>
+          <w:i/>
+        </w:rPr>
+        <w:t>(Phần 2 - XGBoost: **Bùi Thị Mỷ Cẩm** tiếp lời)</w:t>
+      </w:r>
+      <w:r>
+        <w:rPr>
+          <w:rFonts w:ascii="Times New Roman" w:hAnsi="Times New Roman"/>
+        </w:rPr>
+      </w:r>
+    </w:p>
+    <w:p>
+      <w:r>
+        <w:rPr>
+          <w:rFonts w:ascii="Times New Roman" w:hAnsi="Times New Roman"/>
+        </w:rPr>
+      </w:r>
+      <w:r>
+        <w:rPr>
+          <w:rFonts w:ascii="Times New Roman" w:hAnsi="Times New Roman"/>
+          <w:i/>
+        </w:rPr>
+        <w:t>(Anh Sơn vừa nói xong: Random Forest rất chính xác nhưng train mất gần 20 phút)</w:t>
+      </w:r>
+      <w:r>
+        <w:rPr>
+          <w:rFonts w:ascii="Times New Roman" w:hAnsi="Times New Roman"/>
+        </w:rPr>
+      </w:r>
+    </w:p>
+    <w:p>
+      <w:r>
+        <w:rPr>
+          <w:rFonts w:ascii="Times New Roman" w:hAnsi="Times New Roman"/>
+        </w:rPr>
+        <w:t xml:space="preserve">Dạ em cảm ơn anh Sơn. Em chào thầy và các bạn, em là Cẩm, em phụ trách mô hình </w:t>
       </w:r>
       <w:r>
         <w:rPr>
           <w:rFonts w:ascii="Times New Roman" w:hAnsi="Times New Roman"/>
           <w:b/>
         </w:rPr>
-        <w:t>F1-Score = 99.63%</w:t>
-      </w:r>
-      <w:r>
-        <w:rPr>
-          <w:rFonts w:ascii="Times New Roman" w:hAnsi="Times New Roman"/>
-        </w:rPr>
-        <w:t xml:space="preserve">, tương đương Random Forest, nhưng </w:t>
+        <w:t>XGBoost</w:t>
+      </w:r>
+      <w:r>
+        <w:rPr>
+          <w:rFonts w:ascii="Times New Roman" w:hAnsi="Times New Roman"/>
+        </w:rPr>
+        <w:t xml:space="preserve"> và </w:t>
       </w:r>
       <w:r>
         <w:rPr>
           <w:rFonts w:ascii="Times New Roman" w:hAnsi="Times New Roman"/>
           <w:b/>
         </w:rPr>
-        <w:t>thời gian huấn luyện nhanh gấp 28.5 lần — chỉ mất 41.7 giây!</w:t>
-      </w:r>
-      <w:r>
-        <w:rPr>
-          <w:rFonts w:ascii="Times New Roman" w:hAnsi="Times New Roman"/>
-        </w:rPr>
-        <w:t xml:space="preserve"> Độ trễ suy luận cho mỗi giao dịch chỉ dưới </w:t>
+        <w:t>Deep Autoencoder</w:t>
+      </w:r>
+      <w:r>
+        <w:rPr>
+          <w:rFonts w:ascii="Times New Roman" w:hAnsi="Times New Roman"/>
+        </w:rPr>
+        <w:t>.</w:t>
+      </w:r>
+    </w:p>
+    <w:p>
+      <w:r>
+        <w:rPr>
+          <w:rFonts w:ascii="Times New Roman" w:hAnsi="Times New Roman"/>
+        </w:rPr>
+        <w:t>Như anh Sơn vừa trình bày thì Random Forest rất chính xác nhưng train khá lâu. XGBoost ở khung bên phải là hướng tiếp cận nhanh hơn cho cùng bài toán.</w:t>
+      </w:r>
+    </w:p>
+    <w:p>
+      <w:r>
+        <w:rPr>
+          <w:rFonts w:ascii="Times New Roman" w:hAnsi="Times New Roman"/>
+        </w:rPr>
+        <w:t xml:space="preserve">Thầy và các bạn có thể hình dung thế này: Random Forest là hàng trăm cây </w:t>
+      </w:r>
+      <w:r>
+        <w:rPr>
+          <w:rFonts w:ascii="Times New Roman" w:hAnsi="Times New Roman"/>
+          <w:i/>
+        </w:rPr>
+        <w:t>làm độc lập</w:t>
+      </w:r>
+      <w:r>
+        <w:rPr>
+          <w:rFonts w:ascii="Times New Roman" w:hAnsi="Times New Roman"/>
+        </w:rPr>
+        <w:t xml:space="preserve"> rồi bỏ phiếu. Còn XGBoost thuộc họ Gradient Boosting (tăng cường theo độ dốc), các cây được xây </w:t>
+      </w:r>
+      <w:r>
+        <w:rPr>
+          <w:rFonts w:ascii="Times New Roman" w:hAnsi="Times New Roman"/>
+          <w:i/>
+        </w:rPr>
+        <w:t>nối tiếp</w:t>
+      </w:r>
+      <w:r>
+        <w:rPr>
+          <w:rFonts w:ascii="Times New Roman" w:hAnsi="Times New Roman"/>
+        </w:rPr>
+        <w:t xml:space="preserve"> nhau — cây sau sinh ra để sửa đúng những chỗ cây trước làm sai. Để biết sửa theo hướng nào, XGBoost dùng cả gradient (đạo hàm bậc một) lẫn Hessian (đạo hàm bậc hai) — nói đơn giản là nó không chỉ biết hướng đi mà còn biết độ cong của địa hình, nên mỗi bước sửa vừa chuẩn vừa nhanh. </w:t>
+      </w:r>
+      <w:r>
+        <w:rPr>
+          <w:rFonts w:ascii="Times New Roman" w:hAnsi="Times New Roman"/>
+          <w:i/>
+        </w:rPr>
+        <w:t>(chỉ vào công thức)</w:t>
+      </w:r>
+      <w:r>
+        <w:rPr>
+          <w:rFonts w:ascii="Times New Roman" w:hAnsi="Times New Roman"/>
+        </w:rPr>
+        <w:t xml:space="preserve"> Còn công thức phạt này là </w:t>
       </w:r>
       <w:r>
         <w:rPr>
           <w:rFonts w:ascii="Times New Roman" w:hAnsi="Times New Roman"/>
           <w:b/>
         </w:rPr>
-        <w:t>0.5 mili-giây</w:t>
-      </w:r>
-      <w:r>
-        <w:rPr>
-          <w:rFonts w:ascii="Times New Roman" w:hAnsi="Times New Roman"/>
-        </w:rPr>
-        <w:t>, cực kỳ lý tưởng để triển khai vào các cổng thanh toán xử lý thời gian thực.</w:t>
+        <w:t>L2 regularization</w:t>
+      </w:r>
+      <w:r>
+        <w:rPr>
+          <w:rFonts w:ascii="Times New Roman" w:hAnsi="Times New Roman"/>
+        </w:rPr>
+        <w:t xml:space="preserve"> (điều chuẩn L2) cộng với phạt số lá, giữ cho cây không quá phức tạp để tránh </w:t>
+      </w:r>
+      <w:r>
+        <w:rPr>
+          <w:rFonts w:ascii="Times New Roman" w:hAnsi="Times New Roman"/>
+          <w:b/>
+        </w:rPr>
+        <w:t>Overfitting</w:t>
+      </w:r>
+      <w:r>
+        <w:rPr>
+          <w:rFonts w:ascii="Times New Roman" w:hAnsi="Times New Roman"/>
+        </w:rPr>
+        <w:t xml:space="preserve"> (học vẹt).</w:t>
+      </w:r>
+    </w:p>
+    <w:p>
+      <w:r>
+        <w:rPr>
+          <w:rFonts w:ascii="Times New Roman" w:hAnsi="Times New Roman"/>
+        </w:rPr>
+        <w:t xml:space="preserve">Kết quả là </w:t>
+      </w:r>
+      <w:r>
+        <w:rPr>
+          <w:rFonts w:ascii="Times New Roman" w:hAnsi="Times New Roman"/>
+          <w:b/>
+        </w:rPr>
+        <w:t>F1-Score 99.63%</w:t>
+      </w:r>
+      <w:r>
+        <w:rPr>
+          <w:rFonts w:ascii="Times New Roman" w:hAnsi="Times New Roman"/>
+        </w:rPr>
+        <w:t xml:space="preserve"> — ngang ngửa Random Forest — nhưng thời gian huấn luyện </w:t>
+      </w:r>
+      <w:r>
+        <w:rPr>
+          <w:rFonts w:ascii="Times New Roman" w:hAnsi="Times New Roman"/>
+          <w:b/>
+        </w:rPr>
+        <w:t>chưa tới một phút</w:t>
+      </w:r>
+      <w:r>
+        <w:rPr>
+          <w:rFonts w:ascii="Times New Roman" w:hAnsi="Times New Roman"/>
+        </w:rPr>
+        <w:t xml:space="preserve">, trong khi Random Forest mất gần 20 phút, tức là nhanh hơn </w:t>
+      </w:r>
+      <w:r>
+        <w:rPr>
+          <w:rFonts w:ascii="Times New Roman" w:hAnsi="Times New Roman"/>
+          <w:b/>
+        </w:rPr>
+        <w:t>hơn 20 lần</w:t>
+      </w:r>
+      <w:r>
+        <w:rPr>
+          <w:rFonts w:ascii="Times New Roman" w:hAnsi="Times New Roman"/>
+        </w:rPr>
+        <w:t xml:space="preserve">. Và </w:t>
+      </w:r>
+      <w:r>
+        <w:rPr>
+          <w:rFonts w:ascii="Times New Roman" w:hAnsi="Times New Roman"/>
+          <w:b/>
+        </w:rPr>
+        <w:t>inference latency</w:t>
+      </w:r>
+      <w:r>
+        <w:rPr>
+          <w:rFonts w:ascii="Times New Roman" w:hAnsi="Times New Roman"/>
+        </w:rPr>
+        <w:t xml:space="preserve"> (độ trễ suy luận) chỉ cỡ </w:t>
+      </w:r>
+      <w:r>
+        <w:rPr>
+          <w:rFonts w:ascii="Times New Roman" w:hAnsi="Times New Roman"/>
+          <w:b/>
+        </w:rPr>
+        <w:t>nửa mili-giây</w:t>
+      </w:r>
+      <w:r>
+        <w:rPr>
+          <w:rFonts w:ascii="Times New Roman" w:hAnsi="Times New Roman"/>
+        </w:rPr>
+        <w:t xml:space="preserve"> cho một giao dịch, rất hợp với cổng thanh toán </w:t>
+      </w:r>
+      <w:r>
+        <w:rPr>
+          <w:rFonts w:ascii="Times New Roman" w:hAnsi="Times New Roman"/>
+          <w:b/>
+        </w:rPr>
+        <w:t>real-time</w:t>
+      </w:r>
+      <w:r>
+        <w:rPr>
+          <w:rFonts w:ascii="Times New Roman" w:hAnsi="Times New Roman"/>
+        </w:rPr>
+        <w:t xml:space="preserve"> (thời gian thực). Vì vậy XGBoost là mô hình mà phần demo phía sau dùng để chấm điểm trực tiếp ạ.</w:t>
       </w:r>
     </w:p>
     <w:p>
@@ -4471,7 +4785,7 @@
           <w:rFonts w:ascii="Times New Roman" w:hAnsi="Times New Roman"/>
           <w:i/>
         </w:rPr>
-        <w:t>(Thời lượng chuẩn hóa: **~105s – 110s** [Meeting thực tế: ~85s] | Người nói: **Bùi Thị Mỷ Cẩm** - Modeling XGB &amp; Autoencoder Lead)</w:t>
+        <w:t>(Thời lượng chuẩn hóa: **~181s** [409 từ ÷ 135.5 WPM] [Meeting thực tế: ~85s] | Người nói: **Bùi Thị Mỷ Cẩm** - Modeling XGB &amp; Autoencoder Lead)</w:t>
       </w:r>
       <w:r>
         <w:rPr>
@@ -4484,7 +4798,18 @@
         <w:rPr>
           <w:rFonts w:ascii="Times New Roman" w:hAnsi="Times New Roman"/>
         </w:rPr>
-        <w:t>Em đặt ra một câu hỏi: *"Nếu kẻ gian dùng một hình thức lừa đảo hoàn toàn mới, chưa từng có nhãn trong quá khứ thì mô hình có giám sát có còn phát hiện được không?"*</w:t>
+      </w:r>
+      <w:r>
+        <w:rPr>
+          <w:rFonts w:ascii="Times New Roman" w:hAnsi="Times New Roman"/>
+          <w:i/>
+        </w:rPr>
+        <w:t>(Dừng một nhịp, đổi giọng sang đặt vấn đề.)</w:t>
+      </w:r>
+      <w:r>
+        <w:rPr>
+          <w:rFonts w:ascii="Times New Roman" w:hAnsi="Times New Roman"/>
+        </w:rPr>
       </w:r>
     </w:p>
     <w:p>
@@ -4492,20 +4817,33 @@
         <w:rPr>
           <w:rFonts w:ascii="Times New Roman" w:hAnsi="Times New Roman"/>
         </w:rPr>
-        <w:t xml:space="preserve">Để trả lời, em xây dựng thêm mô hình không giám sát </w:t>
+        <w:t xml:space="preserve">Nhưng cả Random Forest và XGBoost có một điểm chung: đều là Supervised Learning (học có giám sát) — nghĩa là phải có </w:t>
       </w:r>
       <w:r>
         <w:rPr>
           <w:rFonts w:ascii="Times New Roman" w:hAnsi="Times New Roman"/>
           <w:b/>
         </w:rPr>
-        <w:t>Deep Autoencoder</w:t>
-      </w:r>
-      <w:r>
-        <w:rPr>
-          <w:rFonts w:ascii="Times New Roman" w:hAnsi="Times New Roman"/>
-        </w:rPr>
-        <w:t>:</w:t>
+        <w:t>nhãn</w:t>
+      </w:r>
+      <w:r>
+        <w:rPr>
+          <w:rFonts w:ascii="Times New Roman" w:hAnsi="Times New Roman"/>
+        </w:rPr>
+        <w:t xml:space="preserve">. Chúng chỉ giỏi bắt những kiểu gian lận mà đã từng được nhìn thấy. Vậy </w:t>
+      </w:r>
+      <w:r>
+        <w:rPr>
+          <w:rFonts w:ascii="Times New Roman" w:hAnsi="Times New Roman"/>
+          <w:i/>
+        </w:rPr>
+        <w:t>nếu kẻ gian nghĩ ra một chiêu hoàn toàn mới, chưa có nhãn nào</w:t>
+      </w:r>
+      <w:r>
+        <w:rPr>
+          <w:rFonts w:ascii="Times New Roman" w:hAnsi="Times New Roman"/>
+        </w:rPr>
+        <w:t xml:space="preserve"> thì sao?</w:t>
       </w:r>
     </w:p>
     <w:p>
@@ -4513,7 +4851,33 @@
         <w:rPr>
           <w:rFonts w:ascii="Times New Roman" w:hAnsi="Times New Roman"/>
         </w:rPr>
-        <w:t>Kiến trúc mạng đối xứng gồm: 14 chiều đầu vào ➔ qua 2 tầng nén 16 và 8 chiều ➔ nút cổ chai Bottleneck 4 chiều ➔ giải mã qua 8 và 16 chiều ➔ và tái tạo lại 14 chiều đầu ra.</w:t>
+        <w:t xml:space="preserve">Để bổ sung cho trường hợp đó, em xây thêm </w:t>
+      </w:r>
+      <w:r>
+        <w:rPr>
+          <w:rFonts w:ascii="Times New Roman" w:hAnsi="Times New Roman"/>
+          <w:b/>
+        </w:rPr>
+        <w:t>Deep Autoencoder</w:t>
+      </w:r>
+      <w:r>
+        <w:rPr>
+          <w:rFonts w:ascii="Times New Roman" w:hAnsi="Times New Roman"/>
+        </w:rPr>
+        <w:t xml:space="preserve"> (mạng tự mã hóa sâu), học theo hướng </w:t>
+      </w:r>
+      <w:r>
+        <w:rPr>
+          <w:rFonts w:ascii="Times New Roman" w:hAnsi="Times New Roman"/>
+          <w:b/>
+        </w:rPr>
+        <w:t>Unsupervised</w:t>
+      </w:r>
+      <w:r>
+        <w:rPr>
+          <w:rFonts w:ascii="Times New Roman" w:hAnsi="Times New Roman"/>
+        </w:rPr>
+        <w:t xml:space="preserve"> (không giám sát).</w:t>
       </w:r>
     </w:p>
     <w:p>
@@ -4521,20 +4885,87 @@
         <w:rPr>
           <w:rFonts w:ascii="Times New Roman" w:hAnsi="Times New Roman"/>
         </w:rPr>
-        <w:t xml:space="preserve">Nguyên lý phát hiện gồm </w:t>
+        <w:t>Ý tưởng rất đời thường: giống một nhân viên kế toán làm việc nhiều năm chỉ với hóa đơn hợp lệ — chưa cần ai dạy "hóa đơn giả trông thế nào", nhưng cứ đưa một tờ bất thường là họ thấy "sai sai" ngay.</w:t>
+      </w:r>
+    </w:p>
+    <w:p>
+      <w:r>
+        <w:rPr>
+          <w:rFonts w:ascii="Times New Roman" w:hAnsi="Times New Roman"/>
+        </w:rPr>
+      </w:r>
+      <w:r>
+        <w:rPr>
+          <w:rFonts w:ascii="Times New Roman" w:hAnsi="Times New Roman"/>
+          <w:i/>
+        </w:rPr>
+        <w:t>(chỉ vào sơ đồ mạng ở đầu slide)</w:t>
+      </w:r>
+      <w:r>
+        <w:rPr>
+          <w:rFonts w:ascii="Times New Roman" w:hAnsi="Times New Roman"/>
+        </w:rPr>
+        <w:t xml:space="preserve"> Về kiến trúc: mạng nhận vào vector 14 chiều, phần </w:t>
       </w:r>
       <w:r>
         <w:rPr>
           <w:rFonts w:ascii="Times New Roman" w:hAnsi="Times New Roman"/>
           <w:b/>
         </w:rPr>
-        <w:t>3 giai đoạn</w:t>
-      </w:r>
-      <w:r>
-        <w:rPr>
-          <w:rFonts w:ascii="Times New Roman" w:hAnsi="Times New Roman"/>
-        </w:rPr>
-        <w:t>:</w:t>
+        <w:t>encoder</w:t>
+      </w:r>
+      <w:r>
+        <w:rPr>
+          <w:rFonts w:ascii="Times New Roman" w:hAnsi="Times New Roman"/>
+        </w:rPr>
+        <w:t xml:space="preserve"> (bộ mã hóa) nén dần qua các lớp 16, rồi 8, xuống </w:t>
+      </w:r>
+      <w:r>
+        <w:rPr>
+          <w:rFonts w:ascii="Times New Roman" w:hAnsi="Times New Roman"/>
+          <w:b/>
+        </w:rPr>
+        <w:t>bottleneck</w:t>
+      </w:r>
+      <w:r>
+        <w:rPr>
+          <w:rFonts w:ascii="Times New Roman" w:hAnsi="Times New Roman"/>
+        </w:rPr>
+        <w:t xml:space="preserve"> (nút cổ chai) chỉ còn 4 chiều; sau đó phần </w:t>
+      </w:r>
+      <w:r>
+        <w:rPr>
+          <w:rFonts w:ascii="Times New Roman" w:hAnsi="Times New Roman"/>
+          <w:b/>
+        </w:rPr>
+        <w:t>decoder</w:t>
+      </w:r>
+      <w:r>
+        <w:rPr>
+          <w:rFonts w:ascii="Times New Roman" w:hAnsi="Times New Roman"/>
+        </w:rPr>
+        <w:t xml:space="preserve"> (bộ giải mã) giãn ngược lại 8, 16 và về 14 chiều. Vì nút cổ chai quá hẹp, mạng không thể học vẹt — nó buộc phải giữ lại cái </w:t>
+      </w:r>
+      <w:r>
+        <w:rPr>
+          <w:rFonts w:ascii="Times New Roman" w:hAnsi="Times New Roman"/>
+          <w:i/>
+        </w:rPr>
+        <w:t>cốt lõi</w:t>
+      </w:r>
+      <w:r>
+        <w:rPr>
+          <w:rFonts w:ascii="Times New Roman" w:hAnsi="Times New Roman"/>
+        </w:rPr>
+        <w:t xml:space="preserve"> của giao dịch.</w:t>
+      </w:r>
+    </w:p>
+    <w:p>
+      <w:r>
+        <w:rPr>
+          <w:rFonts w:ascii="Times New Roman" w:hAnsi="Times New Roman"/>
+        </w:rPr>
+        <w:t>Nguyên lý chạy qua 3 giai đoạn:</w:t>
       </w:r>
     </w:p>
     <w:p>
@@ -4551,26 +4982,26 @@
           <w:rFonts w:ascii="Times New Roman" w:hAnsi="Times New Roman"/>
           <w:b/>
         </w:rPr>
-        <w:t>Giai đoạn 1 - Học chuẩn</w:t>
-      </w:r>
-      <w:r>
-        <w:rPr>
-          <w:rFonts w:ascii="Times New Roman" w:hAnsi="Times New Roman"/>
-        </w:rPr>
-        <w:t xml:space="preserve">: Mạng </w:t>
+        <w:t>Một, học chuẩn</w:t>
+      </w:r>
+      <w:r>
+        <w:rPr>
+          <w:rFonts w:ascii="Times New Roman" w:hAnsi="Times New Roman"/>
+        </w:rPr>
+        <w:t xml:space="preserve">: mạng _chỉ_ được huấn luyện trên giao dịch </w:t>
       </w:r>
       <w:r>
         <w:rPr>
           <w:rFonts w:ascii="Times New Roman" w:hAnsi="Times New Roman"/>
           <w:b/>
         </w:rPr>
-        <w:t>chỉ huấn luyện trên giao dịch hợp lệ</w:t>
-      </w:r>
-      <w:r>
-        <w:rPr>
-          <w:rFonts w:ascii="Times New Roman" w:hAnsi="Times New Roman"/>
-        </w:rPr>
-        <w:t>, học cách nén và tái tạo cấu trúc luồng tiền bình thường.</w:t>
+        <w:t>hợp lệ</w:t>
+      </w:r>
+      <w:r>
+        <w:rPr>
+          <w:rFonts w:ascii="Times New Roman" w:hAnsi="Times New Roman"/>
+        </w:rPr>
+        <w:t>, không dùng nhãn gian lận. Nó học "dòng tiền bình thường trông như thế nào".</w:t>
       </w:r>
     </w:p>
     <w:p>
@@ -4587,13 +5018,39 @@
           <w:rFonts w:ascii="Times New Roman" w:hAnsi="Times New Roman"/>
           <w:b/>
         </w:rPr>
-        <w:t>Giai đoạn 2 - Bắt lỗi</w:t>
-      </w:r>
-      <w:r>
-        <w:rPr>
-          <w:rFonts w:ascii="Times New Roman" w:hAnsi="Times New Roman"/>
-        </w:rPr>
-        <w:t>: Khi gặp giao dịch gian lận bất thường, mạng không thể tái tạo chính xác, khiến sai số tái tạo MSE ($L_{\text{rec}}$) tăng vọt.</w:t>
+        <w:t>Hai, bắt lỗi</w:t>
+      </w:r>
+      <w:r>
+        <w:rPr>
+          <w:rFonts w:ascii="Times New Roman" w:hAnsi="Times New Roman"/>
+        </w:rPr>
+        <w:t xml:space="preserve">: khi gặp giao dịch gian lận, cấu trúc dòng tiền lạ so với những gì nó đã học, nên nó tái tạo rất tệ — </w:t>
+      </w:r>
+      <w:r>
+        <w:rPr>
+          <w:rFonts w:ascii="Times New Roman" w:hAnsi="Times New Roman"/>
+          <w:b/>
+        </w:rPr>
+        <w:t>reconstruction error</w:t>
+      </w:r>
+      <w:r>
+        <w:rPr>
+          <w:rFonts w:ascii="Times New Roman" w:hAnsi="Times New Roman"/>
+        </w:rPr>
+        <w:t xml:space="preserve"> (sai số tái tạo), đo bằng </w:t>
+      </w:r>
+      <w:r>
+        <w:rPr>
+          <w:rFonts w:ascii="Times New Roman" w:hAnsi="Times New Roman"/>
+          <w:b/>
+        </w:rPr>
+        <w:t>MSE</w:t>
+      </w:r>
+      <w:r>
+        <w:rPr>
+          <w:rFonts w:ascii="Times New Roman" w:hAnsi="Times New Roman"/>
+        </w:rPr>
+        <w:t>, tăng vọt.</w:t>
       </w:r>
     </w:p>
     <w:p>
@@ -4610,13 +5067,26 @@
           <w:rFonts w:ascii="Times New Roman" w:hAnsi="Times New Roman"/>
           <w:b/>
         </w:rPr>
-        <w:t>Giai đoạn 3 - Ra quyết định</w:t>
-      </w:r>
-      <w:r>
-        <w:rPr>
-          <w:rFonts w:ascii="Times New Roman" w:hAnsi="Times New Roman"/>
-        </w:rPr>
-        <w:t>: Hệ thống gắn cờ gian lận nếu sai số vượt ngưỡng $\tau = 0.0455$ (tương ứng phân vị thứ 95).</w:t>
+        <w:t>Ba, ra quyết định</w:t>
+      </w:r>
+      <w:r>
+        <w:rPr>
+          <w:rFonts w:ascii="Times New Roman" w:hAnsi="Times New Roman"/>
+        </w:rPr>
+        <w:t xml:space="preserve">: sai số vượt </w:t>
+      </w:r>
+      <w:r>
+        <w:rPr>
+          <w:rFonts w:ascii="Times New Roman" w:hAnsi="Times New Roman"/>
+          <w:b/>
+        </w:rPr>
+        <w:t>ngưỡng τ = 0.0455</w:t>
+      </w:r>
+      <w:r>
+        <w:rPr>
+          <w:rFonts w:ascii="Times New Roman" w:hAnsi="Times New Roman"/>
+        </w:rPr>
+        <w:t xml:space="preserve"> thì hệ thống gắn cờ cảnh báo.</w:t>
       </w:r>
     </w:p>
     <w:p>
@@ -4624,54 +5094,65 @@
         <w:rPr>
           <w:rFonts w:ascii="Times New Roman" w:hAnsi="Times New Roman"/>
         </w:rPr>
-        <w:t xml:space="preserve">Nhờ vậy, dù </w:t>
+        <w:t xml:space="preserve">Kết quả trên tập Test: dù trong lúc huấn luyện mạng không hề biết nhãn gian lận, Autoencoder vẫn bắt được </w:t>
       </w:r>
       <w:r>
         <w:rPr>
           <w:rFonts w:ascii="Times New Roman" w:hAnsi="Times New Roman"/>
           <w:b/>
         </w:rPr>
-        <w:t>không dùng nhãn gian lận khi huấn luyện mạng</w:t>
-      </w:r>
-      <w:r>
-        <w:rPr>
-          <w:rFonts w:ascii="Times New Roman" w:hAnsi="Times New Roman"/>
-        </w:rPr>
-        <w:t xml:space="preserve">, Autoencoder vẫn đạt </w:t>
+        <w:t>75.23% Recall</w:t>
+      </w:r>
+      <w:r>
+        <w:rPr>
+          <w:rFonts w:ascii="Times New Roman" w:hAnsi="Times New Roman"/>
+        </w:rPr>
+        <w:t xml:space="preserve"> — tức 1,236 trên 1,643 vụ gian lận. Em đặt nó ở vai trò </w:t>
       </w:r>
       <w:r>
         <w:rPr>
           <w:rFonts w:ascii="Times New Roman" w:hAnsi="Times New Roman"/>
           <w:b/>
         </w:rPr>
-        <w:t>Recall = 75.23% trên tập Test</w:t>
-      </w:r>
-      <w:r>
-        <w:rPr>
-          <w:rFonts w:ascii="Times New Roman" w:hAnsi="Times New Roman"/>
-        </w:rPr>
-        <w:t>, đóng vai trò như lớp phòng thủ thứ hai (Defense-in-Depth) phát hiện bất thường độc lập với nhãn.</w:t>
+        <w:t>Defense-in-Depth</w:t>
+      </w:r>
+      <w:r>
+        <w:rPr>
+          <w:rFonts w:ascii="Times New Roman" w:hAnsi="Times New Roman"/>
+        </w:rPr>
+        <w:t xml:space="preserve"> (phòng thủ nhiều lớp): </w:t>
+      </w:r>
+      <w:r>
+        <w:rPr>
+          <w:rFonts w:ascii="Times New Roman" w:hAnsi="Times New Roman"/>
+          <w:i/>
+        </w:rPr>
+        <w:t>không thay thế</w:t>
+      </w:r>
+      <w:r>
+        <w:rPr>
+          <w:rFonts w:ascii="Times New Roman" w:hAnsi="Times New Roman"/>
+        </w:rPr>
+        <w:t xml:space="preserve"> XGBoost, mà là lớp lưới an toàn thứ hai, chuyển các giao dịch đáng ngờ sang thẩm định chuyên sâu.</w:t>
       </w:r>
     </w:p>
     <w:p>
-      <w:r>
-        <w:rPr>
-          <w:rFonts w:ascii="Times New Roman" w:hAnsi="Times New Roman"/>
-        </w:rPr>
-        <w:t xml:space="preserve">Tiếp theo, em xin mời bạn </w:t>
-      </w:r>
-      <w:r>
-        <w:rPr>
-          <w:rFonts w:ascii="Times New Roman" w:hAnsi="Times New Roman"/>
-          <w:b/>
-        </w:rPr>
-        <w:t>Nguyễn Duy Khang</w:t>
-      </w:r>
-      <w:r>
-        <w:rPr>
-          <w:rFonts w:ascii="Times New Roman" w:hAnsi="Times New Roman"/>
-        </w:rPr>
-        <w:t xml:space="preserve"> trình bày phần Đánh giá thực nghiệm và Đối chuẩn giữa các mô hình.</w:t>
+      <w:pPr>
+        <w:pStyle w:val="ListBullet"/>
+      </w:pPr>
+      <w:r>
+        <w:rPr>
+          <w:rFonts w:ascii="Times New Roman" w:hAnsi="Times New Roman"/>
+        </w:rPr>
+        <w:t>Về nguyên lý, vì không phụ thuộc nhãn nên lớp này không bị trói vào những kiểu gian lận đã từng thấy; còn khả năng với biến thể hoàn toàn mới thì nhóm chưa kiểm thử riêng, đó là hướng phát triển ạ.</w:t>
+      </w:r>
+    </w:p>
+    <w:p>
+      <w:r>
+        <w:rPr>
+          <w:rFonts w:ascii="Times New Roman" w:hAnsi="Times New Roman"/>
+        </w:rPr>
+        <w:t>Bây giờ em xin mời bạn Khang trình bày kết quả so sánh chi tiết giữa các mô hình ạ.</w:t>
       </w:r>
     </w:p>
     <w:p>
@@ -5392,7 +5873,7 @@
           <w:rFonts w:ascii="Times New Roman" w:hAnsi="Times New Roman"/>
           <w:i/>
         </w:rPr>
-        <w:t>(Thời lượng chuẩn hóa: **~75s – 80s** [Meeting thực tế: ~104s] | Người nói: **Bùi Thị Mỷ Cẩm**)</w:t>
+        <w:t>(Thời lượng chuẩn hóa: **~180s** [407 từ ÷ 135.5 WPM] [Meeting thực tế: ~104s] | Người nói: **Bùi Thị Mỷ Cẩm**)</w:t>
       </w:r>
       <w:r>
         <w:rPr>
@@ -5405,7 +5886,20 @@
         <w:rPr>
           <w:rFonts w:ascii="Times New Roman" w:hAnsi="Times New Roman"/>
         </w:rPr>
-        <w:t>Dạ em cảm ơn bạn Khang.</w:t>
+        <w:t xml:space="preserve">Cảm ơn bạn Khang. Em xin quay lại Autoencoder một chút, vì còn một quyết định quan trọng nhất của mô hình này: </w:t>
+      </w:r>
+      <w:r>
+        <w:rPr>
+          <w:rFonts w:ascii="Times New Roman" w:hAnsi="Times New Roman"/>
+          <w:b/>
+        </w:rPr>
+        <w:t>đặt ngưỡng τ ở đâu</w:t>
+      </w:r>
+      <w:r>
+        <w:rPr>
+          <w:rFonts w:ascii="Times New Roman" w:hAnsi="Times New Roman"/>
+        </w:rPr>
+        <w:t>. Autoencoder không cho ra xác suất, nó chỉ cho một con số "độ lạ" — chính là reconstruction error — nên mình phải tự vạch một đường cắt.</w:t>
       </w:r>
     </w:p>
     <w:p>
@@ -5413,7 +5907,58 @@
         <w:rPr>
           <w:rFonts w:ascii="Times New Roman" w:hAnsi="Times New Roman"/>
         </w:rPr>
-        <w:t>Như mọi người thấy trên slide, biểu đồ bên trái thể hiện rõ sự phân tách sai số tái tạo MSE: giao dịch hợp lệ (đường màu xanh) tập trung ở vùng sai số cực thấp, dưới 0.02; trong khi giao dịch gian lận (đường màu đỏ) có sai số trải dài sang bên phải do cấu trúc luồng tiền dị biệt không thể nén qua nút thắt cổ chai.</w:t>
+      </w:r>
+      <w:r>
+        <w:rPr>
+          <w:rFonts w:ascii="Times New Roman" w:hAnsi="Times New Roman"/>
+          <w:i/>
+        </w:rPr>
+        <w:t>(chỉ biểu đồ)</w:t>
+      </w:r>
+      <w:r>
+        <w:rPr>
+          <w:rFonts w:ascii="Times New Roman" w:hAnsi="Times New Roman"/>
+        </w:rPr>
+        <w:t xml:space="preserve"> Thầy và các bạn nhìn biểu đồ bên trái: </w:t>
+      </w:r>
+      <w:r>
+        <w:rPr>
+          <w:rFonts w:ascii="Times New Roman" w:hAnsi="Times New Roman"/>
+          <w:b/>
+        </w:rPr>
+        <w:t>màu xanh</w:t>
+      </w:r>
+      <w:r>
+        <w:rPr>
+          <w:rFonts w:ascii="Times New Roman" w:hAnsi="Times New Roman"/>
+        </w:rPr>
+        <w:t xml:space="preserve"> là giao dịch bình thường, dồn hết vào vùng sai số rất thấp — hơn 90% nằm dưới 0.02. </w:t>
+      </w:r>
+      <w:r>
+        <w:rPr>
+          <w:rFonts w:ascii="Times New Roman" w:hAnsi="Times New Roman"/>
+          <w:b/>
+        </w:rPr>
+        <w:t>màu đỏ</w:t>
+      </w:r>
+      <w:r>
+        <w:rPr>
+          <w:rFonts w:ascii="Times New Roman" w:hAnsi="Times New Roman"/>
+        </w:rPr>
+        <w:t xml:space="preserve"> là giao dịch gian lận, trải dài sang bên phải, nhiều ca có sai số lớn hơn hẳn, vì dòng tiền dị biệt đó không nén qua nổi bottleneck. Nhưng hai phân bố </w:t>
+      </w:r>
+      <w:r>
+        <w:rPr>
+          <w:rFonts w:ascii="Times New Roman" w:hAnsi="Times New Roman"/>
+          <w:b/>
+        </w:rPr>
+        <w:t>không tách hoàn toàn</w:t>
+      </w:r>
+      <w:r>
+        <w:rPr>
+          <w:rFonts w:ascii="Times New Roman" w:hAnsi="Times New Roman"/>
+        </w:rPr>
+        <w:t>: vẫn có khoảng một phần tư giao dịch gian lận có sai số nằm dưới ngưỡng — đó chính là 407 ca mà Autoencoder bỏ sót. Vùng chồng lấn này buộc mình phải đánh đổi.</w:t>
       </w:r>
     </w:p>
     <w:p>
@@ -5421,121 +5966,225 @@
         <w:rPr>
           <w:rFonts w:ascii="Times New Roman" w:hAnsi="Times New Roman"/>
         </w:rPr>
-        <w:t>Bảng bên phải thể hiện việc dò ngưỡng qua các phân vị trên tập Validation:</w:t>
+      </w:r>
+      <w:r>
+        <w:rPr>
+          <w:rFonts w:ascii="Times New Roman" w:hAnsi="Times New Roman"/>
+          <w:i/>
+        </w:rPr>
+        <w:t>(chỉ bảng bên phải)</w:t>
+      </w:r>
+      <w:r>
+        <w:rPr>
+          <w:rFonts w:ascii="Times New Roman" w:hAnsi="Times New Roman"/>
+        </w:rPr>
+        <w:t xml:space="preserve"> Bảng này cho thấy sự đánh đổi đó. Ngưỡng được đặt theo </w:t>
+      </w:r>
+      <w:r>
+        <w:rPr>
+          <w:rFonts w:ascii="Times New Roman" w:hAnsi="Times New Roman"/>
+          <w:b/>
+        </w:rPr>
+        <w:t>percentile</w:t>
+      </w:r>
+      <w:r>
+        <w:rPr>
+          <w:rFonts w:ascii="Times New Roman" w:hAnsi="Times New Roman"/>
+        </w:rPr>
+        <w:t xml:space="preserve"> (phân vị) của sai số. Hạ ngưỡng xuống, ví dụ phân vị 90, thì </w:t>
+      </w:r>
+      <w:r>
+        <w:rPr>
+          <w:rFonts w:ascii="Times New Roman" w:hAnsi="Times New Roman"/>
+          <w:b/>
+        </w:rPr>
+        <w:t>Recall</w:t>
+      </w:r>
+      <w:r>
+        <w:rPr>
+          <w:rFonts w:ascii="Times New Roman" w:hAnsi="Times New Roman"/>
+        </w:rPr>
+        <w:t xml:space="preserve"> trên 80% nhưng </w:t>
+      </w:r>
+      <w:r>
+        <w:rPr>
+          <w:rFonts w:ascii="Times New Roman" w:hAnsi="Times New Roman"/>
+          <w:b/>
+        </w:rPr>
+        <w:t>Precision</w:t>
+      </w:r>
+      <w:r>
+        <w:rPr>
+          <w:rFonts w:ascii="Times New Roman" w:hAnsi="Times New Roman"/>
+        </w:rPr>
+        <w:t xml:space="preserve"> chưa tới 30% — báo nhầm rất nhiều. Kéo ngưỡng lên cao thì ngược lại: ở phân vị 99.9, Precision lên tới 91.5% nhưng Recall chỉ còn 25.4%, tức là bỏ lọt ba phần tư số vụ gian lận.</w:t>
       </w:r>
     </w:p>
     <w:p>
-      <w:pPr>
-        <w:pStyle w:val="ListBullet"/>
-      </w:pPr>
-      <w:r>
-        <w:rPr>
-          <w:rFonts w:ascii="Times New Roman" w:hAnsi="Times New Roman"/>
-        </w:rPr>
-        <w:t>Ở phân vị 90th ($\tau = 0.0134$): Recall đạt 84.8% nhưng Precision chỉ 26.6%.</w:t>
+      <w:r>
+        <w:rPr>
+          <w:rFonts w:ascii="Times New Roman" w:hAnsi="Times New Roman"/>
+        </w:rPr>
+        <w:t xml:space="preserve">Em chọn </w:t>
+      </w:r>
+      <w:r>
+        <w:rPr>
+          <w:rFonts w:ascii="Times New Roman" w:hAnsi="Times New Roman"/>
+          <w:b/>
+        </w:rPr>
+        <w:t>phân vị 95, τ = 0.0455</w:t>
+      </w:r>
+      <w:r>
+        <w:rPr>
+          <w:rFonts w:ascii="Times New Roman" w:hAnsi="Times New Roman"/>
+        </w:rPr>
+        <w:t xml:space="preserve">. Trên tập Test, ngưỡng này cho </w:t>
+      </w:r>
+      <w:r>
+        <w:rPr>
+          <w:rFonts w:ascii="Times New Roman" w:hAnsi="Times New Roman"/>
+          <w:b/>
+        </w:rPr>
+        <w:t>Recall 75.2%</w:t>
+      </w:r>
+      <w:r>
+        <w:rPr>
+          <w:rFonts w:ascii="Times New Roman" w:hAnsi="Times New Roman"/>
+        </w:rPr>
+        <w:t xml:space="preserve"> và </w:t>
+      </w:r>
+      <w:r>
+        <w:rPr>
+          <w:rFonts w:ascii="Times New Roman" w:hAnsi="Times New Roman"/>
+          <w:b/>
+        </w:rPr>
+        <w:t>Precision 38.2%</w:t>
+      </w:r>
+      <w:r>
+        <w:rPr>
+          <w:rFonts w:ascii="Times New Roman" w:hAnsi="Times New Roman"/>
+        </w:rPr>
+        <w:t xml:space="preserve">. Em ưu tiên Recall vì bạn Thanh đã nói ở phần đầu: bỏ sót một vụ gian lận đắt hơn rất nhiều so với báo nhầm. Cụ thể, em đặt ràng buộc </w:t>
+      </w:r>
+      <w:r>
+        <w:rPr>
+          <w:rFonts w:ascii="Times New Roman" w:hAnsi="Times New Roman"/>
+          <w:b/>
+        </w:rPr>
+        <w:t>Recall tối thiểu 60%</w:t>
+      </w:r>
+      <w:r>
+        <w:rPr>
+          <w:rFonts w:ascii="Times New Roman" w:hAnsi="Times New Roman"/>
+        </w:rPr>
+        <w:t xml:space="preserve">, rồi trong các ngưỡng thỏa ràng buộc đó thì phân vị 95 cho F1 cao nhất. Mà với vai trò lớp phòng thủ thứ hai, giao dịch bị gắn cờ chỉ bị chuyển sang bước xác thực thêm, ví dụ </w:t>
+      </w:r>
+      <w:r>
+        <w:rPr>
+          <w:rFonts w:ascii="Times New Roman" w:hAnsi="Times New Roman"/>
+          <w:b/>
+        </w:rPr>
+        <w:t>OTP</w:t>
+      </w:r>
+      <w:r>
+        <w:rPr>
+          <w:rFonts w:ascii="Times New Roman" w:hAnsi="Times New Roman"/>
+        </w:rPr>
+        <w:t xml:space="preserve"> hoặc chuyên viên rà soát — nên chấp nhận Precision thấp là hợp lý.</w:t>
       </w:r>
     </w:p>
     <w:p>
-      <w:pPr>
-        <w:pStyle w:val="ListBullet"/>
-      </w:pPr>
-      <w:r>
-        <w:rPr>
-          <w:rFonts w:ascii="Times New Roman" w:hAnsi="Times New Roman"/>
-        </w:rPr>
-        <w:t>Ở phân vị 99th ($\tau = 0.1240$): Precision tăng lên 66.8% nhưng Recall giảm xuống còn 47.0%.</w:t>
+      <w:r>
+        <w:rPr>
+          <w:rFonts w:ascii="Times New Roman" w:hAnsi="Times New Roman"/>
+        </w:rPr>
+        <w:t xml:space="preserve">Một điểm nữa em muốn nhấn mạnh: ngưỡng này được chọn bằng cách quét trên </w:t>
+      </w:r>
+      <w:r>
+        <w:rPr>
+          <w:rFonts w:ascii="Times New Roman" w:hAnsi="Times New Roman"/>
+          <w:b/>
+        </w:rPr>
+        <w:t>tập validation</w:t>
+      </w:r>
+      <w:r>
+        <w:rPr>
+          <w:rFonts w:ascii="Times New Roman" w:hAnsi="Times New Roman"/>
+        </w:rPr>
+        <w:t xml:space="preserve"> tách từ tập Train, hoàn toàn </w:t>
+      </w:r>
+      <w:r>
+        <w:rPr>
+          <w:rFonts w:ascii="Times New Roman" w:hAnsi="Times New Roman"/>
+          <w:i/>
+        </w:rPr>
+        <w:t>không</w:t>
+      </w:r>
+      <w:r>
+        <w:rPr>
+          <w:rFonts w:ascii="Times New Roman" w:hAnsi="Times New Roman"/>
+        </w:rPr>
+        <w:t xml:space="preserve"> chạm vào tập Test — đúng với nguyên tắc </w:t>
+      </w:r>
+      <w:r>
+        <w:rPr>
+          <w:rFonts w:ascii="Times New Roman" w:hAnsi="Times New Roman"/>
+          <w:b/>
+        </w:rPr>
+        <w:t>leak-free</w:t>
+      </w:r>
+      <w:r>
+        <w:rPr>
+          <w:rFonts w:ascii="Times New Roman" w:hAnsi="Times New Roman"/>
+        </w:rPr>
+        <w:t xml:space="preserve"> mà anh Sơn đã trình bày.</w:t>
       </w:r>
     </w:p>
     <w:p>
-      <w:pPr>
-        <w:pStyle w:val="ListBullet"/>
-      </w:pPr>
-      <w:r>
-        <w:rPr>
-          <w:rFonts w:ascii="Times New Roman" w:hAnsi="Times New Roman"/>
-        </w:rPr>
-        <w:t xml:space="preserve">Nhóm quyết định chọn </w:t>
+      <w:r>
+        <w:rPr>
+          <w:rFonts w:ascii="Times New Roman" w:hAnsi="Times New Roman"/>
+        </w:rPr>
+        <w:t xml:space="preserve">Tóm lại, Autoencoder và XGBoost không cạnh tranh nhau mà </w:t>
       </w:r>
       <w:r>
         <w:rPr>
           <w:rFonts w:ascii="Times New Roman" w:hAnsi="Times New Roman"/>
           <w:b/>
         </w:rPr>
-        <w:t>Điểm cắt tại phân vị 95th ($\tau = 0.0455$)</w:t>
-      </w:r>
-      <w:r>
-        <w:rPr>
-          <w:rFonts w:ascii="Times New Roman" w:hAnsi="Times New Roman"/>
-        </w:rPr>
-        <w:t xml:space="preserve">: đạt F1 cao nhất (0.5064) trong các ngưỡng thỏa mãn điều kiện Recall $\ge 60\%$. Trên tập Test độc lập sau đó, mô hình đạt </w:t>
+        <w:t>bổ sung</w:t>
+      </w:r>
+      <w:r>
+        <w:rPr>
+          <w:rFonts w:ascii="Times New Roman" w:hAnsi="Times New Roman"/>
+        </w:rPr>
+        <w:t xml:space="preserve"> cho nhau. Tiếp theo em xin mời bạn </w:t>
       </w:r>
       <w:r>
         <w:rPr>
           <w:rFonts w:ascii="Times New Roman" w:hAnsi="Times New Roman"/>
           <w:b/>
         </w:rPr>
-        <w:t>Recall = 75.2%</w:t>
-      </w:r>
-      <w:r>
-        <w:rPr>
-          <w:rFonts w:ascii="Times New Roman" w:hAnsi="Times New Roman"/>
-        </w:rPr>
-        <w:t xml:space="preserve"> và </w:t>
+        <w:t>Trung</w:t>
+      </w:r>
+      <w:r>
+        <w:rPr>
+          <w:rFonts w:ascii="Times New Roman" w:hAnsi="Times New Roman"/>
+        </w:rPr>
+        <w:t xml:space="preserve"> và bạn </w:t>
       </w:r>
       <w:r>
         <w:rPr>
           <w:rFonts w:ascii="Times New Roman" w:hAnsi="Times New Roman"/>
           <w:b/>
         </w:rPr>
-        <w:t>Precision = 38.2%</w:t>
-      </w:r>
-      <w:r>
-        <w:rPr>
-          <w:rFonts w:ascii="Times New Roman" w:hAnsi="Times New Roman"/>
-        </w:rPr>
-        <w:t xml:space="preserve"> (F1 = 50.69%).</w:t>
-      </w:r>
-    </w:p>
-    <w:p>
-      <w:r>
-        <w:rPr>
-          <w:rFonts w:ascii="Times New Roman" w:hAnsi="Times New Roman"/>
-        </w:rPr>
-        <w:t>Đây là chốt chặn phòng thủ thứ hai vững chắc: nếu mô hình có giám sát bị qua mặt bởi hình thức bất thường, Autoencoder sẽ lập tức kích hoạt báo động chuyển giao dịch sang thẩm định chuyên sâu mà không phụ thuộc vào việc có nhãn hay chưa.</w:t>
-      </w:r>
-    </w:p>
-    <w:p>
-      <w:r>
-        <w:rPr>
-          <w:rFonts w:ascii="Times New Roman" w:hAnsi="Times New Roman"/>
-        </w:rPr>
-        <w:t xml:space="preserve">Tiếp theo, em xin mời anh </w:t>
-      </w:r>
-      <w:r>
-        <w:rPr>
-          <w:rFonts w:ascii="Times New Roman" w:hAnsi="Times New Roman"/>
-          <w:b/>
-        </w:rPr>
-        <w:t>Vũ Văn Duy</w:t>
-      </w:r>
-      <w:r>
-        <w:rPr>
-          <w:rFonts w:ascii="Times New Roman" w:hAnsi="Times New Roman"/>
-        </w:rPr>
-        <w:t xml:space="preserve"> và bạn </w:t>
-      </w:r>
-      <w:r>
-        <w:rPr>
-          <w:rFonts w:ascii="Times New Roman" w:hAnsi="Times New Roman"/>
-          <w:b/>
-        </w:rPr>
-        <w:t>Phạm Thành Trung</w:t>
-      </w:r>
-      <w:r>
-        <w:rPr>
-          <w:rFonts w:ascii="Times New Roman" w:hAnsi="Times New Roman"/>
-        </w:rPr>
-        <w:t xml:space="preserve"> trình bày hệ thống Demo Streamlit và các kịch bản kiểm thử ạ.</w:t>
+        <w:t>Duy</w:t>
+      </w:r>
+      <w:r>
+        <w:rPr>
+          <w:rFonts w:ascii="Times New Roman" w:hAnsi="Times New Roman"/>
+        </w:rPr>
+        <w:t xml:space="preserve"> trình diễn phần Demo ạ. Em xin cảm ơn.</w:t>
       </w:r>
     </w:p>
     <w:p>
@@ -6579,7 +7228,7 @@
           <w:i/>
           <w:color w:val="444444"/>
         </w:rPr>
-        <w:t>"Dạ thưa thầy, về chất lượng phân loại thì 2 mô hình tương đương nhau (F1 chênh lệch không đáng kể: 99.73% so với 99.63%, chỉ lệch 3 ca đoán nhầm trên 40,000 mẫu). Nhưng Random Forest mất gần 20 phút để huấn luyện và file model rất nặng (~32MB). Trong khi đó, XGBoost chỉ mất khoảng 42s–58s để huấn luyện (nhanh gấp hơn 20 lần), file model native JSON chỉ 410KB, và độ trễ suy luận cho 1 giao dịch chỉ dưới 0.5 mili-giây. Với các hệ thống cổng thanh toán trực tuyến cần xử lý hàng chục ngàn giao dịch mỗi giây thì XGBoost là lựa chọn tối ưu vượt trội để triển khai production ạ."</w:t>
+        <w:t>"Dạ thưa thầy, về chất lượng phân loại thì 2 mô hình tương đương nhau (F1 99.73% so với 99.63%, chỉ chênh 3 ca đoán nhầm trên 40,000 mẫu). Nhưng Random Forest mất gần 20 phút để huấn luyện, còn XGBoost chưa tới một phút, nhanh hơn hơn 20 lần, và độ trễ suy luận cỡ nửa mili-giây cho một giao dịch. Với cổng thanh toán cần xử lý thời gian thực thì XGBoost là lựa chọn phù hợp để triển khai, và cũng là mô hình mà phần demo dùng để chấm điểm trực tiếp ạ."</w:t>
       </w:r>
     </w:p>
     <w:p>
@@ -6684,7 +7333,7 @@
           <w:i/>
           <w:color w:val="444444"/>
         </w:rPr>
-        <w:t>"Dạ thưa thầy, Deep Autoencoder đóng vai trò là màng bọc an toàn thứ hai (Defense-in-Depth) chứ không thay thế mô hình có giám sát. Mô hình có giám sát chỉ bắt được các thủ đoạn gian lận cũ đã có nhãn. Còn Autoencoder học 'thế nào là bình thường', nên bất kỳ chiêu trò Zero-Day mới nào làm sai lệch dòng tiền đều bị nó phát hiện qua sai số tái tạo tăng vọt.</w:t>
+        <w:t>"Dạ thưa thầy, Deep Autoencoder đóng vai trò lớp phòng thủ thứ hai (Defense-in-Depth), không thay thế XGBoost. Precision 38.2% là do em chủ động đặt ngưỡng ở phân vị 95 với ràng buộc Recall tối thiểu 60%, để ưu tiên bắt được nhiều vụ gian lận (Recall 75.2%) vì bỏ sót một vụ gian lận đắt hơn nhiều so với báo nhầm.</w:t>
       </w:r>
     </w:p>
     <w:p>
@@ -6697,7 +7346,7 @@
           <w:i/>
           <w:color w:val="444444"/>
         </w:rPr>
-        <w:t>Tỷ lệ Precision 38.2% là do em chủ động hạ ngưỡng cắt xuống phân vị thứ 95 (tau = 0.0455) để ưu tiên đẩy Recall lên 75.2%, đúng với triết lý 'thà cảnh báo nhầm còn hơn bỏ sót'. Khoảng 5% giao dịch bị nghi ngờ này hệ thống ngân hàng chỉ cần gửi một mã OTP bổ sung yêu cầu khách hàng xác nhận là giải quyết được, hoàn toàn không làm gián đoạn trải nghiệm người dùng ạ."</w:t>
+        <w:t>Với vai trò lớp thứ hai, giao dịch bị gắn cờ chỉ bị chuyển sang bước xác thực thêm, ví dụ OTP hoặc chuyên viên rà soát; khoảng 5% giao dịch hợp lệ bị báo nhầm nên chấp nhận Precision thấp là hợp lý. Ưu điểm của Autoencoder là không dùng nhãn khi huấn luyện mạng, nên về nguyên lý không bị giới hạn bởi các kiểu gian lận đã có nhãn. Tuy nhiên nhóm chưa kiểm thử riêng trên biến thể gian lận mới, và trong 8 ca XGBoost bỏ sót thì Autoencoder chỉ bắt thêm được 1 ca ạ."</w:t>
       </w:r>
     </w:p>
     <w:p>
@@ -6803,6 +7452,426 @@
           <w:color w:val="444444"/>
         </w:rPr>
         <w:t>"Dạ thưa thầy, trong giao diện Streamlit, em đã cấu hình tính năng `@st.cache_resource` để tải trước trọng số mô hình XGBoost và StandardScaler vào bộ nhớ đệm, tránh tải lại mô hình ở mỗi lượt tương tác. Đồng thời, em sử dụng thư viện Pandas để vector hóa toàn bộ quá trình tính toán 14 đặc trưng miền theo lô (batch processing). Do đó, khi tải file CSV lớn lên, hệ thống có thể chấm điểm song song hàng chục ngàn giao dịch chỉ trong vài giây mà không làm đơ hay nghẽn giao diện ạ."</w:t>
+      </w:r>
+    </w:p>
+    <w:p>
+      <w:pPr>
+        <w:spacing w:before="80" w:after="80"/>
+      </w:pPr>
+    </w:p>
+    <w:p>
+      <w:pPr>
+        <w:pStyle w:val="Heading2"/>
+      </w:pPr>
+      <w:r>
+        <w:rPr>
+          <w:rFonts w:ascii="Times New Roman" w:hAnsi="Times New Roman"/>
+          <w:b/>
+          <w:color w:val="2E75B6"/>
+          <w:sz w:val="24"/>
+        </w:rPr>
+        <w:t>❓ Câu 5: "Autoencoder có bắt được Zero-Day thật không?"</w:t>
+      </w:r>
+    </w:p>
+    <w:p>
+      <w:pPr>
+        <w:ind w:left="432" w:right="432"/>
+      </w:pPr>
+      <w:r>
+        <w:rPr>
+          <w:rFonts w:ascii="Times New Roman" w:hAnsi="Times New Roman"/>
+          <w:i/>
+          <w:color w:val="444444"/>
+        </w:rPr>
+      </w:r>
+      <w:r>
+        <w:rPr>
+          <w:rFonts w:ascii="Times New Roman" w:hAnsi="Times New Roman"/>
+          <w:b/>
+          <w:i/>
+          <w:color w:val="444444"/>
+        </w:rPr>
+        <w:t>Người trả lời chính:</w:t>
+      </w:r>
+      <w:r>
+        <w:rPr>
+          <w:rFonts w:ascii="Times New Roman" w:hAnsi="Times New Roman"/>
+          <w:i/>
+          <w:color w:val="444444"/>
+        </w:rPr>
+        <w:t xml:space="preserve"> </w:t>
+      </w:r>
+      <w:r>
+        <w:rPr>
+          <w:rFonts w:ascii="Times New Roman" w:hAnsi="Times New Roman"/>
+          <w:b/>
+          <w:i/>
+          <w:color w:val="444444"/>
+        </w:rPr>
+        <w:t>Bùi Thị Mỷ Cẩm</w:t>
+      </w:r>
+      <w:r>
+        <w:rPr>
+          <w:rFonts w:ascii="Times New Roman" w:hAnsi="Times New Roman"/>
+          <w:i/>
+          <w:color w:val="444444"/>
+        </w:rPr>
+      </w:r>
+    </w:p>
+    <w:p>
+      <w:pPr>
+        <w:ind w:left="432" w:right="432"/>
+      </w:pPr>
+      <w:r>
+        <w:rPr>
+          <w:rFonts w:ascii="Times New Roman" w:hAnsi="Times New Roman"/>
+          <w:i/>
+          <w:color w:val="444444"/>
+        </w:rPr>
+      </w:r>
+      <w:r>
+        <w:rPr>
+          <w:rFonts w:ascii="Times New Roman" w:hAnsi="Times New Roman"/>
+          <w:b/>
+          <w:i/>
+          <w:color w:val="444444"/>
+        </w:rPr>
+        <w:t>Hướng trả lời:</w:t>
+      </w:r>
+      <w:r>
+        <w:rPr>
+          <w:rFonts w:ascii="Times New Roman" w:hAnsi="Times New Roman"/>
+          <w:i/>
+          <w:color w:val="444444"/>
+        </w:rPr>
+      </w:r>
+    </w:p>
+    <w:p>
+      <w:pPr>
+        <w:ind w:left="432" w:right="432"/>
+      </w:pPr>
+      <w:r>
+        <w:rPr>
+          <w:rFonts w:ascii="Times New Roman" w:hAnsi="Times New Roman"/>
+          <w:i/>
+          <w:color w:val="444444"/>
+        </w:rPr>
+        <w:t>"Dạ, do không dùng nhãn khi huấn luyện nên về nguyên lý nó không bị giới hạn bởi kiểu gian lận cũ. Còn trên PaySim, nhóm chưa có thí nghiệm riêng cho biến thể mới, và trong 8 ca mà XGBoost bỏ sót thì Autoencoder chỉ bắt thêm được 1 ca. Đó là hướng phát triển của nhóm ạ."</w:t>
+      </w:r>
+    </w:p>
+    <w:p>
+      <w:pPr>
+        <w:spacing w:before="80" w:after="80"/>
+      </w:pPr>
+    </w:p>
+    <w:p>
+      <w:pPr>
+        <w:pStyle w:val="Heading2"/>
+      </w:pPr>
+      <w:r>
+        <w:rPr>
+          <w:rFonts w:ascii="Times New Roman" w:hAnsi="Times New Roman"/>
+          <w:b/>
+          <w:color w:val="2E75B6"/>
+          <w:sz w:val="24"/>
+        </w:rPr>
+        <w:t>❓ Câu 6: "Autoencoder hoàn toàn không dùng nhãn à?"</w:t>
+      </w:r>
+    </w:p>
+    <w:p>
+      <w:pPr>
+        <w:ind w:left="432" w:right="432"/>
+      </w:pPr>
+      <w:r>
+        <w:rPr>
+          <w:rFonts w:ascii="Times New Roman" w:hAnsi="Times New Roman"/>
+          <w:i/>
+          <w:color w:val="444444"/>
+        </w:rPr>
+      </w:r>
+      <w:r>
+        <w:rPr>
+          <w:rFonts w:ascii="Times New Roman" w:hAnsi="Times New Roman"/>
+          <w:b/>
+          <w:i/>
+          <w:color w:val="444444"/>
+        </w:rPr>
+        <w:t>Người trả lời chính:</w:t>
+      </w:r>
+      <w:r>
+        <w:rPr>
+          <w:rFonts w:ascii="Times New Roman" w:hAnsi="Times New Roman"/>
+          <w:i/>
+          <w:color w:val="444444"/>
+        </w:rPr>
+        <w:t xml:space="preserve"> </w:t>
+      </w:r>
+      <w:r>
+        <w:rPr>
+          <w:rFonts w:ascii="Times New Roman" w:hAnsi="Times New Roman"/>
+          <w:b/>
+          <w:i/>
+          <w:color w:val="444444"/>
+        </w:rPr>
+        <w:t>Bùi Thị Mỷ Cẩm</w:t>
+      </w:r>
+      <w:r>
+        <w:rPr>
+          <w:rFonts w:ascii="Times New Roman" w:hAnsi="Times New Roman"/>
+          <w:i/>
+          <w:color w:val="444444"/>
+        </w:rPr>
+      </w:r>
+    </w:p>
+    <w:p>
+      <w:pPr>
+        <w:ind w:left="432" w:right="432"/>
+      </w:pPr>
+      <w:r>
+        <w:rPr>
+          <w:rFonts w:ascii="Times New Roman" w:hAnsi="Times New Roman"/>
+          <w:i/>
+          <w:color w:val="444444"/>
+        </w:rPr>
+      </w:r>
+      <w:r>
+        <w:rPr>
+          <w:rFonts w:ascii="Times New Roman" w:hAnsi="Times New Roman"/>
+          <w:b/>
+          <w:i/>
+          <w:color w:val="444444"/>
+        </w:rPr>
+        <w:t>Hướng trả lời:</w:t>
+      </w:r>
+      <w:r>
+        <w:rPr>
+          <w:rFonts w:ascii="Times New Roman" w:hAnsi="Times New Roman"/>
+          <w:i/>
+          <w:color w:val="444444"/>
+        </w:rPr>
+      </w:r>
+    </w:p>
+    <w:p>
+      <w:pPr>
+        <w:ind w:left="432" w:right="432"/>
+      </w:pPr>
+      <w:r>
+        <w:rPr>
+          <w:rFonts w:ascii="Times New Roman" w:hAnsi="Times New Roman"/>
+          <w:i/>
+          <w:color w:val="444444"/>
+        </w:rPr>
+        <w:t>"Dạ, không dùng nhãn khi huấn luyện mạng. Nhãn chỉ dùng ở bước chọn ngưỡng trên tập validation ạ."</w:t>
+      </w:r>
+    </w:p>
+    <w:p>
+      <w:pPr>
+        <w:spacing w:before="80" w:after="80"/>
+      </w:pPr>
+    </w:p>
+    <w:p>
+      <w:pPr>
+        <w:pStyle w:val="Heading2"/>
+      </w:pPr>
+      <w:r>
+        <w:rPr>
+          <w:rFonts w:ascii="Times New Roman" w:hAnsi="Times New Roman"/>
+          <w:b/>
+          <w:color w:val="2E75B6"/>
+          <w:sz w:val="24"/>
+        </w:rPr>
+        <w:t>❓ Câu 7: "Sao không chọn phân vị 99, F1 cao hơn?"</w:t>
+      </w:r>
+    </w:p>
+    <w:p>
+      <w:pPr>
+        <w:ind w:left="432" w:right="432"/>
+      </w:pPr>
+      <w:r>
+        <w:rPr>
+          <w:rFonts w:ascii="Times New Roman" w:hAnsi="Times New Roman"/>
+          <w:i/>
+          <w:color w:val="444444"/>
+        </w:rPr>
+      </w:r>
+      <w:r>
+        <w:rPr>
+          <w:rFonts w:ascii="Times New Roman" w:hAnsi="Times New Roman"/>
+          <w:b/>
+          <w:i/>
+          <w:color w:val="444444"/>
+        </w:rPr>
+        <w:t>Người trả lời chính:</w:t>
+      </w:r>
+      <w:r>
+        <w:rPr>
+          <w:rFonts w:ascii="Times New Roman" w:hAnsi="Times New Roman"/>
+          <w:i/>
+          <w:color w:val="444444"/>
+        </w:rPr>
+        <w:t xml:space="preserve"> </w:t>
+      </w:r>
+      <w:r>
+        <w:rPr>
+          <w:rFonts w:ascii="Times New Roman" w:hAnsi="Times New Roman"/>
+          <w:b/>
+          <w:i/>
+          <w:color w:val="444444"/>
+        </w:rPr>
+        <w:t>Bùi Thị Mỷ Cẩm</w:t>
+      </w:r>
+      <w:r>
+        <w:rPr>
+          <w:rFonts w:ascii="Times New Roman" w:hAnsi="Times New Roman"/>
+          <w:i/>
+          <w:color w:val="444444"/>
+        </w:rPr>
+      </w:r>
+    </w:p>
+    <w:p>
+      <w:pPr>
+        <w:ind w:left="432" w:right="432"/>
+      </w:pPr>
+      <w:r>
+        <w:rPr>
+          <w:rFonts w:ascii="Times New Roman" w:hAnsi="Times New Roman"/>
+          <w:i/>
+          <w:color w:val="444444"/>
+        </w:rPr>
+      </w:r>
+      <w:r>
+        <w:rPr>
+          <w:rFonts w:ascii="Times New Roman" w:hAnsi="Times New Roman"/>
+          <w:b/>
+          <w:i/>
+          <w:color w:val="444444"/>
+        </w:rPr>
+        <w:t>Hướng trả lời:</w:t>
+      </w:r>
+      <w:r>
+        <w:rPr>
+          <w:rFonts w:ascii="Times New Roman" w:hAnsi="Times New Roman"/>
+          <w:i/>
+          <w:color w:val="444444"/>
+        </w:rPr>
+      </w:r>
+    </w:p>
+    <w:p>
+      <w:pPr>
+        <w:ind w:left="432" w:right="432"/>
+      </w:pPr>
+      <w:r>
+        <w:rPr>
+          <w:rFonts w:ascii="Times New Roman" w:hAnsi="Times New Roman"/>
+          <w:i/>
+          <w:color w:val="444444"/>
+        </w:rPr>
+        <w:t>"Dạ, phân vị 99 cho F1 cao hơn nhưng Recall chỉ 47%, không đạt ràng buộc Recall tối thiểu 60% mà em đặt, vì bỏ sót gian lận đắt hơn báo nhầm ạ."</w:t>
+      </w:r>
+    </w:p>
+    <w:p>
+      <w:pPr>
+        <w:spacing w:before="80" w:after="80"/>
+      </w:pPr>
+    </w:p>
+    <w:p>
+      <w:pPr>
+        <w:pStyle w:val="Heading2"/>
+      </w:pPr>
+      <w:r>
+        <w:rPr>
+          <w:rFonts w:ascii="Times New Roman" w:hAnsi="Times New Roman"/>
+          <w:b/>
+          <w:color w:val="2E75B6"/>
+          <w:sz w:val="24"/>
+        </w:rPr>
+        <w:t>❓ Câu 8: "Tại sao gọi là Deep Autoencoder mà dùng scikit-learn?"</w:t>
+      </w:r>
+    </w:p>
+    <w:p>
+      <w:pPr>
+        <w:ind w:left="432" w:right="432"/>
+      </w:pPr>
+      <w:r>
+        <w:rPr>
+          <w:rFonts w:ascii="Times New Roman" w:hAnsi="Times New Roman"/>
+          <w:i/>
+          <w:color w:val="444444"/>
+        </w:rPr>
+      </w:r>
+      <w:r>
+        <w:rPr>
+          <w:rFonts w:ascii="Times New Roman" w:hAnsi="Times New Roman"/>
+          <w:b/>
+          <w:i/>
+          <w:color w:val="444444"/>
+        </w:rPr>
+        <w:t>Người trả lời chính:</w:t>
+      </w:r>
+      <w:r>
+        <w:rPr>
+          <w:rFonts w:ascii="Times New Roman" w:hAnsi="Times New Roman"/>
+          <w:i/>
+          <w:color w:val="444444"/>
+        </w:rPr>
+        <w:t xml:space="preserve"> </w:t>
+      </w:r>
+      <w:r>
+        <w:rPr>
+          <w:rFonts w:ascii="Times New Roman" w:hAnsi="Times New Roman"/>
+          <w:b/>
+          <w:i/>
+          <w:color w:val="444444"/>
+        </w:rPr>
+        <w:t>Bùi Thị Mỷ Cẩm</w:t>
+      </w:r>
+      <w:r>
+        <w:rPr>
+          <w:rFonts w:ascii="Times New Roman" w:hAnsi="Times New Roman"/>
+          <w:i/>
+          <w:color w:val="444444"/>
+        </w:rPr>
+      </w:r>
+    </w:p>
+    <w:p>
+      <w:pPr>
+        <w:ind w:left="432" w:right="432"/>
+      </w:pPr>
+      <w:r>
+        <w:rPr>
+          <w:rFonts w:ascii="Times New Roman" w:hAnsi="Times New Roman"/>
+          <w:i/>
+          <w:color w:val="444444"/>
+        </w:rPr>
+      </w:r>
+      <w:r>
+        <w:rPr>
+          <w:rFonts w:ascii="Times New Roman" w:hAnsi="Times New Roman"/>
+          <w:b/>
+          <w:i/>
+          <w:color w:val="444444"/>
+        </w:rPr>
+        <w:t>Hướng trả lời:</w:t>
+      </w:r>
+      <w:r>
+        <w:rPr>
+          <w:rFonts w:ascii="Times New Roman" w:hAnsi="Times New Roman"/>
+          <w:i/>
+          <w:color w:val="444444"/>
+        </w:rPr>
+      </w:r>
+    </w:p>
+    <w:p>
+      <w:pPr>
+        <w:ind w:left="432" w:right="432"/>
+      </w:pPr>
+      <w:r>
+        <w:rPr>
+          <w:rFonts w:ascii="Times New Roman" w:hAnsi="Times New Roman"/>
+          <w:i/>
+          <w:color w:val="444444"/>
+        </w:rPr>
+        <w:t>"Dạ, TensorFlow/Keras chưa có bản tương thích với Python 3.14 trên máy phát triển, nên nhóm triển khai cùng nguyên lý bằng MLPRegressor với 5 lớp ẩn 16-8-4-8-16, và đã ghi rõ trong báo cáo ạ."</w:t>
       </w:r>
     </w:p>
     <w:sectPr>

</xml_diff>

<commit_message>
docs(script): gộp kịch bản XGBoost/Autoencoder của Cẩm lên main hiện tại (#48)
## Summary
- Gộp lời thoại Slide 12 (XGBoost), 13, 18 và Q&A 2–3, 5–8 từ PR #46 của
Cẩm vào `main` hiện tại, giữ nguyên phần Random Forest đã rút gọn của
Sơn (PR #42).
- Đếm lại thời lượng nói của Cẩm: 1,074 từ ÷ 135.5 WPM = **7 phút 56
giây (476s)**, không dùng mốc 6 phút 36 giây vì lời thoại không có `[có
thể bỏ]`.
- Tái tạo file DOCX kịch bản cho khớp Markdown.

## Test plan
- [x] Hàng Sơn trong bảng vẫn 🟢 PR #42
- [x] Lời thoại Cẩm không claim Zero-Day; Q&A 5 ghi rõ chỉ bắt thêm 1/8
ca
- [x] PR #46 sẽ đóng vì conflict/dirty, nội dung đã được gộp qua PR này

Made with [Cursor](https://cursor.com)

Co-authored-by: Cursor <cursoragent@cursor.com>
</commit_message>
<xml_diff>
--- a/draft/fraud-detection/slide/scripts/SCRIPT_THUYET_TRINH_TOAN_TEAM_CS106.docx
+++ b/draft/fraud-detection/slide/scripts/SCRIPT_THUYET_TRINH_TOAN_TEAM_CS106.docx
@@ -1320,7 +1320,7 @@
                 <w:rFonts w:ascii="Times New Roman" w:hAnsi="Times New Roman"/>
                 <w:sz w:val="20"/>
               </w:rPr>
-              <w:t>🔴**Chưa cập nhật** *(Giữ nguyên bản cũ)*</w:t>
+              <w:t>🟢**Đã cập nhật** *(Rút gọn Slide 9–12 PR #42)*</w:t>
             </w:r>
           </w:p>
         </w:tc>
@@ -1362,7 +1362,7 @@
                 <w:rFonts w:ascii="Times New Roman" w:hAnsi="Times New Roman"/>
                 <w:sz w:val="20"/>
               </w:rPr>
-              <w:t>**3 phút 30s** *(210s)*</w:t>
+              <w:t>**2 phút 30s** *(150s)*</w:t>
             </w:r>
           </w:p>
         </w:tc>
@@ -1390,7 +1390,7 @@
                 <w:rFonts w:ascii="Times New Roman" w:hAnsi="Times New Roman"/>
                 <w:sz w:val="20"/>
               </w:rPr>
-              <w:t>🔴**Vượt +1m30s** *(+75%)*</w:t>
+              <w:t>🟢**Vượt +30s** *(+25%)*</w:t>
             </w:r>
           </w:p>
         </w:tc>
@@ -1404,7 +1404,7 @@
                 <w:rFonts w:ascii="Times New Roman" w:hAnsi="Times New Roman"/>
                 <w:sz w:val="20"/>
               </w:rPr>
-              <w:t>⚠️**Cắt lý thuyết:** Bỏ giải thích ADASYN, chỉ nêu kết quả RF F1=0.9973.</w:t>
+              <w:t>✅**Đã rút gọn (PR #42):** Bám sát slide, 4 nguyên tắc Leak-Free &amp; kết quả RF F1=0.9973.</w:t>
             </w:r>
           </w:p>
         </w:tc>
@@ -1462,7 +1462,7 @@
                 <w:rFonts w:ascii="Times New Roman" w:hAnsi="Times New Roman"/>
                 <w:sz w:val="20"/>
               </w:rPr>
-              <w:t>🔴**Chưa cập nhật** *(Giữ nguyên bản cũ)*</w:t>
+              <w:t>🟢**Đã cập nhật** *(Script mới của Cẩm, 20/09 — gộp local)*</w:t>
             </w:r>
           </w:p>
         </w:tc>
@@ -1476,7 +1476,7 @@
                 <w:rFonts w:ascii="Times New Roman" w:hAnsi="Times New Roman"/>
                 <w:sz w:val="20"/>
               </w:rPr>
-              <w:t>XGBoost siêu tốc (41s, JSON 410KB) và Deep Autoencoder bắt Zero-Day.</w:t>
+              <w:t>XGBoost (huấn luyện chưa tới 1 phút, nhanh hơn RF hơn 20 lần) và Deep Autoencoder: lớp phòng thủ thứ cấp, chọn ngưỡng phân vị 95.</w:t>
             </w:r>
           </w:p>
         </w:tc>
@@ -1504,7 +1504,7 @@
                 <w:rFonts w:ascii="Times New Roman" w:hAnsi="Times New Roman"/>
                 <w:sz w:val="20"/>
               </w:rPr>
-              <w:t>**3 phút 43s** *(223s)*</w:t>
+              <w:t>**7 phút 56s** *(476s)* *(đếm lại: 1,074 từ ÷ 135.5 WPM; Slide 12 XGB 258 từ / 114s, Slide 13 409 từ / 181s, Slide 18 407 từ / 180s)*</w:t>
             </w:r>
           </w:p>
         </w:tc>
@@ -1532,7 +1532,7 @@
                 <w:rFonts w:ascii="Times New Roman" w:hAnsi="Times New Roman"/>
                 <w:sz w:val="20"/>
               </w:rPr>
-              <w:t>🔴**Vượt +1m43s** *(+86%)*</w:t>
+              <w:t>🔴**Vượt +5m56s** *(+297%)*</w:t>
             </w:r>
           </w:p>
         </w:tc>
@@ -1546,7 +1546,7 @@
                 <w:rFonts w:ascii="Times New Roman" w:hAnsi="Times New Roman"/>
                 <w:sz w:val="20"/>
               </w:rPr>
-              <w:t>⚠️**Cần cô đọng:** XGB 40s + Autoencoder &amp; ngưỡng 95th 80s.</w:t>
+              <w:t>⚠️**Cần cắt mạnh:** kịch bản dài gần 4 lần ngân sách 2 phút; không có mốc **[có thể bỏ]** trong lời thoại. Ưu tiên giữ ngưỡng 95th, Recall 75.2%, và vai trò lớp phòng thủ thứ hai.</w:t>
             </w:r>
           </w:p>
         </w:tc>
@@ -2314,7 +2314,7 @@
                 <w:rFonts w:ascii="Times New Roman" w:hAnsi="Times New Roman"/>
                 <w:sz w:val="20"/>
               </w:rPr>
-              <w:t>**3/7 bạn đã tối ưu**</w:t>
+              <w:t>**5/7 bạn đã cập nhật; 4/7 đã tối ưu**</w:t>
             </w:r>
           </w:p>
         </w:tc>
@@ -2356,7 +2356,7 @@
                 <w:rFonts w:ascii="Times New Roman" w:hAnsi="Times New Roman"/>
                 <w:sz w:val="20"/>
               </w:rPr>
-              <w:t>**18 phút 32s** *(1,112s)*</w:t>
+              <w:t>**21 phút 45s** *(1,305s)*</w:t>
             </w:r>
           </w:p>
         </w:tc>
@@ -2384,7 +2384,7 @@
                 <w:rFonts w:ascii="Times New Roman" w:hAnsi="Times New Roman"/>
                 <w:sz w:val="20"/>
               </w:rPr>
-              <w:t>🔴**VƯỢT +3m32s (+24%)**</w:t>
+              <w:t>🔴**VƯỢT +6m45s (+45%)**</w:t>
             </w:r>
           </w:p>
         </w:tc>
@@ -2398,7 +2398,7 @@
                 <w:rFonts w:ascii="Times New Roman" w:hAnsi="Times New Roman"/>
                 <w:sz w:val="20"/>
               </w:rPr>
-              <w:t>⚠️**ĐÃ GIẢM GẦN 4.5 PHÚT! CẦN NÓI Ý CHÍNH ĐỂ VỀ ĐÚNG 15P.**</w:t>
+              <w:t>⚠️**CẨM ĐÃ CẬP NHẬT NỘI DUNG NHƯNG CẦN CẮT VỀ 2 PHÚT. KHANG, TRUNG TIẾP TỤC RÚT GỌN.**</w:t>
             </w:r>
           </w:p>
         </w:tc>
@@ -3719,14 +3719,27 @@
         <w:rPr>
           <w:rFonts w:ascii="Times New Roman" w:hAnsi="Times New Roman"/>
         </w:rPr>
-        <w:t xml:space="preserve">Em chào thầy và các bạn, mình là </w:t>
+        <w:t xml:space="preserve">Cảm ơn Thanh. Chào Thầy và các bạn, mình là </w:t>
       </w:r>
       <w:r>
         <w:rPr>
           <w:rFonts w:ascii="Times New Roman" w:hAnsi="Times New Roman"/>
           <w:b/>
         </w:rPr>
-        <w:t>Hoàng Cao Sơn</w:t>
+        <w:t>Sơn</w:t>
+      </w:r>
+      <w:r>
+        <w:rPr>
+          <w:rFonts w:ascii="Times New Roman" w:hAnsi="Times New Roman"/>
+        </w:rPr>
+        <w:t xml:space="preserve">. Sau khi em Thanh đã trích xuất 14 đặc trưng, mình tiếp nhận bài toán và xử lý thách thức cốt lõi đầu tiên: </w:t>
+      </w:r>
+      <w:r>
+        <w:rPr>
+          <w:rFonts w:ascii="Times New Roman" w:hAnsi="Times New Roman"/>
+          <w:b/>
+        </w:rPr>
+        <w:t>Dữ liệu bị mất cân bằng (Imbalanced Data) cực đoan ~0.13%</w:t>
       </w:r>
       <w:r>
         <w:rPr>
@@ -3740,20 +3753,85 @@
         <w:rPr>
           <w:rFonts w:ascii="Times New Roman" w:hAnsi="Times New Roman"/>
         </w:rPr>
-        <w:t xml:space="preserve">Ở phần trước thì Thanh đã phân tích rất rõ về 14 đặc trưng trích xuất. Nhưng khi bước sang huấn luyện mô hình, thách thức lớn nhất là tỷ lệ gian lận cực đoan chỉ chiếm </w:t>
+        <w:t xml:space="preserve">Nhìn vào khung cảnh báo màu đỏ ở trên cùng: Đây là </w:t>
       </w:r>
       <w:r>
         <w:rPr>
           <w:rFonts w:ascii="Times New Roman" w:hAnsi="Times New Roman"/>
           <w:b/>
         </w:rPr>
-        <w:t>0.13%</w:t>
-      </w:r>
-      <w:r>
-        <w:rPr>
-          <w:rFonts w:ascii="Times New Roman" w:hAnsi="Times New Roman"/>
-        </w:rPr>
-        <w:t>. Nếu để nguyên dữ liệu gốc, mô hình sẽ bị rơi vào cái bẫy 'bộ phân lớp hiển nhiên' (Majority Classifier) — đoán tất cả là bình thường thì Accuracy vẫn 99.87% nhưng hoàn toàn vô dụng.</w:t>
+        <w:t>Accuracy Paradox (nghịch lý độ chính xác)</w:t>
+      </w:r>
+      <w:r>
+        <w:rPr>
+          <w:rFonts w:ascii="Times New Roman" w:hAnsi="Times New Roman"/>
+        </w:rPr>
+        <w:t xml:space="preserve">. Nếu mô hình ngây thơ đoán 100% giao dịch là bình thường thì </w:t>
+      </w:r>
+      <w:r>
+        <w:rPr>
+          <w:rFonts w:ascii="Times New Roman" w:hAnsi="Times New Roman"/>
+          <w:b/>
+        </w:rPr>
+        <w:t>Accuracy (độ chính xác tổng thể)</w:t>
+      </w:r>
+      <w:r>
+        <w:rPr>
+          <w:rFonts w:ascii="Times New Roman" w:hAnsi="Times New Roman"/>
+        </w:rPr>
+        <w:t xml:space="preserve"> vẫn đạt 99.87% nhưng bỏ sót toàn bộ gian lận. Do đó, việc đánh giá bắt buộc phải dẫn dắt bởi </w:t>
+      </w:r>
+      <w:r>
+        <w:rPr>
+          <w:rFonts w:ascii="Times New Roman" w:hAnsi="Times New Roman"/>
+          <w:b/>
+        </w:rPr>
+        <w:t>Precision (độ chuẩn xác)</w:t>
+      </w:r>
+      <w:r>
+        <w:rPr>
+          <w:rFonts w:ascii="Times New Roman" w:hAnsi="Times New Roman"/>
+        </w:rPr>
+        <w:t xml:space="preserve">, </w:t>
+      </w:r>
+      <w:r>
+        <w:rPr>
+          <w:rFonts w:ascii="Times New Roman" w:hAnsi="Times New Roman"/>
+          <w:b/>
+        </w:rPr>
+        <w:t>Recall (độ phủ)</w:t>
+      </w:r>
+      <w:r>
+        <w:rPr>
+          <w:rFonts w:ascii="Times New Roman" w:hAnsi="Times New Roman"/>
+        </w:rPr>
+        <w:t xml:space="preserve">, </w:t>
+      </w:r>
+      <w:r>
+        <w:rPr>
+          <w:rFonts w:ascii="Times New Roman" w:hAnsi="Times New Roman"/>
+          <w:b/>
+        </w:rPr>
+        <w:t>F1-Score</w:t>
+      </w:r>
+      <w:r>
+        <w:rPr>
+          <w:rFonts w:ascii="Times New Roman" w:hAnsi="Times New Roman"/>
+        </w:rPr>
+        <w:t xml:space="preserve"> và </w:t>
+      </w:r>
+      <w:r>
+        <w:rPr>
+          <w:rFonts w:ascii="Times New Roman" w:hAnsi="Times New Roman"/>
+          <w:b/>
+        </w:rPr>
+        <w:t>PR-AUC</w:t>
+      </w:r>
+      <w:r>
+        <w:rPr>
+          <w:rFonts w:ascii="Times New Roman" w:hAnsi="Times New Roman"/>
+        </w:rPr>
+        <w:t>.</w:t>
       </w:r>
     </w:p>
     <w:p>
@@ -3761,33 +3839,7 @@
         <w:rPr>
           <w:rFonts w:ascii="Times New Roman" w:hAnsi="Times New Roman"/>
         </w:rPr>
-        <w:t xml:space="preserve">Để xử lý, nhóm đã thử nghiệm đối chuẩn 2 kỹ thuật sinh mẫu nhân tạo là </w:t>
-      </w:r>
-      <w:r>
-        <w:rPr>
-          <w:rFonts w:ascii="Times New Roman" w:hAnsi="Times New Roman"/>
-          <w:b/>
-        </w:rPr>
-        <w:t>SMOTENC</w:t>
-      </w:r>
-      <w:r>
-        <w:rPr>
-          <w:rFonts w:ascii="Times New Roman" w:hAnsi="Times New Roman"/>
-        </w:rPr>
-        <w:t xml:space="preserve"> và </w:t>
-      </w:r>
-      <w:r>
-        <w:rPr>
-          <w:rFonts w:ascii="Times New Roman" w:hAnsi="Times New Roman"/>
-          <w:b/>
-        </w:rPr>
-        <w:t>ADASYN</w:t>
-      </w:r>
-      <w:r>
-        <w:rPr>
-          <w:rFonts w:ascii="Times New Roman" w:hAnsi="Times New Roman"/>
-        </w:rPr>
-        <w:t>:</w:t>
+        <w:t>Để cân bằng dữ liệu, mình đưa 2 kỹ thuật sinh mẫu vào đối chuẩn:</w:t>
       </w:r>
     </w:p>
     <w:p>
@@ -3798,33 +3850,46 @@
         <w:rPr>
           <w:rFonts w:ascii="Times New Roman" w:hAnsi="Times New Roman"/>
         </w:rPr>
-        <w:t xml:space="preserve">Với </w:t>
+        <w:t xml:space="preserve">Ở khung màu xanh bên trái: Như công thức hiển thị, bản chất của </w:t>
       </w:r>
       <w:r>
         <w:rPr>
           <w:rFonts w:ascii="Times New Roman" w:hAnsi="Times New Roman"/>
           <w:b/>
         </w:rPr>
-        <w:t>ADASYN</w:t>
-      </w:r>
-      <w:r>
-        <w:rPr>
-          <w:rFonts w:ascii="Times New Roman" w:hAnsi="Times New Roman"/>
-        </w:rPr>
-        <w:t xml:space="preserve">: Thuật toán ưu tiên sinh mẫu ở các vùng biên khó. Tuy nhiên trong dữ liệu gian lận, vùng biên thường bị nhiễu do kẻ gian ngụy trang. ADASYN tập trung sinh dày đặc mẫu nhân tạo vào vùng nhiễu này, làm méo mó ranh giới quyết định và dẫn tới </w:t>
+        <w:t>SMOTE (Kỹ thuật nội suy mẫu tổng hợp)</w:t>
+      </w:r>
+      <w:r>
+        <w:rPr>
+          <w:rFonts w:ascii="Times New Roman" w:hAnsi="Times New Roman"/>
+        </w:rPr>
+        <w:t xml:space="preserve"> là nội suy mẫu nhân tạo dọc theo đoạn thẳng nối các láng giềng </w:t>
       </w:r>
       <w:r>
         <w:rPr>
           <w:rFonts w:ascii="Times New Roman" w:hAnsi="Times New Roman"/>
           <w:b/>
         </w:rPr>
-        <w:t>tỷ lệ báo động giả (False Alarm) tăng vọt</w:t>
-      </w:r>
-      <w:r>
-        <w:rPr>
-          <w:rFonts w:ascii="Times New Roman" w:hAnsi="Times New Roman"/>
-        </w:rPr>
-        <w:t>, khách hàng bình thường cũng bị chặn thẻ.</w:t>
+        <w:t>k-NN (k láng giềng gần nhất)</w:t>
+      </w:r>
+      <w:r>
+        <w:rPr>
+          <w:rFonts w:ascii="Times New Roman" w:hAnsi="Times New Roman"/>
+        </w:rPr>
+        <w:t xml:space="preserve">, tạo ra đường biên phân tách phẳng và rõ nét. Điểm mấu chốt là mình dùng biến thể </w:t>
+      </w:r>
+      <w:r>
+        <w:rPr>
+          <w:rFonts w:ascii="Times New Roman" w:hAnsi="Times New Roman"/>
+          <w:b/>
+        </w:rPr>
+        <w:t>SMOTENC (Nominal &amp; Continuous - biến định danh và liên tục)</w:t>
+      </w:r>
+      <w:r>
+        <w:rPr>
+          <w:rFonts w:ascii="Times New Roman" w:hAnsi="Times New Roman"/>
+        </w:rPr>
+        <w:t xml:space="preserve"> để bảo toàn nguyên vẹn giá trị 0-1 của các cờ nhị phân.</w:t>
       </w:r>
     </w:p>
     <w:p>
@@ -3835,33 +3900,33 @@
         <w:rPr>
           <w:rFonts w:ascii="Times New Roman" w:hAnsi="Times New Roman"/>
         </w:rPr>
-        <w:t xml:space="preserve">Với </w:t>
+        <w:t xml:space="preserve">Ngược lại, ở khung màu xám bên phải là </w:t>
       </w:r>
       <w:r>
         <w:rPr>
           <w:rFonts w:ascii="Times New Roman" w:hAnsi="Times New Roman"/>
           <w:b/>
         </w:rPr>
-        <w:t>SMOTENC</w:t>
-      </w:r>
-      <w:r>
-        <w:rPr>
-          <w:rFonts w:ascii="Times New Roman" w:hAnsi="Times New Roman"/>
-        </w:rPr>
-        <w:t xml:space="preserve">: Thuật toán nội suy tuyến tính láng giềng k-NN trong không gian ẩn ổn định hơn, tạo ra ranh giới phẳng và phân cách rõ ràng. Điểm mấu chốt là nhóm dùng biến thể </w:t>
+        <w:t>ADASYN (Lấy mẫu thích ứng theo mật độ)</w:t>
+      </w:r>
+      <w:r>
+        <w:rPr>
+          <w:rFonts w:ascii="Times New Roman" w:hAnsi="Times New Roman"/>
+        </w:rPr>
+        <w:t xml:space="preserve">: Do cố sinh mẫu theo mật độ vùng biên khó, mà kẻ gian lại ngụy trang tinh vi, ADASYN đã đẻ mẫu quá đà ở vùng chồng lấn nhiễu, làm tăng </w:t>
       </w:r>
       <w:r>
         <w:rPr>
           <w:rFonts w:ascii="Times New Roman" w:hAnsi="Times New Roman"/>
           <w:b/>
         </w:rPr>
-        <w:t>SMOTENC (Nominal and Continuous)</w:t>
-      </w:r>
-      <w:r>
-        <w:rPr>
-          <w:rFonts w:ascii="Times New Roman" w:hAnsi="Times New Roman"/>
-        </w:rPr>
-        <w:t>: vì dữ liệu có 4 cờ nhị phân quan trọng (như cờ rút cạn, giao dịch đêm), SMOTENC bảo toàn nguyên vẹn giá trị 0 hoặc 1, không bao giờ nội suy ra các số thực lẻ vô nghĩa như 0.4 hay 0.7.</w:t>
+        <w:t>False Positives (báo động giả)</w:t>
+      </w:r>
+      <w:r>
+        <w:rPr>
+          <w:rFonts w:ascii="Times New Roman" w:hAnsi="Times New Roman"/>
+        </w:rPr>
+        <w:t>.</w:t>
       </w:r>
     </w:p>
     <w:p>
@@ -3869,19 +3934,20 @@
         <w:rPr>
           <w:rFonts w:ascii="Times New Roman" w:hAnsi="Times New Roman"/>
         </w:rPr>
+        <w:t xml:space="preserve">👉 </w:t>
       </w:r>
       <w:r>
         <w:rPr>
           <w:rFonts w:ascii="Times New Roman" w:hAnsi="Times New Roman"/>
           <w:b/>
         </w:rPr>
-        <w:t>Kết luận thực nghiệm:</w:t>
-      </w:r>
-      <w:r>
-        <w:rPr>
-          <w:rFonts w:ascii="Times New Roman" w:hAnsi="Times New Roman"/>
-        </w:rPr>
-        <w:t xml:space="preserve"> Nhóm chọn </w:t>
+        <w:t>Chốt lại:</w:t>
+      </w:r>
+      <w:r>
+        <w:rPr>
+          <w:rFonts w:ascii="Times New Roman" w:hAnsi="Times New Roman"/>
+        </w:rPr>
+        <w:t xml:space="preserve"> Mình chọn </w:t>
       </w:r>
       <w:r>
         <w:rPr>
@@ -3894,20 +3960,20 @@
         <w:rPr>
           <w:rFonts w:ascii="Times New Roman" w:hAnsi="Times New Roman"/>
         </w:rPr>
-        <w:t xml:space="preserve"> làm phương pháp xử lý chính thức, tạo ra tập huấn luyện cân bằng gồm </w:t>
+        <w:t xml:space="preserve">, tạo ra tập train cân bằng </w:t>
       </w:r>
       <w:r>
         <w:rPr>
           <w:rFonts w:ascii="Times New Roman" w:hAnsi="Times New Roman"/>
           <w:b/>
         </w:rPr>
-        <w:t>230,145 dòng</w:t>
-      </w:r>
-      <w:r>
-        <w:rPr>
-          <w:rFonts w:ascii="Times New Roman" w:hAnsi="Times New Roman"/>
-        </w:rPr>
-        <w:t>, giúp mô hình triệt tiêu tối đa các ca báo động giả.</w:t>
+        <w:t>230.145 dòng</w:t>
+      </w:r>
+      <w:r>
+        <w:rPr>
+          <w:rFonts w:ascii="Times New Roman" w:hAnsi="Times New Roman"/>
+        </w:rPr>
+        <w:t xml:space="preserve"> (theo tỷ lệ 1:2 tối ưu), triệt tiêu tối đa báo động giả.</w:t>
       </w:r>
     </w:p>
     <w:p>
@@ -3953,7 +4019,7 @@
         <w:rPr>
           <w:rFonts w:ascii="Times New Roman" w:hAnsi="Times New Roman"/>
         </w:rPr>
-        <w:t>Tiếp theo, em xin đi vào Phần 3: Kiến trúc Pipeline chuẩn Leak-Free và chi tiết 3 mô hình học máy mà nhóm đã xây dựng.</w:t>
+        <w:t>Tiếp theo, mình xin đi vào Phần 3: Kiến trúc Pipeline chuẩn Leak-Free và Mô hình Random Forest do mình huấn luyện.</w:t>
       </w:r>
     </w:p>
     <w:p>
@@ -3999,20 +4065,33 @@
         <w:rPr>
           <w:rFonts w:ascii="Times New Roman" w:hAnsi="Times New Roman"/>
         </w:rPr>
-        <w:t xml:space="preserve">Kính thưa Thầy, trong các hệ thống AI tài chính, rủi ro lớn nhất là </w:t>
+        <w:t xml:space="preserve">Bước sang Slide 11 là kiến trúc </w:t>
       </w:r>
       <w:r>
         <w:rPr>
           <w:rFonts w:ascii="Times New Roman" w:hAnsi="Times New Roman"/>
           <w:b/>
         </w:rPr>
-        <w:t>Rò rỉ dữ liệu (Data Leakage)</w:t>
-      </w:r>
-      <w:r>
-        <w:rPr>
-          <w:rFonts w:ascii="Times New Roman" w:hAnsi="Times New Roman"/>
-        </w:rPr>
-        <w:t xml:space="preserve"> — mô hình nhìn trộm dữ liệu kiểm thử, dẫn đến điểm số trên máy thì cao chót vót nhưng đem ra chạy thực tế thì thất bại hoàn toàn.</w:t>
+        <w:t>Pipeline (chuỗi quy trình xử lý)</w:t>
+      </w:r>
+      <w:r>
+        <w:rPr>
+          <w:rFonts w:ascii="Times New Roman" w:hAnsi="Times New Roman"/>
+        </w:rPr>
+        <w:t xml:space="preserve"> gồm 6 bước của nhóm (từ Lọc dữ liệu, Trích xuất đặc trưng, Chia tập, Tái lấy mẫu, Huấn luyện đến Đánh giá), được thiết kế để triệt tiêu hoàn toàn nguy cơ </w:t>
+      </w:r>
+      <w:r>
+        <w:rPr>
+          <w:rFonts w:ascii="Times New Roman" w:hAnsi="Times New Roman"/>
+          <w:b/>
+        </w:rPr>
+        <w:t>Data Leakage (rò rỉ dữ liệu)</w:t>
+      </w:r>
+      <w:r>
+        <w:rPr>
+          <w:rFonts w:ascii="Times New Roman" w:hAnsi="Times New Roman"/>
+        </w:rPr>
+        <w:t>.</w:t>
       </w:r>
     </w:p>
     <w:p>
@@ -4020,20 +4099,20 @@
         <w:rPr>
           <w:rFonts w:ascii="Times New Roman" w:hAnsi="Times New Roman"/>
         </w:rPr>
-        <w:t xml:space="preserve">Để đảm bảo tính trung thực và khách quan tuyệt đối, nhóm đã thiết kế quy trình gồm 6 bước với </w:t>
+        <w:t xml:space="preserve">Mọi người có thể thấy </w:t>
       </w:r>
       <w:r>
         <w:rPr>
           <w:rFonts w:ascii="Times New Roman" w:hAnsi="Times New Roman"/>
           <w:b/>
         </w:rPr>
-        <w:t>4 nguyên tắc bảo vệ Leak-Free nghiêm ngặt</w:t>
-      </w:r>
-      <w:r>
-        <w:rPr>
-          <w:rFonts w:ascii="Times New Roman" w:hAnsi="Times New Roman"/>
-        </w:rPr>
-        <w:t>:</w:t>
+        <w:t>4 quy chuẩn bảo vệ nghiêm ngặt</w:t>
+      </w:r>
+      <w:r>
+        <w:rPr>
+          <w:rFonts w:ascii="Times New Roman" w:hAnsi="Times New Roman"/>
+        </w:rPr>
+        <w:t xml:space="preserve"> ở khung bên dưới:</w:t>
       </w:r>
     </w:p>
     <w:p>
@@ -4050,13 +4129,13 @@
           <w:rFonts w:ascii="Times New Roman" w:hAnsi="Times New Roman"/>
           <w:b/>
         </w:rPr>
-        <w:t>Stratified Split (80/20) TRƯỚC TIÊN</w:t>
-      </w:r>
-      <w:r>
-        <w:rPr>
-          <w:rFonts w:ascii="Times New Roman" w:hAnsi="Times New Roman"/>
-        </w:rPr>
-        <w:t>: Chốt chặn đầu tiên tách riêng tập Train (160,000 dòng) và Test (40,000 dòng) trước khi thực hiện bất kỳ phép biến đổi nào.</w:t>
+        <w:t>Stratified Split (chia phân tầng) 80/20</w:t>
+      </w:r>
+      <w:r>
+        <w:rPr>
+          <w:rFonts w:ascii="Times New Roman" w:hAnsi="Times New Roman"/>
+        </w:rPr>
+        <w:t xml:space="preserve"> được chốt chặn trước bất kỳ bước tái lấy mẫu hay chuẩn hóa nào.</w:t>
       </w:r>
     </w:p>
     <w:p>
@@ -4073,26 +4152,39 @@
           <w:rFonts w:ascii="Times New Roman" w:hAnsi="Times New Roman"/>
           <w:b/>
         </w:rPr>
-        <w:t>Cô lập Resampling tuyệt đối</w:t>
-      </w:r>
-      <w:r>
-        <w:rPr>
-          <w:rFonts w:ascii="Times New Roman" w:hAnsi="Times New Roman"/>
-        </w:rPr>
-        <w:t xml:space="preserve">: Quá trình sinh mẫu SMOTENC </w:t>
+        <w:t>Resampling (tái lấy mẫu)</w:t>
+      </w:r>
+      <w:r>
+        <w:rPr>
+          <w:rFonts w:ascii="Times New Roman" w:hAnsi="Times New Roman"/>
+        </w:rPr>
+        <w:t xml:space="preserve"> ở Bước 4 </w:t>
       </w:r>
       <w:r>
         <w:rPr>
           <w:rFonts w:ascii="Times New Roman" w:hAnsi="Times New Roman"/>
           <w:b/>
         </w:rPr>
-        <w:t>chỉ chạy trên 80% tập Train</w:t>
-      </w:r>
-      <w:r>
-        <w:rPr>
-          <w:rFonts w:ascii="Times New Roman" w:hAnsi="Times New Roman"/>
-        </w:rPr>
-        <w:t>. Tập Test 40,000 mẫu được giữ nguyên vẹn 100% tỷ lệ thực tế ngoài đời, tuyệt đối không có một mẫu nhân tạo nào lọt vào.</w:t>
+        <w:t>tuyệt đối chỉ chạy trên tập Train (huấn luyện)</w:t>
+      </w:r>
+      <w:r>
+        <w:rPr>
+          <w:rFonts w:ascii="Times New Roman" w:hAnsi="Times New Roman"/>
+        </w:rPr>
+        <w:t xml:space="preserve">; tập </w:t>
+      </w:r>
+      <w:r>
+        <w:rPr>
+          <w:rFonts w:ascii="Times New Roman" w:hAnsi="Times New Roman"/>
+          <w:b/>
+        </w:rPr>
+        <w:t>Test (kiểm thử)</w:t>
+      </w:r>
+      <w:r>
+        <w:rPr>
+          <w:rFonts w:ascii="Times New Roman" w:hAnsi="Times New Roman"/>
+        </w:rPr>
+        <w:t xml:space="preserve"> 40.000 mẫu được giữ nguyên vẹn 100% tỷ lệ thực tế ngoài đời, không một mẫu nhân tạo nào được lọt vào.</w:t>
       </w:r>
     </w:p>
     <w:p>
@@ -4109,13 +4201,13 @@
           <w:rFonts w:ascii="Times New Roman" w:hAnsi="Times New Roman"/>
           <w:b/>
         </w:rPr>
-        <w:t>Chuẩn hóa Scaler độc lập</w:t>
-      </w:r>
-      <w:r>
-        <w:rPr>
-          <w:rFonts w:ascii="Times New Roman" w:hAnsi="Times New Roman"/>
-        </w:rPr>
-        <w:t>: Bộ `StandardScaler` chỉ được `fit` trên tập Train để lấy trung bình và phương sai, rồi dùng nguyên tham số đó `transform` trên Test.</w:t>
+        <w:t>StandardScaler (chuẩn hóa độ lệch chuẩn)</w:t>
+      </w:r>
+      <w:r>
+        <w:rPr>
+          <w:rFonts w:ascii="Times New Roman" w:hAnsi="Times New Roman"/>
+        </w:rPr>
+        <w:t xml:space="preserve"> chỉ `fit` (học tham số) trên Train rồi mới `transform` (áp dụng chuyển đổi) mù sang Test.</w:t>
       </w:r>
     </w:p>
     <w:p>
@@ -4126,32 +4218,33 @@
         <w:rPr>
           <w:rFonts w:ascii="Times New Roman" w:hAnsi="Times New Roman"/>
         </w:rPr>
+        <w:t xml:space="preserve">Toàn bộ khâu chọn ngưỡng và dò </w:t>
       </w:r>
       <w:r>
         <w:rPr>
           <w:rFonts w:ascii="Times New Roman" w:hAnsi="Times New Roman"/>
           <w:b/>
         </w:rPr>
-        <w:t>Tối ưu siêu tham số độc lập</w:t>
-      </w:r>
-      <w:r>
-        <w:rPr>
-          <w:rFonts w:ascii="Times New Roman" w:hAnsi="Times New Roman"/>
-        </w:rPr>
-        <w:t xml:space="preserve">: Toàn bộ khâu chọn ngưỡng và tune model đều dùng </w:t>
+        <w:t>Hyperparameters (siêu tham số)</w:t>
+      </w:r>
+      <w:r>
+        <w:rPr>
+          <w:rFonts w:ascii="Times New Roman" w:hAnsi="Times New Roman"/>
+        </w:rPr>
+        <w:t xml:space="preserve"> đều dùng </w:t>
       </w:r>
       <w:r>
         <w:rPr>
           <w:rFonts w:ascii="Times New Roman" w:hAnsi="Times New Roman"/>
           <w:b/>
         </w:rPr>
-        <w:t>5-Fold Stratified Cross-Validation nội bộ trên Train</w:t>
-      </w:r>
-      <w:r>
-        <w:rPr>
-          <w:rFonts w:ascii="Times New Roman" w:hAnsi="Times New Roman"/>
-        </w:rPr>
-        <w:t>, không chạm vào Test.</w:t>
+        <w:t>Cross-Validation (kiểm định chéo)</w:t>
+      </w:r>
+      <w:r>
+        <w:rPr>
+          <w:rFonts w:ascii="Times New Roman" w:hAnsi="Times New Roman"/>
+        </w:rPr>
+        <w:t xml:space="preserve"> nội bộ trên Train, không chạm vào Test.</w:t>
       </w:r>
     </w:p>
     <w:p>
@@ -4159,7 +4252,7 @@
         <w:rPr>
           <w:rFonts w:ascii="Times New Roman" w:hAnsi="Times New Roman"/>
         </w:rPr>
-        <w:t>Nhờ 4 nguyên tắc này, toàn bộ kết quả thực nghiệm của nhóm đều là số liệu thật và có giá trị tin cậy cao.</w:t>
+        <w:t>Nhờ 4 nguyên tắc này, toàn bộ kết quả thực nghiệm của nhóm đều đảm bảo tính khách quan và trung thực tuyệt đối.</w:t>
       </w:r>
     </w:p>
     <w:p>
@@ -4192,7 +4285,7 @@
           <w:rFonts w:ascii="Times New Roman" w:hAnsi="Times New Roman"/>
           <w:i/>
         </w:rPr>
-        <w:t>(Thời lượng chuẩn hóa: **~90s – 95s** [Sơn ~40s, Cẩm ~50s] [Meeting thực tế: ~200s] | Người nói: **Hoàng Cao Sơn** [phần RF] &amp; **Bùi Thị Mỷ Cẩm** [phần XGB])</w:t>
+        <w:t>(Thời lượng chuẩn hóa: **~154s** [Sơn ~40s, Cẩm ~114s / 258 từ] [Meeting thực tế: ~200s] | Người nói: **Hoàng Cao Sơn** [phần RF] &amp; **Bùi Thị Mỷ Cẩm** [phần XGB])</w:t>
       </w:r>
       <w:r>
         <w:rPr>
@@ -4211,7 +4304,7 @@
           <w:rFonts w:ascii="Times New Roman" w:hAnsi="Times New Roman"/>
           <w:i/>
         </w:rPr>
-        <w:t>(Phần 1 - Random Forest: **Hoàng Cao Sơn** trình bày)</w:t>
+        <w:t>(Phần 1 - Random Forest: **Hoàng Cao Sơn** trình bày - ~40s)</w:t>
       </w:r>
       <w:r>
         <w:rPr>
@@ -4224,20 +4317,20 @@
         <w:rPr>
           <w:rFonts w:ascii="Times New Roman" w:hAnsi="Times New Roman"/>
         </w:rPr>
-        <w:t xml:space="preserve">Dựa trên pipeline đó, mô hình có giám sát đầu tiên nhóm xây dựng là </w:t>
+        <w:t xml:space="preserve">Tại Slide 12, ở nửa bên trái là mô hình </w:t>
       </w:r>
       <w:r>
         <w:rPr>
           <w:rFonts w:ascii="Times New Roman" w:hAnsi="Times New Roman"/>
           <w:b/>
         </w:rPr>
-        <w:t>Random Forest</w:t>
-      </w:r>
-      <w:r>
-        <w:rPr>
-          <w:rFonts w:ascii="Times New Roman" w:hAnsi="Times New Roman"/>
-        </w:rPr>
-        <w:t xml:space="preserve"> ở bên trái. Nhóm sử dụng cơ chế Ensemble Bagging với 200 cây quyết định độc lập, tối ưu qua `RandomizedSearchCV` 50 vòng lặp, khống chế `max_depth = 20`, đồng thời áp dụng trọng số lớp cân bằng theo từng cây con.</w:t>
+        <w:t>Random Forest (Rừng ngẫu nhiên)</w:t>
+      </w:r>
+      <w:r>
+        <w:rPr>
+          <w:rFonts w:ascii="Times New Roman" w:hAnsi="Times New Roman"/>
+        </w:rPr>
+        <w:t xml:space="preserve"> do mình huấn luyện.</w:t>
       </w:r>
     </w:p>
     <w:p>
@@ -4245,46 +4338,59 @@
         <w:rPr>
           <w:rFonts w:ascii="Times New Roman" w:hAnsi="Times New Roman"/>
         </w:rPr>
-        <w:t xml:space="preserve">Khi kiểm thử trên 40,000 mẫu tập Test, mô hình đạt độ chính xác cực cao: </w:t>
+        <w:t xml:space="preserve">Về kiến trúc, mô hình tập hợp </w:t>
       </w:r>
       <w:r>
         <w:rPr>
           <w:rFonts w:ascii="Times New Roman" w:hAnsi="Times New Roman"/>
           <w:b/>
         </w:rPr>
-        <w:t>Precision = 99.94%</w:t>
-      </w:r>
-      <w:r>
-        <w:rPr>
-          <w:rFonts w:ascii="Times New Roman" w:hAnsi="Times New Roman"/>
-        </w:rPr>
-        <w:t xml:space="preserve"> (trên 38,357 giao dịch bình thường chỉ đoán nhầm đúng 1 ca), </w:t>
+        <w:t>200 Decision Trees (cây quyết định độc lập)</w:t>
+      </w:r>
+      <w:r>
+        <w:rPr>
+          <w:rFonts w:ascii="Times New Roman" w:hAnsi="Times New Roman"/>
+        </w:rPr>
+        <w:t xml:space="preserve"> theo cơ chế </w:t>
       </w:r>
       <w:r>
         <w:rPr>
           <w:rFonts w:ascii="Times New Roman" w:hAnsi="Times New Roman"/>
           <w:b/>
         </w:rPr>
-        <w:t>Recall = 99.51%</w:t>
-      </w:r>
-      <w:r>
-        <w:rPr>
-          <w:rFonts w:ascii="Times New Roman" w:hAnsi="Times New Roman"/>
-        </w:rPr>
-        <w:t xml:space="preserve">, và </w:t>
+        <w:t>Ensemble Bagging (học kết hợp đóng bao)</w:t>
+      </w:r>
+      <w:r>
+        <w:rPr>
+          <w:rFonts w:ascii="Times New Roman" w:hAnsi="Times New Roman"/>
+        </w:rPr>
+        <w:t xml:space="preserve">, phân nhánh tối ưu theo độ tinh khiết </w:t>
       </w:r>
       <w:r>
         <w:rPr>
           <w:rFonts w:ascii="Times New Roman" w:hAnsi="Times New Roman"/>
           <w:b/>
         </w:rPr>
-        <w:t>F1-Score = 0.9973</w:t>
-      </w:r>
-      <w:r>
-        <w:rPr>
-          <w:rFonts w:ascii="Times New Roman" w:hAnsi="Times New Roman"/>
-        </w:rPr>
-        <w:t>. Tuy nhiên, hạn chế của Random Forest là thời gian huấn luyện khá lâu, mất gần 20 phút.</w:t>
+        <w:t>Gini</w:t>
+      </w:r>
+      <w:r>
+        <w:rPr>
+          <w:rFonts w:ascii="Times New Roman" w:hAnsi="Times New Roman"/>
+        </w:rPr>
+        <w:t xml:space="preserve"> như công thức trên slide. Để chống </w:t>
+      </w:r>
+      <w:r>
+        <w:rPr>
+          <w:rFonts w:ascii="Times New Roman" w:hAnsi="Times New Roman"/>
+          <w:b/>
+        </w:rPr>
+        <w:t>Overfitting (học vẹt)</w:t>
+      </w:r>
+      <w:r>
+        <w:rPr>
+          <w:rFonts w:ascii="Times New Roman" w:hAnsi="Times New Roman"/>
+        </w:rPr>
+        <w:t>, mình khống chế độ sâu tối đa `max_depth = 20`.</w:t>
       </w:r>
     </w:p>
     <w:p>
@@ -4292,94 +4398,101 @@
         <w:rPr>
           <w:rFonts w:ascii="Times New Roman" w:hAnsi="Times New Roman"/>
         </w:rPr>
-        <w:t xml:space="preserve">Để giải quyết bài toán tốc độ, phần tiếp theo sẽ do bạn </w:t>
+        <w:t xml:space="preserve">🎯 </w:t>
       </w:r>
       <w:r>
         <w:rPr>
           <w:rFonts w:ascii="Times New Roman" w:hAnsi="Times New Roman"/>
           <w:b/>
         </w:rPr>
-        <w:t>Bùi Thị Mỷ Cẩm</w:t>
-      </w:r>
-      <w:r>
-        <w:rPr>
-          <w:rFonts w:ascii="Times New Roman" w:hAnsi="Times New Roman"/>
-        </w:rPr>
-        <w:t xml:space="preserve"> trình bày về mô hình XGBoost.</w:t>
+        <w:t>Kết quả thực nghiệm nổi bật:</w:t>
+      </w:r>
+      <w:r>
+        <w:rPr>
+          <w:rFonts w:ascii="Times New Roman" w:hAnsi="Times New Roman"/>
+        </w:rPr>
       </w:r>
     </w:p>
     <w:p>
-      <w:r>
-        <w:rPr>
-          <w:rFonts w:ascii="Times New Roman" w:hAnsi="Times New Roman"/>
-        </w:rPr>
-      </w:r>
-      <w:r>
-        <w:rPr>
-          <w:rFonts w:ascii="Times New Roman" w:hAnsi="Times New Roman"/>
-          <w:i/>
-        </w:rPr>
-        <w:t>(Phần 2 - XGBoost: **Bùi Thị Mỷ Cẩm** tiếp lời)</w:t>
-      </w:r>
-      <w:r>
-        <w:rPr>
-          <w:rFonts w:ascii="Times New Roman" w:hAnsi="Times New Roman"/>
-        </w:rPr>
+      <w:pPr>
+        <w:pStyle w:val="ListBullet"/>
+      </w:pPr>
+      <w:r>
+        <w:rPr>
+          <w:rFonts w:ascii="Times New Roman" w:hAnsi="Times New Roman"/>
+        </w:rPr>
+      </w:r>
+      <w:r>
+        <w:rPr>
+          <w:rFonts w:ascii="Times New Roman" w:hAnsi="Times New Roman"/>
+          <w:b/>
+        </w:rPr>
+        <w:t>Peak Precision (độ chuẩn xác đỉnh cao) đạt 99.94%:</w:t>
+      </w:r>
+      <w:r>
+        <w:rPr>
+          <w:rFonts w:ascii="Times New Roman" w:hAnsi="Times New Roman"/>
+        </w:rPr>
+        <w:t xml:space="preserve"> Trong 38.357 giao dịch hợp lệ, mô hình chỉ báo nhầm duy nhất </w:t>
+      </w:r>
+      <w:r>
+        <w:rPr>
+          <w:rFonts w:ascii="Times New Roman" w:hAnsi="Times New Roman"/>
+          <w:b/>
+        </w:rPr>
+        <w:t>đúng 1 ca</w:t>
+      </w:r>
+      <w:r>
+        <w:rPr>
+          <w:rFonts w:ascii="Times New Roman" w:hAnsi="Times New Roman"/>
+        </w:rPr>
+        <w:t>!</w:t>
       </w:r>
     </w:p>
     <w:p>
-      <w:r>
-        <w:rPr>
-          <w:rFonts w:ascii="Times New Roman" w:hAnsi="Times New Roman"/>
-        </w:rPr>
-        <w:t xml:space="preserve">Dạ em chào thầy và các bạn, em là </w:t>
+      <w:pPr>
+        <w:pStyle w:val="ListBullet"/>
+      </w:pPr>
+      <w:r>
+        <w:rPr>
+          <w:rFonts w:ascii="Times New Roman" w:hAnsi="Times New Roman"/>
+        </w:rPr>
       </w:r>
       <w:r>
         <w:rPr>
           <w:rFonts w:ascii="Times New Roman" w:hAnsi="Times New Roman"/>
           <w:b/>
         </w:rPr>
-        <w:t>Bùi Thị Mỷ Cẩm</w:t>
-      </w:r>
-      <w:r>
-        <w:rPr>
-          <w:rFonts w:ascii="Times New Roman" w:hAnsi="Times New Roman"/>
-        </w:rPr>
-        <w:t xml:space="preserve">. Em đảm nhận việc huấn luyện mô hình </w:t>
-      </w:r>
-      <w:r>
-        <w:rPr>
-          <w:rFonts w:ascii="Times New Roman" w:hAnsi="Times New Roman"/>
-          <w:b/>
-        </w:rPr>
-        <w:t>XGBoost</w:t>
-      </w:r>
-      <w:r>
-        <w:rPr>
-          <w:rFonts w:ascii="Times New Roman" w:hAnsi="Times New Roman"/>
-        </w:rPr>
-        <w:t xml:space="preserve"> ở bên phải:</w:t>
+        <w:t>F1-Score đạt 0.9973:</w:t>
+      </w:r>
+      <w:r>
+        <w:rPr>
+          <w:rFonts w:ascii="Times New Roman" w:hAnsi="Times New Roman"/>
+        </w:rPr>
+        <w:t xml:space="preserve"> Đưa Random Forest trở thành mô hình có độ chính xác cao nhất toàn đồ án.</w:t>
       </w:r>
     </w:p>
     <w:p>
-      <w:r>
-        <w:rPr>
-          <w:rFonts w:ascii="Times New Roman" w:hAnsi="Times New Roman"/>
-        </w:rPr>
-        <w:t>Về cơ chế, XGBoost tối ưu hàm mục tiêu xấp xỉ bậc 2 sử dụng cả Gradient bậc 1 ($g</w:t>
-      </w:r>
-      <w:r>
-        <w:rPr>
-          <w:rFonts w:ascii="Times New Roman" w:hAnsi="Times New Roman"/>
-          <w:i/>
-        </w:rPr>
-        <w:t>i$) và Hessian bậc 2 ($h</w:t>
-      </w:r>
-      <w:r>
-        <w:rPr>
-          <w:rFonts w:ascii="Times New Roman" w:hAnsi="Times New Roman"/>
-        </w:rPr>
-        <w:t>i$) của hàm mất mát, kết hợp số hạng điều chuẩn $\Omega(f_t)$ để kiểm soát độ sâu cây và chống Overfitting.</w:t>
+      <w:pPr>
+        <w:pStyle w:val="ListBullet"/>
+      </w:pPr>
+      <w:r>
+        <w:rPr>
+          <w:rFonts w:ascii="Times New Roman" w:hAnsi="Times New Roman"/>
+        </w:rPr>
+      </w:r>
+      <w:r>
+        <w:rPr>
+          <w:rFonts w:ascii="Times New Roman" w:hAnsi="Times New Roman"/>
+          <w:b/>
+        </w:rPr>
+        <w:t>Hạn chế:</w:t>
+      </w:r>
+      <w:r>
+        <w:rPr>
+          <w:rFonts w:ascii="Times New Roman" w:hAnsi="Times New Roman"/>
+        </w:rPr>
+        <w:t xml:space="preserve"> Thời gian huấn luyện khá lâu, mất gần 20 phút (~1187 giây).</w:t>
       </w:r>
     </w:p>
     <w:p>
@@ -4387,58 +4500,259 @@
         <w:rPr>
           <w:rFonts w:ascii="Times New Roman" w:hAnsi="Times New Roman"/>
         </w:rPr>
+        <w:t xml:space="preserve">Để giải quyết bài toán tốc độ, phần tiếp theo sẽ do bạn </w:t>
       </w:r>
       <w:r>
         <w:rPr>
           <w:rFonts w:ascii="Times New Roman" w:hAnsi="Times New Roman"/>
           <w:b/>
         </w:rPr>
-        <w:t>Ưu thế vượt trội:</w:t>
-      </w:r>
-      <w:r>
-        <w:rPr>
-          <w:rFonts w:ascii="Times New Roman" w:hAnsi="Times New Roman"/>
-        </w:rPr>
-        <w:t xml:space="preserve"> XGBoost đạt </w:t>
+        <w:t>Bùi Thị Mỷ Cẩm</w:t>
+      </w:r>
+      <w:r>
+        <w:rPr>
+          <w:rFonts w:ascii="Times New Roman" w:hAnsi="Times New Roman"/>
+        </w:rPr>
+        <w:t xml:space="preserve"> trình bày về mô hình XGBoost.</w:t>
+      </w:r>
+    </w:p>
+    <w:p>
+      <w:r>
+        <w:rPr>
+          <w:rFonts w:ascii="Times New Roman" w:hAnsi="Times New Roman"/>
+        </w:rPr>
+      </w:r>
+      <w:r>
+        <w:rPr>
+          <w:rFonts w:ascii="Times New Roman" w:hAnsi="Times New Roman"/>
+          <w:i/>
+        </w:rPr>
+        <w:t>(Phần 2 - XGBoost: **Bùi Thị Mỷ Cẩm** tiếp lời)</w:t>
+      </w:r>
+      <w:r>
+        <w:rPr>
+          <w:rFonts w:ascii="Times New Roman" w:hAnsi="Times New Roman"/>
+        </w:rPr>
+      </w:r>
+    </w:p>
+    <w:p>
+      <w:r>
+        <w:rPr>
+          <w:rFonts w:ascii="Times New Roman" w:hAnsi="Times New Roman"/>
+        </w:rPr>
+      </w:r>
+      <w:r>
+        <w:rPr>
+          <w:rFonts w:ascii="Times New Roman" w:hAnsi="Times New Roman"/>
+          <w:i/>
+        </w:rPr>
+        <w:t>(Anh Sơn vừa nói xong: Random Forest rất chính xác nhưng train mất gần 20 phút)</w:t>
+      </w:r>
+      <w:r>
+        <w:rPr>
+          <w:rFonts w:ascii="Times New Roman" w:hAnsi="Times New Roman"/>
+        </w:rPr>
+      </w:r>
+    </w:p>
+    <w:p>
+      <w:r>
+        <w:rPr>
+          <w:rFonts w:ascii="Times New Roman" w:hAnsi="Times New Roman"/>
+        </w:rPr>
+        <w:t xml:space="preserve">Dạ em cảm ơn anh Sơn. Em chào thầy và các bạn, em là Cẩm, em phụ trách mô hình </w:t>
       </w:r>
       <w:r>
         <w:rPr>
           <w:rFonts w:ascii="Times New Roman" w:hAnsi="Times New Roman"/>
           <w:b/>
         </w:rPr>
-        <w:t>F1-Score = 99.63%</w:t>
-      </w:r>
-      <w:r>
-        <w:rPr>
-          <w:rFonts w:ascii="Times New Roman" w:hAnsi="Times New Roman"/>
-        </w:rPr>
-        <w:t xml:space="preserve">, tương đương Random Forest, nhưng </w:t>
+        <w:t>XGBoost</w:t>
+      </w:r>
+      <w:r>
+        <w:rPr>
+          <w:rFonts w:ascii="Times New Roman" w:hAnsi="Times New Roman"/>
+        </w:rPr>
+        <w:t xml:space="preserve"> và </w:t>
       </w:r>
       <w:r>
         <w:rPr>
           <w:rFonts w:ascii="Times New Roman" w:hAnsi="Times New Roman"/>
           <w:b/>
         </w:rPr>
-        <w:t>thời gian huấn luyện nhanh gấp 28.5 lần — chỉ mất 41.7 giây!</w:t>
-      </w:r>
-      <w:r>
-        <w:rPr>
-          <w:rFonts w:ascii="Times New Roman" w:hAnsi="Times New Roman"/>
-        </w:rPr>
-        <w:t xml:space="preserve"> Độ trễ suy luận cho mỗi giao dịch chỉ dưới </w:t>
+        <w:t>Deep Autoencoder</w:t>
+      </w:r>
+      <w:r>
+        <w:rPr>
+          <w:rFonts w:ascii="Times New Roman" w:hAnsi="Times New Roman"/>
+        </w:rPr>
+        <w:t>.</w:t>
+      </w:r>
+    </w:p>
+    <w:p>
+      <w:r>
+        <w:rPr>
+          <w:rFonts w:ascii="Times New Roman" w:hAnsi="Times New Roman"/>
+        </w:rPr>
+        <w:t>Như anh Sơn vừa trình bày thì Random Forest rất chính xác nhưng train khá lâu. XGBoost ở khung bên phải là hướng tiếp cận nhanh hơn cho cùng bài toán.</w:t>
+      </w:r>
+    </w:p>
+    <w:p>
+      <w:r>
+        <w:rPr>
+          <w:rFonts w:ascii="Times New Roman" w:hAnsi="Times New Roman"/>
+        </w:rPr>
+        <w:t xml:space="preserve">Thầy và các bạn có thể hình dung thế này: Random Forest là hàng trăm cây </w:t>
+      </w:r>
+      <w:r>
+        <w:rPr>
+          <w:rFonts w:ascii="Times New Roman" w:hAnsi="Times New Roman"/>
+          <w:i/>
+        </w:rPr>
+        <w:t>làm độc lập</w:t>
+      </w:r>
+      <w:r>
+        <w:rPr>
+          <w:rFonts w:ascii="Times New Roman" w:hAnsi="Times New Roman"/>
+        </w:rPr>
+        <w:t xml:space="preserve"> rồi bỏ phiếu. Còn XGBoost thuộc họ Gradient Boosting (tăng cường theo độ dốc), các cây được xây </w:t>
+      </w:r>
+      <w:r>
+        <w:rPr>
+          <w:rFonts w:ascii="Times New Roman" w:hAnsi="Times New Roman"/>
+          <w:i/>
+        </w:rPr>
+        <w:t>nối tiếp</w:t>
+      </w:r>
+      <w:r>
+        <w:rPr>
+          <w:rFonts w:ascii="Times New Roman" w:hAnsi="Times New Roman"/>
+        </w:rPr>
+        <w:t xml:space="preserve"> nhau — cây sau sinh ra để sửa đúng những chỗ cây trước làm sai. Để biết sửa theo hướng nào, XGBoost dùng cả gradient (đạo hàm bậc một) lẫn Hessian (đạo hàm bậc hai) — nói đơn giản là nó không chỉ biết hướng đi mà còn biết độ cong của địa hình, nên mỗi bước sửa vừa chuẩn vừa nhanh. </w:t>
+      </w:r>
+      <w:r>
+        <w:rPr>
+          <w:rFonts w:ascii="Times New Roman" w:hAnsi="Times New Roman"/>
+          <w:i/>
+        </w:rPr>
+        <w:t>(chỉ vào công thức)</w:t>
+      </w:r>
+      <w:r>
+        <w:rPr>
+          <w:rFonts w:ascii="Times New Roman" w:hAnsi="Times New Roman"/>
+        </w:rPr>
+        <w:t xml:space="preserve"> Còn công thức phạt này là </w:t>
       </w:r>
       <w:r>
         <w:rPr>
           <w:rFonts w:ascii="Times New Roman" w:hAnsi="Times New Roman"/>
           <w:b/>
         </w:rPr>
-        <w:t>0.5 mili-giây</w:t>
-      </w:r>
-      <w:r>
-        <w:rPr>
-          <w:rFonts w:ascii="Times New Roman" w:hAnsi="Times New Roman"/>
-        </w:rPr>
-        <w:t>, cực kỳ lý tưởng để triển khai vào các cổng thanh toán xử lý thời gian thực.</w:t>
+        <w:t>L2 regularization</w:t>
+      </w:r>
+      <w:r>
+        <w:rPr>
+          <w:rFonts w:ascii="Times New Roman" w:hAnsi="Times New Roman"/>
+        </w:rPr>
+        <w:t xml:space="preserve"> (điều chuẩn L2) cộng với phạt số lá, giữ cho cây không quá phức tạp để tránh </w:t>
+      </w:r>
+      <w:r>
+        <w:rPr>
+          <w:rFonts w:ascii="Times New Roman" w:hAnsi="Times New Roman"/>
+          <w:b/>
+        </w:rPr>
+        <w:t>Overfitting</w:t>
+      </w:r>
+      <w:r>
+        <w:rPr>
+          <w:rFonts w:ascii="Times New Roman" w:hAnsi="Times New Roman"/>
+        </w:rPr>
+        <w:t xml:space="preserve"> (học vẹt).</w:t>
+      </w:r>
+    </w:p>
+    <w:p>
+      <w:r>
+        <w:rPr>
+          <w:rFonts w:ascii="Times New Roman" w:hAnsi="Times New Roman"/>
+        </w:rPr>
+        <w:t xml:space="preserve">Kết quả là </w:t>
+      </w:r>
+      <w:r>
+        <w:rPr>
+          <w:rFonts w:ascii="Times New Roman" w:hAnsi="Times New Roman"/>
+          <w:b/>
+        </w:rPr>
+        <w:t>F1-Score 99.63%</w:t>
+      </w:r>
+      <w:r>
+        <w:rPr>
+          <w:rFonts w:ascii="Times New Roman" w:hAnsi="Times New Roman"/>
+        </w:rPr>
+        <w:t xml:space="preserve"> — ngang ngửa Random Forest — nhưng thời gian huấn luyện </w:t>
+      </w:r>
+      <w:r>
+        <w:rPr>
+          <w:rFonts w:ascii="Times New Roman" w:hAnsi="Times New Roman"/>
+          <w:b/>
+        </w:rPr>
+        <w:t>chưa tới một phút</w:t>
+      </w:r>
+      <w:r>
+        <w:rPr>
+          <w:rFonts w:ascii="Times New Roman" w:hAnsi="Times New Roman"/>
+        </w:rPr>
+        <w:t xml:space="preserve">, trong khi Random Forest mất gần 20 phút, tức là nhanh hơn </w:t>
+      </w:r>
+      <w:r>
+        <w:rPr>
+          <w:rFonts w:ascii="Times New Roman" w:hAnsi="Times New Roman"/>
+          <w:b/>
+        </w:rPr>
+        <w:t>hơn 20 lần</w:t>
+      </w:r>
+      <w:r>
+        <w:rPr>
+          <w:rFonts w:ascii="Times New Roman" w:hAnsi="Times New Roman"/>
+        </w:rPr>
+        <w:t xml:space="preserve">. Và </w:t>
+      </w:r>
+      <w:r>
+        <w:rPr>
+          <w:rFonts w:ascii="Times New Roman" w:hAnsi="Times New Roman"/>
+          <w:b/>
+        </w:rPr>
+        <w:t>inference latency</w:t>
+      </w:r>
+      <w:r>
+        <w:rPr>
+          <w:rFonts w:ascii="Times New Roman" w:hAnsi="Times New Roman"/>
+        </w:rPr>
+        <w:t xml:space="preserve"> (độ trễ suy luận) chỉ cỡ </w:t>
+      </w:r>
+      <w:r>
+        <w:rPr>
+          <w:rFonts w:ascii="Times New Roman" w:hAnsi="Times New Roman"/>
+          <w:b/>
+        </w:rPr>
+        <w:t>nửa mili-giây</w:t>
+      </w:r>
+      <w:r>
+        <w:rPr>
+          <w:rFonts w:ascii="Times New Roman" w:hAnsi="Times New Roman"/>
+        </w:rPr>
+        <w:t xml:space="preserve"> cho một giao dịch, rất hợp với cổng thanh toán </w:t>
+      </w:r>
+      <w:r>
+        <w:rPr>
+          <w:rFonts w:ascii="Times New Roman" w:hAnsi="Times New Roman"/>
+          <w:b/>
+        </w:rPr>
+        <w:t>real-time</w:t>
+      </w:r>
+      <w:r>
+        <w:rPr>
+          <w:rFonts w:ascii="Times New Roman" w:hAnsi="Times New Roman"/>
+        </w:rPr>
+        <w:t xml:space="preserve"> (thời gian thực). Vì vậy XGBoost là mô hình mà phần demo phía sau dùng để chấm điểm trực tiếp ạ.</w:t>
       </w:r>
     </w:p>
     <w:p>
@@ -4471,7 +4785,7 @@
           <w:rFonts w:ascii="Times New Roman" w:hAnsi="Times New Roman"/>
           <w:i/>
         </w:rPr>
-        <w:t>(Thời lượng chuẩn hóa: **~105s – 110s** [Meeting thực tế: ~85s] | Người nói: **Bùi Thị Mỷ Cẩm** - Modeling XGB &amp; Autoencoder Lead)</w:t>
+        <w:t>(Thời lượng chuẩn hóa: **~181s** [409 từ ÷ 135.5 WPM] [Meeting thực tế: ~85s] | Người nói: **Bùi Thị Mỷ Cẩm** - Modeling XGB &amp; Autoencoder Lead)</w:t>
       </w:r>
       <w:r>
         <w:rPr>
@@ -4484,7 +4798,18 @@
         <w:rPr>
           <w:rFonts w:ascii="Times New Roman" w:hAnsi="Times New Roman"/>
         </w:rPr>
-        <w:t>Em đặt ra một câu hỏi: *"Nếu kẻ gian dùng một hình thức lừa đảo hoàn toàn mới, chưa từng có nhãn trong quá khứ thì mô hình có giám sát có còn phát hiện được không?"*</w:t>
+      </w:r>
+      <w:r>
+        <w:rPr>
+          <w:rFonts w:ascii="Times New Roman" w:hAnsi="Times New Roman"/>
+          <w:i/>
+        </w:rPr>
+        <w:t>(Dừng một nhịp, đổi giọng sang đặt vấn đề.)</w:t>
+      </w:r>
+      <w:r>
+        <w:rPr>
+          <w:rFonts w:ascii="Times New Roman" w:hAnsi="Times New Roman"/>
+        </w:rPr>
       </w:r>
     </w:p>
     <w:p>
@@ -4492,20 +4817,33 @@
         <w:rPr>
           <w:rFonts w:ascii="Times New Roman" w:hAnsi="Times New Roman"/>
         </w:rPr>
-        <w:t xml:space="preserve">Để trả lời, em xây dựng thêm mô hình không giám sát </w:t>
+        <w:t xml:space="preserve">Nhưng cả Random Forest và XGBoost có một điểm chung: đều là Supervised Learning (học có giám sát) — nghĩa là phải có </w:t>
       </w:r>
       <w:r>
         <w:rPr>
           <w:rFonts w:ascii="Times New Roman" w:hAnsi="Times New Roman"/>
           <w:b/>
         </w:rPr>
-        <w:t>Deep Autoencoder</w:t>
-      </w:r>
-      <w:r>
-        <w:rPr>
-          <w:rFonts w:ascii="Times New Roman" w:hAnsi="Times New Roman"/>
-        </w:rPr>
-        <w:t>:</w:t>
+        <w:t>nhãn</w:t>
+      </w:r>
+      <w:r>
+        <w:rPr>
+          <w:rFonts w:ascii="Times New Roman" w:hAnsi="Times New Roman"/>
+        </w:rPr>
+        <w:t xml:space="preserve">. Chúng chỉ giỏi bắt những kiểu gian lận mà đã từng được nhìn thấy. Vậy </w:t>
+      </w:r>
+      <w:r>
+        <w:rPr>
+          <w:rFonts w:ascii="Times New Roman" w:hAnsi="Times New Roman"/>
+          <w:i/>
+        </w:rPr>
+        <w:t>nếu kẻ gian nghĩ ra một chiêu hoàn toàn mới, chưa có nhãn nào</w:t>
+      </w:r>
+      <w:r>
+        <w:rPr>
+          <w:rFonts w:ascii="Times New Roman" w:hAnsi="Times New Roman"/>
+        </w:rPr>
+        <w:t xml:space="preserve"> thì sao?</w:t>
       </w:r>
     </w:p>
     <w:p>
@@ -4513,7 +4851,33 @@
         <w:rPr>
           <w:rFonts w:ascii="Times New Roman" w:hAnsi="Times New Roman"/>
         </w:rPr>
-        <w:t>Kiến trúc mạng đối xứng gồm: 14 chiều đầu vào ➔ qua 2 tầng nén 16 và 8 chiều ➔ nút cổ chai Bottleneck 4 chiều ➔ giải mã qua 8 và 16 chiều ➔ và tái tạo lại 14 chiều đầu ra.</w:t>
+        <w:t xml:space="preserve">Để bổ sung cho trường hợp đó, em xây thêm </w:t>
+      </w:r>
+      <w:r>
+        <w:rPr>
+          <w:rFonts w:ascii="Times New Roman" w:hAnsi="Times New Roman"/>
+          <w:b/>
+        </w:rPr>
+        <w:t>Deep Autoencoder</w:t>
+      </w:r>
+      <w:r>
+        <w:rPr>
+          <w:rFonts w:ascii="Times New Roman" w:hAnsi="Times New Roman"/>
+        </w:rPr>
+        <w:t xml:space="preserve"> (mạng tự mã hóa sâu), học theo hướng </w:t>
+      </w:r>
+      <w:r>
+        <w:rPr>
+          <w:rFonts w:ascii="Times New Roman" w:hAnsi="Times New Roman"/>
+          <w:b/>
+        </w:rPr>
+        <w:t>Unsupervised</w:t>
+      </w:r>
+      <w:r>
+        <w:rPr>
+          <w:rFonts w:ascii="Times New Roman" w:hAnsi="Times New Roman"/>
+        </w:rPr>
+        <w:t xml:space="preserve"> (không giám sát).</w:t>
       </w:r>
     </w:p>
     <w:p>
@@ -4521,20 +4885,87 @@
         <w:rPr>
           <w:rFonts w:ascii="Times New Roman" w:hAnsi="Times New Roman"/>
         </w:rPr>
-        <w:t xml:space="preserve">Nguyên lý phát hiện gồm </w:t>
+        <w:t>Ý tưởng rất đời thường: giống một nhân viên kế toán làm việc nhiều năm chỉ với hóa đơn hợp lệ — chưa cần ai dạy "hóa đơn giả trông thế nào", nhưng cứ đưa một tờ bất thường là họ thấy "sai sai" ngay.</w:t>
+      </w:r>
+    </w:p>
+    <w:p>
+      <w:r>
+        <w:rPr>
+          <w:rFonts w:ascii="Times New Roman" w:hAnsi="Times New Roman"/>
+        </w:rPr>
+      </w:r>
+      <w:r>
+        <w:rPr>
+          <w:rFonts w:ascii="Times New Roman" w:hAnsi="Times New Roman"/>
+          <w:i/>
+        </w:rPr>
+        <w:t>(chỉ vào sơ đồ mạng ở đầu slide)</w:t>
+      </w:r>
+      <w:r>
+        <w:rPr>
+          <w:rFonts w:ascii="Times New Roman" w:hAnsi="Times New Roman"/>
+        </w:rPr>
+        <w:t xml:space="preserve"> Về kiến trúc: mạng nhận vào vector 14 chiều, phần </w:t>
       </w:r>
       <w:r>
         <w:rPr>
           <w:rFonts w:ascii="Times New Roman" w:hAnsi="Times New Roman"/>
           <w:b/>
         </w:rPr>
-        <w:t>3 giai đoạn</w:t>
-      </w:r>
-      <w:r>
-        <w:rPr>
-          <w:rFonts w:ascii="Times New Roman" w:hAnsi="Times New Roman"/>
-        </w:rPr>
-        <w:t>:</w:t>
+        <w:t>encoder</w:t>
+      </w:r>
+      <w:r>
+        <w:rPr>
+          <w:rFonts w:ascii="Times New Roman" w:hAnsi="Times New Roman"/>
+        </w:rPr>
+        <w:t xml:space="preserve"> (bộ mã hóa) nén dần qua các lớp 16, rồi 8, xuống </w:t>
+      </w:r>
+      <w:r>
+        <w:rPr>
+          <w:rFonts w:ascii="Times New Roman" w:hAnsi="Times New Roman"/>
+          <w:b/>
+        </w:rPr>
+        <w:t>bottleneck</w:t>
+      </w:r>
+      <w:r>
+        <w:rPr>
+          <w:rFonts w:ascii="Times New Roman" w:hAnsi="Times New Roman"/>
+        </w:rPr>
+        <w:t xml:space="preserve"> (nút cổ chai) chỉ còn 4 chiều; sau đó phần </w:t>
+      </w:r>
+      <w:r>
+        <w:rPr>
+          <w:rFonts w:ascii="Times New Roman" w:hAnsi="Times New Roman"/>
+          <w:b/>
+        </w:rPr>
+        <w:t>decoder</w:t>
+      </w:r>
+      <w:r>
+        <w:rPr>
+          <w:rFonts w:ascii="Times New Roman" w:hAnsi="Times New Roman"/>
+        </w:rPr>
+        <w:t xml:space="preserve"> (bộ giải mã) giãn ngược lại 8, 16 và về 14 chiều. Vì nút cổ chai quá hẹp, mạng không thể học vẹt — nó buộc phải giữ lại cái </w:t>
+      </w:r>
+      <w:r>
+        <w:rPr>
+          <w:rFonts w:ascii="Times New Roman" w:hAnsi="Times New Roman"/>
+          <w:i/>
+        </w:rPr>
+        <w:t>cốt lõi</w:t>
+      </w:r>
+      <w:r>
+        <w:rPr>
+          <w:rFonts w:ascii="Times New Roman" w:hAnsi="Times New Roman"/>
+        </w:rPr>
+        <w:t xml:space="preserve"> của giao dịch.</w:t>
+      </w:r>
+    </w:p>
+    <w:p>
+      <w:r>
+        <w:rPr>
+          <w:rFonts w:ascii="Times New Roman" w:hAnsi="Times New Roman"/>
+        </w:rPr>
+        <w:t>Nguyên lý chạy qua 3 giai đoạn:</w:t>
       </w:r>
     </w:p>
     <w:p>
@@ -4551,26 +4982,26 @@
           <w:rFonts w:ascii="Times New Roman" w:hAnsi="Times New Roman"/>
           <w:b/>
         </w:rPr>
-        <w:t>Giai đoạn 1 - Học chuẩn</w:t>
-      </w:r>
-      <w:r>
-        <w:rPr>
-          <w:rFonts w:ascii="Times New Roman" w:hAnsi="Times New Roman"/>
-        </w:rPr>
-        <w:t xml:space="preserve">: Mạng </w:t>
+        <w:t>Một, học chuẩn</w:t>
+      </w:r>
+      <w:r>
+        <w:rPr>
+          <w:rFonts w:ascii="Times New Roman" w:hAnsi="Times New Roman"/>
+        </w:rPr>
+        <w:t xml:space="preserve">: mạng _chỉ_ được huấn luyện trên giao dịch </w:t>
       </w:r>
       <w:r>
         <w:rPr>
           <w:rFonts w:ascii="Times New Roman" w:hAnsi="Times New Roman"/>
           <w:b/>
         </w:rPr>
-        <w:t>chỉ huấn luyện trên giao dịch hợp lệ</w:t>
-      </w:r>
-      <w:r>
-        <w:rPr>
-          <w:rFonts w:ascii="Times New Roman" w:hAnsi="Times New Roman"/>
-        </w:rPr>
-        <w:t>, học cách nén và tái tạo cấu trúc luồng tiền bình thường.</w:t>
+        <w:t>hợp lệ</w:t>
+      </w:r>
+      <w:r>
+        <w:rPr>
+          <w:rFonts w:ascii="Times New Roman" w:hAnsi="Times New Roman"/>
+        </w:rPr>
+        <w:t>, không dùng nhãn gian lận. Nó học "dòng tiền bình thường trông như thế nào".</w:t>
       </w:r>
     </w:p>
     <w:p>
@@ -4587,13 +5018,39 @@
           <w:rFonts w:ascii="Times New Roman" w:hAnsi="Times New Roman"/>
           <w:b/>
         </w:rPr>
-        <w:t>Giai đoạn 2 - Bắt lỗi</w:t>
-      </w:r>
-      <w:r>
-        <w:rPr>
-          <w:rFonts w:ascii="Times New Roman" w:hAnsi="Times New Roman"/>
-        </w:rPr>
-        <w:t>: Khi gặp giao dịch gian lận bất thường, mạng không thể tái tạo chính xác, khiến sai số tái tạo MSE ($L_{\text{rec}}$) tăng vọt.</w:t>
+        <w:t>Hai, bắt lỗi</w:t>
+      </w:r>
+      <w:r>
+        <w:rPr>
+          <w:rFonts w:ascii="Times New Roman" w:hAnsi="Times New Roman"/>
+        </w:rPr>
+        <w:t xml:space="preserve">: khi gặp giao dịch gian lận, cấu trúc dòng tiền lạ so với những gì nó đã học, nên nó tái tạo rất tệ — </w:t>
+      </w:r>
+      <w:r>
+        <w:rPr>
+          <w:rFonts w:ascii="Times New Roman" w:hAnsi="Times New Roman"/>
+          <w:b/>
+        </w:rPr>
+        <w:t>reconstruction error</w:t>
+      </w:r>
+      <w:r>
+        <w:rPr>
+          <w:rFonts w:ascii="Times New Roman" w:hAnsi="Times New Roman"/>
+        </w:rPr>
+        <w:t xml:space="preserve"> (sai số tái tạo), đo bằng </w:t>
+      </w:r>
+      <w:r>
+        <w:rPr>
+          <w:rFonts w:ascii="Times New Roman" w:hAnsi="Times New Roman"/>
+          <w:b/>
+        </w:rPr>
+        <w:t>MSE</w:t>
+      </w:r>
+      <w:r>
+        <w:rPr>
+          <w:rFonts w:ascii="Times New Roman" w:hAnsi="Times New Roman"/>
+        </w:rPr>
+        <w:t>, tăng vọt.</w:t>
       </w:r>
     </w:p>
     <w:p>
@@ -4610,13 +5067,26 @@
           <w:rFonts w:ascii="Times New Roman" w:hAnsi="Times New Roman"/>
           <w:b/>
         </w:rPr>
-        <w:t>Giai đoạn 3 - Ra quyết định</w:t>
-      </w:r>
-      <w:r>
-        <w:rPr>
-          <w:rFonts w:ascii="Times New Roman" w:hAnsi="Times New Roman"/>
-        </w:rPr>
-        <w:t>: Hệ thống gắn cờ gian lận nếu sai số vượt ngưỡng $\tau = 0.0455$ (tương ứng phân vị thứ 95).</w:t>
+        <w:t>Ba, ra quyết định</w:t>
+      </w:r>
+      <w:r>
+        <w:rPr>
+          <w:rFonts w:ascii="Times New Roman" w:hAnsi="Times New Roman"/>
+        </w:rPr>
+        <w:t xml:space="preserve">: sai số vượt </w:t>
+      </w:r>
+      <w:r>
+        <w:rPr>
+          <w:rFonts w:ascii="Times New Roman" w:hAnsi="Times New Roman"/>
+          <w:b/>
+        </w:rPr>
+        <w:t>ngưỡng τ = 0.0455</w:t>
+      </w:r>
+      <w:r>
+        <w:rPr>
+          <w:rFonts w:ascii="Times New Roman" w:hAnsi="Times New Roman"/>
+        </w:rPr>
+        <w:t xml:space="preserve"> thì hệ thống gắn cờ cảnh báo.</w:t>
       </w:r>
     </w:p>
     <w:p>
@@ -4624,54 +5094,65 @@
         <w:rPr>
           <w:rFonts w:ascii="Times New Roman" w:hAnsi="Times New Roman"/>
         </w:rPr>
-        <w:t xml:space="preserve">Nhờ vậy, dù </w:t>
+        <w:t xml:space="preserve">Kết quả trên tập Test: dù trong lúc huấn luyện mạng không hề biết nhãn gian lận, Autoencoder vẫn bắt được </w:t>
       </w:r>
       <w:r>
         <w:rPr>
           <w:rFonts w:ascii="Times New Roman" w:hAnsi="Times New Roman"/>
           <w:b/>
         </w:rPr>
-        <w:t>không dùng nhãn gian lận khi huấn luyện mạng</w:t>
-      </w:r>
-      <w:r>
-        <w:rPr>
-          <w:rFonts w:ascii="Times New Roman" w:hAnsi="Times New Roman"/>
-        </w:rPr>
-        <w:t xml:space="preserve">, Autoencoder vẫn đạt </w:t>
+        <w:t>75.23% Recall</w:t>
+      </w:r>
+      <w:r>
+        <w:rPr>
+          <w:rFonts w:ascii="Times New Roman" w:hAnsi="Times New Roman"/>
+        </w:rPr>
+        <w:t xml:space="preserve"> — tức 1,236 trên 1,643 vụ gian lận. Em đặt nó ở vai trò </w:t>
       </w:r>
       <w:r>
         <w:rPr>
           <w:rFonts w:ascii="Times New Roman" w:hAnsi="Times New Roman"/>
           <w:b/>
         </w:rPr>
-        <w:t>Recall = 75.23% trên tập Test</w:t>
-      </w:r>
-      <w:r>
-        <w:rPr>
-          <w:rFonts w:ascii="Times New Roman" w:hAnsi="Times New Roman"/>
-        </w:rPr>
-        <w:t>, đóng vai trò như lớp phòng thủ thứ hai (Defense-in-Depth) phát hiện bất thường độc lập với nhãn.</w:t>
+        <w:t>Defense-in-Depth</w:t>
+      </w:r>
+      <w:r>
+        <w:rPr>
+          <w:rFonts w:ascii="Times New Roman" w:hAnsi="Times New Roman"/>
+        </w:rPr>
+        <w:t xml:space="preserve"> (phòng thủ nhiều lớp): </w:t>
+      </w:r>
+      <w:r>
+        <w:rPr>
+          <w:rFonts w:ascii="Times New Roman" w:hAnsi="Times New Roman"/>
+          <w:i/>
+        </w:rPr>
+        <w:t>không thay thế</w:t>
+      </w:r>
+      <w:r>
+        <w:rPr>
+          <w:rFonts w:ascii="Times New Roman" w:hAnsi="Times New Roman"/>
+        </w:rPr>
+        <w:t xml:space="preserve"> XGBoost, mà là lớp lưới an toàn thứ hai, chuyển các giao dịch đáng ngờ sang thẩm định chuyên sâu.</w:t>
       </w:r>
     </w:p>
     <w:p>
-      <w:r>
-        <w:rPr>
-          <w:rFonts w:ascii="Times New Roman" w:hAnsi="Times New Roman"/>
-        </w:rPr>
-        <w:t xml:space="preserve">Tiếp theo, em xin mời bạn </w:t>
-      </w:r>
-      <w:r>
-        <w:rPr>
-          <w:rFonts w:ascii="Times New Roman" w:hAnsi="Times New Roman"/>
-          <w:b/>
-        </w:rPr>
-        <w:t>Nguyễn Duy Khang</w:t>
-      </w:r>
-      <w:r>
-        <w:rPr>
-          <w:rFonts w:ascii="Times New Roman" w:hAnsi="Times New Roman"/>
-        </w:rPr>
-        <w:t xml:space="preserve"> trình bày phần Đánh giá thực nghiệm và Đối chuẩn giữa các mô hình.</w:t>
+      <w:pPr>
+        <w:pStyle w:val="ListBullet"/>
+      </w:pPr>
+      <w:r>
+        <w:rPr>
+          <w:rFonts w:ascii="Times New Roman" w:hAnsi="Times New Roman"/>
+        </w:rPr>
+        <w:t>Về nguyên lý, vì không phụ thuộc nhãn nên lớp này không bị trói vào những kiểu gian lận đã từng thấy; còn khả năng với biến thể hoàn toàn mới thì nhóm chưa kiểm thử riêng, đó là hướng phát triển ạ.</w:t>
+      </w:r>
+    </w:p>
+    <w:p>
+      <w:r>
+        <w:rPr>
+          <w:rFonts w:ascii="Times New Roman" w:hAnsi="Times New Roman"/>
+        </w:rPr>
+        <w:t>Bây giờ em xin mời bạn Khang trình bày kết quả so sánh chi tiết giữa các mô hình ạ.</w:t>
       </w:r>
     </w:p>
     <w:p>
@@ -5392,7 +5873,7 @@
           <w:rFonts w:ascii="Times New Roman" w:hAnsi="Times New Roman"/>
           <w:i/>
         </w:rPr>
-        <w:t>(Thời lượng chuẩn hóa: **~75s – 80s** [Meeting thực tế: ~104s] | Người nói: **Bùi Thị Mỷ Cẩm**)</w:t>
+        <w:t>(Thời lượng chuẩn hóa: **~180s** [407 từ ÷ 135.5 WPM] [Meeting thực tế: ~104s] | Người nói: **Bùi Thị Mỷ Cẩm**)</w:t>
       </w:r>
       <w:r>
         <w:rPr>
@@ -5405,7 +5886,20 @@
         <w:rPr>
           <w:rFonts w:ascii="Times New Roman" w:hAnsi="Times New Roman"/>
         </w:rPr>
-        <w:t>Dạ em cảm ơn bạn Khang.</w:t>
+        <w:t xml:space="preserve">Cảm ơn bạn Khang. Em xin quay lại Autoencoder một chút, vì còn một quyết định quan trọng nhất của mô hình này: </w:t>
+      </w:r>
+      <w:r>
+        <w:rPr>
+          <w:rFonts w:ascii="Times New Roman" w:hAnsi="Times New Roman"/>
+          <w:b/>
+        </w:rPr>
+        <w:t>đặt ngưỡng τ ở đâu</w:t>
+      </w:r>
+      <w:r>
+        <w:rPr>
+          <w:rFonts w:ascii="Times New Roman" w:hAnsi="Times New Roman"/>
+        </w:rPr>
+        <w:t>. Autoencoder không cho ra xác suất, nó chỉ cho một con số "độ lạ" — chính là reconstruction error — nên mình phải tự vạch một đường cắt.</w:t>
       </w:r>
     </w:p>
     <w:p>
@@ -5413,7 +5907,58 @@
         <w:rPr>
           <w:rFonts w:ascii="Times New Roman" w:hAnsi="Times New Roman"/>
         </w:rPr>
-        <w:t>Như mọi người thấy trên slide, biểu đồ bên trái thể hiện rõ sự phân tách sai số tái tạo MSE: giao dịch hợp lệ (đường màu xanh) tập trung ở vùng sai số cực thấp, dưới 0.02; trong khi giao dịch gian lận (đường màu đỏ) có sai số trải dài sang bên phải do cấu trúc luồng tiền dị biệt không thể nén qua nút thắt cổ chai.</w:t>
+      </w:r>
+      <w:r>
+        <w:rPr>
+          <w:rFonts w:ascii="Times New Roman" w:hAnsi="Times New Roman"/>
+          <w:i/>
+        </w:rPr>
+        <w:t>(chỉ biểu đồ)</w:t>
+      </w:r>
+      <w:r>
+        <w:rPr>
+          <w:rFonts w:ascii="Times New Roman" w:hAnsi="Times New Roman"/>
+        </w:rPr>
+        <w:t xml:space="preserve"> Thầy và các bạn nhìn biểu đồ bên trái: </w:t>
+      </w:r>
+      <w:r>
+        <w:rPr>
+          <w:rFonts w:ascii="Times New Roman" w:hAnsi="Times New Roman"/>
+          <w:b/>
+        </w:rPr>
+        <w:t>màu xanh</w:t>
+      </w:r>
+      <w:r>
+        <w:rPr>
+          <w:rFonts w:ascii="Times New Roman" w:hAnsi="Times New Roman"/>
+        </w:rPr>
+        <w:t xml:space="preserve"> là giao dịch bình thường, dồn hết vào vùng sai số rất thấp — hơn 90% nằm dưới 0.02. </w:t>
+      </w:r>
+      <w:r>
+        <w:rPr>
+          <w:rFonts w:ascii="Times New Roman" w:hAnsi="Times New Roman"/>
+          <w:b/>
+        </w:rPr>
+        <w:t>màu đỏ</w:t>
+      </w:r>
+      <w:r>
+        <w:rPr>
+          <w:rFonts w:ascii="Times New Roman" w:hAnsi="Times New Roman"/>
+        </w:rPr>
+        <w:t xml:space="preserve"> là giao dịch gian lận, trải dài sang bên phải, nhiều ca có sai số lớn hơn hẳn, vì dòng tiền dị biệt đó không nén qua nổi bottleneck. Nhưng hai phân bố </w:t>
+      </w:r>
+      <w:r>
+        <w:rPr>
+          <w:rFonts w:ascii="Times New Roman" w:hAnsi="Times New Roman"/>
+          <w:b/>
+        </w:rPr>
+        <w:t>không tách hoàn toàn</w:t>
+      </w:r>
+      <w:r>
+        <w:rPr>
+          <w:rFonts w:ascii="Times New Roman" w:hAnsi="Times New Roman"/>
+        </w:rPr>
+        <w:t>: vẫn có khoảng một phần tư giao dịch gian lận có sai số nằm dưới ngưỡng — đó chính là 407 ca mà Autoencoder bỏ sót. Vùng chồng lấn này buộc mình phải đánh đổi.</w:t>
       </w:r>
     </w:p>
     <w:p>
@@ -5421,121 +5966,225 @@
         <w:rPr>
           <w:rFonts w:ascii="Times New Roman" w:hAnsi="Times New Roman"/>
         </w:rPr>
-        <w:t>Bảng bên phải thể hiện việc dò ngưỡng qua các phân vị trên tập Validation:</w:t>
+      </w:r>
+      <w:r>
+        <w:rPr>
+          <w:rFonts w:ascii="Times New Roman" w:hAnsi="Times New Roman"/>
+          <w:i/>
+        </w:rPr>
+        <w:t>(chỉ bảng bên phải)</w:t>
+      </w:r>
+      <w:r>
+        <w:rPr>
+          <w:rFonts w:ascii="Times New Roman" w:hAnsi="Times New Roman"/>
+        </w:rPr>
+        <w:t xml:space="preserve"> Bảng này cho thấy sự đánh đổi đó. Ngưỡng được đặt theo </w:t>
+      </w:r>
+      <w:r>
+        <w:rPr>
+          <w:rFonts w:ascii="Times New Roman" w:hAnsi="Times New Roman"/>
+          <w:b/>
+        </w:rPr>
+        <w:t>percentile</w:t>
+      </w:r>
+      <w:r>
+        <w:rPr>
+          <w:rFonts w:ascii="Times New Roman" w:hAnsi="Times New Roman"/>
+        </w:rPr>
+        <w:t xml:space="preserve"> (phân vị) của sai số. Hạ ngưỡng xuống, ví dụ phân vị 90, thì </w:t>
+      </w:r>
+      <w:r>
+        <w:rPr>
+          <w:rFonts w:ascii="Times New Roman" w:hAnsi="Times New Roman"/>
+          <w:b/>
+        </w:rPr>
+        <w:t>Recall</w:t>
+      </w:r>
+      <w:r>
+        <w:rPr>
+          <w:rFonts w:ascii="Times New Roman" w:hAnsi="Times New Roman"/>
+        </w:rPr>
+        <w:t xml:space="preserve"> trên 80% nhưng </w:t>
+      </w:r>
+      <w:r>
+        <w:rPr>
+          <w:rFonts w:ascii="Times New Roman" w:hAnsi="Times New Roman"/>
+          <w:b/>
+        </w:rPr>
+        <w:t>Precision</w:t>
+      </w:r>
+      <w:r>
+        <w:rPr>
+          <w:rFonts w:ascii="Times New Roman" w:hAnsi="Times New Roman"/>
+        </w:rPr>
+        <w:t xml:space="preserve"> chưa tới 30% — báo nhầm rất nhiều. Kéo ngưỡng lên cao thì ngược lại: ở phân vị 99.9, Precision lên tới 91.5% nhưng Recall chỉ còn 25.4%, tức là bỏ lọt ba phần tư số vụ gian lận.</w:t>
       </w:r>
     </w:p>
     <w:p>
-      <w:pPr>
-        <w:pStyle w:val="ListBullet"/>
-      </w:pPr>
-      <w:r>
-        <w:rPr>
-          <w:rFonts w:ascii="Times New Roman" w:hAnsi="Times New Roman"/>
-        </w:rPr>
-        <w:t>Ở phân vị 90th ($\tau = 0.0134$): Recall đạt 84.8% nhưng Precision chỉ 26.6%.</w:t>
+      <w:r>
+        <w:rPr>
+          <w:rFonts w:ascii="Times New Roman" w:hAnsi="Times New Roman"/>
+        </w:rPr>
+        <w:t xml:space="preserve">Em chọn </w:t>
+      </w:r>
+      <w:r>
+        <w:rPr>
+          <w:rFonts w:ascii="Times New Roman" w:hAnsi="Times New Roman"/>
+          <w:b/>
+        </w:rPr>
+        <w:t>phân vị 95, τ = 0.0455</w:t>
+      </w:r>
+      <w:r>
+        <w:rPr>
+          <w:rFonts w:ascii="Times New Roman" w:hAnsi="Times New Roman"/>
+        </w:rPr>
+        <w:t xml:space="preserve">. Trên tập Test, ngưỡng này cho </w:t>
+      </w:r>
+      <w:r>
+        <w:rPr>
+          <w:rFonts w:ascii="Times New Roman" w:hAnsi="Times New Roman"/>
+          <w:b/>
+        </w:rPr>
+        <w:t>Recall 75.2%</w:t>
+      </w:r>
+      <w:r>
+        <w:rPr>
+          <w:rFonts w:ascii="Times New Roman" w:hAnsi="Times New Roman"/>
+        </w:rPr>
+        <w:t xml:space="preserve"> và </w:t>
+      </w:r>
+      <w:r>
+        <w:rPr>
+          <w:rFonts w:ascii="Times New Roman" w:hAnsi="Times New Roman"/>
+          <w:b/>
+        </w:rPr>
+        <w:t>Precision 38.2%</w:t>
+      </w:r>
+      <w:r>
+        <w:rPr>
+          <w:rFonts w:ascii="Times New Roman" w:hAnsi="Times New Roman"/>
+        </w:rPr>
+        <w:t xml:space="preserve">. Em ưu tiên Recall vì bạn Thanh đã nói ở phần đầu: bỏ sót một vụ gian lận đắt hơn rất nhiều so với báo nhầm. Cụ thể, em đặt ràng buộc </w:t>
+      </w:r>
+      <w:r>
+        <w:rPr>
+          <w:rFonts w:ascii="Times New Roman" w:hAnsi="Times New Roman"/>
+          <w:b/>
+        </w:rPr>
+        <w:t>Recall tối thiểu 60%</w:t>
+      </w:r>
+      <w:r>
+        <w:rPr>
+          <w:rFonts w:ascii="Times New Roman" w:hAnsi="Times New Roman"/>
+        </w:rPr>
+        <w:t xml:space="preserve">, rồi trong các ngưỡng thỏa ràng buộc đó thì phân vị 95 cho F1 cao nhất. Mà với vai trò lớp phòng thủ thứ hai, giao dịch bị gắn cờ chỉ bị chuyển sang bước xác thực thêm, ví dụ </w:t>
+      </w:r>
+      <w:r>
+        <w:rPr>
+          <w:rFonts w:ascii="Times New Roman" w:hAnsi="Times New Roman"/>
+          <w:b/>
+        </w:rPr>
+        <w:t>OTP</w:t>
+      </w:r>
+      <w:r>
+        <w:rPr>
+          <w:rFonts w:ascii="Times New Roman" w:hAnsi="Times New Roman"/>
+        </w:rPr>
+        <w:t xml:space="preserve"> hoặc chuyên viên rà soát — nên chấp nhận Precision thấp là hợp lý.</w:t>
       </w:r>
     </w:p>
     <w:p>
-      <w:pPr>
-        <w:pStyle w:val="ListBullet"/>
-      </w:pPr>
-      <w:r>
-        <w:rPr>
-          <w:rFonts w:ascii="Times New Roman" w:hAnsi="Times New Roman"/>
-        </w:rPr>
-        <w:t>Ở phân vị 99th ($\tau = 0.1240$): Precision tăng lên 66.8% nhưng Recall giảm xuống còn 47.0%.</w:t>
+      <w:r>
+        <w:rPr>
+          <w:rFonts w:ascii="Times New Roman" w:hAnsi="Times New Roman"/>
+        </w:rPr>
+        <w:t xml:space="preserve">Một điểm nữa em muốn nhấn mạnh: ngưỡng này được chọn bằng cách quét trên </w:t>
+      </w:r>
+      <w:r>
+        <w:rPr>
+          <w:rFonts w:ascii="Times New Roman" w:hAnsi="Times New Roman"/>
+          <w:b/>
+        </w:rPr>
+        <w:t>tập validation</w:t>
+      </w:r>
+      <w:r>
+        <w:rPr>
+          <w:rFonts w:ascii="Times New Roman" w:hAnsi="Times New Roman"/>
+        </w:rPr>
+        <w:t xml:space="preserve"> tách từ tập Train, hoàn toàn </w:t>
+      </w:r>
+      <w:r>
+        <w:rPr>
+          <w:rFonts w:ascii="Times New Roman" w:hAnsi="Times New Roman"/>
+          <w:i/>
+        </w:rPr>
+        <w:t>không</w:t>
+      </w:r>
+      <w:r>
+        <w:rPr>
+          <w:rFonts w:ascii="Times New Roman" w:hAnsi="Times New Roman"/>
+        </w:rPr>
+        <w:t xml:space="preserve"> chạm vào tập Test — đúng với nguyên tắc </w:t>
+      </w:r>
+      <w:r>
+        <w:rPr>
+          <w:rFonts w:ascii="Times New Roman" w:hAnsi="Times New Roman"/>
+          <w:b/>
+        </w:rPr>
+        <w:t>leak-free</w:t>
+      </w:r>
+      <w:r>
+        <w:rPr>
+          <w:rFonts w:ascii="Times New Roman" w:hAnsi="Times New Roman"/>
+        </w:rPr>
+        <w:t xml:space="preserve"> mà anh Sơn đã trình bày.</w:t>
       </w:r>
     </w:p>
     <w:p>
-      <w:pPr>
-        <w:pStyle w:val="ListBullet"/>
-      </w:pPr>
-      <w:r>
-        <w:rPr>
-          <w:rFonts w:ascii="Times New Roman" w:hAnsi="Times New Roman"/>
-        </w:rPr>
-        <w:t xml:space="preserve">Nhóm quyết định chọn </w:t>
+      <w:r>
+        <w:rPr>
+          <w:rFonts w:ascii="Times New Roman" w:hAnsi="Times New Roman"/>
+        </w:rPr>
+        <w:t xml:space="preserve">Tóm lại, Autoencoder và XGBoost không cạnh tranh nhau mà </w:t>
       </w:r>
       <w:r>
         <w:rPr>
           <w:rFonts w:ascii="Times New Roman" w:hAnsi="Times New Roman"/>
           <w:b/>
         </w:rPr>
-        <w:t>Điểm cắt tại phân vị 95th ($\tau = 0.0455$)</w:t>
-      </w:r>
-      <w:r>
-        <w:rPr>
-          <w:rFonts w:ascii="Times New Roman" w:hAnsi="Times New Roman"/>
-        </w:rPr>
-        <w:t xml:space="preserve">: đạt F1 cao nhất (0.5064) trong các ngưỡng thỏa mãn điều kiện Recall $\ge 60\%$. Trên tập Test độc lập sau đó, mô hình đạt </w:t>
+        <w:t>bổ sung</w:t>
+      </w:r>
+      <w:r>
+        <w:rPr>
+          <w:rFonts w:ascii="Times New Roman" w:hAnsi="Times New Roman"/>
+        </w:rPr>
+        <w:t xml:space="preserve"> cho nhau. Tiếp theo em xin mời bạn </w:t>
       </w:r>
       <w:r>
         <w:rPr>
           <w:rFonts w:ascii="Times New Roman" w:hAnsi="Times New Roman"/>
           <w:b/>
         </w:rPr>
-        <w:t>Recall = 75.2%</w:t>
-      </w:r>
-      <w:r>
-        <w:rPr>
-          <w:rFonts w:ascii="Times New Roman" w:hAnsi="Times New Roman"/>
-        </w:rPr>
-        <w:t xml:space="preserve"> và </w:t>
+        <w:t>Trung</w:t>
+      </w:r>
+      <w:r>
+        <w:rPr>
+          <w:rFonts w:ascii="Times New Roman" w:hAnsi="Times New Roman"/>
+        </w:rPr>
+        <w:t xml:space="preserve"> và bạn </w:t>
       </w:r>
       <w:r>
         <w:rPr>
           <w:rFonts w:ascii="Times New Roman" w:hAnsi="Times New Roman"/>
           <w:b/>
         </w:rPr>
-        <w:t>Precision = 38.2%</w:t>
-      </w:r>
-      <w:r>
-        <w:rPr>
-          <w:rFonts w:ascii="Times New Roman" w:hAnsi="Times New Roman"/>
-        </w:rPr>
-        <w:t xml:space="preserve"> (F1 = 50.69%).</w:t>
-      </w:r>
-    </w:p>
-    <w:p>
-      <w:r>
-        <w:rPr>
-          <w:rFonts w:ascii="Times New Roman" w:hAnsi="Times New Roman"/>
-        </w:rPr>
-        <w:t>Đây là chốt chặn phòng thủ thứ hai vững chắc: nếu mô hình có giám sát bị qua mặt bởi hình thức bất thường, Autoencoder sẽ lập tức kích hoạt báo động chuyển giao dịch sang thẩm định chuyên sâu mà không phụ thuộc vào việc có nhãn hay chưa.</w:t>
-      </w:r>
-    </w:p>
-    <w:p>
-      <w:r>
-        <w:rPr>
-          <w:rFonts w:ascii="Times New Roman" w:hAnsi="Times New Roman"/>
-        </w:rPr>
-        <w:t xml:space="preserve">Tiếp theo, em xin mời anh </w:t>
-      </w:r>
-      <w:r>
-        <w:rPr>
-          <w:rFonts w:ascii="Times New Roman" w:hAnsi="Times New Roman"/>
-          <w:b/>
-        </w:rPr>
-        <w:t>Vũ Văn Duy</w:t>
-      </w:r>
-      <w:r>
-        <w:rPr>
-          <w:rFonts w:ascii="Times New Roman" w:hAnsi="Times New Roman"/>
-        </w:rPr>
-        <w:t xml:space="preserve"> và bạn </w:t>
-      </w:r>
-      <w:r>
-        <w:rPr>
-          <w:rFonts w:ascii="Times New Roman" w:hAnsi="Times New Roman"/>
-          <w:b/>
-        </w:rPr>
-        <w:t>Phạm Thành Trung</w:t>
-      </w:r>
-      <w:r>
-        <w:rPr>
-          <w:rFonts w:ascii="Times New Roman" w:hAnsi="Times New Roman"/>
-        </w:rPr>
-        <w:t xml:space="preserve"> trình bày hệ thống Demo Streamlit và các kịch bản kiểm thử ạ.</w:t>
+        <w:t>Duy</w:t>
+      </w:r>
+      <w:r>
+        <w:rPr>
+          <w:rFonts w:ascii="Times New Roman" w:hAnsi="Times New Roman"/>
+        </w:rPr>
+        <w:t xml:space="preserve"> trình diễn phần Demo ạ. Em xin cảm ơn.</w:t>
       </w:r>
     </w:p>
     <w:p>
@@ -6579,7 +7228,7 @@
           <w:i/>
           <w:color w:val="444444"/>
         </w:rPr>
-        <w:t>"Dạ thưa thầy, về chất lượng phân loại thì 2 mô hình tương đương nhau (F1 chênh lệch không đáng kể: 99.73% so với 99.63%, chỉ lệch 3 ca đoán nhầm trên 40,000 mẫu). Nhưng Random Forest mất gần 20 phút để huấn luyện và file model rất nặng (~32MB). Trong khi đó, XGBoost chỉ mất khoảng 42s–58s để huấn luyện (nhanh gấp hơn 20 lần), file model native JSON chỉ 410KB, và độ trễ suy luận cho 1 giao dịch chỉ dưới 0.5 mili-giây. Với các hệ thống cổng thanh toán trực tuyến cần xử lý hàng chục ngàn giao dịch mỗi giây thì XGBoost là lựa chọn tối ưu vượt trội để triển khai production ạ."</w:t>
+        <w:t>"Dạ thưa thầy, về chất lượng phân loại thì 2 mô hình tương đương nhau (F1 99.73% so với 99.63%, chỉ chênh 3 ca đoán nhầm trên 40,000 mẫu). Nhưng Random Forest mất gần 20 phút để huấn luyện, còn XGBoost chưa tới một phút, nhanh hơn hơn 20 lần, và độ trễ suy luận cỡ nửa mili-giây cho một giao dịch. Với cổng thanh toán cần xử lý thời gian thực thì XGBoost là lựa chọn phù hợp để triển khai, và cũng là mô hình mà phần demo dùng để chấm điểm trực tiếp ạ."</w:t>
       </w:r>
     </w:p>
     <w:p>
@@ -6684,7 +7333,7 @@
           <w:i/>
           <w:color w:val="444444"/>
         </w:rPr>
-        <w:t>"Dạ thưa thầy, Deep Autoencoder đóng vai trò là màng bọc an toàn thứ hai (Defense-in-Depth) chứ không thay thế mô hình có giám sát. Mô hình có giám sát chỉ bắt được các thủ đoạn gian lận cũ đã có nhãn. Còn Autoencoder học 'thế nào là bình thường', nên bất kỳ chiêu trò Zero-Day mới nào làm sai lệch dòng tiền đều bị nó phát hiện qua sai số tái tạo tăng vọt.</w:t>
+        <w:t>"Dạ thưa thầy, Deep Autoencoder đóng vai trò lớp phòng thủ thứ hai (Defense-in-Depth), không thay thế XGBoost. Precision 38.2% là do em chủ động đặt ngưỡng ở phân vị 95 với ràng buộc Recall tối thiểu 60%, để ưu tiên bắt được nhiều vụ gian lận (Recall 75.2%) vì bỏ sót một vụ gian lận đắt hơn nhiều so với báo nhầm.</w:t>
       </w:r>
     </w:p>
     <w:p>
@@ -6697,7 +7346,7 @@
           <w:i/>
           <w:color w:val="444444"/>
         </w:rPr>
-        <w:t>Tỷ lệ Precision 38.2% là do em chủ động hạ ngưỡng cắt xuống phân vị thứ 95 (tau = 0.0455) để ưu tiên đẩy Recall lên 75.2%, đúng với triết lý 'thà cảnh báo nhầm còn hơn bỏ sót'. Khoảng 5% giao dịch bị nghi ngờ này hệ thống ngân hàng chỉ cần gửi một mã OTP bổ sung yêu cầu khách hàng xác nhận là giải quyết được, hoàn toàn không làm gián đoạn trải nghiệm người dùng ạ."</w:t>
+        <w:t>Với vai trò lớp thứ hai, giao dịch bị gắn cờ chỉ bị chuyển sang bước xác thực thêm, ví dụ OTP hoặc chuyên viên rà soát; khoảng 5% giao dịch hợp lệ bị báo nhầm nên chấp nhận Precision thấp là hợp lý. Ưu điểm của Autoencoder là không dùng nhãn khi huấn luyện mạng, nên về nguyên lý không bị giới hạn bởi các kiểu gian lận đã có nhãn. Tuy nhiên nhóm chưa kiểm thử riêng trên biến thể gian lận mới, và trong 8 ca XGBoost bỏ sót thì Autoencoder chỉ bắt thêm được 1 ca ạ."</w:t>
       </w:r>
     </w:p>
     <w:p>
@@ -6803,6 +7452,426 @@
           <w:color w:val="444444"/>
         </w:rPr>
         <w:t>"Dạ thưa thầy, trong giao diện Streamlit, em đã cấu hình tính năng `@st.cache_resource` để tải trước trọng số mô hình XGBoost và StandardScaler vào bộ nhớ đệm, tránh tải lại mô hình ở mỗi lượt tương tác. Đồng thời, em sử dụng thư viện Pandas để vector hóa toàn bộ quá trình tính toán 14 đặc trưng miền theo lô (batch processing). Do đó, khi tải file CSV lớn lên, hệ thống có thể chấm điểm song song hàng chục ngàn giao dịch chỉ trong vài giây mà không làm đơ hay nghẽn giao diện ạ."</w:t>
+      </w:r>
+    </w:p>
+    <w:p>
+      <w:pPr>
+        <w:spacing w:before="80" w:after="80"/>
+      </w:pPr>
+    </w:p>
+    <w:p>
+      <w:pPr>
+        <w:pStyle w:val="Heading2"/>
+      </w:pPr>
+      <w:r>
+        <w:rPr>
+          <w:rFonts w:ascii="Times New Roman" w:hAnsi="Times New Roman"/>
+          <w:b/>
+          <w:color w:val="2E75B6"/>
+          <w:sz w:val="24"/>
+        </w:rPr>
+        <w:t>❓ Câu 5: "Autoencoder có bắt được Zero-Day thật không?"</w:t>
+      </w:r>
+    </w:p>
+    <w:p>
+      <w:pPr>
+        <w:ind w:left="432" w:right="432"/>
+      </w:pPr>
+      <w:r>
+        <w:rPr>
+          <w:rFonts w:ascii="Times New Roman" w:hAnsi="Times New Roman"/>
+          <w:i/>
+          <w:color w:val="444444"/>
+        </w:rPr>
+      </w:r>
+      <w:r>
+        <w:rPr>
+          <w:rFonts w:ascii="Times New Roman" w:hAnsi="Times New Roman"/>
+          <w:b/>
+          <w:i/>
+          <w:color w:val="444444"/>
+        </w:rPr>
+        <w:t>Người trả lời chính:</w:t>
+      </w:r>
+      <w:r>
+        <w:rPr>
+          <w:rFonts w:ascii="Times New Roman" w:hAnsi="Times New Roman"/>
+          <w:i/>
+          <w:color w:val="444444"/>
+        </w:rPr>
+        <w:t xml:space="preserve"> </w:t>
+      </w:r>
+      <w:r>
+        <w:rPr>
+          <w:rFonts w:ascii="Times New Roman" w:hAnsi="Times New Roman"/>
+          <w:b/>
+          <w:i/>
+          <w:color w:val="444444"/>
+        </w:rPr>
+        <w:t>Bùi Thị Mỷ Cẩm</w:t>
+      </w:r>
+      <w:r>
+        <w:rPr>
+          <w:rFonts w:ascii="Times New Roman" w:hAnsi="Times New Roman"/>
+          <w:i/>
+          <w:color w:val="444444"/>
+        </w:rPr>
+      </w:r>
+    </w:p>
+    <w:p>
+      <w:pPr>
+        <w:ind w:left="432" w:right="432"/>
+      </w:pPr>
+      <w:r>
+        <w:rPr>
+          <w:rFonts w:ascii="Times New Roman" w:hAnsi="Times New Roman"/>
+          <w:i/>
+          <w:color w:val="444444"/>
+        </w:rPr>
+      </w:r>
+      <w:r>
+        <w:rPr>
+          <w:rFonts w:ascii="Times New Roman" w:hAnsi="Times New Roman"/>
+          <w:b/>
+          <w:i/>
+          <w:color w:val="444444"/>
+        </w:rPr>
+        <w:t>Hướng trả lời:</w:t>
+      </w:r>
+      <w:r>
+        <w:rPr>
+          <w:rFonts w:ascii="Times New Roman" w:hAnsi="Times New Roman"/>
+          <w:i/>
+          <w:color w:val="444444"/>
+        </w:rPr>
+      </w:r>
+    </w:p>
+    <w:p>
+      <w:pPr>
+        <w:ind w:left="432" w:right="432"/>
+      </w:pPr>
+      <w:r>
+        <w:rPr>
+          <w:rFonts w:ascii="Times New Roman" w:hAnsi="Times New Roman"/>
+          <w:i/>
+          <w:color w:val="444444"/>
+        </w:rPr>
+        <w:t>"Dạ, do không dùng nhãn khi huấn luyện nên về nguyên lý nó không bị giới hạn bởi kiểu gian lận cũ. Còn trên PaySim, nhóm chưa có thí nghiệm riêng cho biến thể mới, và trong 8 ca mà XGBoost bỏ sót thì Autoencoder chỉ bắt thêm được 1 ca. Đó là hướng phát triển của nhóm ạ."</w:t>
+      </w:r>
+    </w:p>
+    <w:p>
+      <w:pPr>
+        <w:spacing w:before="80" w:after="80"/>
+      </w:pPr>
+    </w:p>
+    <w:p>
+      <w:pPr>
+        <w:pStyle w:val="Heading2"/>
+      </w:pPr>
+      <w:r>
+        <w:rPr>
+          <w:rFonts w:ascii="Times New Roman" w:hAnsi="Times New Roman"/>
+          <w:b/>
+          <w:color w:val="2E75B6"/>
+          <w:sz w:val="24"/>
+        </w:rPr>
+        <w:t>❓ Câu 6: "Autoencoder hoàn toàn không dùng nhãn à?"</w:t>
+      </w:r>
+    </w:p>
+    <w:p>
+      <w:pPr>
+        <w:ind w:left="432" w:right="432"/>
+      </w:pPr>
+      <w:r>
+        <w:rPr>
+          <w:rFonts w:ascii="Times New Roman" w:hAnsi="Times New Roman"/>
+          <w:i/>
+          <w:color w:val="444444"/>
+        </w:rPr>
+      </w:r>
+      <w:r>
+        <w:rPr>
+          <w:rFonts w:ascii="Times New Roman" w:hAnsi="Times New Roman"/>
+          <w:b/>
+          <w:i/>
+          <w:color w:val="444444"/>
+        </w:rPr>
+        <w:t>Người trả lời chính:</w:t>
+      </w:r>
+      <w:r>
+        <w:rPr>
+          <w:rFonts w:ascii="Times New Roman" w:hAnsi="Times New Roman"/>
+          <w:i/>
+          <w:color w:val="444444"/>
+        </w:rPr>
+        <w:t xml:space="preserve"> </w:t>
+      </w:r>
+      <w:r>
+        <w:rPr>
+          <w:rFonts w:ascii="Times New Roman" w:hAnsi="Times New Roman"/>
+          <w:b/>
+          <w:i/>
+          <w:color w:val="444444"/>
+        </w:rPr>
+        <w:t>Bùi Thị Mỷ Cẩm</w:t>
+      </w:r>
+      <w:r>
+        <w:rPr>
+          <w:rFonts w:ascii="Times New Roman" w:hAnsi="Times New Roman"/>
+          <w:i/>
+          <w:color w:val="444444"/>
+        </w:rPr>
+      </w:r>
+    </w:p>
+    <w:p>
+      <w:pPr>
+        <w:ind w:left="432" w:right="432"/>
+      </w:pPr>
+      <w:r>
+        <w:rPr>
+          <w:rFonts w:ascii="Times New Roman" w:hAnsi="Times New Roman"/>
+          <w:i/>
+          <w:color w:val="444444"/>
+        </w:rPr>
+      </w:r>
+      <w:r>
+        <w:rPr>
+          <w:rFonts w:ascii="Times New Roman" w:hAnsi="Times New Roman"/>
+          <w:b/>
+          <w:i/>
+          <w:color w:val="444444"/>
+        </w:rPr>
+        <w:t>Hướng trả lời:</w:t>
+      </w:r>
+      <w:r>
+        <w:rPr>
+          <w:rFonts w:ascii="Times New Roman" w:hAnsi="Times New Roman"/>
+          <w:i/>
+          <w:color w:val="444444"/>
+        </w:rPr>
+      </w:r>
+    </w:p>
+    <w:p>
+      <w:pPr>
+        <w:ind w:left="432" w:right="432"/>
+      </w:pPr>
+      <w:r>
+        <w:rPr>
+          <w:rFonts w:ascii="Times New Roman" w:hAnsi="Times New Roman"/>
+          <w:i/>
+          <w:color w:val="444444"/>
+        </w:rPr>
+        <w:t>"Dạ, không dùng nhãn khi huấn luyện mạng. Nhãn chỉ dùng ở bước chọn ngưỡng trên tập validation ạ."</w:t>
+      </w:r>
+    </w:p>
+    <w:p>
+      <w:pPr>
+        <w:spacing w:before="80" w:after="80"/>
+      </w:pPr>
+    </w:p>
+    <w:p>
+      <w:pPr>
+        <w:pStyle w:val="Heading2"/>
+      </w:pPr>
+      <w:r>
+        <w:rPr>
+          <w:rFonts w:ascii="Times New Roman" w:hAnsi="Times New Roman"/>
+          <w:b/>
+          <w:color w:val="2E75B6"/>
+          <w:sz w:val="24"/>
+        </w:rPr>
+        <w:t>❓ Câu 7: "Sao không chọn phân vị 99, F1 cao hơn?"</w:t>
+      </w:r>
+    </w:p>
+    <w:p>
+      <w:pPr>
+        <w:ind w:left="432" w:right="432"/>
+      </w:pPr>
+      <w:r>
+        <w:rPr>
+          <w:rFonts w:ascii="Times New Roman" w:hAnsi="Times New Roman"/>
+          <w:i/>
+          <w:color w:val="444444"/>
+        </w:rPr>
+      </w:r>
+      <w:r>
+        <w:rPr>
+          <w:rFonts w:ascii="Times New Roman" w:hAnsi="Times New Roman"/>
+          <w:b/>
+          <w:i/>
+          <w:color w:val="444444"/>
+        </w:rPr>
+        <w:t>Người trả lời chính:</w:t>
+      </w:r>
+      <w:r>
+        <w:rPr>
+          <w:rFonts w:ascii="Times New Roman" w:hAnsi="Times New Roman"/>
+          <w:i/>
+          <w:color w:val="444444"/>
+        </w:rPr>
+        <w:t xml:space="preserve"> </w:t>
+      </w:r>
+      <w:r>
+        <w:rPr>
+          <w:rFonts w:ascii="Times New Roman" w:hAnsi="Times New Roman"/>
+          <w:b/>
+          <w:i/>
+          <w:color w:val="444444"/>
+        </w:rPr>
+        <w:t>Bùi Thị Mỷ Cẩm</w:t>
+      </w:r>
+      <w:r>
+        <w:rPr>
+          <w:rFonts w:ascii="Times New Roman" w:hAnsi="Times New Roman"/>
+          <w:i/>
+          <w:color w:val="444444"/>
+        </w:rPr>
+      </w:r>
+    </w:p>
+    <w:p>
+      <w:pPr>
+        <w:ind w:left="432" w:right="432"/>
+      </w:pPr>
+      <w:r>
+        <w:rPr>
+          <w:rFonts w:ascii="Times New Roman" w:hAnsi="Times New Roman"/>
+          <w:i/>
+          <w:color w:val="444444"/>
+        </w:rPr>
+      </w:r>
+      <w:r>
+        <w:rPr>
+          <w:rFonts w:ascii="Times New Roman" w:hAnsi="Times New Roman"/>
+          <w:b/>
+          <w:i/>
+          <w:color w:val="444444"/>
+        </w:rPr>
+        <w:t>Hướng trả lời:</w:t>
+      </w:r>
+      <w:r>
+        <w:rPr>
+          <w:rFonts w:ascii="Times New Roman" w:hAnsi="Times New Roman"/>
+          <w:i/>
+          <w:color w:val="444444"/>
+        </w:rPr>
+      </w:r>
+    </w:p>
+    <w:p>
+      <w:pPr>
+        <w:ind w:left="432" w:right="432"/>
+      </w:pPr>
+      <w:r>
+        <w:rPr>
+          <w:rFonts w:ascii="Times New Roman" w:hAnsi="Times New Roman"/>
+          <w:i/>
+          <w:color w:val="444444"/>
+        </w:rPr>
+        <w:t>"Dạ, phân vị 99 cho F1 cao hơn nhưng Recall chỉ 47%, không đạt ràng buộc Recall tối thiểu 60% mà em đặt, vì bỏ sót gian lận đắt hơn báo nhầm ạ."</w:t>
+      </w:r>
+    </w:p>
+    <w:p>
+      <w:pPr>
+        <w:spacing w:before="80" w:after="80"/>
+      </w:pPr>
+    </w:p>
+    <w:p>
+      <w:pPr>
+        <w:pStyle w:val="Heading2"/>
+      </w:pPr>
+      <w:r>
+        <w:rPr>
+          <w:rFonts w:ascii="Times New Roman" w:hAnsi="Times New Roman"/>
+          <w:b/>
+          <w:color w:val="2E75B6"/>
+          <w:sz w:val="24"/>
+        </w:rPr>
+        <w:t>❓ Câu 8: "Tại sao gọi là Deep Autoencoder mà dùng scikit-learn?"</w:t>
+      </w:r>
+    </w:p>
+    <w:p>
+      <w:pPr>
+        <w:ind w:left="432" w:right="432"/>
+      </w:pPr>
+      <w:r>
+        <w:rPr>
+          <w:rFonts w:ascii="Times New Roman" w:hAnsi="Times New Roman"/>
+          <w:i/>
+          <w:color w:val="444444"/>
+        </w:rPr>
+      </w:r>
+      <w:r>
+        <w:rPr>
+          <w:rFonts w:ascii="Times New Roman" w:hAnsi="Times New Roman"/>
+          <w:b/>
+          <w:i/>
+          <w:color w:val="444444"/>
+        </w:rPr>
+        <w:t>Người trả lời chính:</w:t>
+      </w:r>
+      <w:r>
+        <w:rPr>
+          <w:rFonts w:ascii="Times New Roman" w:hAnsi="Times New Roman"/>
+          <w:i/>
+          <w:color w:val="444444"/>
+        </w:rPr>
+        <w:t xml:space="preserve"> </w:t>
+      </w:r>
+      <w:r>
+        <w:rPr>
+          <w:rFonts w:ascii="Times New Roman" w:hAnsi="Times New Roman"/>
+          <w:b/>
+          <w:i/>
+          <w:color w:val="444444"/>
+        </w:rPr>
+        <w:t>Bùi Thị Mỷ Cẩm</w:t>
+      </w:r>
+      <w:r>
+        <w:rPr>
+          <w:rFonts w:ascii="Times New Roman" w:hAnsi="Times New Roman"/>
+          <w:i/>
+          <w:color w:val="444444"/>
+        </w:rPr>
+      </w:r>
+    </w:p>
+    <w:p>
+      <w:pPr>
+        <w:ind w:left="432" w:right="432"/>
+      </w:pPr>
+      <w:r>
+        <w:rPr>
+          <w:rFonts w:ascii="Times New Roman" w:hAnsi="Times New Roman"/>
+          <w:i/>
+          <w:color w:val="444444"/>
+        </w:rPr>
+      </w:r>
+      <w:r>
+        <w:rPr>
+          <w:rFonts w:ascii="Times New Roman" w:hAnsi="Times New Roman"/>
+          <w:b/>
+          <w:i/>
+          <w:color w:val="444444"/>
+        </w:rPr>
+        <w:t>Hướng trả lời:</w:t>
+      </w:r>
+      <w:r>
+        <w:rPr>
+          <w:rFonts w:ascii="Times New Roman" w:hAnsi="Times New Roman"/>
+          <w:i/>
+          <w:color w:val="444444"/>
+        </w:rPr>
+      </w:r>
+    </w:p>
+    <w:p>
+      <w:pPr>
+        <w:ind w:left="432" w:right="432"/>
+      </w:pPr>
+      <w:r>
+        <w:rPr>
+          <w:rFonts w:ascii="Times New Roman" w:hAnsi="Times New Roman"/>
+          <w:i/>
+          <w:color w:val="444444"/>
+        </w:rPr>
+        <w:t>"Dạ, TensorFlow/Keras chưa có bản tương thích với Python 3.14 trên máy phát triển, nên nhóm triển khai cùng nguyên lý bằng MLPRegressor với 5 lớp ẩn 16-8-4-8-16, và đã ghi rõ trong báo cáo ạ."</w:t>
       </w:r>
     </w:p>
     <w:sectPr>

</xml_diff>

<commit_message>
docs(script): đồng bộ bảng ngân sách 15p sau khi Khang rút gọn Slide 15-17 (PR #50)
- Cập nhật dòng Nguyễn Duy Khang sang trạng thái Đã cập nhật (PR #50), thời gian kịch bản giảm từ 4m39s xuống 2m45s (vượt +30s).
- Cập nhật dòng Tổng kết toàn bài: 6/7 thành viên đã cập nhật, 5/7 đã tối ưu sát ngân sách.
- Tái tạo đồng bộ file SCRIPT_THUYET_TRINH_TOAN_TEAM_CS106.docx từ file MD.
</commit_message>
<xml_diff>
--- a/draft/fraud-detection/slide/scripts/SCRIPT_THUYET_TRINH_TOAN_TEAM_CS106.docx
+++ b/draft/fraud-detection/slide/scripts/SCRIPT_THUYET_TRINH_TOAN_TEAM_CS106.docx
@@ -1604,7 +1604,7 @@
                 <w:rFonts w:ascii="Times New Roman" w:hAnsi="Times New Roman"/>
                 <w:sz w:val="20"/>
               </w:rPr>
-              <w:t>🔴**Chưa cập nhật** *(Giữ nguyên bản cũ)*</w:t>
+              <w:t>🟢**Đã cập nhật** *(Rút gọn Slide 15–17 PR #50)*</w:t>
             </w:r>
           </w:p>
         </w:tc>
@@ -1646,7 +1646,7 @@
                 <w:rFonts w:ascii="Times New Roman" w:hAnsi="Times New Roman"/>
                 <w:sz w:val="20"/>
               </w:rPr>
-              <w:t>**4 phút 39s** *(279s)*</w:t>
+              <w:t>**2 phút 45s** *(165s)*</w:t>
             </w:r>
           </w:p>
         </w:tc>
@@ -1674,7 +1674,7 @@
                 <w:rFonts w:ascii="Times New Roman" w:hAnsi="Times New Roman"/>
                 <w:sz w:val="20"/>
               </w:rPr>
-              <w:t>🔴**Vượt +2m24s** *(+106%)*</w:t>
+              <w:t>🟢**Vượt +30s** *(+22%)*</w:t>
             </w:r>
           </w:p>
         </w:tc>
@@ -1688,7 +1688,7 @@
                 <w:rFonts w:ascii="Times New Roman" w:hAnsi="Times New Roman"/>
                 <w:sz w:val="20"/>
               </w:rPr>
-              <w:t>⚠️**Không đọc bảng:** Chỉ nêu bật RF &amp; XGBoost dẫn đầu, lướt các chỉ số phụ.</w:t>
+              <w:t>✅**Đã rút gọn (PR #50):** Lời thoại ngắn gọn (~45–50s/slide), bỏ đọc số liệu chi tiết và viết tắt TP/FN/FP; nêu bật RF/XGBoost và 2 đặc trưng chính 97%.</w:t>
             </w:r>
           </w:p>
         </w:tc>
@@ -2314,7 +2314,7 @@
                 <w:rFonts w:ascii="Times New Roman" w:hAnsi="Times New Roman"/>
                 <w:sz w:val="20"/>
               </w:rPr>
-              <w:t>**5/7 bạn đã cập nhật; 4/7 đã tối ưu**</w:t>
+              <w:t>**6/7 bạn đã cập nhật; 5/7 đã tối ưu**</w:t>
             </w:r>
           </w:p>
         </w:tc>
@@ -2356,7 +2356,7 @@
                 <w:rFonts w:ascii="Times New Roman" w:hAnsi="Times New Roman"/>
                 <w:sz w:val="20"/>
               </w:rPr>
-              <w:t>**21 phút 45s** *(1,305s)*</w:t>
+              <w:t>**23 phút 11s** *(1,391s)*</w:t>
             </w:r>
           </w:p>
         </w:tc>
@@ -2384,7 +2384,7 @@
                 <w:rFonts w:ascii="Times New Roman" w:hAnsi="Times New Roman"/>
                 <w:sz w:val="20"/>
               </w:rPr>
-              <w:t>🔴**VƯỢT +6m45s (+45%)**</w:t>
+              <w:t>🔴**VƯỢT +8m11s (+55%)**</w:t>
             </w:r>
           </w:p>
         </w:tc>
@@ -2398,7 +2398,7 @@
                 <w:rFonts w:ascii="Times New Roman" w:hAnsi="Times New Roman"/>
                 <w:sz w:val="20"/>
               </w:rPr>
-              <w:t>⚠️**CẨM ĐÃ CẬP NHẬT NỘI DUNG NHƯNG CẦN CẮT VỀ 2 PHÚT. KHANG, TRUNG TIẾP TỤC RÚT GỌN.**</w:t>
+              <w:t>⚠️**KHANG ĐÃ TỐI ƯU XONG. CẨM CẦN CẮT GỌN LỜI THOẠI VỀ 2 PHÚT (HIỆN DÀI ~8 PHÚT). TRUNG CHẠY LIVE DEMO TINH GỌN.**</w:t>
             </w:r>
           </w:p>
         </w:tc>
@@ -5244,7 +5244,7 @@
           <w:rFonts w:ascii="Times New Roman" w:hAnsi="Times New Roman"/>
           <w:i/>
         </w:rPr>
-        <w:t>(Thời lượng chuẩn hóa: **~80s – 85s** [Meeting thực tế: ~80s] | Người nói: **Nguyễn Duy Khang**)</w:t>
+        <w:t>(Thời lượng chuẩn hóa: **~45s – 50s** | Người nói: **Nguyễn Duy Khang**)</w:t>
       </w:r>
       <w:r>
         <w:rPr>
@@ -5257,63 +5257,87 @@
         <w:rPr>
           <w:rFonts w:ascii="Times New Roman" w:hAnsi="Times New Roman"/>
         </w:rPr>
-        <w:t>Nhìn vào bảng so sánh bên trái và biểu đồ bên phải do nhóm em tổng hợp:</w:t>
+        <w:t xml:space="preserve">Nhìn vào bảng so sánh bên trái, thầy và các bạn có thể thấy hai mô hình cây là </w:t>
+      </w:r>
+      <w:r>
+        <w:rPr>
+          <w:rFonts w:ascii="Times New Roman" w:hAnsi="Times New Roman"/>
+          <w:b/>
+        </w:rPr>
+        <w:t>Random Forest</w:t>
+      </w:r>
+      <w:r>
+        <w:rPr>
+          <w:rFonts w:ascii="Times New Roman" w:hAnsi="Times New Roman"/>
+        </w:rPr>
+        <w:t xml:space="preserve"> và </w:t>
+      </w:r>
+      <w:r>
+        <w:rPr>
+          <w:rFonts w:ascii="Times New Roman" w:hAnsi="Times New Roman"/>
+          <w:b/>
+        </w:rPr>
+        <w:t>XGBoost</w:t>
+      </w:r>
+      <w:r>
+        <w:rPr>
+          <w:rFonts w:ascii="Times New Roman" w:hAnsi="Times New Roman"/>
+        </w:rPr>
+        <w:t xml:space="preserve"> đều đạt F1-Score trên </w:t>
+      </w:r>
+      <w:r>
+        <w:rPr>
+          <w:rFonts w:ascii="Times New Roman" w:hAnsi="Times New Roman"/>
+          <w:b/>
+        </w:rPr>
+        <w:t>99.5%</w:t>
+      </w:r>
+      <w:r>
+        <w:rPr>
+          <w:rFonts w:ascii="Times New Roman" w:hAnsi="Times New Roman"/>
+        </w:rPr>
+        <w:t xml:space="preserve">, tức là bắt gần như trọn gian lận mà rất ít báo động nhầm. Random Forest nhỉnh hơn một chút, với F1 là </w:t>
+      </w:r>
+      <w:r>
+        <w:rPr>
+          <w:rFonts w:ascii="Times New Roman" w:hAnsi="Times New Roman"/>
+          <w:b/>
+        </w:rPr>
+        <w:t>99.73%</w:t>
+      </w:r>
+      <w:r>
+        <w:rPr>
+          <w:rFonts w:ascii="Times New Roman" w:hAnsi="Times New Roman"/>
+        </w:rPr>
+        <w:t>.</w:t>
       </w:r>
     </w:p>
     <w:p>
-      <w:pPr>
-        <w:pStyle w:val="ListBullet"/>
-      </w:pPr>
-      <w:r>
-        <w:rPr>
-          <w:rFonts w:ascii="Times New Roman" w:hAnsi="Times New Roman"/>
-        </w:rPr>
+      <w:r>
+        <w:rPr>
+          <w:rFonts w:ascii="Times New Roman" w:hAnsi="Times New Roman"/>
+        </w:rPr>
+        <w:t xml:space="preserve">Điểm khác biệt nằm ở thời gian huấn luyện: XGBoost chỉ mất </w:t>
       </w:r>
       <w:r>
         <w:rPr>
           <w:rFonts w:ascii="Times New Roman" w:hAnsi="Times New Roman"/>
           <w:b/>
         </w:rPr>
-        <w:t>Random Forest + SMOTE</w:t>
-      </w:r>
-      <w:r>
-        <w:rPr>
-          <w:rFonts w:ascii="Times New Roman" w:hAnsi="Times New Roman"/>
-        </w:rPr>
-        <w:t xml:space="preserve"> đạt hiệu năng phân lớp toàn diện cao nhất: </w:t>
+        <w:t>chưa tới một phút</w:t>
+      </w:r>
+      <w:r>
+        <w:rPr>
+          <w:rFonts w:ascii="Times New Roman" w:hAnsi="Times New Roman"/>
+        </w:rPr>
+        <w:t xml:space="preserve">, còn Random Forest mất gần 20 phút, tức là nhanh hơn khoảng </w:t>
       </w:r>
       <w:r>
         <w:rPr>
           <w:rFonts w:ascii="Times New Roman" w:hAnsi="Times New Roman"/>
           <w:b/>
         </w:rPr>
-        <w:t>Precision = 99.94%</w:t>
-      </w:r>
-      <w:r>
-        <w:rPr>
-          <w:rFonts w:ascii="Times New Roman" w:hAnsi="Times New Roman"/>
-        </w:rPr>
-        <w:t xml:space="preserve">, </w:t>
-      </w:r>
-      <w:r>
-        <w:rPr>
-          <w:rFonts w:ascii="Times New Roman" w:hAnsi="Times New Roman"/>
-          <w:b/>
-        </w:rPr>
-        <w:t>Recall = 99.51%</w:t>
-      </w:r>
-      <w:r>
-        <w:rPr>
-          <w:rFonts w:ascii="Times New Roman" w:hAnsi="Times New Roman"/>
-        </w:rPr>
-        <w:t xml:space="preserve">, và </w:t>
-      </w:r>
-      <w:r>
-        <w:rPr>
-          <w:rFonts w:ascii="Times New Roman" w:hAnsi="Times New Roman"/>
-          <w:b/>
-        </w:rPr>
-        <w:t>F1-Score = 99.73%</w:t>
+        <w:t>20 lần</w:t>
       </w:r>
       <w:r>
         <w:rPr>
@@ -5323,122 +5347,45 @@
       </w:r>
     </w:p>
     <w:p>
-      <w:pPr>
-        <w:pStyle w:val="ListBullet"/>
-      </w:pPr>
-      <w:r>
-        <w:rPr>
-          <w:rFonts w:ascii="Times New Roman" w:hAnsi="Times New Roman"/>
-        </w:rPr>
+      <w:r>
+        <w:rPr>
+          <w:rFonts w:ascii="Times New Roman" w:hAnsi="Times New Roman"/>
+        </w:rPr>
+        <w:t xml:space="preserve">Riêng </w:t>
       </w:r>
       <w:r>
         <w:rPr>
           <w:rFonts w:ascii="Times New Roman" w:hAnsi="Times New Roman"/>
           <w:b/>
         </w:rPr>
-        <w:t>XGBoost + SMOTE</w:t>
-      </w:r>
-      <w:r>
-        <w:rPr>
-          <w:rFonts w:ascii="Times New Roman" w:hAnsi="Times New Roman"/>
-        </w:rPr>
-        <w:t xml:space="preserve"> bám sát nút với </w:t>
+        <w:t>Autoencoder</w:t>
+      </w:r>
+      <w:r>
+        <w:rPr>
+          <w:rFonts w:ascii="Times New Roman" w:hAnsi="Times New Roman"/>
+        </w:rPr>
+        <w:t xml:space="preserve"> học hoàn toàn không cần nhãn nhưng vẫn bắt được khoảng </w:t>
       </w:r>
       <w:r>
         <w:rPr>
           <w:rFonts w:ascii="Times New Roman" w:hAnsi="Times New Roman"/>
           <w:b/>
         </w:rPr>
-        <w:t>Precision = 99.76%</w:t>
-      </w:r>
-      <w:r>
-        <w:rPr>
-          <w:rFonts w:ascii="Times New Roman" w:hAnsi="Times New Roman"/>
-        </w:rPr>
-        <w:t xml:space="preserve">, </w:t>
-      </w:r>
-      <w:r>
-        <w:rPr>
-          <w:rFonts w:ascii="Times New Roman" w:hAnsi="Times New Roman"/>
-          <w:b/>
-        </w:rPr>
-        <w:t>Recall = 99.51%</w:t>
-      </w:r>
-      <w:r>
-        <w:rPr>
-          <w:rFonts w:ascii="Times New Roman" w:hAnsi="Times New Roman"/>
-        </w:rPr>
-        <w:t xml:space="preserve">, </w:t>
-      </w:r>
-      <w:r>
-        <w:rPr>
-          <w:rFonts w:ascii="Times New Roman" w:hAnsi="Times New Roman"/>
-          <w:b/>
-        </w:rPr>
-        <w:t>F1-Score = 99.63%</w:t>
-      </w:r>
-      <w:r>
-        <w:rPr>
-          <w:rFonts w:ascii="Times New Roman" w:hAnsi="Times New Roman"/>
-        </w:rPr>
-        <w:t xml:space="preserve">, nhưng có thời gian huấn luyện siêu tốc chỉ </w:t>
-      </w:r>
-      <w:r>
-        <w:rPr>
-          <w:rFonts w:ascii="Times New Roman" w:hAnsi="Times New Roman"/>
-          <w:b/>
-        </w:rPr>
-        <w:t>41.7 giây</w:t>
-      </w:r>
-      <w:r>
-        <w:rPr>
-          <w:rFonts w:ascii="Times New Roman" w:hAnsi="Times New Roman"/>
-        </w:rPr>
-        <w:t>.</w:t>
+        <w:t>75%</w:t>
+      </w:r>
+      <w:r>
+        <w:rPr>
+          <w:rFonts w:ascii="Times New Roman" w:hAnsi="Times New Roman"/>
+        </w:rPr>
+        <w:t xml:space="preserve"> số vụ gian lận, nên đóng vai trò lớp phòng thủ dự phòng.</w:t>
       </w:r>
     </w:p>
     <w:p>
-      <w:pPr>
-        <w:pStyle w:val="ListBullet"/>
-      </w:pPr>
-      <w:r>
-        <w:rPr>
-          <w:rFonts w:ascii="Times New Roman" w:hAnsi="Times New Roman"/>
-        </w:rPr>
-      </w:r>
-      <w:r>
-        <w:rPr>
-          <w:rFonts w:ascii="Times New Roman" w:hAnsi="Times New Roman"/>
-          <w:b/>
-        </w:rPr>
-        <w:t>Deep Autoencoder</w:t>
-      </w:r>
-      <w:r>
-        <w:rPr>
-          <w:rFonts w:ascii="Times New Roman" w:hAnsi="Times New Roman"/>
-        </w:rPr>
-        <w:t xml:space="preserve"> đạt </w:t>
-      </w:r>
-      <w:r>
-        <w:rPr>
-          <w:rFonts w:ascii="Times New Roman" w:hAnsi="Times New Roman"/>
-          <w:b/>
-        </w:rPr>
-        <w:t>Recall = 75.23%</w:t>
-      </w:r>
-      <w:r>
-        <w:rPr>
-          <w:rFonts w:ascii="Times New Roman" w:hAnsi="Times New Roman"/>
-        </w:rPr>
-        <w:t xml:space="preserve"> ở chế độ hoàn toàn không giám sát.</w:t>
-      </w:r>
-    </w:p>
-    <w:p>
-      <w:r>
-        <w:rPr>
-          <w:rFonts w:ascii="Times New Roman" w:hAnsi="Times New Roman"/>
-        </w:rPr>
-        <w:t>Nhìn vào biểu đồ cột bên phải: Hai mô hình cây (cột xanh) đạt sự cân bằng lý tưởng giữa Precision và Recall. Còn Autoencoder (cột đỏ) chấp nhận Precision ở mức 38.2% để giữ Recall cao ở mức 75.2%, hoàn toàn đúng với triết lý an toàn tài chính: *"Thà cảnh báo nhầm để kiểm tra lại một bước OTP, còn hơn bỏ lọt tội phạm tài chính"*.</w:t>
+      <w:r>
+        <w:rPr>
+          <w:rFonts w:ascii="Times New Roman" w:hAnsi="Times New Roman"/>
+        </w:rPr>
+        <w:t>Ở biểu đồ bên phải, hai mô hình cây gần như đạt tối đa cả ba chỉ số, còn Autoencoder chủ động chấp nhận Precision thấp, khoảng 38%, để giữ Recall cao. Đây là đánh đổi có chủ đích: *"Thà cảnh báo nhầm để xác thực thêm một bước OTP, còn hơn bỏ lọt tội phạm tài chính"*.</w:t>
       </w:r>
     </w:p>
     <w:p>
@@ -5471,7 +5418,7 @@
           <w:rFonts w:ascii="Times New Roman" w:hAnsi="Times New Roman"/>
           <w:i/>
         </w:rPr>
-        <w:t>(Thời lượng chuẩn hóa: **~80s – 85s** [Meeting thực tế: ~80s] | Người nói: **Nguyễn Duy Khang**)</w:t>
+        <w:t>(Thời lượng chuẩn hóa: **~45s – 50s** | Người nói: **Nguyễn Duy Khang**)</w:t>
       </w:r>
       <w:r>
         <w:rPr>
@@ -5484,7 +5431,7 @@
         <w:rPr>
           <w:rFonts w:ascii="Times New Roman" w:hAnsi="Times New Roman"/>
         </w:rPr>
-        <w:t xml:space="preserve">Slide này thể hiện chi tiết </w:t>
+        <w:t xml:space="preserve">Đây là </w:t>
       </w:r>
       <w:r>
         <w:rPr>
@@ -5497,154 +5444,127 @@
         <w:rPr>
           <w:rFonts w:ascii="Times New Roman" w:hAnsi="Times New Roman"/>
         </w:rPr>
-        <w:t xml:space="preserve"> trên 40,000 mẫu kiểm thử độc lập:</w:t>
+        <w:t xml:space="preserve"> của các mô hình trên 40,000 mẫu kiểm thử độc lập.</w:t>
       </w:r>
     </w:p>
     <w:p>
-      <w:pPr>
-        <w:pStyle w:val="ListBullet"/>
-      </w:pPr>
-      <w:r>
-        <w:rPr>
-          <w:rFonts w:ascii="Times New Roman" w:hAnsi="Times New Roman"/>
-        </w:rPr>
+      <w:r>
+        <w:rPr>
+          <w:rFonts w:ascii="Times New Roman" w:hAnsi="Times New Roman"/>
+        </w:rPr>
+        <w:t xml:space="preserve">Với </w:t>
       </w:r>
       <w:r>
         <w:rPr>
           <w:rFonts w:ascii="Times New Roman" w:hAnsi="Times New Roman"/>
           <w:b/>
         </w:rPr>
-        <w:t>Ô đầu tiên — Random Forest:</w:t>
-      </w:r>
-      <w:r>
-        <w:rPr>
-          <w:rFonts w:ascii="Times New Roman" w:hAnsi="Times New Roman"/>
-        </w:rPr>
-        <w:t xml:space="preserve"> Trong 1,643 vụ gian lận thật, mô hình bắt trúng </w:t>
+        <w:t>Random Forest</w:t>
+      </w:r>
+      <w:r>
+        <w:rPr>
+          <w:rFonts w:ascii="Times New Roman" w:hAnsi="Times New Roman"/>
+        </w:rPr>
+        <w:t xml:space="preserve">, trong 1,643 vụ gian lận thật, mô hình bắt trúng 1,635 vụ, chỉ để lọt </w:t>
       </w:r>
       <w:r>
         <w:rPr>
           <w:rFonts w:ascii="Times New Roman" w:hAnsi="Times New Roman"/>
           <w:b/>
         </w:rPr>
-        <w:t>1,635 vụ (TP)</w:t>
-      </w:r>
-      <w:r>
-        <w:rPr>
-          <w:rFonts w:ascii="Times New Roman" w:hAnsi="Times New Roman"/>
-        </w:rPr>
-        <w:t xml:space="preserve">, chỉ để lọt duy nhất </w:t>
+        <w:t>8 vụ</w:t>
+      </w:r>
+      <w:r>
+        <w:rPr>
+          <w:rFonts w:ascii="Times New Roman" w:hAnsi="Times New Roman"/>
+        </w:rPr>
+        <w:t xml:space="preserve">, và trên hơn 38 nghìn giao dịch bình thường chỉ cảnh báo nhầm </w:t>
       </w:r>
       <w:r>
         <w:rPr>
           <w:rFonts w:ascii="Times New Roman" w:hAnsi="Times New Roman"/>
           <w:b/>
         </w:rPr>
-        <w:t>8 vụ (FN)</w:t>
-      </w:r>
-      <w:r>
-        <w:rPr>
-          <w:rFonts w:ascii="Times New Roman" w:hAnsi="Times New Roman"/>
-        </w:rPr>
-        <w:t xml:space="preserve">. Và trên 38,357 giao dịch bình thường, mô hình chỉ cảnh báo nhầm đúng </w:t>
+        <w:t>đúng 1 ca</w:t>
+      </w:r>
+      <w:r>
+        <w:rPr>
+          <w:rFonts w:ascii="Times New Roman" w:hAnsi="Times New Roman"/>
+        </w:rPr>
+        <w:t xml:space="preserve">. </w:t>
       </w:r>
       <w:r>
         <w:rPr>
           <w:rFonts w:ascii="Times New Roman" w:hAnsi="Times New Roman"/>
           <w:b/>
         </w:rPr>
-        <w:t>1 ca duy nhất (FP)</w:t>
-      </w:r>
-      <w:r>
-        <w:rPr>
-          <w:rFonts w:ascii="Times New Roman" w:hAnsi="Times New Roman"/>
-        </w:rPr>
-        <w:t>.</w:t>
+        <w:t>XGBoost</w:t>
+      </w:r>
+      <w:r>
+        <w:rPr>
+          <w:rFonts w:ascii="Times New Roman" w:hAnsi="Times New Roman"/>
+        </w:rPr>
+        <w:t xml:space="preserve">, mô hình nhóm chọn đưa vào sản xuất, cũng bắt trúng 1,635 vụ và bỏ lọt 8 vụ, chỉ cảnh báo nhầm </w:t>
+      </w:r>
+      <w:r>
+        <w:rPr>
+          <w:rFonts w:ascii="Times New Roman" w:hAnsi="Times New Roman"/>
+          <w:b/>
+        </w:rPr>
+        <w:t>4 ca</w:t>
+      </w:r>
+      <w:r>
+        <w:rPr>
+          <w:rFonts w:ascii="Times New Roman" w:hAnsi="Times New Roman"/>
+        </w:rPr>
+        <w:t>, nhưng huấn luyện nhanh hơn nhiều và độ trễ chỉ cỡ nửa mili-giây.</w:t>
       </w:r>
     </w:p>
     <w:p>
-      <w:pPr>
-        <w:pStyle w:val="ListBullet"/>
-      </w:pPr>
-      <w:r>
-        <w:rPr>
-          <w:rFonts w:ascii="Times New Roman" w:hAnsi="Times New Roman"/>
-        </w:rPr>
+      <w:r>
+        <w:rPr>
+          <w:rFonts w:ascii="Times New Roman" w:hAnsi="Times New Roman"/>
+        </w:rPr>
+        <w:t xml:space="preserve">Còn </w:t>
       </w:r>
       <w:r>
         <w:rPr>
           <w:rFonts w:ascii="Times New Roman" w:hAnsi="Times New Roman"/>
           <w:b/>
         </w:rPr>
-        <w:t>Ô thứ hai — XGBoost:</w:t>
-      </w:r>
-      <w:r>
-        <w:rPr>
-          <w:rFonts w:ascii="Times New Roman" w:hAnsi="Times New Roman"/>
-        </w:rPr>
-        <w:t xml:space="preserve"> Bắt trúng </w:t>
+        <w:t>Autoencoder</w:t>
+      </w:r>
+      <w:r>
+        <w:rPr>
+          <w:rFonts w:ascii="Times New Roman" w:hAnsi="Times New Roman"/>
+        </w:rPr>
+        <w:t xml:space="preserve"> bắt được </w:t>
       </w:r>
       <w:r>
         <w:rPr>
           <w:rFonts w:ascii="Times New Roman" w:hAnsi="Times New Roman"/>
           <w:b/>
         </w:rPr>
-        <w:t>1,635 vụ gian lận</w:t>
-      </w:r>
-      <w:r>
-        <w:rPr>
-          <w:rFonts w:ascii="Times New Roman" w:hAnsi="Times New Roman"/>
-        </w:rPr>
-        <w:t xml:space="preserve">, bỏ lọt 8 vụ, và chỉ đoán nhầm </w:t>
+        <w:t>1,236 vụ</w:t>
+      </w:r>
+      <w:r>
+        <w:rPr>
+          <w:rFonts w:ascii="Times New Roman" w:hAnsi="Times New Roman"/>
+        </w:rPr>
+        <w:t xml:space="preserve"> mà không cần nhãn, đóng vai trò màng lọc thứ cấp cho các kiểu tấn công lạ. Đổi lại, mô hình vẫn bỏ lọt 407 vụ và cảnh báo nhầm cỡ </w:t>
       </w:r>
       <w:r>
         <w:rPr>
           <w:rFonts w:ascii="Times New Roman" w:hAnsi="Times New Roman"/>
           <w:b/>
         </w:rPr>
-        <w:t>4 vụ</w:t>
-      </w:r>
-      <w:r>
-        <w:rPr>
-          <w:rFonts w:ascii="Times New Roman" w:hAnsi="Times New Roman"/>
-        </w:rPr>
-        <w:t>. Đây là sự đánh đổi hoàn toàn tối ưu để lấy tốc độ huấn luyện nhanh gấp 28.5 lần.</w:t>
-      </w:r>
-    </w:p>
-    <w:p>
-      <w:pPr>
-        <w:pStyle w:val="ListBullet"/>
-      </w:pPr>
-      <w:r>
-        <w:rPr>
-          <w:rFonts w:ascii="Times New Roman" w:hAnsi="Times New Roman"/>
-        </w:rPr>
-      </w:r>
-      <w:r>
-        <w:rPr>
-          <w:rFonts w:ascii="Times New Roman" w:hAnsi="Times New Roman"/>
-          <w:b/>
-        </w:rPr>
-        <w:t>Ô thứ ba — Deep Autoencoder:</w:t>
-      </w:r>
-      <w:r>
-        <w:rPr>
-          <w:rFonts w:ascii="Times New Roman" w:hAnsi="Times New Roman"/>
-        </w:rPr>
-        <w:t xml:space="preserve"> Bắt trúng </w:t>
-      </w:r>
-      <w:r>
-        <w:rPr>
-          <w:rFonts w:ascii="Times New Roman" w:hAnsi="Times New Roman"/>
-          <w:b/>
-        </w:rPr>
-        <w:t>1,236 vụ gian lận</w:t>
-      </w:r>
-      <w:r>
-        <w:rPr>
-          <w:rFonts w:ascii="Times New Roman" w:hAnsi="Times New Roman"/>
-        </w:rPr>
-        <w:t xml:space="preserve"> mà không cần biết trước nhãn. Dù có 1,998 ca đoán nhầm, nhưng với quy mô ngân hàng, việc chuyển 5% giao dịch đáng ngờ sang bước xác thực OTP bổ sung là hoàn toàn khả thi và chấp nhận được trong thực tế.</w:t>
+        <w:t>5%</w:t>
+      </w:r>
+      <w:r>
+        <w:rPr>
+          <w:rFonts w:ascii="Times New Roman" w:hAnsi="Times New Roman"/>
+        </w:rPr>
+        <w:t xml:space="preserve"> giao dịch. Với ngân hàng thì con số này vẫn chấp nhận được, vì chỉ cần chuyển các giao dịch đó sang bước xác thực OTP.</w:t>
       </w:r>
     </w:p>
     <w:p>
@@ -5677,7 +5597,7 @@
           <w:rFonts w:ascii="Times New Roman" w:hAnsi="Times New Roman"/>
           <w:i/>
         </w:rPr>
-        <w:t>(Thời lượng chuẩn hóa: **~80s – 85s** [Meeting thực tế: ~82s] | Người nói: **Nguyễn Duy Khang**)</w:t>
+        <w:t>(Thời lượng chuẩn hóa: **~45s – 50s** | Người nói: **Nguyễn Duy Khang**)</w:t>
       </w:r>
       <w:r>
         <w:rPr>
@@ -5690,20 +5610,20 @@
         <w:rPr>
           <w:rFonts w:ascii="Times New Roman" w:hAnsi="Times New Roman"/>
         </w:rPr>
-        <w:t xml:space="preserve">Cũng trong module đánh giá, nhóm tiến hành phân tích </w:t>
+        <w:t xml:space="preserve">Tiếp theo là </w:t>
       </w:r>
       <w:r>
         <w:rPr>
           <w:rFonts w:ascii="Times New Roman" w:hAnsi="Times New Roman"/>
           <w:b/>
         </w:rPr>
-        <w:t>Độ quan trọng của đặc trưng (Feature Importance)</w:t>
-      </w:r>
-      <w:r>
-        <w:rPr>
-          <w:rFonts w:ascii="Times New Roman" w:hAnsi="Times New Roman"/>
-        </w:rPr>
-        <w:t>:</w:t>
+        <w:t>Độ quan trọng của đặc trưng</w:t>
+      </w:r>
+      <w:r>
+        <w:rPr>
+          <w:rFonts w:ascii="Times New Roman" w:hAnsi="Times New Roman"/>
+        </w:rPr>
+        <w:t>, tức là mô hình XGBoost dựa vào thông tin nào nhiều nhất để ra quyết định.</w:t>
       </w:r>
     </w:p>
     <w:p>
@@ -5711,7 +5631,72 @@
         <w:rPr>
           <w:rFonts w:ascii="Times New Roman" w:hAnsi="Times New Roman"/>
         </w:rPr>
-        <w:t>Nhìn vào biểu đồ thanh ngang và bảng xếp hạng, Thầy và các bạn sẽ thấy một kết quả định lượng rất rõ ràng:</w:t>
+        <w:t xml:space="preserve">Nhìn vào biểu đồ, hai đặc trưng đứng đầu là </w:t>
+      </w:r>
+      <w:r>
+        <w:rPr>
+          <w:rFonts w:ascii="Times New Roman" w:hAnsi="Times New Roman"/>
+          <w:b/>
+        </w:rPr>
+        <w:t>`errorBalanceOrig`</w:t>
+      </w:r>
+      <w:r>
+        <w:rPr>
+          <w:rFonts w:ascii="Times New Roman" w:hAnsi="Times New Roman"/>
+        </w:rPr>
+        <w:t xml:space="preserve">, tức sai lệch số dư nguồn, chiếm khoảng </w:t>
+      </w:r>
+      <w:r>
+        <w:rPr>
+          <w:rFonts w:ascii="Times New Roman" w:hAnsi="Times New Roman"/>
+          <w:b/>
+        </w:rPr>
+        <w:t>50%</w:t>
+      </w:r>
+      <w:r>
+        <w:rPr>
+          <w:rFonts w:ascii="Times New Roman" w:hAnsi="Times New Roman"/>
+        </w:rPr>
+        <w:t xml:space="preserve">, và </w:t>
+      </w:r>
+      <w:r>
+        <w:rPr>
+          <w:rFonts w:ascii="Times New Roman" w:hAnsi="Times New Roman"/>
+          <w:b/>
+        </w:rPr>
+        <w:t>`newbalanceOrig`</w:t>
+      </w:r>
+      <w:r>
+        <w:rPr>
+          <w:rFonts w:ascii="Times New Roman" w:hAnsi="Times New Roman"/>
+        </w:rPr>
+        <w:t xml:space="preserve">, tức số dư về 0 sau khi rút cạn, chiếm khoảng </w:t>
+      </w:r>
+      <w:r>
+        <w:rPr>
+          <w:rFonts w:ascii="Times New Roman" w:hAnsi="Times New Roman"/>
+          <w:b/>
+        </w:rPr>
+        <w:t>47%</w:t>
+      </w:r>
+      <w:r>
+        <w:rPr>
+          <w:rFonts w:ascii="Times New Roman" w:hAnsi="Times New Roman"/>
+        </w:rPr>
+        <w:t xml:space="preserve">. Gộp lại, riêng hai đặc trưng này đã chiếm tới </w:t>
+      </w:r>
+      <w:r>
+        <w:rPr>
+          <w:rFonts w:ascii="Times New Roman" w:hAnsi="Times New Roman"/>
+          <w:b/>
+        </w:rPr>
+        <w:t>97%</w:t>
+      </w:r>
+      <w:r>
+        <w:rPr>
+          <w:rFonts w:ascii="Times New Roman" w:hAnsi="Times New Roman"/>
+        </w:rPr>
+        <w:t xml:space="preserve"> sức mạnh phân loại. Số tiền giao dịch hay khung giờ đêm gần như không đóng góp đáng kể.</w:t>
       </w:r>
     </w:p>
     <w:p>
@@ -5719,107 +5704,7 @@
         <w:rPr>
           <w:rFonts w:ascii="Times New Roman" w:hAnsi="Times New Roman"/>
         </w:rPr>
-        <w:t>Hai đặc trưng hàng đầu chiếm thế thượng phong:</w:t>
-      </w:r>
-    </w:p>
-    <w:p>
-      <w:pPr>
-        <w:pStyle w:val="ListBullet"/>
-      </w:pPr>
-      <w:r>
-        <w:rPr>
-          <w:rFonts w:ascii="Times New Roman" w:hAnsi="Times New Roman"/>
-        </w:rPr>
-      </w:r>
-      <w:r>
-        <w:rPr>
-          <w:rFonts w:ascii="Times New Roman" w:hAnsi="Times New Roman"/>
-          <w:b/>
-        </w:rPr>
-        <w:t>`errorBalanceOrig`</w:t>
-      </w:r>
-      <w:r>
-        <w:rPr>
-          <w:rFonts w:ascii="Times New Roman" w:hAnsi="Times New Roman"/>
-        </w:rPr>
-        <w:t xml:space="preserve"> (Sai lệch số dư nguồn) chiếm </w:t>
-      </w:r>
-      <w:r>
-        <w:rPr>
-          <w:rFonts w:ascii="Times New Roman" w:hAnsi="Times New Roman"/>
-          <w:b/>
-        </w:rPr>
-        <w:t>49.9%</w:t>
-      </w:r>
-      <w:r>
-        <w:rPr>
-          <w:rFonts w:ascii="Times New Roman" w:hAnsi="Times New Roman"/>
-        </w:rPr>
-        <w:t xml:space="preserve"> đóng góp.</w:t>
-      </w:r>
-    </w:p>
-    <w:p>
-      <w:pPr>
-        <w:pStyle w:val="ListBullet"/>
-      </w:pPr>
-      <w:r>
-        <w:rPr>
-          <w:rFonts w:ascii="Times New Roman" w:hAnsi="Times New Roman"/>
-        </w:rPr>
-      </w:r>
-      <w:r>
-        <w:rPr>
-          <w:rFonts w:ascii="Times New Roman" w:hAnsi="Times New Roman"/>
-          <w:b/>
-        </w:rPr>
-        <w:t>`newbalanceOrig`</w:t>
-      </w:r>
-      <w:r>
-        <w:rPr>
-          <w:rFonts w:ascii="Times New Roman" w:hAnsi="Times New Roman"/>
-        </w:rPr>
-        <w:t xml:space="preserve"> (Số dư nguồn về 0 khi rút cạn) chiếm </w:t>
-      </w:r>
-      <w:r>
-        <w:rPr>
-          <w:rFonts w:ascii="Times New Roman" w:hAnsi="Times New Roman"/>
-          <w:b/>
-        </w:rPr>
-        <w:t>47.2%</w:t>
-      </w:r>
-      <w:r>
-        <w:rPr>
-          <w:rFonts w:ascii="Times New Roman" w:hAnsi="Times New Roman"/>
-        </w:rPr>
-        <w:t xml:space="preserve"> đóng góp.</w:t>
-      </w:r>
-    </w:p>
-    <w:p>
-      <w:r>
-        <w:rPr>
-          <w:rFonts w:ascii="Times New Roman" w:hAnsi="Times New Roman"/>
-        </w:rPr>
-      </w:r>
-      <w:r>
-        <w:rPr>
-          <w:rFonts w:ascii="Times New Roman" w:hAnsi="Times New Roman"/>
-          <w:b/>
-        </w:rPr>
-        <w:t>Chỉ riêng 2 đặc trưng này gộp lại đã chiếm tới 97.1% toàn bộ Feature Split Gains của XGBoost!</w:t>
-      </w:r>
-      <w:r>
-        <w:rPr>
-          <w:rFonts w:ascii="Times New Roman" w:hAnsi="Times New Roman"/>
-        </w:rPr>
-        <w:t xml:space="preserve"> Trong khi các thuộc tính phụ trợ như số tiền giao dịch (`amount`) chỉ chiếm khoảng 0.5%, hay khung giờ đêm chỉ chiếm 0.03%.</w:t>
-      </w:r>
-    </w:p>
-    <w:p>
-      <w:r>
-        <w:rPr>
-          <w:rFonts w:ascii="Times New Roman" w:hAnsi="Times New Roman"/>
-        </w:rPr>
-        <w:t>Điều này cho thấy mô hình bám rất chặt vào dấu vết sai lệch số dư. Trong báo cáo, nhóm cũng nhận diện rõ việc phụ thuộc 98.5% vào nhóm số dư là nguy cơ rủi ro do đặc thù simulator PaySim, chứ không vội vàng xem đây là ranh giới tuyến tính đơn giản ngoài thực tế.</w:t>
+        <w:t>Điều này cho thấy mô hình bám rất chặt vào dấu vết sai lệch số dư. Tuy nhiên, nhóm cũng lưu ý đây là đặc thù của dữ liệu mô phỏng PaySim, nên chưa thể khẳng định kết quả này giữ nguyên ngoài thực tế.</w:t>
       </w:r>
     </w:p>
     <w:p>

</xml_diff>

<commit_message>
docs(script): đồng bộ bảng ngân sách 15p sau khi Khang rút gọn Slide 15-17 (PR #50) (#51)
## Summary
- Cập nhật dòng Nguyễn Duy Khang trong Bảng đối chiếu mục tiêu 15 phút:
chuyển trạng thái sang 🟢 **Đã cập nhật (Rút gọn Slide 15–17 PR #50)**.
- Thời lượng kịch bản của Khang giảm từ **4 phút 39s (279s)** xuống còn
**2 phút 45s (165s)** (tiết kiệm ~114s); mức chênh lệch giảm xuống
**+30s (+22%)** so với ngân sách mục tiêu (2m15s).
- Cập nhật dòng Tổng kết toàn bài: 6/7 thành viên đã cập nhật kịch bản,
5/7 đã tối ưu sát ngân sách.
- Tái tạo đồng bộ file Word \SCRIPT_THUYET_TRINH_TOAN_TEAM_CS106.docx\
từ file Markdown.

## Test plan
- [x] Kiểm tra hiển thị bảng trong Markdown và file DOCX khớp nhau 100%.
- [x] Số liệu thời gian Khang khớp với PR #50 (Slide 14 ~25s, Slide
15-17 ~45-50s/slide).
</commit_message>
<xml_diff>
--- a/draft/fraud-detection/slide/scripts/SCRIPT_THUYET_TRINH_TOAN_TEAM_CS106.docx
+++ b/draft/fraud-detection/slide/scripts/SCRIPT_THUYET_TRINH_TOAN_TEAM_CS106.docx
@@ -1604,7 +1604,7 @@
                 <w:rFonts w:ascii="Times New Roman" w:hAnsi="Times New Roman"/>
                 <w:sz w:val="20"/>
               </w:rPr>
-              <w:t>🔴**Chưa cập nhật** *(Giữ nguyên bản cũ)*</w:t>
+              <w:t>🟢**Đã cập nhật** *(Rút gọn Slide 15–17 PR #50)*</w:t>
             </w:r>
           </w:p>
         </w:tc>
@@ -1646,7 +1646,7 @@
                 <w:rFonts w:ascii="Times New Roman" w:hAnsi="Times New Roman"/>
                 <w:sz w:val="20"/>
               </w:rPr>
-              <w:t>**4 phút 39s** *(279s)*</w:t>
+              <w:t>**2 phút 45s** *(165s)*</w:t>
             </w:r>
           </w:p>
         </w:tc>
@@ -1674,7 +1674,7 @@
                 <w:rFonts w:ascii="Times New Roman" w:hAnsi="Times New Roman"/>
                 <w:sz w:val="20"/>
               </w:rPr>
-              <w:t>🔴**Vượt +2m24s** *(+106%)*</w:t>
+              <w:t>🟢**Vượt +30s** *(+22%)*</w:t>
             </w:r>
           </w:p>
         </w:tc>
@@ -1688,7 +1688,7 @@
                 <w:rFonts w:ascii="Times New Roman" w:hAnsi="Times New Roman"/>
                 <w:sz w:val="20"/>
               </w:rPr>
-              <w:t>⚠️**Không đọc bảng:** Chỉ nêu bật RF &amp; XGBoost dẫn đầu, lướt các chỉ số phụ.</w:t>
+              <w:t>✅**Đã rút gọn (PR #50):** Lời thoại ngắn gọn (~45–50s/slide), bỏ đọc số liệu chi tiết và viết tắt TP/FN/FP; nêu bật RF/XGBoost và 2 đặc trưng chính 97%.</w:t>
             </w:r>
           </w:p>
         </w:tc>
@@ -2314,7 +2314,7 @@
                 <w:rFonts w:ascii="Times New Roman" w:hAnsi="Times New Roman"/>
                 <w:sz w:val="20"/>
               </w:rPr>
-              <w:t>**5/7 bạn đã cập nhật; 4/7 đã tối ưu**</w:t>
+              <w:t>**6/7 bạn đã cập nhật; 5/7 đã tối ưu**</w:t>
             </w:r>
           </w:p>
         </w:tc>
@@ -2356,7 +2356,7 @@
                 <w:rFonts w:ascii="Times New Roman" w:hAnsi="Times New Roman"/>
                 <w:sz w:val="20"/>
               </w:rPr>
-              <w:t>**21 phút 45s** *(1,305s)*</w:t>
+              <w:t>**23 phút 11s** *(1,391s)*</w:t>
             </w:r>
           </w:p>
         </w:tc>
@@ -2384,7 +2384,7 @@
                 <w:rFonts w:ascii="Times New Roman" w:hAnsi="Times New Roman"/>
                 <w:sz w:val="20"/>
               </w:rPr>
-              <w:t>🔴**VƯỢT +6m45s (+45%)**</w:t>
+              <w:t>🔴**VƯỢT +8m11s (+55%)**</w:t>
             </w:r>
           </w:p>
         </w:tc>
@@ -2398,7 +2398,7 @@
                 <w:rFonts w:ascii="Times New Roman" w:hAnsi="Times New Roman"/>
                 <w:sz w:val="20"/>
               </w:rPr>
-              <w:t>⚠️**CẨM ĐÃ CẬP NHẬT NỘI DUNG NHƯNG CẦN CẮT VỀ 2 PHÚT. KHANG, TRUNG TIẾP TỤC RÚT GỌN.**</w:t>
+              <w:t>⚠️**KHANG ĐÃ TỐI ƯU XONG. CẨM CẦN CẮT GỌN LỜI THOẠI VỀ 2 PHÚT (HIỆN DÀI ~8 PHÚT). TRUNG CHẠY LIVE DEMO TINH GỌN.**</w:t>
             </w:r>
           </w:p>
         </w:tc>
@@ -5244,7 +5244,7 @@
           <w:rFonts w:ascii="Times New Roman" w:hAnsi="Times New Roman"/>
           <w:i/>
         </w:rPr>
-        <w:t>(Thời lượng chuẩn hóa: **~80s – 85s** [Meeting thực tế: ~80s] | Người nói: **Nguyễn Duy Khang**)</w:t>
+        <w:t>(Thời lượng chuẩn hóa: **~45s – 50s** | Người nói: **Nguyễn Duy Khang**)</w:t>
       </w:r>
       <w:r>
         <w:rPr>
@@ -5257,63 +5257,87 @@
         <w:rPr>
           <w:rFonts w:ascii="Times New Roman" w:hAnsi="Times New Roman"/>
         </w:rPr>
-        <w:t>Nhìn vào bảng so sánh bên trái và biểu đồ bên phải do nhóm em tổng hợp:</w:t>
+        <w:t xml:space="preserve">Nhìn vào bảng so sánh bên trái, thầy và các bạn có thể thấy hai mô hình cây là </w:t>
+      </w:r>
+      <w:r>
+        <w:rPr>
+          <w:rFonts w:ascii="Times New Roman" w:hAnsi="Times New Roman"/>
+          <w:b/>
+        </w:rPr>
+        <w:t>Random Forest</w:t>
+      </w:r>
+      <w:r>
+        <w:rPr>
+          <w:rFonts w:ascii="Times New Roman" w:hAnsi="Times New Roman"/>
+        </w:rPr>
+        <w:t xml:space="preserve"> và </w:t>
+      </w:r>
+      <w:r>
+        <w:rPr>
+          <w:rFonts w:ascii="Times New Roman" w:hAnsi="Times New Roman"/>
+          <w:b/>
+        </w:rPr>
+        <w:t>XGBoost</w:t>
+      </w:r>
+      <w:r>
+        <w:rPr>
+          <w:rFonts w:ascii="Times New Roman" w:hAnsi="Times New Roman"/>
+        </w:rPr>
+        <w:t xml:space="preserve"> đều đạt F1-Score trên </w:t>
+      </w:r>
+      <w:r>
+        <w:rPr>
+          <w:rFonts w:ascii="Times New Roman" w:hAnsi="Times New Roman"/>
+          <w:b/>
+        </w:rPr>
+        <w:t>99.5%</w:t>
+      </w:r>
+      <w:r>
+        <w:rPr>
+          <w:rFonts w:ascii="Times New Roman" w:hAnsi="Times New Roman"/>
+        </w:rPr>
+        <w:t xml:space="preserve">, tức là bắt gần như trọn gian lận mà rất ít báo động nhầm. Random Forest nhỉnh hơn một chút, với F1 là </w:t>
+      </w:r>
+      <w:r>
+        <w:rPr>
+          <w:rFonts w:ascii="Times New Roman" w:hAnsi="Times New Roman"/>
+          <w:b/>
+        </w:rPr>
+        <w:t>99.73%</w:t>
+      </w:r>
+      <w:r>
+        <w:rPr>
+          <w:rFonts w:ascii="Times New Roman" w:hAnsi="Times New Roman"/>
+        </w:rPr>
+        <w:t>.</w:t>
       </w:r>
     </w:p>
     <w:p>
-      <w:pPr>
-        <w:pStyle w:val="ListBullet"/>
-      </w:pPr>
-      <w:r>
-        <w:rPr>
-          <w:rFonts w:ascii="Times New Roman" w:hAnsi="Times New Roman"/>
-        </w:rPr>
+      <w:r>
+        <w:rPr>
+          <w:rFonts w:ascii="Times New Roman" w:hAnsi="Times New Roman"/>
+        </w:rPr>
+        <w:t xml:space="preserve">Điểm khác biệt nằm ở thời gian huấn luyện: XGBoost chỉ mất </w:t>
       </w:r>
       <w:r>
         <w:rPr>
           <w:rFonts w:ascii="Times New Roman" w:hAnsi="Times New Roman"/>
           <w:b/>
         </w:rPr>
-        <w:t>Random Forest + SMOTE</w:t>
-      </w:r>
-      <w:r>
-        <w:rPr>
-          <w:rFonts w:ascii="Times New Roman" w:hAnsi="Times New Roman"/>
-        </w:rPr>
-        <w:t xml:space="preserve"> đạt hiệu năng phân lớp toàn diện cao nhất: </w:t>
+        <w:t>chưa tới một phút</w:t>
+      </w:r>
+      <w:r>
+        <w:rPr>
+          <w:rFonts w:ascii="Times New Roman" w:hAnsi="Times New Roman"/>
+        </w:rPr>
+        <w:t xml:space="preserve">, còn Random Forest mất gần 20 phút, tức là nhanh hơn khoảng </w:t>
       </w:r>
       <w:r>
         <w:rPr>
           <w:rFonts w:ascii="Times New Roman" w:hAnsi="Times New Roman"/>
           <w:b/>
         </w:rPr>
-        <w:t>Precision = 99.94%</w:t>
-      </w:r>
-      <w:r>
-        <w:rPr>
-          <w:rFonts w:ascii="Times New Roman" w:hAnsi="Times New Roman"/>
-        </w:rPr>
-        <w:t xml:space="preserve">, </w:t>
-      </w:r>
-      <w:r>
-        <w:rPr>
-          <w:rFonts w:ascii="Times New Roman" w:hAnsi="Times New Roman"/>
-          <w:b/>
-        </w:rPr>
-        <w:t>Recall = 99.51%</w:t>
-      </w:r>
-      <w:r>
-        <w:rPr>
-          <w:rFonts w:ascii="Times New Roman" w:hAnsi="Times New Roman"/>
-        </w:rPr>
-        <w:t xml:space="preserve">, và </w:t>
-      </w:r>
-      <w:r>
-        <w:rPr>
-          <w:rFonts w:ascii="Times New Roman" w:hAnsi="Times New Roman"/>
-          <w:b/>
-        </w:rPr>
-        <w:t>F1-Score = 99.73%</w:t>
+        <w:t>20 lần</w:t>
       </w:r>
       <w:r>
         <w:rPr>
@@ -5323,122 +5347,45 @@
       </w:r>
     </w:p>
     <w:p>
-      <w:pPr>
-        <w:pStyle w:val="ListBullet"/>
-      </w:pPr>
-      <w:r>
-        <w:rPr>
-          <w:rFonts w:ascii="Times New Roman" w:hAnsi="Times New Roman"/>
-        </w:rPr>
+      <w:r>
+        <w:rPr>
+          <w:rFonts w:ascii="Times New Roman" w:hAnsi="Times New Roman"/>
+        </w:rPr>
+        <w:t xml:space="preserve">Riêng </w:t>
       </w:r>
       <w:r>
         <w:rPr>
           <w:rFonts w:ascii="Times New Roman" w:hAnsi="Times New Roman"/>
           <w:b/>
         </w:rPr>
-        <w:t>XGBoost + SMOTE</w:t>
-      </w:r>
-      <w:r>
-        <w:rPr>
-          <w:rFonts w:ascii="Times New Roman" w:hAnsi="Times New Roman"/>
-        </w:rPr>
-        <w:t xml:space="preserve"> bám sát nút với </w:t>
+        <w:t>Autoencoder</w:t>
+      </w:r>
+      <w:r>
+        <w:rPr>
+          <w:rFonts w:ascii="Times New Roman" w:hAnsi="Times New Roman"/>
+        </w:rPr>
+        <w:t xml:space="preserve"> học hoàn toàn không cần nhãn nhưng vẫn bắt được khoảng </w:t>
       </w:r>
       <w:r>
         <w:rPr>
           <w:rFonts w:ascii="Times New Roman" w:hAnsi="Times New Roman"/>
           <w:b/>
         </w:rPr>
-        <w:t>Precision = 99.76%</w:t>
-      </w:r>
-      <w:r>
-        <w:rPr>
-          <w:rFonts w:ascii="Times New Roman" w:hAnsi="Times New Roman"/>
-        </w:rPr>
-        <w:t xml:space="preserve">, </w:t>
-      </w:r>
-      <w:r>
-        <w:rPr>
-          <w:rFonts w:ascii="Times New Roman" w:hAnsi="Times New Roman"/>
-          <w:b/>
-        </w:rPr>
-        <w:t>Recall = 99.51%</w:t>
-      </w:r>
-      <w:r>
-        <w:rPr>
-          <w:rFonts w:ascii="Times New Roman" w:hAnsi="Times New Roman"/>
-        </w:rPr>
-        <w:t xml:space="preserve">, </w:t>
-      </w:r>
-      <w:r>
-        <w:rPr>
-          <w:rFonts w:ascii="Times New Roman" w:hAnsi="Times New Roman"/>
-          <w:b/>
-        </w:rPr>
-        <w:t>F1-Score = 99.63%</w:t>
-      </w:r>
-      <w:r>
-        <w:rPr>
-          <w:rFonts w:ascii="Times New Roman" w:hAnsi="Times New Roman"/>
-        </w:rPr>
-        <w:t xml:space="preserve">, nhưng có thời gian huấn luyện siêu tốc chỉ </w:t>
-      </w:r>
-      <w:r>
-        <w:rPr>
-          <w:rFonts w:ascii="Times New Roman" w:hAnsi="Times New Roman"/>
-          <w:b/>
-        </w:rPr>
-        <w:t>41.7 giây</w:t>
-      </w:r>
-      <w:r>
-        <w:rPr>
-          <w:rFonts w:ascii="Times New Roman" w:hAnsi="Times New Roman"/>
-        </w:rPr>
-        <w:t>.</w:t>
+        <w:t>75%</w:t>
+      </w:r>
+      <w:r>
+        <w:rPr>
+          <w:rFonts w:ascii="Times New Roman" w:hAnsi="Times New Roman"/>
+        </w:rPr>
+        <w:t xml:space="preserve"> số vụ gian lận, nên đóng vai trò lớp phòng thủ dự phòng.</w:t>
       </w:r>
     </w:p>
     <w:p>
-      <w:pPr>
-        <w:pStyle w:val="ListBullet"/>
-      </w:pPr>
-      <w:r>
-        <w:rPr>
-          <w:rFonts w:ascii="Times New Roman" w:hAnsi="Times New Roman"/>
-        </w:rPr>
-      </w:r>
-      <w:r>
-        <w:rPr>
-          <w:rFonts w:ascii="Times New Roman" w:hAnsi="Times New Roman"/>
-          <w:b/>
-        </w:rPr>
-        <w:t>Deep Autoencoder</w:t>
-      </w:r>
-      <w:r>
-        <w:rPr>
-          <w:rFonts w:ascii="Times New Roman" w:hAnsi="Times New Roman"/>
-        </w:rPr>
-        <w:t xml:space="preserve"> đạt </w:t>
-      </w:r>
-      <w:r>
-        <w:rPr>
-          <w:rFonts w:ascii="Times New Roman" w:hAnsi="Times New Roman"/>
-          <w:b/>
-        </w:rPr>
-        <w:t>Recall = 75.23%</w:t>
-      </w:r>
-      <w:r>
-        <w:rPr>
-          <w:rFonts w:ascii="Times New Roman" w:hAnsi="Times New Roman"/>
-        </w:rPr>
-        <w:t xml:space="preserve"> ở chế độ hoàn toàn không giám sát.</w:t>
-      </w:r>
-    </w:p>
-    <w:p>
-      <w:r>
-        <w:rPr>
-          <w:rFonts w:ascii="Times New Roman" w:hAnsi="Times New Roman"/>
-        </w:rPr>
-        <w:t>Nhìn vào biểu đồ cột bên phải: Hai mô hình cây (cột xanh) đạt sự cân bằng lý tưởng giữa Precision và Recall. Còn Autoencoder (cột đỏ) chấp nhận Precision ở mức 38.2% để giữ Recall cao ở mức 75.2%, hoàn toàn đúng với triết lý an toàn tài chính: *"Thà cảnh báo nhầm để kiểm tra lại một bước OTP, còn hơn bỏ lọt tội phạm tài chính"*.</w:t>
+      <w:r>
+        <w:rPr>
+          <w:rFonts w:ascii="Times New Roman" w:hAnsi="Times New Roman"/>
+        </w:rPr>
+        <w:t>Ở biểu đồ bên phải, hai mô hình cây gần như đạt tối đa cả ba chỉ số, còn Autoencoder chủ động chấp nhận Precision thấp, khoảng 38%, để giữ Recall cao. Đây là đánh đổi có chủ đích: *"Thà cảnh báo nhầm để xác thực thêm một bước OTP, còn hơn bỏ lọt tội phạm tài chính"*.</w:t>
       </w:r>
     </w:p>
     <w:p>
@@ -5471,7 +5418,7 @@
           <w:rFonts w:ascii="Times New Roman" w:hAnsi="Times New Roman"/>
           <w:i/>
         </w:rPr>
-        <w:t>(Thời lượng chuẩn hóa: **~80s – 85s** [Meeting thực tế: ~80s] | Người nói: **Nguyễn Duy Khang**)</w:t>
+        <w:t>(Thời lượng chuẩn hóa: **~45s – 50s** | Người nói: **Nguyễn Duy Khang**)</w:t>
       </w:r>
       <w:r>
         <w:rPr>
@@ -5484,7 +5431,7 @@
         <w:rPr>
           <w:rFonts w:ascii="Times New Roman" w:hAnsi="Times New Roman"/>
         </w:rPr>
-        <w:t xml:space="preserve">Slide này thể hiện chi tiết </w:t>
+        <w:t xml:space="preserve">Đây là </w:t>
       </w:r>
       <w:r>
         <w:rPr>
@@ -5497,154 +5444,127 @@
         <w:rPr>
           <w:rFonts w:ascii="Times New Roman" w:hAnsi="Times New Roman"/>
         </w:rPr>
-        <w:t xml:space="preserve"> trên 40,000 mẫu kiểm thử độc lập:</w:t>
+        <w:t xml:space="preserve"> của các mô hình trên 40,000 mẫu kiểm thử độc lập.</w:t>
       </w:r>
     </w:p>
     <w:p>
-      <w:pPr>
-        <w:pStyle w:val="ListBullet"/>
-      </w:pPr>
-      <w:r>
-        <w:rPr>
-          <w:rFonts w:ascii="Times New Roman" w:hAnsi="Times New Roman"/>
-        </w:rPr>
+      <w:r>
+        <w:rPr>
+          <w:rFonts w:ascii="Times New Roman" w:hAnsi="Times New Roman"/>
+        </w:rPr>
+        <w:t xml:space="preserve">Với </w:t>
       </w:r>
       <w:r>
         <w:rPr>
           <w:rFonts w:ascii="Times New Roman" w:hAnsi="Times New Roman"/>
           <w:b/>
         </w:rPr>
-        <w:t>Ô đầu tiên — Random Forest:</w:t>
-      </w:r>
-      <w:r>
-        <w:rPr>
-          <w:rFonts w:ascii="Times New Roman" w:hAnsi="Times New Roman"/>
-        </w:rPr>
-        <w:t xml:space="preserve"> Trong 1,643 vụ gian lận thật, mô hình bắt trúng </w:t>
+        <w:t>Random Forest</w:t>
+      </w:r>
+      <w:r>
+        <w:rPr>
+          <w:rFonts w:ascii="Times New Roman" w:hAnsi="Times New Roman"/>
+        </w:rPr>
+        <w:t xml:space="preserve">, trong 1,643 vụ gian lận thật, mô hình bắt trúng 1,635 vụ, chỉ để lọt </w:t>
       </w:r>
       <w:r>
         <w:rPr>
           <w:rFonts w:ascii="Times New Roman" w:hAnsi="Times New Roman"/>
           <w:b/>
         </w:rPr>
-        <w:t>1,635 vụ (TP)</w:t>
-      </w:r>
-      <w:r>
-        <w:rPr>
-          <w:rFonts w:ascii="Times New Roman" w:hAnsi="Times New Roman"/>
-        </w:rPr>
-        <w:t xml:space="preserve">, chỉ để lọt duy nhất </w:t>
+        <w:t>8 vụ</w:t>
+      </w:r>
+      <w:r>
+        <w:rPr>
+          <w:rFonts w:ascii="Times New Roman" w:hAnsi="Times New Roman"/>
+        </w:rPr>
+        <w:t xml:space="preserve">, và trên hơn 38 nghìn giao dịch bình thường chỉ cảnh báo nhầm </w:t>
       </w:r>
       <w:r>
         <w:rPr>
           <w:rFonts w:ascii="Times New Roman" w:hAnsi="Times New Roman"/>
           <w:b/>
         </w:rPr>
-        <w:t>8 vụ (FN)</w:t>
-      </w:r>
-      <w:r>
-        <w:rPr>
-          <w:rFonts w:ascii="Times New Roman" w:hAnsi="Times New Roman"/>
-        </w:rPr>
-        <w:t xml:space="preserve">. Và trên 38,357 giao dịch bình thường, mô hình chỉ cảnh báo nhầm đúng </w:t>
+        <w:t>đúng 1 ca</w:t>
+      </w:r>
+      <w:r>
+        <w:rPr>
+          <w:rFonts w:ascii="Times New Roman" w:hAnsi="Times New Roman"/>
+        </w:rPr>
+        <w:t xml:space="preserve">. </w:t>
       </w:r>
       <w:r>
         <w:rPr>
           <w:rFonts w:ascii="Times New Roman" w:hAnsi="Times New Roman"/>
           <w:b/>
         </w:rPr>
-        <w:t>1 ca duy nhất (FP)</w:t>
-      </w:r>
-      <w:r>
-        <w:rPr>
-          <w:rFonts w:ascii="Times New Roman" w:hAnsi="Times New Roman"/>
-        </w:rPr>
-        <w:t>.</w:t>
+        <w:t>XGBoost</w:t>
+      </w:r>
+      <w:r>
+        <w:rPr>
+          <w:rFonts w:ascii="Times New Roman" w:hAnsi="Times New Roman"/>
+        </w:rPr>
+        <w:t xml:space="preserve">, mô hình nhóm chọn đưa vào sản xuất, cũng bắt trúng 1,635 vụ và bỏ lọt 8 vụ, chỉ cảnh báo nhầm </w:t>
+      </w:r>
+      <w:r>
+        <w:rPr>
+          <w:rFonts w:ascii="Times New Roman" w:hAnsi="Times New Roman"/>
+          <w:b/>
+        </w:rPr>
+        <w:t>4 ca</w:t>
+      </w:r>
+      <w:r>
+        <w:rPr>
+          <w:rFonts w:ascii="Times New Roman" w:hAnsi="Times New Roman"/>
+        </w:rPr>
+        <w:t>, nhưng huấn luyện nhanh hơn nhiều và độ trễ chỉ cỡ nửa mili-giây.</w:t>
       </w:r>
     </w:p>
     <w:p>
-      <w:pPr>
-        <w:pStyle w:val="ListBullet"/>
-      </w:pPr>
-      <w:r>
-        <w:rPr>
-          <w:rFonts w:ascii="Times New Roman" w:hAnsi="Times New Roman"/>
-        </w:rPr>
+      <w:r>
+        <w:rPr>
+          <w:rFonts w:ascii="Times New Roman" w:hAnsi="Times New Roman"/>
+        </w:rPr>
+        <w:t xml:space="preserve">Còn </w:t>
       </w:r>
       <w:r>
         <w:rPr>
           <w:rFonts w:ascii="Times New Roman" w:hAnsi="Times New Roman"/>
           <w:b/>
         </w:rPr>
-        <w:t>Ô thứ hai — XGBoost:</w:t>
-      </w:r>
-      <w:r>
-        <w:rPr>
-          <w:rFonts w:ascii="Times New Roman" w:hAnsi="Times New Roman"/>
-        </w:rPr>
-        <w:t xml:space="preserve"> Bắt trúng </w:t>
+        <w:t>Autoencoder</w:t>
+      </w:r>
+      <w:r>
+        <w:rPr>
+          <w:rFonts w:ascii="Times New Roman" w:hAnsi="Times New Roman"/>
+        </w:rPr>
+        <w:t xml:space="preserve"> bắt được </w:t>
       </w:r>
       <w:r>
         <w:rPr>
           <w:rFonts w:ascii="Times New Roman" w:hAnsi="Times New Roman"/>
           <w:b/>
         </w:rPr>
-        <w:t>1,635 vụ gian lận</w:t>
-      </w:r>
-      <w:r>
-        <w:rPr>
-          <w:rFonts w:ascii="Times New Roman" w:hAnsi="Times New Roman"/>
-        </w:rPr>
-        <w:t xml:space="preserve">, bỏ lọt 8 vụ, và chỉ đoán nhầm </w:t>
+        <w:t>1,236 vụ</w:t>
+      </w:r>
+      <w:r>
+        <w:rPr>
+          <w:rFonts w:ascii="Times New Roman" w:hAnsi="Times New Roman"/>
+        </w:rPr>
+        <w:t xml:space="preserve"> mà không cần nhãn, đóng vai trò màng lọc thứ cấp cho các kiểu tấn công lạ. Đổi lại, mô hình vẫn bỏ lọt 407 vụ và cảnh báo nhầm cỡ </w:t>
       </w:r>
       <w:r>
         <w:rPr>
           <w:rFonts w:ascii="Times New Roman" w:hAnsi="Times New Roman"/>
           <w:b/>
         </w:rPr>
-        <w:t>4 vụ</w:t>
-      </w:r>
-      <w:r>
-        <w:rPr>
-          <w:rFonts w:ascii="Times New Roman" w:hAnsi="Times New Roman"/>
-        </w:rPr>
-        <w:t>. Đây là sự đánh đổi hoàn toàn tối ưu để lấy tốc độ huấn luyện nhanh gấp 28.5 lần.</w:t>
-      </w:r>
-    </w:p>
-    <w:p>
-      <w:pPr>
-        <w:pStyle w:val="ListBullet"/>
-      </w:pPr>
-      <w:r>
-        <w:rPr>
-          <w:rFonts w:ascii="Times New Roman" w:hAnsi="Times New Roman"/>
-        </w:rPr>
-      </w:r>
-      <w:r>
-        <w:rPr>
-          <w:rFonts w:ascii="Times New Roman" w:hAnsi="Times New Roman"/>
-          <w:b/>
-        </w:rPr>
-        <w:t>Ô thứ ba — Deep Autoencoder:</w:t>
-      </w:r>
-      <w:r>
-        <w:rPr>
-          <w:rFonts w:ascii="Times New Roman" w:hAnsi="Times New Roman"/>
-        </w:rPr>
-        <w:t xml:space="preserve"> Bắt trúng </w:t>
-      </w:r>
-      <w:r>
-        <w:rPr>
-          <w:rFonts w:ascii="Times New Roman" w:hAnsi="Times New Roman"/>
-          <w:b/>
-        </w:rPr>
-        <w:t>1,236 vụ gian lận</w:t>
-      </w:r>
-      <w:r>
-        <w:rPr>
-          <w:rFonts w:ascii="Times New Roman" w:hAnsi="Times New Roman"/>
-        </w:rPr>
-        <w:t xml:space="preserve"> mà không cần biết trước nhãn. Dù có 1,998 ca đoán nhầm, nhưng với quy mô ngân hàng, việc chuyển 5% giao dịch đáng ngờ sang bước xác thực OTP bổ sung là hoàn toàn khả thi và chấp nhận được trong thực tế.</w:t>
+        <w:t>5%</w:t>
+      </w:r>
+      <w:r>
+        <w:rPr>
+          <w:rFonts w:ascii="Times New Roman" w:hAnsi="Times New Roman"/>
+        </w:rPr>
+        <w:t xml:space="preserve"> giao dịch. Với ngân hàng thì con số này vẫn chấp nhận được, vì chỉ cần chuyển các giao dịch đó sang bước xác thực OTP.</w:t>
       </w:r>
     </w:p>
     <w:p>
@@ -5677,7 +5597,7 @@
           <w:rFonts w:ascii="Times New Roman" w:hAnsi="Times New Roman"/>
           <w:i/>
         </w:rPr>
-        <w:t>(Thời lượng chuẩn hóa: **~80s – 85s** [Meeting thực tế: ~82s] | Người nói: **Nguyễn Duy Khang**)</w:t>
+        <w:t>(Thời lượng chuẩn hóa: **~45s – 50s** | Người nói: **Nguyễn Duy Khang**)</w:t>
       </w:r>
       <w:r>
         <w:rPr>
@@ -5690,20 +5610,20 @@
         <w:rPr>
           <w:rFonts w:ascii="Times New Roman" w:hAnsi="Times New Roman"/>
         </w:rPr>
-        <w:t xml:space="preserve">Cũng trong module đánh giá, nhóm tiến hành phân tích </w:t>
+        <w:t xml:space="preserve">Tiếp theo là </w:t>
       </w:r>
       <w:r>
         <w:rPr>
           <w:rFonts w:ascii="Times New Roman" w:hAnsi="Times New Roman"/>
           <w:b/>
         </w:rPr>
-        <w:t>Độ quan trọng của đặc trưng (Feature Importance)</w:t>
-      </w:r>
-      <w:r>
-        <w:rPr>
-          <w:rFonts w:ascii="Times New Roman" w:hAnsi="Times New Roman"/>
-        </w:rPr>
-        <w:t>:</w:t>
+        <w:t>Độ quan trọng của đặc trưng</w:t>
+      </w:r>
+      <w:r>
+        <w:rPr>
+          <w:rFonts w:ascii="Times New Roman" w:hAnsi="Times New Roman"/>
+        </w:rPr>
+        <w:t>, tức là mô hình XGBoost dựa vào thông tin nào nhiều nhất để ra quyết định.</w:t>
       </w:r>
     </w:p>
     <w:p>
@@ -5711,7 +5631,72 @@
         <w:rPr>
           <w:rFonts w:ascii="Times New Roman" w:hAnsi="Times New Roman"/>
         </w:rPr>
-        <w:t>Nhìn vào biểu đồ thanh ngang và bảng xếp hạng, Thầy và các bạn sẽ thấy một kết quả định lượng rất rõ ràng:</w:t>
+        <w:t xml:space="preserve">Nhìn vào biểu đồ, hai đặc trưng đứng đầu là </w:t>
+      </w:r>
+      <w:r>
+        <w:rPr>
+          <w:rFonts w:ascii="Times New Roman" w:hAnsi="Times New Roman"/>
+          <w:b/>
+        </w:rPr>
+        <w:t>`errorBalanceOrig`</w:t>
+      </w:r>
+      <w:r>
+        <w:rPr>
+          <w:rFonts w:ascii="Times New Roman" w:hAnsi="Times New Roman"/>
+        </w:rPr>
+        <w:t xml:space="preserve">, tức sai lệch số dư nguồn, chiếm khoảng </w:t>
+      </w:r>
+      <w:r>
+        <w:rPr>
+          <w:rFonts w:ascii="Times New Roman" w:hAnsi="Times New Roman"/>
+          <w:b/>
+        </w:rPr>
+        <w:t>50%</w:t>
+      </w:r>
+      <w:r>
+        <w:rPr>
+          <w:rFonts w:ascii="Times New Roman" w:hAnsi="Times New Roman"/>
+        </w:rPr>
+        <w:t xml:space="preserve">, và </w:t>
+      </w:r>
+      <w:r>
+        <w:rPr>
+          <w:rFonts w:ascii="Times New Roman" w:hAnsi="Times New Roman"/>
+          <w:b/>
+        </w:rPr>
+        <w:t>`newbalanceOrig`</w:t>
+      </w:r>
+      <w:r>
+        <w:rPr>
+          <w:rFonts w:ascii="Times New Roman" w:hAnsi="Times New Roman"/>
+        </w:rPr>
+        <w:t xml:space="preserve">, tức số dư về 0 sau khi rút cạn, chiếm khoảng </w:t>
+      </w:r>
+      <w:r>
+        <w:rPr>
+          <w:rFonts w:ascii="Times New Roman" w:hAnsi="Times New Roman"/>
+          <w:b/>
+        </w:rPr>
+        <w:t>47%</w:t>
+      </w:r>
+      <w:r>
+        <w:rPr>
+          <w:rFonts w:ascii="Times New Roman" w:hAnsi="Times New Roman"/>
+        </w:rPr>
+        <w:t xml:space="preserve">. Gộp lại, riêng hai đặc trưng này đã chiếm tới </w:t>
+      </w:r>
+      <w:r>
+        <w:rPr>
+          <w:rFonts w:ascii="Times New Roman" w:hAnsi="Times New Roman"/>
+          <w:b/>
+        </w:rPr>
+        <w:t>97%</w:t>
+      </w:r>
+      <w:r>
+        <w:rPr>
+          <w:rFonts w:ascii="Times New Roman" w:hAnsi="Times New Roman"/>
+        </w:rPr>
+        <w:t xml:space="preserve"> sức mạnh phân loại. Số tiền giao dịch hay khung giờ đêm gần như không đóng góp đáng kể.</w:t>
       </w:r>
     </w:p>
     <w:p>
@@ -5719,107 +5704,7 @@
         <w:rPr>
           <w:rFonts w:ascii="Times New Roman" w:hAnsi="Times New Roman"/>
         </w:rPr>
-        <w:t>Hai đặc trưng hàng đầu chiếm thế thượng phong:</w:t>
-      </w:r>
-    </w:p>
-    <w:p>
-      <w:pPr>
-        <w:pStyle w:val="ListBullet"/>
-      </w:pPr>
-      <w:r>
-        <w:rPr>
-          <w:rFonts w:ascii="Times New Roman" w:hAnsi="Times New Roman"/>
-        </w:rPr>
-      </w:r>
-      <w:r>
-        <w:rPr>
-          <w:rFonts w:ascii="Times New Roman" w:hAnsi="Times New Roman"/>
-          <w:b/>
-        </w:rPr>
-        <w:t>`errorBalanceOrig`</w:t>
-      </w:r>
-      <w:r>
-        <w:rPr>
-          <w:rFonts w:ascii="Times New Roman" w:hAnsi="Times New Roman"/>
-        </w:rPr>
-        <w:t xml:space="preserve"> (Sai lệch số dư nguồn) chiếm </w:t>
-      </w:r>
-      <w:r>
-        <w:rPr>
-          <w:rFonts w:ascii="Times New Roman" w:hAnsi="Times New Roman"/>
-          <w:b/>
-        </w:rPr>
-        <w:t>49.9%</w:t>
-      </w:r>
-      <w:r>
-        <w:rPr>
-          <w:rFonts w:ascii="Times New Roman" w:hAnsi="Times New Roman"/>
-        </w:rPr>
-        <w:t xml:space="preserve"> đóng góp.</w:t>
-      </w:r>
-    </w:p>
-    <w:p>
-      <w:pPr>
-        <w:pStyle w:val="ListBullet"/>
-      </w:pPr>
-      <w:r>
-        <w:rPr>
-          <w:rFonts w:ascii="Times New Roman" w:hAnsi="Times New Roman"/>
-        </w:rPr>
-      </w:r>
-      <w:r>
-        <w:rPr>
-          <w:rFonts w:ascii="Times New Roman" w:hAnsi="Times New Roman"/>
-          <w:b/>
-        </w:rPr>
-        <w:t>`newbalanceOrig`</w:t>
-      </w:r>
-      <w:r>
-        <w:rPr>
-          <w:rFonts w:ascii="Times New Roman" w:hAnsi="Times New Roman"/>
-        </w:rPr>
-        <w:t xml:space="preserve"> (Số dư nguồn về 0 khi rút cạn) chiếm </w:t>
-      </w:r>
-      <w:r>
-        <w:rPr>
-          <w:rFonts w:ascii="Times New Roman" w:hAnsi="Times New Roman"/>
-          <w:b/>
-        </w:rPr>
-        <w:t>47.2%</w:t>
-      </w:r>
-      <w:r>
-        <w:rPr>
-          <w:rFonts w:ascii="Times New Roman" w:hAnsi="Times New Roman"/>
-        </w:rPr>
-        <w:t xml:space="preserve"> đóng góp.</w:t>
-      </w:r>
-    </w:p>
-    <w:p>
-      <w:r>
-        <w:rPr>
-          <w:rFonts w:ascii="Times New Roman" w:hAnsi="Times New Roman"/>
-        </w:rPr>
-      </w:r>
-      <w:r>
-        <w:rPr>
-          <w:rFonts w:ascii="Times New Roman" w:hAnsi="Times New Roman"/>
-          <w:b/>
-        </w:rPr>
-        <w:t>Chỉ riêng 2 đặc trưng này gộp lại đã chiếm tới 97.1% toàn bộ Feature Split Gains của XGBoost!</w:t>
-      </w:r>
-      <w:r>
-        <w:rPr>
-          <w:rFonts w:ascii="Times New Roman" w:hAnsi="Times New Roman"/>
-        </w:rPr>
-        <w:t xml:space="preserve"> Trong khi các thuộc tính phụ trợ như số tiền giao dịch (`amount`) chỉ chiếm khoảng 0.5%, hay khung giờ đêm chỉ chiếm 0.03%.</w:t>
-      </w:r>
-    </w:p>
-    <w:p>
-      <w:r>
-        <w:rPr>
-          <w:rFonts w:ascii="Times New Roman" w:hAnsi="Times New Roman"/>
-        </w:rPr>
-        <w:t>Điều này cho thấy mô hình bám rất chặt vào dấu vết sai lệch số dư. Trong báo cáo, nhóm cũng nhận diện rõ việc phụ thuộc 98.5% vào nhóm số dư là nguy cơ rủi ro do đặc thù simulator PaySim, chứ không vội vàng xem đây là ranh giới tuyến tính đơn giản ngoài thực tế.</w:t>
+        <w:t>Điều này cho thấy mô hình bám rất chặt vào dấu vết sai lệch số dư. Tuy nhiên, nhóm cũng lưu ý đây là đặc thù của dữ liệu mô phỏng PaySim, nên chưa thể khẳng định kết quả này giữ nguyên ngoài thực tế.</w:t>
       </w:r>
     </w:p>
     <w:p>

</xml_diff>

<commit_message>
docs(script): refine demo transition and closing remarks
- Shorten demo handover direction to concise cue on Slide 20.
- Remove redundant Q&A invitation sentence at the conclusion of Slide 21.
- Regenerate SCRIPT_THUYET_TRINH_TOAN_TEAM_CS106.docx with updated text.
</commit_message>
<xml_diff>
--- a/draft/fraud-detection/slide/scripts/SCRIPT_THUYET_TRINH_TOAN_TEAM_CS106.docx
+++ b/draft/fraud-detection/slide/scripts/SCRIPT_THUYET_TRINH_TOAN_TEAM_CS106.docx
@@ -10715,7 +10715,7 @@
           <w:color w:val="222222"/>
           <w:sz w:val="22"/>
         </w:rPr>
-        <w:t>(Ngay khi phần demo kết thúc tại câu "...để ưu tiên đưa vào quá trình rà soát" với cờ đỏ 88.36%, Phạm Thành Trung cầm micro tiếp lời liền mạch)</w:t>
+        <w:t>(Ngay khi phần demo kết thúc... Trung cầm micro tiếp lời)</w:t>
       </w:r>
     </w:p>
     <w:p>
@@ -11069,7 +11069,7 @@
           <w:color w:val="222222"/>
           <w:sz w:val="22"/>
         </w:rPr>
-        <w:t>Thay mặt toàn thể 7 thành viên Nhóm 09, em xin chân thành cảm ơn Thầy và các bạn đã chú ý theo dõi phần trình bày của nhóm. Sau đây, nhóm chúng em xin trân trọng kính mời Thầy và hội đồng bắt đầu phiên hỏi đáp phản biện Q&amp;A ạ!</w:t>
+        <w:t>Thay mặt toàn thể 7 thành viên Nhóm 09, em xin chân thành cảm ơn Thầy và các bạn đã chú ý theo dõi phần trình bày của nhóm!</w:t>
       </w:r>
     </w:p>
     <w:p>

</xml_diff>